<commit_message>
Added K-map, Logic Gates, and Boolean Algebra
</commit_message>
<xml_diff>
--- a/PSI syllabus Links.docx
+++ b/PSI syllabus Links.docx
@@ -20,21 +20,69 @@
           <w:rFonts w:ascii="Times New Roman" w:eastAsia="Times New Roman" w:hAnsi="Times New Roman" w:cs="Times New Roman"/>
           <w:b/>
           <w:bCs/>
-          <w:color w:val="000000"/>
-          <w:sz w:val="32"/>
-          <w:szCs w:val="32"/>
-        </w:rPr>
-      </w:pPr>
-      <w:r>
-        <w:rPr>
-          <w:rFonts w:ascii="Times New Roman" w:eastAsia="Times New Roman" w:hAnsi="Times New Roman" w:cs="Times New Roman"/>
-          <w:b/>
-          <w:bCs/>
-          <w:color w:val="000000"/>
-          <w:sz w:val="32"/>
-          <w:szCs w:val="32"/>
-        </w:rPr>
-        <w:t>Electronics Components, Devices and Circuits</w:t>
+          <w:i/>
+          <w:iCs/>
+          <w:color w:val="000000"/>
+          <w:sz w:val="40"/>
+          <w:szCs w:val="40"/>
+          <w:u w:val="single"/>
+        </w:rPr>
+      </w:pPr>
+      <w:r>
+        <w:rPr>
+          <w:rFonts w:ascii="Times New Roman" w:eastAsia="Times New Roman" w:hAnsi="Times New Roman" w:cs="Times New Roman"/>
+          <w:b/>
+          <w:bCs/>
+          <w:i/>
+          <w:iCs/>
+          <w:color w:val="000000"/>
+          <w:sz w:val="40"/>
+          <w:szCs w:val="40"/>
+          <w:u w:val="single"/>
+        </w:rPr>
+        <w:t xml:space="preserve">Electronics Components, Devices and </w:t>
+      </w:r>
+      <w:proofErr w:type="gramStart"/>
+      <w:r>
+        <w:rPr>
+          <w:rFonts w:ascii="Times New Roman" w:eastAsia="Times New Roman" w:hAnsi="Times New Roman" w:cs="Times New Roman"/>
+          <w:b/>
+          <w:bCs/>
+          <w:i/>
+          <w:iCs/>
+          <w:color w:val="000000"/>
+          <w:sz w:val="40"/>
+          <w:szCs w:val="40"/>
+          <w:u w:val="single"/>
+        </w:rPr>
+        <w:t>Circuits</w:t>
+      </w:r>
+      <w:r>
+        <w:rPr>
+          <w:rFonts w:ascii="Times New Roman" w:eastAsia="Times New Roman" w:hAnsi="Times New Roman" w:cs="Times New Roman"/>
+          <w:b/>
+          <w:bCs/>
+          <w:i/>
+          <w:iCs/>
+          <w:color w:val="000000"/>
+          <w:sz w:val="40"/>
+          <w:szCs w:val="40"/>
+        </w:rPr>
+        <w:t xml:space="preserve"> :</w:t>
+      </w:r>
+      <w:proofErr w:type="gramEnd"/>
+      <w:r>
+        <w:rPr>
+          <w:rFonts w:ascii="Times New Roman" w:eastAsia="Times New Roman" w:hAnsi="Times New Roman" w:cs="Times New Roman"/>
+          <w:b/>
+          <w:bCs/>
+          <w:i/>
+          <w:iCs/>
+          <w:color w:val="000000"/>
+          <w:sz w:val="40"/>
+          <w:szCs w:val="40"/>
+        </w:rPr>
+        <w:t>-</w:t>
       </w:r>
     </w:p>
     <w:p>
@@ -2381,6 +2429,138 @@
     <w:p>
       <w:pPr>
         <w:pStyle w:val="ListParagraph"/>
+        <w:pBdr>
+          <w:top w:val="nil"/>
+          <w:left w:val="nil"/>
+          <w:bottom w:val="nil"/>
+          <w:right w:val="nil"/>
+          <w:between w:val="nil"/>
+        </w:pBdr>
+        <w:spacing w:after="0"/>
+        <w:ind w:left="1440"/>
+        <w:rPr>
+          <w:rFonts w:ascii="Times New Roman" w:eastAsia="Times New Roman" w:hAnsi="Times New Roman" w:cs="Times New Roman"/>
+          <w:b/>
+          <w:bCs/>
+          <w:color w:val="000000"/>
+          <w:sz w:val="32"/>
+          <w:szCs w:val="32"/>
+        </w:rPr>
+      </w:pPr>
+    </w:p>
+    <w:p>
+      <w:pPr>
+        <w:pStyle w:val="ListParagraph"/>
+        <w:pBdr>
+          <w:top w:val="nil"/>
+          <w:left w:val="nil"/>
+          <w:bottom w:val="nil"/>
+          <w:right w:val="nil"/>
+          <w:between w:val="nil"/>
+        </w:pBdr>
+        <w:spacing w:after="0"/>
+        <w:ind w:left="1440"/>
+        <w:rPr>
+          <w:rFonts w:ascii="Times New Roman" w:eastAsia="Times New Roman" w:hAnsi="Times New Roman" w:cs="Times New Roman"/>
+          <w:b/>
+          <w:bCs/>
+          <w:color w:val="000000"/>
+          <w:sz w:val="32"/>
+          <w:szCs w:val="32"/>
+        </w:rPr>
+      </w:pPr>
+    </w:p>
+    <w:p>
+      <w:pPr>
+        <w:pStyle w:val="ListParagraph"/>
+        <w:pBdr>
+          <w:top w:val="nil"/>
+          <w:left w:val="nil"/>
+          <w:bottom w:val="nil"/>
+          <w:right w:val="nil"/>
+          <w:between w:val="nil"/>
+        </w:pBdr>
+        <w:spacing w:after="0"/>
+        <w:ind w:left="1440"/>
+        <w:rPr>
+          <w:rFonts w:ascii="Times New Roman" w:eastAsia="Times New Roman" w:hAnsi="Times New Roman" w:cs="Times New Roman"/>
+          <w:b/>
+          <w:bCs/>
+          <w:color w:val="000000"/>
+          <w:sz w:val="32"/>
+          <w:szCs w:val="32"/>
+        </w:rPr>
+      </w:pPr>
+    </w:p>
+    <w:p>
+      <w:pPr>
+        <w:pStyle w:val="ListParagraph"/>
+        <w:pBdr>
+          <w:top w:val="nil"/>
+          <w:left w:val="nil"/>
+          <w:bottom w:val="nil"/>
+          <w:right w:val="nil"/>
+          <w:between w:val="nil"/>
+        </w:pBdr>
+        <w:spacing w:after="0"/>
+        <w:ind w:left="1440"/>
+        <w:rPr>
+          <w:rFonts w:ascii="Times New Roman" w:eastAsia="Times New Roman" w:hAnsi="Times New Roman" w:cs="Times New Roman"/>
+          <w:b/>
+          <w:bCs/>
+          <w:color w:val="000000"/>
+          <w:sz w:val="32"/>
+          <w:szCs w:val="32"/>
+        </w:rPr>
+      </w:pPr>
+    </w:p>
+    <w:p>
+      <w:pPr>
+        <w:pStyle w:val="ListParagraph"/>
+        <w:pBdr>
+          <w:top w:val="nil"/>
+          <w:left w:val="nil"/>
+          <w:bottom w:val="nil"/>
+          <w:right w:val="nil"/>
+          <w:between w:val="nil"/>
+        </w:pBdr>
+        <w:spacing w:after="0"/>
+        <w:ind w:left="1440"/>
+        <w:rPr>
+          <w:rFonts w:ascii="Times New Roman" w:eastAsia="Times New Roman" w:hAnsi="Times New Roman" w:cs="Times New Roman"/>
+          <w:b/>
+          <w:bCs/>
+          <w:color w:val="000000"/>
+          <w:sz w:val="32"/>
+          <w:szCs w:val="32"/>
+        </w:rPr>
+      </w:pPr>
+    </w:p>
+    <w:p>
+      <w:pPr>
+        <w:pStyle w:val="ListParagraph"/>
+        <w:pBdr>
+          <w:top w:val="nil"/>
+          <w:left w:val="nil"/>
+          <w:bottom w:val="nil"/>
+          <w:right w:val="nil"/>
+          <w:between w:val="nil"/>
+        </w:pBdr>
+        <w:spacing w:after="0"/>
+        <w:ind w:left="1440"/>
+        <w:rPr>
+          <w:rFonts w:ascii="Times New Roman" w:eastAsia="Times New Roman" w:hAnsi="Times New Roman" w:cs="Times New Roman"/>
+          <w:b/>
+          <w:bCs/>
+          <w:color w:val="000000"/>
+          <w:sz w:val="32"/>
+          <w:szCs w:val="32"/>
+        </w:rPr>
+      </w:pPr>
+    </w:p>
+    <w:p>
+      <w:pPr>
+        <w:pStyle w:val="ListParagraph"/>
         <w:numPr>
           <w:ilvl w:val="0"/>
           <w:numId w:val="2"/>
@@ -2397,22 +2577,95 @@
           <w:rFonts w:ascii="Times New Roman" w:eastAsia="Times New Roman" w:hAnsi="Times New Roman" w:cs="Times New Roman"/>
           <w:b/>
           <w:bCs/>
-          <w:color w:val="000000"/>
-          <w:sz w:val="32"/>
-          <w:szCs w:val="32"/>
-        </w:rPr>
-      </w:pPr>
-      <w:r>
-        <w:rPr>
-          <w:rFonts w:ascii="Times New Roman" w:eastAsia="Times New Roman" w:hAnsi="Times New Roman" w:cs="Times New Roman"/>
-          <w:b/>
-          <w:bCs/>
-          <w:color w:val="000000"/>
-          <w:sz w:val="32"/>
-          <w:szCs w:val="32"/>
-        </w:rPr>
-        <w:t>Digital Electronics &amp; VLSI</w:t>
-      </w:r>
+          <w:i/>
+          <w:iCs/>
+          <w:color w:val="000000"/>
+          <w:sz w:val="40"/>
+          <w:szCs w:val="40"/>
+          <w:u w:val="single"/>
+        </w:rPr>
+      </w:pPr>
+      <w:r>
+        <w:rPr>
+          <w:rFonts w:ascii="Times New Roman" w:eastAsia="Times New Roman" w:hAnsi="Times New Roman" w:cs="Times New Roman"/>
+          <w:b/>
+          <w:bCs/>
+          <w:i/>
+          <w:iCs/>
+          <w:color w:val="000000"/>
+          <w:sz w:val="40"/>
+          <w:szCs w:val="40"/>
+          <w:u w:val="single"/>
+        </w:rPr>
+        <w:t xml:space="preserve">Digital Electronics &amp; </w:t>
+      </w:r>
+      <w:proofErr w:type="gramStart"/>
+      <w:r>
+        <w:rPr>
+          <w:rFonts w:ascii="Times New Roman" w:eastAsia="Times New Roman" w:hAnsi="Times New Roman" w:cs="Times New Roman"/>
+          <w:b/>
+          <w:bCs/>
+          <w:i/>
+          <w:iCs/>
+          <w:color w:val="000000"/>
+          <w:sz w:val="40"/>
+          <w:szCs w:val="40"/>
+          <w:u w:val="single"/>
+        </w:rPr>
+        <w:t>VLSI</w:t>
+      </w:r>
+      <w:r>
+        <w:rPr>
+          <w:rFonts w:ascii="Times New Roman" w:eastAsia="Times New Roman" w:hAnsi="Times New Roman" w:cs="Times New Roman"/>
+          <w:b/>
+          <w:bCs/>
+          <w:i/>
+          <w:iCs/>
+          <w:color w:val="000000"/>
+          <w:sz w:val="40"/>
+          <w:szCs w:val="40"/>
+        </w:rPr>
+        <w:t xml:space="preserve"> :</w:t>
+      </w:r>
+      <w:proofErr w:type="gramEnd"/>
+      <w:r>
+        <w:rPr>
+          <w:rFonts w:ascii="Times New Roman" w:eastAsia="Times New Roman" w:hAnsi="Times New Roman" w:cs="Times New Roman"/>
+          <w:b/>
+          <w:bCs/>
+          <w:i/>
+          <w:iCs/>
+          <w:color w:val="000000"/>
+          <w:sz w:val="40"/>
+          <w:szCs w:val="40"/>
+        </w:rPr>
+        <w:t>-</w:t>
+      </w:r>
+    </w:p>
+    <w:p>
+      <w:pPr>
+        <w:pStyle w:val="ListParagraph"/>
+        <w:pBdr>
+          <w:top w:val="nil"/>
+          <w:left w:val="nil"/>
+          <w:bottom w:val="nil"/>
+          <w:right w:val="nil"/>
+          <w:between w:val="nil"/>
+        </w:pBdr>
+        <w:spacing w:after="0"/>
+        <w:ind w:left="360"/>
+        <w:rPr>
+          <w:rFonts w:ascii="Times New Roman" w:eastAsia="Times New Roman" w:hAnsi="Times New Roman" w:cs="Times New Roman"/>
+          <w:b/>
+          <w:bCs/>
+          <w:i/>
+          <w:iCs/>
+          <w:color w:val="000000"/>
+          <w:sz w:val="30"/>
+          <w:szCs w:val="30"/>
+          <w:u w:val="single"/>
+        </w:rPr>
+      </w:pPr>
     </w:p>
     <w:p>
       <w:pPr>
@@ -2431,18 +2684,14 @@
         <w:spacing w:after="0"/>
         <w:rPr>
           <w:rFonts w:ascii="Times New Roman" w:eastAsia="Times New Roman" w:hAnsi="Times New Roman" w:cs="Times New Roman"/>
-          <w:b/>
-          <w:bCs/>
-          <w:color w:val="000000"/>
-          <w:sz w:val="32"/>
-          <w:szCs w:val="32"/>
-        </w:rPr>
-      </w:pPr>
-      <w:r>
-        <w:rPr>
-          <w:rFonts w:ascii="Times New Roman" w:eastAsia="Times New Roman" w:hAnsi="Times New Roman" w:cs="Times New Roman"/>
-          <w:b/>
-          <w:bCs/>
+          <w:color w:val="000000"/>
+          <w:sz w:val="32"/>
+          <w:szCs w:val="32"/>
+        </w:rPr>
+      </w:pPr>
+      <w:r>
+        <w:rPr>
+          <w:rFonts w:ascii="Times New Roman" w:eastAsia="Times New Roman" w:hAnsi="Times New Roman" w:cs="Times New Roman"/>
           <w:color w:val="000000"/>
           <w:sz w:val="32"/>
           <w:szCs w:val="32"/>
@@ -2453,8 +2702,6 @@
       <w:r>
         <w:rPr>
           <w:rFonts w:ascii="Times New Roman" w:eastAsia="Times New Roman" w:hAnsi="Times New Roman" w:cs="Times New Roman"/>
-          <w:b/>
-          <w:bCs/>
           <w:color w:val="000000"/>
           <w:sz w:val="32"/>
           <w:szCs w:val="32"/>
@@ -2535,18 +2782,14 @@
         <w:spacing w:after="0"/>
         <w:rPr>
           <w:rFonts w:ascii="Times New Roman" w:eastAsia="Times New Roman" w:hAnsi="Times New Roman" w:cs="Times New Roman"/>
-          <w:b/>
-          <w:bCs/>
-          <w:color w:val="000000"/>
-          <w:sz w:val="32"/>
-          <w:szCs w:val="32"/>
-        </w:rPr>
-      </w:pPr>
-      <w:r>
-        <w:rPr>
-          <w:rFonts w:ascii="Times New Roman" w:eastAsia="Times New Roman" w:hAnsi="Times New Roman" w:cs="Times New Roman"/>
-          <w:b/>
-          <w:bCs/>
+          <w:color w:val="000000"/>
+          <w:sz w:val="32"/>
+          <w:szCs w:val="32"/>
+        </w:rPr>
+      </w:pPr>
+      <w:r>
+        <w:rPr>
+          <w:rFonts w:ascii="Times New Roman" w:eastAsia="Times New Roman" w:hAnsi="Times New Roman" w:cs="Times New Roman"/>
           <w:color w:val="000000"/>
           <w:sz w:val="32"/>
           <w:szCs w:val="32"/>
@@ -2557,8 +2800,6 @@
       <w:r>
         <w:rPr>
           <w:rFonts w:ascii="Times New Roman" w:eastAsia="Times New Roman" w:hAnsi="Times New Roman" w:cs="Times New Roman"/>
-          <w:b/>
-          <w:bCs/>
           <w:color w:val="000000"/>
           <w:sz w:val="32"/>
           <w:szCs w:val="32"/>
@@ -2632,7 +2873,7 @@
             <w:sz w:val="32"/>
             <w:szCs w:val="32"/>
           </w:rPr>
-          <w:t>https://youtu.be/Ciyml_dytKc?si=WpeAyzwIsd-lPfUc</w:t>
+          <w:t>https://youtu.be/35YXM8PcloY?si=BVvSZZU_Slt9qd4s</w:t>
         </w:r>
       </w:hyperlink>
     </w:p>
@@ -2881,6 +3122,291 @@
         <w:spacing w:after="0"/>
         <w:rPr>
           <w:rFonts w:ascii="Times New Roman" w:eastAsia="Times New Roman" w:hAnsi="Times New Roman" w:cs="Times New Roman"/>
+          <w:color w:val="000000"/>
+          <w:sz w:val="32"/>
+          <w:szCs w:val="32"/>
+        </w:rPr>
+      </w:pPr>
+      <w:r>
+        <w:rPr>
+          <w:rFonts w:ascii="Times New Roman" w:eastAsia="Times New Roman" w:hAnsi="Times New Roman" w:cs="Times New Roman"/>
+          <w:color w:val="000000"/>
+          <w:sz w:val="32"/>
+          <w:szCs w:val="32"/>
+        </w:rPr>
+        <w:t xml:space="preserve">Combinational </w:t>
+      </w:r>
+      <w:proofErr w:type="gramStart"/>
+      <w:r>
+        <w:rPr>
+          <w:rFonts w:ascii="Times New Roman" w:eastAsia="Times New Roman" w:hAnsi="Times New Roman" w:cs="Times New Roman"/>
+          <w:color w:val="000000"/>
+          <w:sz w:val="32"/>
+          <w:szCs w:val="32"/>
+        </w:rPr>
+        <w:t>Circuits :</w:t>
+      </w:r>
+      <w:proofErr w:type="gramEnd"/>
+    </w:p>
+    <w:p>
+      <w:pPr>
+        <w:pStyle w:val="ListParagraph"/>
+        <w:pBdr>
+          <w:top w:val="nil"/>
+          <w:left w:val="nil"/>
+          <w:bottom w:val="nil"/>
+          <w:right w:val="nil"/>
+          <w:between w:val="nil"/>
+        </w:pBdr>
+        <w:spacing w:after="0"/>
+        <w:rPr>
+          <w:rFonts w:ascii="Times New Roman" w:eastAsia="Times New Roman" w:hAnsi="Times New Roman" w:cs="Times New Roman"/>
+          <w:color w:val="000000"/>
+          <w:sz w:val="32"/>
+          <w:szCs w:val="32"/>
+        </w:rPr>
+      </w:pPr>
+      <w:r>
+        <w:rPr>
+          <w:rFonts w:ascii="Times New Roman" w:eastAsia="Times New Roman" w:hAnsi="Times New Roman" w:cs="Times New Roman"/>
+          <w:color w:val="000000"/>
+          <w:sz w:val="32"/>
+          <w:szCs w:val="32"/>
+        </w:rPr>
+        <w:t>*</w:t>
+      </w:r>
+      <w:r>
+        <w:rPr>
+          <w:rFonts w:ascii="Times New Roman" w:eastAsia="Times New Roman" w:hAnsi="Times New Roman" w:cs="Times New Roman"/>
+          <w:color w:val="000000"/>
+          <w:sz w:val="32"/>
+          <w:szCs w:val="32"/>
+        </w:rPr>
+        <w:t xml:space="preserve">You will need </w:t>
+      </w:r>
+      <w:proofErr w:type="gramStart"/>
+      <w:r>
+        <w:rPr>
+          <w:rFonts w:ascii="Times New Roman" w:eastAsia="Times New Roman" w:hAnsi="Times New Roman" w:cs="Times New Roman"/>
+          <w:color w:val="000000"/>
+          <w:sz w:val="32"/>
+          <w:szCs w:val="32"/>
+        </w:rPr>
+        <w:t>this :</w:t>
+      </w:r>
+      <w:proofErr w:type="gramEnd"/>
+      <w:r>
+        <w:rPr>
+          <w:rFonts w:ascii="Times New Roman" w:eastAsia="Times New Roman" w:hAnsi="Times New Roman" w:cs="Times New Roman"/>
+          <w:b/>
+          <w:bCs/>
+          <w:color w:val="000000"/>
+          <w:sz w:val="32"/>
+          <w:szCs w:val="32"/>
+        </w:rPr>
+        <w:t xml:space="preserve"> </w:t>
+      </w:r>
+      <w:hyperlink r:id="rId32" w:history="1">
+        <w:r>
+          <w:rPr>
+            <w:rStyle w:val="Hyperlink"/>
+            <w:rFonts w:ascii="Times New Roman" w:eastAsia="Times New Roman" w:hAnsi="Times New Roman" w:cs="Times New Roman"/>
+            <w:sz w:val="32"/>
+            <w:szCs w:val="32"/>
+          </w:rPr>
+          <w:t>https://www.geeksforgeeks.org/dsa/bcd-or-binary-coded-decimal/</w:t>
+        </w:r>
+      </w:hyperlink>
+    </w:p>
+    <w:p>
+      <w:pPr>
+        <w:pStyle w:val="ListParagraph"/>
+        <w:pBdr>
+          <w:top w:val="nil"/>
+          <w:left w:val="nil"/>
+          <w:bottom w:val="nil"/>
+          <w:right w:val="nil"/>
+          <w:between w:val="nil"/>
+        </w:pBdr>
+        <w:spacing w:after="0"/>
+        <w:rPr>
+          <w:rFonts w:ascii="Times New Roman" w:eastAsia="Times New Roman" w:hAnsi="Times New Roman" w:cs="Times New Roman"/>
+          <w:color w:val="000000"/>
+          <w:sz w:val="32"/>
+          <w:szCs w:val="32"/>
+        </w:rPr>
+      </w:pPr>
+      <w:r>
+        <w:rPr>
+          <w:rFonts w:ascii="Times New Roman" w:eastAsia="Times New Roman" w:hAnsi="Times New Roman" w:cs="Times New Roman"/>
+          <w:color w:val="000000"/>
+          <w:sz w:val="32"/>
+          <w:szCs w:val="32"/>
+        </w:rPr>
+        <w:t>*</w:t>
+      </w:r>
+      <w:r>
+        <w:rPr>
+          <w:rFonts w:ascii="Times New Roman" w:eastAsia="Times New Roman" w:hAnsi="Times New Roman" w:cs="Times New Roman"/>
+          <w:color w:val="000000"/>
+          <w:sz w:val="32"/>
+          <w:szCs w:val="32"/>
+        </w:rPr>
+        <w:t>&amp; this too:</w:t>
+      </w:r>
+      <w:r>
+        <w:rPr>
+          <w:rFonts w:ascii="Times New Roman" w:eastAsia="Times New Roman" w:hAnsi="Times New Roman" w:cs="Times New Roman"/>
+          <w:color w:val="000000"/>
+          <w:sz w:val="32"/>
+          <w:szCs w:val="32"/>
+        </w:rPr>
+        <w:t xml:space="preserve"> </w:t>
+      </w:r>
+      <w:hyperlink r:id="rId33" w:history="1">
+        <w:r>
+          <w:rPr>
+            <w:rStyle w:val="Hyperlink"/>
+            <w:rFonts w:ascii="Times New Roman" w:hAnsi="Times New Roman" w:cs="Times New Roman"/>
+            <w:sz w:val="32"/>
+            <w:szCs w:val="32"/>
+          </w:rPr>
+          <w:t>https://www.youtube.com/watch?v=6dneWcLv1HM&amp;list=PL-IC1WV1OE4noB2cXD_w3BZ0y1GoKwZuw</w:t>
+        </w:r>
+      </w:hyperlink>
+    </w:p>
+    <w:p>
+      <w:pPr>
+        <w:pStyle w:val="ListParagraph"/>
+        <w:pBdr>
+          <w:top w:val="nil"/>
+          <w:left w:val="nil"/>
+          <w:bottom w:val="nil"/>
+          <w:right w:val="nil"/>
+          <w:between w:val="nil"/>
+        </w:pBdr>
+        <w:spacing w:after="0"/>
+        <w:rPr>
+          <w:rFonts w:ascii="Times New Roman" w:eastAsia="Times New Roman" w:hAnsi="Times New Roman" w:cs="Times New Roman"/>
+          <w:b/>
+          <w:bCs/>
+          <w:color w:val="000000"/>
+          <w:sz w:val="32"/>
+          <w:szCs w:val="32"/>
+        </w:rPr>
+      </w:pPr>
+    </w:p>
+    <w:p>
+      <w:pPr>
+        <w:pStyle w:val="ListParagraph"/>
+        <w:pBdr>
+          <w:top w:val="nil"/>
+          <w:left w:val="nil"/>
+          <w:bottom w:val="nil"/>
+          <w:right w:val="nil"/>
+          <w:between w:val="nil"/>
+        </w:pBdr>
+        <w:spacing w:after="0"/>
+        <w:rPr>
+          <w:rFonts w:ascii="Times New Roman" w:eastAsia="Times New Roman" w:hAnsi="Times New Roman" w:cs="Times New Roman"/>
+          <w:b/>
+          <w:bCs/>
+          <w:color w:val="000000"/>
+          <w:sz w:val="32"/>
+          <w:szCs w:val="32"/>
+          <w:u w:val="single"/>
+        </w:rPr>
+      </w:pPr>
+      <w:hyperlink r:id="rId34" w:history="1">
+        <w:r>
+          <w:rPr>
+            <w:rStyle w:val="Hyperlink"/>
+            <w:rFonts w:ascii="Times New Roman" w:eastAsia="Times New Roman" w:hAnsi="Times New Roman" w:cs="Times New Roman"/>
+            <w:b/>
+            <w:bCs/>
+            <w:sz w:val="32"/>
+            <w:szCs w:val="32"/>
+          </w:rPr>
+          <w:t>https://www.youtube.com/watch?v=KDZ-SI7OHNY&amp;list=PL-IC1WV1OE4m3hb-LfCYJ3MOkJD3v9XQT&amp;pp=0gcJCbUEOCosWNin</w:t>
+        </w:r>
+      </w:hyperlink>
+    </w:p>
+    <w:p>
+      <w:pPr>
+        <w:pStyle w:val="ListParagraph"/>
+        <w:pBdr>
+          <w:top w:val="nil"/>
+          <w:left w:val="nil"/>
+          <w:bottom w:val="nil"/>
+          <w:right w:val="nil"/>
+          <w:between w:val="nil"/>
+        </w:pBdr>
+        <w:spacing w:after="0"/>
+        <w:rPr>
+          <w:rFonts w:ascii="Times New Roman" w:eastAsia="Times New Roman" w:hAnsi="Times New Roman" w:cs="Times New Roman"/>
+          <w:b/>
+          <w:bCs/>
+          <w:color w:val="000000"/>
+          <w:sz w:val="32"/>
+          <w:szCs w:val="32"/>
+        </w:rPr>
+      </w:pPr>
+    </w:p>
+    <w:p>
+      <w:pPr>
+        <w:pStyle w:val="ListParagraph"/>
+        <w:numPr>
+          <w:ilvl w:val="0"/>
+          <w:numId w:val="13"/>
+        </w:numPr>
+        <w:pBdr>
+          <w:top w:val="nil"/>
+          <w:left w:val="nil"/>
+          <w:bottom w:val="nil"/>
+          <w:right w:val="nil"/>
+          <w:between w:val="nil"/>
+        </w:pBdr>
+        <w:spacing w:after="0"/>
+        <w:rPr>
+          <w:rFonts w:ascii="Times New Roman" w:eastAsia="Times New Roman" w:hAnsi="Times New Roman" w:cs="Times New Roman"/>
+          <w:b/>
+          <w:bCs/>
+          <w:color w:val="000000"/>
+          <w:sz w:val="32"/>
+          <w:szCs w:val="32"/>
+        </w:rPr>
+      </w:pPr>
+      <w:proofErr w:type="spellStart"/>
+      <w:r>
+        <w:rPr>
+          <w:rFonts w:ascii="Times New Roman" w:eastAsia="Times New Roman" w:hAnsi="Times New Roman" w:cs="Times New Roman"/>
+          <w:b/>
+          <w:bCs/>
+          <w:color w:val="000000"/>
+          <w:sz w:val="32"/>
+          <w:szCs w:val="32"/>
+        </w:rPr>
+        <w:t>Fd</w:t>
+      </w:r>
+      <w:proofErr w:type="spellEnd"/>
+    </w:p>
+    <w:p>
+      <w:pPr>
+        <w:pStyle w:val="ListParagraph"/>
+        <w:numPr>
+          <w:ilvl w:val="0"/>
+          <w:numId w:val="13"/>
+        </w:numPr>
+        <w:pBdr>
+          <w:top w:val="nil"/>
+          <w:left w:val="nil"/>
+          <w:bottom w:val="nil"/>
+          <w:right w:val="nil"/>
+          <w:between w:val="nil"/>
+        </w:pBdr>
+        <w:spacing w:after="0"/>
+        <w:rPr>
+          <w:rFonts w:ascii="Times New Roman" w:eastAsia="Times New Roman" w:hAnsi="Times New Roman" w:cs="Times New Roman"/>
           <w:b/>
           <w:bCs/>
           <w:color w:val="000000"/>
@@ -2907,21 +3433,80 @@
           <w:rFonts w:ascii="Times New Roman" w:eastAsia="Times New Roman" w:hAnsi="Times New Roman" w:cs="Times New Roman"/>
           <w:b/>
           <w:bCs/>
-          <w:color w:val="000000"/>
-          <w:sz w:val="32"/>
-          <w:szCs w:val="32"/>
-        </w:rPr>
-      </w:pPr>
-      <w:r>
-        <w:rPr>
-          <w:rFonts w:ascii="Times New Roman" w:eastAsia="Times New Roman" w:hAnsi="Times New Roman" w:cs="Times New Roman"/>
-          <w:b/>
-          <w:bCs/>
-          <w:color w:val="000000"/>
-          <w:sz w:val="32"/>
-          <w:szCs w:val="32"/>
-        </w:rPr>
-        <w:t>Electronics Networks and Instruments &amp; Measurements</w:t>
+          <w:i/>
+          <w:iCs/>
+          <w:color w:val="000000"/>
+          <w:sz w:val="40"/>
+          <w:szCs w:val="40"/>
+          <w:u w:val="single"/>
+        </w:rPr>
+      </w:pPr>
+      <w:r>
+        <w:rPr>
+          <w:rFonts w:ascii="Times New Roman" w:eastAsia="Times New Roman" w:hAnsi="Times New Roman" w:cs="Times New Roman"/>
+          <w:b/>
+          <w:bCs/>
+          <w:i/>
+          <w:iCs/>
+          <w:color w:val="000000"/>
+          <w:sz w:val="40"/>
+          <w:szCs w:val="40"/>
+          <w:u w:val="single"/>
+        </w:rPr>
+        <w:t xml:space="preserve">Electronics Networks and Instruments &amp; </w:t>
+      </w:r>
+      <w:proofErr w:type="gramStart"/>
+      <w:r>
+        <w:rPr>
+          <w:rFonts w:ascii="Times New Roman" w:eastAsia="Times New Roman" w:hAnsi="Times New Roman" w:cs="Times New Roman"/>
+          <w:b/>
+          <w:bCs/>
+          <w:i/>
+          <w:iCs/>
+          <w:color w:val="000000"/>
+          <w:sz w:val="40"/>
+          <w:szCs w:val="40"/>
+          <w:u w:val="single"/>
+        </w:rPr>
+        <w:t>Measurements</w:t>
+      </w:r>
+      <w:r>
+        <w:rPr>
+          <w:rFonts w:ascii="Times New Roman" w:eastAsia="Times New Roman" w:hAnsi="Times New Roman" w:cs="Times New Roman"/>
+          <w:i/>
+          <w:iCs/>
+          <w:color w:val="000000"/>
+          <w:sz w:val="40"/>
+          <w:szCs w:val="40"/>
+        </w:rPr>
+        <w:t xml:space="preserve"> </w:t>
+      </w:r>
+      <w:r>
+        <w:rPr>
+          <w:rFonts w:ascii="Times New Roman" w:eastAsia="Times New Roman" w:hAnsi="Times New Roman" w:cs="Times New Roman"/>
+          <w:b/>
+          <w:bCs/>
+          <w:i/>
+          <w:iCs/>
+          <w:color w:val="000000"/>
+          <w:sz w:val="40"/>
+          <w:szCs w:val="40"/>
+        </w:rPr>
+        <w:t>:</w:t>
+      </w:r>
+      <w:proofErr w:type="gramEnd"/>
+      <w:r>
+        <w:rPr>
+          <w:rFonts w:ascii="Times New Roman" w:eastAsia="Times New Roman" w:hAnsi="Times New Roman" w:cs="Times New Roman"/>
+          <w:b/>
+          <w:bCs/>
+          <w:i/>
+          <w:iCs/>
+          <w:color w:val="000000"/>
+          <w:sz w:val="40"/>
+          <w:szCs w:val="40"/>
+        </w:rPr>
+        <w:t>-</w:t>
       </w:r>
     </w:p>
     <w:p>
@@ -3073,7 +3658,7 @@
         </w:rPr>
         <w:br/>
       </w:r>
-      <w:hyperlink r:id="rId32" w:history="1">
+      <w:hyperlink r:id="rId35" w:history="1">
         <w:r>
           <w:rPr>
             <w:rStyle w:val="Hyperlink"/>
@@ -3168,7 +3753,7 @@
         </w:rPr>
         <w:t xml:space="preserve">Concept 1: </w:t>
       </w:r>
-      <w:hyperlink r:id="rId33" w:history="1">
+      <w:hyperlink r:id="rId36" w:history="1">
         <w:r>
           <w:rPr>
             <w:rStyle w:val="Hyperlink"/>
@@ -3231,7 +3816,7 @@
         </w:rPr>
         <w:t xml:space="preserve"> </w:t>
       </w:r>
-      <w:hyperlink r:id="rId34" w:history="1">
+      <w:hyperlink r:id="rId37" w:history="1">
         <w:r>
           <w:rPr>
             <w:rStyle w:val="Hyperlink"/>
@@ -3294,7 +3879,7 @@
         </w:rPr>
         <w:t xml:space="preserve"> </w:t>
       </w:r>
-      <w:hyperlink r:id="rId35" w:history="1">
+      <w:hyperlink r:id="rId38" w:history="1">
         <w:r>
           <w:rPr>
             <w:rStyle w:val="Hyperlink"/>
@@ -3348,7 +3933,7 @@
         </w:rPr>
         <w:t xml:space="preserve"> </w:t>
       </w:r>
-      <w:hyperlink r:id="rId36" w:history="1">
+      <w:hyperlink r:id="rId39" w:history="1">
         <w:r>
           <w:rPr>
             <w:rStyle w:val="Hyperlink"/>
@@ -3411,7 +3996,7 @@
         </w:rPr>
         <w:t xml:space="preserve"> </w:t>
       </w:r>
-      <w:hyperlink r:id="rId37" w:history="1">
+      <w:hyperlink r:id="rId40" w:history="1">
         <w:r>
           <w:rPr>
             <w:rStyle w:val="Hyperlink"/>
@@ -3465,7 +4050,7 @@
         </w:rPr>
         <w:t xml:space="preserve"> </w:t>
       </w:r>
-      <w:hyperlink r:id="rId38" w:history="1">
+      <w:hyperlink r:id="rId41" w:history="1">
         <w:r>
           <w:rPr>
             <w:rStyle w:val="Hyperlink"/>
@@ -3519,7 +4104,7 @@
         </w:rPr>
         <w:t xml:space="preserve"> </w:t>
       </w:r>
-      <w:hyperlink r:id="rId39" w:history="1">
+      <w:hyperlink r:id="rId42" w:history="1">
         <w:r>
           <w:rPr>
             <w:rStyle w:val="Hyperlink"/>
@@ -3573,7 +4158,7 @@
         </w:rPr>
         <w:t xml:space="preserve"> </w:t>
       </w:r>
-      <w:hyperlink r:id="rId40" w:history="1">
+      <w:hyperlink r:id="rId43" w:history="1">
         <w:r>
           <w:rPr>
             <w:rStyle w:val="Hyperlink"/>
@@ -3581,43 +4166,7 @@
             <w:sz w:val="32"/>
             <w:szCs w:val="32"/>
           </w:rPr>
-          <w:t>https://youtu.be/YaX2_S</w:t>
-        </w:r>
-        <w:r>
-          <w:rPr>
-            <w:rStyle w:val="Hyperlink"/>
-            <w:rFonts w:ascii="Times New Roman" w:eastAsia="Times New Roman" w:hAnsi="Times New Roman" w:cs="Times New Roman"/>
-            <w:sz w:val="32"/>
-            <w:szCs w:val="32"/>
-          </w:rPr>
-          <w:t>_</w:t>
-        </w:r>
-        <w:r>
-          <w:rPr>
-            <w:rStyle w:val="Hyperlink"/>
-            <w:rFonts w:ascii="Times New Roman" w:eastAsia="Times New Roman" w:hAnsi="Times New Roman" w:cs="Times New Roman"/>
-            <w:sz w:val="32"/>
-            <w:szCs w:val="32"/>
-          </w:rPr>
-          <w:t>k0_w?si=THUhZd3ben</w:t>
-        </w:r>
-        <w:r>
-          <w:rPr>
-            <w:rStyle w:val="Hyperlink"/>
-            <w:rFonts w:ascii="Times New Roman" w:eastAsia="Times New Roman" w:hAnsi="Times New Roman" w:cs="Times New Roman"/>
-            <w:sz w:val="32"/>
-            <w:szCs w:val="32"/>
-          </w:rPr>
-          <w:t>w</w:t>
-        </w:r>
-        <w:r>
-          <w:rPr>
-            <w:rStyle w:val="Hyperlink"/>
-            <w:rFonts w:ascii="Times New Roman" w:eastAsia="Times New Roman" w:hAnsi="Times New Roman" w:cs="Times New Roman"/>
-            <w:sz w:val="32"/>
-            <w:szCs w:val="32"/>
-          </w:rPr>
-          <w:t>N96fH</w:t>
+          <w:t>https://youtu.be/YaX2_S_k0_w?si=THUhZd3benwN96fH</w:t>
         </w:r>
       </w:hyperlink>
     </w:p>
@@ -3663,7 +4212,7 @@
         </w:rPr>
         <w:t xml:space="preserve"> </w:t>
       </w:r>
-      <w:hyperlink r:id="rId41" w:history="1">
+      <w:hyperlink r:id="rId44" w:history="1">
         <w:r>
           <w:rPr>
             <w:rStyle w:val="Hyperlink"/>
@@ -3711,7 +4260,7 @@
       <w:r>
         <w:t xml:space="preserve"> </w:t>
       </w:r>
-      <w:hyperlink r:id="rId42" w:history="1">
+      <w:hyperlink r:id="rId45" w:history="1">
         <w:r>
           <w:rPr>
             <w:rStyle w:val="Hyperlink"/>
@@ -3719,25 +4268,7 @@
             <w:sz w:val="32"/>
             <w:szCs w:val="32"/>
           </w:rPr>
-          <w:t>https://youtu.be/2v9qdbbjpS8?</w:t>
-        </w:r>
-        <w:r>
-          <w:rPr>
-            <w:rStyle w:val="Hyperlink"/>
-            <w:rFonts w:ascii="Times New Roman" w:eastAsia="Times New Roman" w:hAnsi="Times New Roman" w:cs="Times New Roman"/>
-            <w:sz w:val="32"/>
-            <w:szCs w:val="32"/>
-          </w:rPr>
-          <w:t>s</w:t>
-        </w:r>
-        <w:r>
-          <w:rPr>
-            <w:rStyle w:val="Hyperlink"/>
-            <w:rFonts w:ascii="Times New Roman" w:eastAsia="Times New Roman" w:hAnsi="Times New Roman" w:cs="Times New Roman"/>
-            <w:sz w:val="32"/>
-            <w:szCs w:val="32"/>
-          </w:rPr>
-          <w:t>i=smr3JcvZhJAfcObc</w:t>
+          <w:t>https://youtu.be/2v9qdbbjpS8?si=smr3JcvZhJAfcObc</w:t>
         </w:r>
       </w:hyperlink>
     </w:p>
@@ -3783,7 +4314,7 @@
         </w:rPr>
         <w:t xml:space="preserve"> </w:t>
       </w:r>
-      <w:hyperlink r:id="rId43" w:history="1">
+      <w:hyperlink r:id="rId46" w:history="1">
         <w:r>
           <w:rPr>
             <w:rStyle w:val="Hyperlink"/>
@@ -3837,7 +4368,7 @@
         </w:rPr>
         <w:t xml:space="preserve"> </w:t>
       </w:r>
-      <w:hyperlink r:id="rId44" w:history="1">
+      <w:hyperlink r:id="rId47" w:history="1">
         <w:r>
           <w:rPr>
             <w:rStyle w:val="Hyperlink"/>
@@ -3845,16 +4376,7 @@
             <w:sz w:val="32"/>
             <w:szCs w:val="32"/>
           </w:rPr>
-          <w:t>https://youtu</w:t>
-        </w:r>
-        <w:r>
-          <w:rPr>
-            <w:rStyle w:val="Hyperlink"/>
-            <w:rFonts w:ascii="Times New Roman" w:eastAsia="Times New Roman" w:hAnsi="Times New Roman" w:cs="Times New Roman"/>
-            <w:sz w:val="32"/>
-            <w:szCs w:val="32"/>
-          </w:rPr>
-          <w:t>.be/7TUzSSY5790?si=FKtPskw5015M1bXk</w:t>
+          <w:t>https://youtu.be/7TUzSSY5790?si=FKtPskw5015M1bXk</w:t>
         </w:r>
       </w:hyperlink>
     </w:p>
@@ -3900,7 +4422,7 @@
         </w:rPr>
         <w:t xml:space="preserve"> </w:t>
       </w:r>
-      <w:hyperlink r:id="rId45" w:history="1">
+      <w:hyperlink r:id="rId48" w:history="1">
         <w:r>
           <w:rPr>
             <w:rStyle w:val="Hyperlink"/>
@@ -3954,7 +4476,7 @@
         </w:rPr>
         <w:t xml:space="preserve"> </w:t>
       </w:r>
-      <w:hyperlink r:id="rId46" w:history="1">
+      <w:hyperlink r:id="rId49" w:history="1">
         <w:r>
           <w:rPr>
             <w:rStyle w:val="Hyperlink"/>
@@ -4167,7 +4689,7 @@
           <w:szCs w:val="32"/>
         </w:rPr>
       </w:pPr>
-      <w:hyperlink r:id="rId47" w:history="1">
+      <w:hyperlink r:id="rId50" w:history="1">
         <w:r>
           <w:rPr>
             <w:rStyle w:val="Hyperlink"/>
@@ -4222,7 +4744,7 @@
           <w:szCs w:val="32"/>
         </w:rPr>
       </w:pPr>
-      <w:hyperlink r:id="rId48" w:history="1">
+      <w:hyperlink r:id="rId51" w:history="1">
         <w:r>
           <w:rPr>
             <w:rStyle w:val="Hyperlink"/>
@@ -4336,7 +4858,7 @@
           <w:szCs w:val="32"/>
         </w:rPr>
       </w:pPr>
-      <w:hyperlink r:id="rId49" w:history="1">
+      <w:hyperlink r:id="rId52" w:history="1">
         <w:r>
           <w:rPr>
             <w:rStyle w:val="Hyperlink"/>
@@ -4412,21 +4934,67 @@
           <w:rFonts w:ascii="Times New Roman" w:eastAsia="Times New Roman" w:hAnsi="Times New Roman" w:cs="Times New Roman"/>
           <w:b/>
           <w:bCs/>
-          <w:color w:val="000000"/>
-          <w:sz w:val="32"/>
-          <w:szCs w:val="32"/>
-        </w:rPr>
-      </w:pPr>
-      <w:r>
-        <w:rPr>
-          <w:rFonts w:ascii="Times New Roman" w:eastAsia="Times New Roman" w:hAnsi="Times New Roman" w:cs="Times New Roman"/>
-          <w:b/>
-          <w:bCs/>
-          <w:color w:val="000000"/>
-          <w:sz w:val="32"/>
-          <w:szCs w:val="32"/>
-        </w:rPr>
-        <w:t>Communication Engineering</w:t>
+          <w:i/>
+          <w:iCs/>
+          <w:color w:val="000000"/>
+          <w:sz w:val="40"/>
+          <w:szCs w:val="40"/>
+          <w:u w:val="single"/>
+        </w:rPr>
+      </w:pPr>
+      <w:r>
+        <w:rPr>
+          <w:rFonts w:ascii="Times New Roman" w:eastAsia="Times New Roman" w:hAnsi="Times New Roman" w:cs="Times New Roman"/>
+          <w:b/>
+          <w:bCs/>
+          <w:i/>
+          <w:iCs/>
+          <w:color w:val="000000"/>
+          <w:sz w:val="40"/>
+          <w:szCs w:val="40"/>
+          <w:u w:val="single"/>
+        </w:rPr>
+        <w:t xml:space="preserve">Communication </w:t>
+      </w:r>
+      <w:proofErr w:type="gramStart"/>
+      <w:r>
+        <w:rPr>
+          <w:rFonts w:ascii="Times New Roman" w:eastAsia="Times New Roman" w:hAnsi="Times New Roman" w:cs="Times New Roman"/>
+          <w:b/>
+          <w:bCs/>
+          <w:i/>
+          <w:iCs/>
+          <w:color w:val="000000"/>
+          <w:sz w:val="40"/>
+          <w:szCs w:val="40"/>
+          <w:u w:val="single"/>
+        </w:rPr>
+        <w:t>Engineering</w:t>
+      </w:r>
+      <w:r>
+        <w:rPr>
+          <w:rFonts w:ascii="Times New Roman" w:eastAsia="Times New Roman" w:hAnsi="Times New Roman" w:cs="Times New Roman"/>
+          <w:i/>
+          <w:iCs/>
+          <w:color w:val="000000"/>
+          <w:sz w:val="40"/>
+          <w:szCs w:val="40"/>
+          <w:u w:val="single"/>
+        </w:rPr>
+        <w:t xml:space="preserve"> :</w:t>
+      </w:r>
+      <w:proofErr w:type="gramEnd"/>
+      <w:r>
+        <w:rPr>
+          <w:rFonts w:ascii="Times New Roman" w:eastAsia="Times New Roman" w:hAnsi="Times New Roman" w:cs="Times New Roman"/>
+          <w:i/>
+          <w:iCs/>
+          <w:color w:val="000000"/>
+          <w:sz w:val="40"/>
+          <w:szCs w:val="40"/>
+          <w:u w:val="single"/>
+        </w:rPr>
+        <w:t>-</w:t>
       </w:r>
     </w:p>
     <w:p>
@@ -4444,9 +5012,12 @@
           <w:rFonts w:ascii="Times New Roman" w:eastAsia="Times New Roman" w:hAnsi="Times New Roman" w:cs="Times New Roman"/>
           <w:b/>
           <w:bCs/>
-          <w:color w:val="000000"/>
-          <w:sz w:val="32"/>
-          <w:szCs w:val="32"/>
+          <w:i/>
+          <w:iCs/>
+          <w:color w:val="000000"/>
+          <w:sz w:val="40"/>
+          <w:szCs w:val="40"/>
+          <w:u w:val="single"/>
         </w:rPr>
       </w:pPr>
     </w:p>
@@ -4468,21 +5039,69 @@
           <w:rFonts w:ascii="Times New Roman" w:eastAsia="Times New Roman" w:hAnsi="Times New Roman" w:cs="Times New Roman"/>
           <w:b/>
           <w:bCs/>
-          <w:color w:val="000000"/>
-          <w:sz w:val="32"/>
-          <w:szCs w:val="32"/>
-        </w:rPr>
-      </w:pPr>
-      <w:r>
-        <w:rPr>
-          <w:rFonts w:ascii="Times New Roman" w:eastAsia="Times New Roman" w:hAnsi="Times New Roman" w:cs="Times New Roman"/>
-          <w:b/>
-          <w:bCs/>
-          <w:color w:val="000000"/>
-          <w:sz w:val="32"/>
-          <w:szCs w:val="32"/>
-        </w:rPr>
-        <w:t>Communication Applications &amp; Microwave Engineering</w:t>
+          <w:i/>
+          <w:iCs/>
+          <w:color w:val="000000"/>
+          <w:sz w:val="40"/>
+          <w:szCs w:val="40"/>
+          <w:u w:val="single"/>
+        </w:rPr>
+      </w:pPr>
+      <w:r>
+        <w:rPr>
+          <w:rFonts w:ascii="Times New Roman" w:eastAsia="Times New Roman" w:hAnsi="Times New Roman" w:cs="Times New Roman"/>
+          <w:b/>
+          <w:bCs/>
+          <w:i/>
+          <w:iCs/>
+          <w:color w:val="000000"/>
+          <w:sz w:val="40"/>
+          <w:szCs w:val="40"/>
+          <w:u w:val="single"/>
+        </w:rPr>
+        <w:t xml:space="preserve">Communication Applications &amp; Microwave </w:t>
+      </w:r>
+      <w:proofErr w:type="gramStart"/>
+      <w:r>
+        <w:rPr>
+          <w:rFonts w:ascii="Times New Roman" w:eastAsia="Times New Roman" w:hAnsi="Times New Roman" w:cs="Times New Roman"/>
+          <w:b/>
+          <w:bCs/>
+          <w:i/>
+          <w:iCs/>
+          <w:color w:val="000000"/>
+          <w:sz w:val="40"/>
+          <w:szCs w:val="40"/>
+          <w:u w:val="single"/>
+        </w:rPr>
+        <w:t>Engineering</w:t>
+      </w:r>
+      <w:r>
+        <w:rPr>
+          <w:rFonts w:ascii="Times New Roman" w:eastAsia="Times New Roman" w:hAnsi="Times New Roman" w:cs="Times New Roman"/>
+          <w:b/>
+          <w:bCs/>
+          <w:i/>
+          <w:iCs/>
+          <w:color w:val="000000"/>
+          <w:sz w:val="40"/>
+          <w:szCs w:val="40"/>
+        </w:rPr>
+        <w:t xml:space="preserve"> :</w:t>
+      </w:r>
+      <w:proofErr w:type="gramEnd"/>
+      <w:r>
+        <w:rPr>
+          <w:rFonts w:ascii="Times New Roman" w:eastAsia="Times New Roman" w:hAnsi="Times New Roman" w:cs="Times New Roman"/>
+          <w:b/>
+          <w:bCs/>
+          <w:i/>
+          <w:iCs/>
+          <w:color w:val="000000"/>
+          <w:sz w:val="40"/>
+          <w:szCs w:val="40"/>
+        </w:rPr>
+        <w:t>-</w:t>
       </w:r>
     </w:p>
     <w:p>
@@ -4500,9 +5119,12 @@
           <w:rFonts w:ascii="Times New Roman" w:eastAsia="Times New Roman" w:hAnsi="Times New Roman" w:cs="Times New Roman"/>
           <w:b/>
           <w:bCs/>
-          <w:color w:val="000000"/>
-          <w:sz w:val="32"/>
-          <w:szCs w:val="32"/>
+          <w:i/>
+          <w:iCs/>
+          <w:color w:val="000000"/>
+          <w:sz w:val="40"/>
+          <w:szCs w:val="40"/>
+          <w:u w:val="single"/>
         </w:rPr>
       </w:pPr>
     </w:p>
@@ -4524,21 +5146,69 @@
           <w:rFonts w:ascii="Times New Roman" w:eastAsia="Times New Roman" w:hAnsi="Times New Roman" w:cs="Times New Roman"/>
           <w:b/>
           <w:bCs/>
-          <w:color w:val="000000"/>
-          <w:sz w:val="32"/>
-          <w:szCs w:val="32"/>
-        </w:rPr>
-      </w:pPr>
-      <w:r>
-        <w:rPr>
-          <w:rFonts w:ascii="Times New Roman" w:eastAsia="Times New Roman" w:hAnsi="Times New Roman" w:cs="Times New Roman"/>
-          <w:b/>
-          <w:bCs/>
-          <w:color w:val="000000"/>
-          <w:sz w:val="32"/>
-          <w:szCs w:val="32"/>
-        </w:rPr>
-        <w:t>Microprocessors &amp; Microcontrollers</w:t>
+          <w:i/>
+          <w:iCs/>
+          <w:color w:val="000000"/>
+          <w:sz w:val="40"/>
+          <w:szCs w:val="40"/>
+          <w:u w:val="single"/>
+        </w:rPr>
+      </w:pPr>
+      <w:r>
+        <w:rPr>
+          <w:rFonts w:ascii="Times New Roman" w:eastAsia="Times New Roman" w:hAnsi="Times New Roman" w:cs="Times New Roman"/>
+          <w:b/>
+          <w:bCs/>
+          <w:i/>
+          <w:iCs/>
+          <w:color w:val="000000"/>
+          <w:sz w:val="40"/>
+          <w:szCs w:val="40"/>
+          <w:u w:val="single"/>
+        </w:rPr>
+        <w:t xml:space="preserve">Microprocessors &amp; </w:t>
+      </w:r>
+      <w:proofErr w:type="gramStart"/>
+      <w:r>
+        <w:rPr>
+          <w:rFonts w:ascii="Times New Roman" w:eastAsia="Times New Roman" w:hAnsi="Times New Roman" w:cs="Times New Roman"/>
+          <w:b/>
+          <w:bCs/>
+          <w:i/>
+          <w:iCs/>
+          <w:color w:val="000000"/>
+          <w:sz w:val="40"/>
+          <w:szCs w:val="40"/>
+          <w:u w:val="single"/>
+        </w:rPr>
+        <w:t>Microcontrollers</w:t>
+      </w:r>
+      <w:r>
+        <w:rPr>
+          <w:rFonts w:ascii="Times New Roman" w:eastAsia="Times New Roman" w:hAnsi="Times New Roman" w:cs="Times New Roman"/>
+          <w:b/>
+          <w:bCs/>
+          <w:i/>
+          <w:iCs/>
+          <w:color w:val="000000"/>
+          <w:sz w:val="40"/>
+          <w:szCs w:val="40"/>
+        </w:rPr>
+        <w:t xml:space="preserve"> :</w:t>
+      </w:r>
+      <w:proofErr w:type="gramEnd"/>
+      <w:r>
+        <w:rPr>
+          <w:rFonts w:ascii="Times New Roman" w:eastAsia="Times New Roman" w:hAnsi="Times New Roman" w:cs="Times New Roman"/>
+          <w:b/>
+          <w:bCs/>
+          <w:i/>
+          <w:iCs/>
+          <w:color w:val="000000"/>
+          <w:sz w:val="40"/>
+          <w:szCs w:val="40"/>
+        </w:rPr>
+        <w:t>-</w:t>
       </w:r>
     </w:p>
     <w:p>
@@ -4556,9 +5226,12 @@
           <w:rFonts w:ascii="Times New Roman" w:eastAsia="Times New Roman" w:hAnsi="Times New Roman" w:cs="Times New Roman"/>
           <w:b/>
           <w:bCs/>
-          <w:color w:val="000000"/>
-          <w:sz w:val="32"/>
-          <w:szCs w:val="32"/>
+          <w:i/>
+          <w:iCs/>
+          <w:color w:val="000000"/>
+          <w:sz w:val="40"/>
+          <w:szCs w:val="40"/>
+          <w:u w:val="single"/>
         </w:rPr>
       </w:pPr>
     </w:p>
@@ -4580,21 +5253,69 @@
           <w:rFonts w:ascii="Times New Roman" w:eastAsia="Times New Roman" w:hAnsi="Times New Roman" w:cs="Times New Roman"/>
           <w:b/>
           <w:bCs/>
-          <w:color w:val="000000"/>
-          <w:sz w:val="32"/>
-          <w:szCs w:val="32"/>
-        </w:rPr>
-      </w:pPr>
-      <w:r>
-        <w:rPr>
-          <w:rFonts w:ascii="Times New Roman" w:eastAsia="Times New Roman" w:hAnsi="Times New Roman" w:cs="Times New Roman"/>
-          <w:b/>
-          <w:bCs/>
-          <w:color w:val="000000"/>
-          <w:sz w:val="32"/>
-          <w:szCs w:val="32"/>
-        </w:rPr>
-        <w:t>Computer Networks</w:t>
+          <w:i/>
+          <w:iCs/>
+          <w:color w:val="000000"/>
+          <w:sz w:val="40"/>
+          <w:szCs w:val="40"/>
+          <w:u w:val="single"/>
+        </w:rPr>
+      </w:pPr>
+      <w:r>
+        <w:rPr>
+          <w:rFonts w:ascii="Times New Roman" w:eastAsia="Times New Roman" w:hAnsi="Times New Roman" w:cs="Times New Roman"/>
+          <w:b/>
+          <w:bCs/>
+          <w:i/>
+          <w:iCs/>
+          <w:color w:val="000000"/>
+          <w:sz w:val="40"/>
+          <w:szCs w:val="40"/>
+          <w:u w:val="single"/>
+        </w:rPr>
+        <w:t xml:space="preserve">Computer </w:t>
+      </w:r>
+      <w:proofErr w:type="gramStart"/>
+      <w:r>
+        <w:rPr>
+          <w:rFonts w:ascii="Times New Roman" w:eastAsia="Times New Roman" w:hAnsi="Times New Roman" w:cs="Times New Roman"/>
+          <w:b/>
+          <w:bCs/>
+          <w:i/>
+          <w:iCs/>
+          <w:color w:val="000000"/>
+          <w:sz w:val="40"/>
+          <w:szCs w:val="40"/>
+          <w:u w:val="single"/>
+        </w:rPr>
+        <w:t>Networks</w:t>
+      </w:r>
+      <w:r>
+        <w:rPr>
+          <w:rFonts w:ascii="Times New Roman" w:eastAsia="Times New Roman" w:hAnsi="Times New Roman" w:cs="Times New Roman"/>
+          <w:b/>
+          <w:bCs/>
+          <w:i/>
+          <w:iCs/>
+          <w:color w:val="000000"/>
+          <w:sz w:val="40"/>
+          <w:szCs w:val="40"/>
+        </w:rPr>
+        <w:t xml:space="preserve"> :</w:t>
+      </w:r>
+      <w:proofErr w:type="gramEnd"/>
+      <w:r>
+        <w:rPr>
+          <w:rFonts w:ascii="Times New Roman" w:eastAsia="Times New Roman" w:hAnsi="Times New Roman" w:cs="Times New Roman"/>
+          <w:b/>
+          <w:bCs/>
+          <w:i/>
+          <w:iCs/>
+          <w:color w:val="000000"/>
+          <w:sz w:val="40"/>
+          <w:szCs w:val="40"/>
+        </w:rPr>
+        <w:t>-</w:t>
       </w:r>
     </w:p>
     <w:p>
@@ -4686,7 +5407,7 @@
           <w:szCs w:val="28"/>
         </w:rPr>
       </w:pPr>
-      <w:hyperlink r:id="rId50">
+      <w:hyperlink r:id="rId53">
         <w:r>
           <w:rPr>
             <w:rFonts w:ascii="Times New Roman" w:eastAsia="Times New Roman" w:hAnsi="Times New Roman" w:cs="Times New Roman"/>
@@ -4805,7 +5526,7 @@
           <w:szCs w:val="28"/>
         </w:rPr>
       </w:pPr>
-      <w:hyperlink r:id="rId51">
+      <w:hyperlink r:id="rId54">
         <w:r>
           <w:rPr>
             <w:rFonts w:ascii="Times New Roman" w:eastAsia="Times New Roman" w:hAnsi="Times New Roman" w:cs="Times New Roman"/>
@@ -4917,7 +5638,7 @@
           <w:szCs w:val="28"/>
         </w:rPr>
       </w:pPr>
-      <w:hyperlink r:id="rId52">
+      <w:hyperlink r:id="rId55">
         <w:r>
           <w:rPr>
             <w:rFonts w:ascii="Times New Roman" w:eastAsia="Times New Roman" w:hAnsi="Times New Roman" w:cs="Times New Roman"/>
@@ -4965,7 +5686,7 @@
           <w:szCs w:val="28"/>
         </w:rPr>
       </w:pPr>
-      <w:hyperlink r:id="rId53">
+      <w:hyperlink r:id="rId56">
         <w:r>
           <w:rPr>
             <w:rFonts w:ascii="Times New Roman" w:eastAsia="Times New Roman" w:hAnsi="Times New Roman" w:cs="Times New Roman"/>
@@ -5141,7 +5862,7 @@
           <w:szCs w:val="28"/>
         </w:rPr>
       </w:pPr>
-      <w:hyperlink r:id="rId54">
+      <w:hyperlink r:id="rId57">
         <w:r>
           <w:rPr>
             <w:rFonts w:ascii="Times New Roman" w:eastAsia="Times New Roman" w:hAnsi="Times New Roman" w:cs="Times New Roman"/>
@@ -5203,7 +5924,7 @@
           <w:szCs w:val="28"/>
         </w:rPr>
       </w:pPr>
-      <w:hyperlink r:id="rId55">
+      <w:hyperlink r:id="rId58">
         <w:r>
           <w:rPr>
             <w:rFonts w:ascii="Times New Roman" w:eastAsia="Times New Roman" w:hAnsi="Times New Roman" w:cs="Times New Roman"/>
@@ -5284,7 +6005,7 @@
           <w:szCs w:val="28"/>
         </w:rPr>
       </w:pPr>
-      <w:hyperlink r:id="rId56">
+      <w:hyperlink r:id="rId59">
         <w:r>
           <w:rPr>
             <w:rFonts w:ascii="Times New Roman" w:eastAsia="Times New Roman" w:hAnsi="Times New Roman" w:cs="Times New Roman"/>
@@ -5418,7 +6139,7 @@
         <w:spacing w:after="0"/>
         <w:ind w:left="1080"/>
       </w:pPr>
-      <w:hyperlink r:id="rId57" w:history="1">
+      <w:hyperlink r:id="rId60" w:history="1">
         <w:r>
           <w:rPr>
             <w:rStyle w:val="Hyperlink"/>
@@ -5518,7 +6239,7 @@
           <w:szCs w:val="28"/>
         </w:rPr>
       </w:pPr>
-      <w:hyperlink r:id="rId58" w:history="1">
+      <w:hyperlink r:id="rId61" w:history="1">
         <w:r>
           <w:rPr>
             <w:rStyle w:val="Hyperlink"/>
@@ -5628,7 +6349,7 @@
           <w:szCs w:val="28"/>
         </w:rPr>
       </w:pPr>
-      <w:hyperlink r:id="rId59" w:history="1">
+      <w:hyperlink r:id="rId62" w:history="1">
         <w:r>
           <w:rPr>
             <w:rStyle w:val="Hyperlink"/>
@@ -5778,7 +6499,7 @@
           <w:szCs w:val="28"/>
         </w:rPr>
       </w:pPr>
-      <w:hyperlink r:id="rId60">
+      <w:hyperlink r:id="rId63">
         <w:r>
           <w:rPr>
             <w:rFonts w:ascii="Times New Roman" w:eastAsia="Times New Roman" w:hAnsi="Times New Roman" w:cs="Times New Roman"/>
@@ -5879,7 +6600,7 @@
           <w:szCs w:val="28"/>
         </w:rPr>
       </w:pPr>
-      <w:hyperlink r:id="rId61">
+      <w:hyperlink r:id="rId64">
         <w:r>
           <w:rPr>
             <w:rFonts w:ascii="Times New Roman" w:eastAsia="Times New Roman" w:hAnsi="Times New Roman" w:cs="Times New Roman"/>
@@ -5999,7 +6720,7 @@
           <w:szCs w:val="28"/>
         </w:rPr>
       </w:pPr>
-      <w:hyperlink r:id="rId62">
+      <w:hyperlink r:id="rId65">
         <w:r>
           <w:rPr>
             <w:rFonts w:ascii="Times New Roman" w:eastAsia="Times New Roman" w:hAnsi="Times New Roman" w:cs="Times New Roman"/>
@@ -6049,7 +6770,7 @@
           <w:szCs w:val="28"/>
         </w:rPr>
       </w:pPr>
-      <w:hyperlink r:id="rId63">
+      <w:hyperlink r:id="rId66">
         <w:r>
           <w:rPr>
             <w:rFonts w:ascii="Times New Roman" w:eastAsia="Times New Roman" w:hAnsi="Times New Roman" w:cs="Times New Roman"/>
@@ -6150,7 +6871,7 @@
           <w:szCs w:val="28"/>
         </w:rPr>
       </w:pPr>
-      <w:hyperlink r:id="rId64">
+      <w:hyperlink r:id="rId67">
         <w:r>
           <w:rPr>
             <w:rFonts w:ascii="Times New Roman" w:eastAsia="Times New Roman" w:hAnsi="Times New Roman" w:cs="Times New Roman"/>
@@ -6175,7 +6896,7 @@
         <w:spacing w:after="0"/>
         <w:ind w:left="1080"/>
       </w:pPr>
-      <w:hyperlink r:id="rId65">
+      <w:hyperlink r:id="rId68">
         <w:r>
           <w:rPr>
             <w:rFonts w:ascii="Times New Roman" w:eastAsia="Times New Roman" w:hAnsi="Times New Roman" w:cs="Times New Roman"/>
@@ -6225,7 +6946,7 @@
           <w:szCs w:val="28"/>
         </w:rPr>
       </w:pPr>
-      <w:hyperlink r:id="rId66">
+      <w:hyperlink r:id="rId69">
         <w:r>
           <w:rPr>
             <w:rFonts w:ascii="Times New Roman" w:eastAsia="Times New Roman" w:hAnsi="Times New Roman" w:cs="Times New Roman"/>
@@ -6313,21 +7034,69 @@
           <w:rFonts w:ascii="Times New Roman" w:eastAsia="Times New Roman" w:hAnsi="Times New Roman" w:cs="Times New Roman"/>
           <w:b/>
           <w:bCs/>
-          <w:color w:val="000000"/>
-          <w:sz w:val="32"/>
-          <w:szCs w:val="32"/>
-        </w:rPr>
-      </w:pPr>
-      <w:r>
-        <w:rPr>
-          <w:rFonts w:ascii="Times New Roman" w:eastAsia="Times New Roman" w:hAnsi="Times New Roman" w:cs="Times New Roman"/>
-          <w:b/>
-          <w:bCs/>
-          <w:color w:val="000000"/>
-          <w:sz w:val="32"/>
-          <w:szCs w:val="32"/>
-        </w:rPr>
-        <w:t>Essentials of Network Security</w:t>
+          <w:i/>
+          <w:iCs/>
+          <w:color w:val="000000"/>
+          <w:sz w:val="40"/>
+          <w:szCs w:val="40"/>
+          <w:u w:val="single"/>
+        </w:rPr>
+      </w:pPr>
+      <w:r>
+        <w:rPr>
+          <w:rFonts w:ascii="Times New Roman" w:eastAsia="Times New Roman" w:hAnsi="Times New Roman" w:cs="Times New Roman"/>
+          <w:b/>
+          <w:bCs/>
+          <w:i/>
+          <w:iCs/>
+          <w:color w:val="000000"/>
+          <w:sz w:val="40"/>
+          <w:szCs w:val="40"/>
+          <w:u w:val="single"/>
+        </w:rPr>
+        <w:t xml:space="preserve">Essentials of Network </w:t>
+      </w:r>
+      <w:proofErr w:type="gramStart"/>
+      <w:r>
+        <w:rPr>
+          <w:rFonts w:ascii="Times New Roman" w:eastAsia="Times New Roman" w:hAnsi="Times New Roman" w:cs="Times New Roman"/>
+          <w:b/>
+          <w:bCs/>
+          <w:i/>
+          <w:iCs/>
+          <w:color w:val="000000"/>
+          <w:sz w:val="40"/>
+          <w:szCs w:val="40"/>
+          <w:u w:val="single"/>
+        </w:rPr>
+        <w:t>Security</w:t>
+      </w:r>
+      <w:r>
+        <w:rPr>
+          <w:rFonts w:ascii="Times New Roman" w:eastAsia="Times New Roman" w:hAnsi="Times New Roman" w:cs="Times New Roman"/>
+          <w:b/>
+          <w:bCs/>
+          <w:i/>
+          <w:iCs/>
+          <w:color w:val="000000"/>
+          <w:sz w:val="40"/>
+          <w:szCs w:val="40"/>
+        </w:rPr>
+        <w:t xml:space="preserve"> :</w:t>
+      </w:r>
+      <w:proofErr w:type="gramEnd"/>
+      <w:r>
+        <w:rPr>
+          <w:rFonts w:ascii="Times New Roman" w:eastAsia="Times New Roman" w:hAnsi="Times New Roman" w:cs="Times New Roman"/>
+          <w:b/>
+          <w:bCs/>
+          <w:i/>
+          <w:iCs/>
+          <w:color w:val="000000"/>
+          <w:sz w:val="40"/>
+          <w:szCs w:val="40"/>
+        </w:rPr>
+        <w:t>-</w:t>
       </w:r>
     </w:p>
     <w:p>
@@ -6410,7 +7179,7 @@
           <w:szCs w:val="28"/>
         </w:rPr>
       </w:pPr>
-      <w:hyperlink r:id="rId67" w:history="1">
+      <w:hyperlink r:id="rId70" w:history="1">
         <w:r>
           <w:rPr>
             <w:rStyle w:val="Hyperlink"/>
@@ -6544,7 +7313,7 @@
           <w:szCs w:val="28"/>
         </w:rPr>
       </w:pPr>
-      <w:hyperlink r:id="rId68" w:history="1">
+      <w:hyperlink r:id="rId71" w:history="1">
         <w:r>
           <w:rPr>
             <w:rStyle w:val="Hyperlink"/>
@@ -6657,21 +7426,69 @@
           <w:rFonts w:ascii="Times New Roman" w:eastAsia="Times New Roman" w:hAnsi="Times New Roman" w:cs="Times New Roman"/>
           <w:b/>
           <w:bCs/>
-          <w:color w:val="000000"/>
-          <w:sz w:val="32"/>
-          <w:szCs w:val="32"/>
-        </w:rPr>
-      </w:pPr>
-      <w:r>
-        <w:rPr>
-          <w:rFonts w:ascii="Times New Roman" w:eastAsia="Times New Roman" w:hAnsi="Times New Roman" w:cs="Times New Roman"/>
-          <w:b/>
-          <w:bCs/>
-          <w:color w:val="000000"/>
-          <w:sz w:val="32"/>
-          <w:szCs w:val="32"/>
-        </w:rPr>
-        <w:t>Web Technology</w:t>
+          <w:i/>
+          <w:iCs/>
+          <w:color w:val="000000"/>
+          <w:sz w:val="40"/>
+          <w:szCs w:val="40"/>
+          <w:u w:val="single"/>
+        </w:rPr>
+      </w:pPr>
+      <w:r>
+        <w:rPr>
+          <w:rFonts w:ascii="Times New Roman" w:eastAsia="Times New Roman" w:hAnsi="Times New Roman" w:cs="Times New Roman"/>
+          <w:b/>
+          <w:bCs/>
+          <w:i/>
+          <w:iCs/>
+          <w:color w:val="000000"/>
+          <w:sz w:val="40"/>
+          <w:szCs w:val="40"/>
+          <w:u w:val="single"/>
+        </w:rPr>
+        <w:t xml:space="preserve">Web </w:t>
+      </w:r>
+      <w:proofErr w:type="gramStart"/>
+      <w:r>
+        <w:rPr>
+          <w:rFonts w:ascii="Times New Roman" w:eastAsia="Times New Roman" w:hAnsi="Times New Roman" w:cs="Times New Roman"/>
+          <w:b/>
+          <w:bCs/>
+          <w:i/>
+          <w:iCs/>
+          <w:color w:val="000000"/>
+          <w:sz w:val="40"/>
+          <w:szCs w:val="40"/>
+          <w:u w:val="single"/>
+        </w:rPr>
+        <w:t>Technology</w:t>
+      </w:r>
+      <w:r>
+        <w:rPr>
+          <w:rFonts w:ascii="Times New Roman" w:eastAsia="Times New Roman" w:hAnsi="Times New Roman" w:cs="Times New Roman"/>
+          <w:b/>
+          <w:bCs/>
+          <w:i/>
+          <w:iCs/>
+          <w:color w:val="000000"/>
+          <w:sz w:val="40"/>
+          <w:szCs w:val="40"/>
+        </w:rPr>
+        <w:t xml:space="preserve"> :</w:t>
+      </w:r>
+      <w:proofErr w:type="gramEnd"/>
+      <w:r>
+        <w:rPr>
+          <w:rFonts w:ascii="Times New Roman" w:eastAsia="Times New Roman" w:hAnsi="Times New Roman" w:cs="Times New Roman"/>
+          <w:b/>
+          <w:bCs/>
+          <w:i/>
+          <w:iCs/>
+          <w:color w:val="000000"/>
+          <w:sz w:val="40"/>
+          <w:szCs w:val="40"/>
+        </w:rPr>
+        <w:t>-</w:t>
       </w:r>
     </w:p>
     <w:p>
@@ -6689,9 +7506,12 @@
           <w:rFonts w:ascii="Times New Roman" w:eastAsia="Times New Roman" w:hAnsi="Times New Roman" w:cs="Times New Roman"/>
           <w:b/>
           <w:bCs/>
-          <w:color w:val="000000"/>
-          <w:sz w:val="32"/>
-          <w:szCs w:val="32"/>
+          <w:i/>
+          <w:iCs/>
+          <w:color w:val="000000"/>
+          <w:sz w:val="40"/>
+          <w:szCs w:val="40"/>
+          <w:u w:val="single"/>
         </w:rPr>
       </w:pPr>
     </w:p>
@@ -6713,21 +7533,69 @@
           <w:rFonts w:ascii="Times New Roman" w:eastAsia="Times New Roman" w:hAnsi="Times New Roman" w:cs="Times New Roman"/>
           <w:b/>
           <w:bCs/>
-          <w:color w:val="000000"/>
-          <w:sz w:val="32"/>
-          <w:szCs w:val="32"/>
-        </w:rPr>
-      </w:pPr>
-      <w:r>
-        <w:rPr>
-          <w:rFonts w:ascii="Times New Roman" w:eastAsia="Times New Roman" w:hAnsi="Times New Roman" w:cs="Times New Roman"/>
-          <w:b/>
-          <w:bCs/>
-          <w:color w:val="000000"/>
-          <w:sz w:val="32"/>
-          <w:szCs w:val="32"/>
-        </w:rPr>
-        <w:t>Android Application Development</w:t>
+          <w:i/>
+          <w:iCs/>
+          <w:color w:val="000000"/>
+          <w:sz w:val="40"/>
+          <w:szCs w:val="40"/>
+          <w:u w:val="single"/>
+        </w:rPr>
+      </w:pPr>
+      <w:r>
+        <w:rPr>
+          <w:rFonts w:ascii="Times New Roman" w:eastAsia="Times New Roman" w:hAnsi="Times New Roman" w:cs="Times New Roman"/>
+          <w:b/>
+          <w:bCs/>
+          <w:i/>
+          <w:iCs/>
+          <w:color w:val="000000"/>
+          <w:sz w:val="40"/>
+          <w:szCs w:val="40"/>
+          <w:u w:val="single"/>
+        </w:rPr>
+        <w:t xml:space="preserve">Android Application </w:t>
+      </w:r>
+      <w:proofErr w:type="gramStart"/>
+      <w:r>
+        <w:rPr>
+          <w:rFonts w:ascii="Times New Roman" w:eastAsia="Times New Roman" w:hAnsi="Times New Roman" w:cs="Times New Roman"/>
+          <w:b/>
+          <w:bCs/>
+          <w:i/>
+          <w:iCs/>
+          <w:color w:val="000000"/>
+          <w:sz w:val="40"/>
+          <w:szCs w:val="40"/>
+          <w:u w:val="single"/>
+        </w:rPr>
+        <w:t>Development</w:t>
+      </w:r>
+      <w:r>
+        <w:rPr>
+          <w:rFonts w:ascii="Times New Roman" w:eastAsia="Times New Roman" w:hAnsi="Times New Roman" w:cs="Times New Roman"/>
+          <w:b/>
+          <w:bCs/>
+          <w:i/>
+          <w:iCs/>
+          <w:color w:val="000000"/>
+          <w:sz w:val="40"/>
+          <w:szCs w:val="40"/>
+        </w:rPr>
+        <w:t xml:space="preserve"> :</w:t>
+      </w:r>
+      <w:proofErr w:type="gramEnd"/>
+      <w:r>
+        <w:rPr>
+          <w:rFonts w:ascii="Times New Roman" w:eastAsia="Times New Roman" w:hAnsi="Times New Roman" w:cs="Times New Roman"/>
+          <w:b/>
+          <w:bCs/>
+          <w:i/>
+          <w:iCs/>
+          <w:color w:val="000000"/>
+          <w:sz w:val="40"/>
+          <w:szCs w:val="40"/>
+        </w:rPr>
+        <w:t>-</w:t>
       </w:r>
     </w:p>
     <w:p>
@@ -6745,9 +7613,12 @@
           <w:rFonts w:ascii="Times New Roman" w:eastAsia="Times New Roman" w:hAnsi="Times New Roman" w:cs="Times New Roman"/>
           <w:b/>
           <w:bCs/>
-          <w:color w:val="000000"/>
-          <w:sz w:val="32"/>
-          <w:szCs w:val="32"/>
+          <w:i/>
+          <w:iCs/>
+          <w:color w:val="000000"/>
+          <w:sz w:val="40"/>
+          <w:szCs w:val="40"/>
+          <w:u w:val="single"/>
         </w:rPr>
       </w:pPr>
     </w:p>
@@ -6768,21 +7639,69 @@
           <w:rFonts w:ascii="Times New Roman" w:eastAsia="Times New Roman" w:hAnsi="Times New Roman" w:cs="Times New Roman"/>
           <w:b/>
           <w:bCs/>
-          <w:color w:val="000000"/>
-          <w:sz w:val="32"/>
-          <w:szCs w:val="32"/>
-        </w:rPr>
-      </w:pPr>
-      <w:r>
-        <w:rPr>
-          <w:rFonts w:ascii="Times New Roman" w:eastAsia="Times New Roman" w:hAnsi="Times New Roman" w:cs="Times New Roman"/>
-          <w:b/>
-          <w:bCs/>
-          <w:color w:val="000000"/>
-          <w:sz w:val="32"/>
-          <w:szCs w:val="32"/>
-        </w:rPr>
-        <w:t xml:space="preserve">Current Trends </w:t>
+          <w:i/>
+          <w:iCs/>
+          <w:color w:val="000000"/>
+          <w:sz w:val="40"/>
+          <w:szCs w:val="40"/>
+          <w:u w:val="single"/>
+        </w:rPr>
+      </w:pPr>
+      <w:r>
+        <w:rPr>
+          <w:rFonts w:ascii="Times New Roman" w:eastAsia="Times New Roman" w:hAnsi="Times New Roman" w:cs="Times New Roman"/>
+          <w:b/>
+          <w:bCs/>
+          <w:i/>
+          <w:iCs/>
+          <w:color w:val="000000"/>
+          <w:sz w:val="40"/>
+          <w:szCs w:val="40"/>
+          <w:u w:val="single"/>
+        </w:rPr>
+        <w:t xml:space="preserve">Current </w:t>
+      </w:r>
+      <w:proofErr w:type="gramStart"/>
+      <w:r>
+        <w:rPr>
+          <w:rFonts w:ascii="Times New Roman" w:eastAsia="Times New Roman" w:hAnsi="Times New Roman" w:cs="Times New Roman"/>
+          <w:b/>
+          <w:bCs/>
+          <w:i/>
+          <w:iCs/>
+          <w:color w:val="000000"/>
+          <w:sz w:val="40"/>
+          <w:szCs w:val="40"/>
+          <w:u w:val="single"/>
+        </w:rPr>
+        <w:t>Trends</w:t>
+      </w:r>
+      <w:r>
+        <w:rPr>
+          <w:rFonts w:ascii="Times New Roman" w:eastAsia="Times New Roman" w:hAnsi="Times New Roman" w:cs="Times New Roman"/>
+          <w:b/>
+          <w:bCs/>
+          <w:i/>
+          <w:iCs/>
+          <w:color w:val="000000"/>
+          <w:sz w:val="40"/>
+          <w:szCs w:val="40"/>
+        </w:rPr>
+        <w:t xml:space="preserve"> :</w:t>
+      </w:r>
+      <w:proofErr w:type="gramEnd"/>
+      <w:r>
+        <w:rPr>
+          <w:rFonts w:ascii="Times New Roman" w:eastAsia="Times New Roman" w:hAnsi="Times New Roman" w:cs="Times New Roman"/>
+          <w:b/>
+          <w:bCs/>
+          <w:i/>
+          <w:iCs/>
+          <w:color w:val="000000"/>
+          <w:sz w:val="40"/>
+          <w:szCs w:val="40"/>
+        </w:rPr>
+        <w:t>-</w:t>
       </w:r>
     </w:p>
     <w:p>

</xml_diff>

<commit_message>
Added the links of Encoders & Decoders
</commit_message>
<xml_diff>
--- a/PSI syllabus Links.docx
+++ b/PSI syllabus Links.docx
@@ -16,6 +16,7 @@
           <w:between w:val="nil"/>
         </w:pBdr>
         <w:spacing w:after="0"/>
+        <w:jc w:val="center"/>
         <w:rPr>
           <w:rFonts w:ascii="Times New Roman" w:eastAsia="Times New Roman" w:hAnsi="Times New Roman" w:cs="Times New Roman"/>
           <w:b/>
@@ -23,8 +24,8 @@
           <w:i/>
           <w:iCs/>
           <w:color w:val="000000"/>
-          <w:sz w:val="40"/>
-          <w:szCs w:val="40"/>
+          <w:sz w:val="44"/>
+          <w:szCs w:val="44"/>
           <w:u w:val="single"/>
         </w:rPr>
       </w:pPr>
@@ -36,53 +37,11 @@
           <w:i/>
           <w:iCs/>
           <w:color w:val="000000"/>
-          <w:sz w:val="40"/>
-          <w:szCs w:val="40"/>
+          <w:sz w:val="44"/>
+          <w:szCs w:val="44"/>
           <w:u w:val="single"/>
         </w:rPr>
-        <w:t xml:space="preserve">Electronics Components, Devices and </w:t>
-      </w:r>
-      <w:proofErr w:type="gramStart"/>
-      <w:r>
-        <w:rPr>
-          <w:rFonts w:ascii="Times New Roman" w:eastAsia="Times New Roman" w:hAnsi="Times New Roman" w:cs="Times New Roman"/>
-          <w:b/>
-          <w:bCs/>
-          <w:i/>
-          <w:iCs/>
-          <w:color w:val="000000"/>
-          <w:sz w:val="40"/>
-          <w:szCs w:val="40"/>
-          <w:u w:val="single"/>
-        </w:rPr>
-        <w:t>Circuits</w:t>
-      </w:r>
-      <w:r>
-        <w:rPr>
-          <w:rFonts w:ascii="Times New Roman" w:eastAsia="Times New Roman" w:hAnsi="Times New Roman" w:cs="Times New Roman"/>
-          <w:b/>
-          <w:bCs/>
-          <w:i/>
-          <w:iCs/>
-          <w:color w:val="000000"/>
-          <w:sz w:val="40"/>
-          <w:szCs w:val="40"/>
-        </w:rPr>
-        <w:t xml:space="preserve"> :</w:t>
-      </w:r>
-      <w:proofErr w:type="gramEnd"/>
-      <w:r>
-        <w:rPr>
-          <w:rFonts w:ascii="Times New Roman" w:eastAsia="Times New Roman" w:hAnsi="Times New Roman" w:cs="Times New Roman"/>
-          <w:b/>
-          <w:bCs/>
-          <w:i/>
-          <w:iCs/>
-          <w:color w:val="000000"/>
-          <w:sz w:val="40"/>
-          <w:szCs w:val="40"/>
-        </w:rPr>
-        <w:t>-</w:t>
+        <w:t>Electronics Components, Devices and Circuits</w:t>
       </w:r>
     </w:p>
     <w:p>
@@ -333,6 +292,8 @@
       <w:r>
         <w:rPr>
           <w:rFonts w:ascii="Times New Roman" w:eastAsia="Times New Roman" w:hAnsi="Times New Roman" w:cs="Times New Roman"/>
+          <w:b/>
+          <w:bCs/>
           <w:color w:val="000000"/>
           <w:sz w:val="32"/>
           <w:szCs w:val="32"/>
@@ -447,12 +408,36 @@
       <w:r>
         <w:rPr>
           <w:rFonts w:ascii="Times New Roman" w:eastAsia="Times New Roman" w:hAnsi="Times New Roman" w:cs="Times New Roman"/>
-          <w:color w:val="000000"/>
-          <w:sz w:val="32"/>
-          <w:szCs w:val="32"/>
-        </w:rPr>
-        <w:t>Half Wave &amp; Full Wave Rectifiers</w:t>
-      </w:r>
+          <w:b/>
+          <w:bCs/>
+          <w:color w:val="000000"/>
+          <w:sz w:val="32"/>
+          <w:szCs w:val="32"/>
+        </w:rPr>
+        <w:t xml:space="preserve">Half Wave &amp; Full Wave </w:t>
+      </w:r>
+      <w:proofErr w:type="gramStart"/>
+      <w:r>
+        <w:rPr>
+          <w:rFonts w:ascii="Times New Roman" w:eastAsia="Times New Roman" w:hAnsi="Times New Roman" w:cs="Times New Roman"/>
+          <w:b/>
+          <w:bCs/>
+          <w:color w:val="000000"/>
+          <w:sz w:val="32"/>
+          <w:szCs w:val="32"/>
+        </w:rPr>
+        <w:t>Rectifiers</w:t>
+      </w:r>
+      <w:r>
+        <w:rPr>
+          <w:rFonts w:ascii="Times New Roman" w:eastAsia="Times New Roman" w:hAnsi="Times New Roman" w:cs="Times New Roman"/>
+          <w:color w:val="000000"/>
+          <w:sz w:val="32"/>
+          <w:szCs w:val="32"/>
+        </w:rPr>
+        <w:t xml:space="preserve"> :</w:t>
+      </w:r>
+      <w:proofErr w:type="gramEnd"/>
       <w:r>
         <w:rPr>
           <w:rFonts w:ascii="Times New Roman" w:eastAsia="Times New Roman" w:hAnsi="Times New Roman" w:cs="Times New Roman"/>
@@ -640,14 +625,18 @@
         <w:ind w:left="900" w:hanging="450"/>
         <w:rPr>
           <w:rFonts w:ascii="Times New Roman" w:eastAsia="Times New Roman" w:hAnsi="Times New Roman" w:cs="Times New Roman"/>
-          <w:color w:val="000000"/>
-          <w:sz w:val="32"/>
-          <w:szCs w:val="32"/>
-        </w:rPr>
-      </w:pPr>
-      <w:r>
-        <w:rPr>
-          <w:rFonts w:ascii="Times New Roman" w:eastAsia="Times New Roman" w:hAnsi="Times New Roman" w:cs="Times New Roman"/>
+          <w:b/>
+          <w:bCs/>
+          <w:color w:val="000000"/>
+          <w:sz w:val="32"/>
+          <w:szCs w:val="32"/>
+        </w:rPr>
+      </w:pPr>
+      <w:r>
+        <w:rPr>
+          <w:rFonts w:ascii="Times New Roman" w:eastAsia="Times New Roman" w:hAnsi="Times New Roman" w:cs="Times New Roman"/>
+          <w:b/>
+          <w:bCs/>
           <w:color w:val="000000"/>
           <w:sz w:val="32"/>
           <w:szCs w:val="32"/>
@@ -724,6 +713,8 @@
         <w:ind w:left="900" w:hanging="450"/>
         <w:rPr>
           <w:rFonts w:ascii="Times New Roman" w:eastAsia="Times New Roman" w:hAnsi="Times New Roman" w:cs="Times New Roman"/>
+          <w:b/>
+          <w:bCs/>
           <w:color w:val="000000"/>
           <w:sz w:val="32"/>
           <w:szCs w:val="32"/>
@@ -733,6 +724,8 @@
       <w:r>
         <w:rPr>
           <w:rFonts w:ascii="Times New Roman" w:eastAsia="Times New Roman" w:hAnsi="Times New Roman" w:cs="Times New Roman"/>
+          <w:b/>
+          <w:bCs/>
           <w:color w:val="000000"/>
           <w:sz w:val="32"/>
           <w:szCs w:val="32"/>
@@ -1463,6 +1456,17 @@
           <w:szCs w:val="32"/>
         </w:rPr>
       </w:pPr>
+      <w:hyperlink r:id="rId21" w:history="1">
+        <w:r>
+          <w:rPr>
+            <w:rStyle w:val="Hyperlink"/>
+            <w:rFonts w:ascii="Times New Roman" w:eastAsia="Times New Roman" w:hAnsi="Times New Roman" w:cs="Times New Roman"/>
+            <w:sz w:val="32"/>
+            <w:szCs w:val="32"/>
+          </w:rPr>
+          <w:t>https://youtu.be/UZlvuOGmQFY?si=ukP0flPdn25RZfkp</w:t>
+        </w:r>
+      </w:hyperlink>
     </w:p>
     <w:p>
       <w:pPr>
@@ -1527,7 +1531,7 @@
           <w:szCs w:val="32"/>
         </w:rPr>
       </w:pPr>
-      <w:hyperlink r:id="rId21" w:history="1">
+      <w:hyperlink r:id="rId22" w:history="1">
         <w:r>
           <w:rPr>
             <w:rStyle w:val="Hyperlink"/>
@@ -1610,7 +1614,7 @@
           <w:szCs w:val="32"/>
         </w:rPr>
       </w:pPr>
-      <w:hyperlink r:id="rId22" w:history="1">
+      <w:hyperlink r:id="rId23" w:history="1">
         <w:r>
           <w:rPr>
             <w:rStyle w:val="Hyperlink"/>
@@ -1693,7 +1697,7 @@
           <w:szCs w:val="32"/>
         </w:rPr>
       </w:pPr>
-      <w:hyperlink r:id="rId23" w:history="1">
+      <w:hyperlink r:id="rId24" w:history="1">
         <w:r>
           <w:rPr>
             <w:rStyle w:val="Hyperlink"/>
@@ -1760,14 +1764,8 @@
         </w:pBdr>
         <w:spacing w:after="0"/>
         <w:ind w:left="1260"/>
-        <w:rPr>
-          <w:rFonts w:ascii="Times New Roman" w:eastAsia="Times New Roman" w:hAnsi="Times New Roman" w:cs="Times New Roman"/>
-          <w:color w:val="000000"/>
-          <w:sz w:val="32"/>
-          <w:szCs w:val="32"/>
-        </w:rPr>
-      </w:pPr>
-      <w:hyperlink r:id="rId24" w:history="1">
+      </w:pPr>
+      <w:hyperlink r:id="rId25" w:history="1">
         <w:r>
           <w:rPr>
             <w:rStyle w:val="Hyperlink"/>
@@ -1782,47 +1780,15 @@
     <w:p>
       <w:pPr>
         <w:pStyle w:val="ListParagraph"/>
-        <w:numPr>
-          <w:ilvl w:val="0"/>
-          <w:numId w:val="14"/>
-        </w:numPr>
-        <w:pBdr>
-          <w:top w:val="nil"/>
-          <w:left w:val="nil"/>
-          <w:bottom w:val="nil"/>
-          <w:right w:val="nil"/>
-          <w:between w:val="nil"/>
-        </w:pBdr>
-        <w:spacing w:after="0"/>
-        <w:rPr>
-          <w:rFonts w:ascii="Times New Roman" w:eastAsia="Times New Roman" w:hAnsi="Times New Roman" w:cs="Times New Roman"/>
-          <w:color w:val="000000"/>
-          <w:sz w:val="32"/>
-          <w:szCs w:val="32"/>
-        </w:rPr>
-      </w:pPr>
-      <w:r>
-        <w:rPr>
-          <w:rFonts w:ascii="Times New Roman" w:eastAsia="Times New Roman" w:hAnsi="Times New Roman" w:cs="Times New Roman"/>
-          <w:color w:val="000000"/>
-          <w:sz w:val="32"/>
-          <w:szCs w:val="32"/>
-        </w:rPr>
-        <w:t xml:space="preserve"> </w:t>
-      </w:r>
-    </w:p>
-    <w:p>
-      <w:pPr>
-        <w:pStyle w:val="ListParagraph"/>
-        <w:pBdr>
-          <w:top w:val="nil"/>
-          <w:left w:val="nil"/>
-          <w:bottom w:val="nil"/>
-          <w:right w:val="nil"/>
-          <w:between w:val="nil"/>
-        </w:pBdr>
-        <w:spacing w:after="0"/>
-        <w:ind w:left="900"/>
+        <w:pBdr>
+          <w:top w:val="nil"/>
+          <w:left w:val="nil"/>
+          <w:bottom w:val="nil"/>
+          <w:right w:val="nil"/>
+          <w:between w:val="nil"/>
+        </w:pBdr>
+        <w:spacing w:after="0"/>
+        <w:ind w:left="1260"/>
         <w:rPr>
           <w:rFonts w:ascii="Times New Roman" w:eastAsia="Times New Roman" w:hAnsi="Times New Roman" w:cs="Times New Roman"/>
           <w:color w:val="000000"/>
@@ -2059,14 +2025,18 @@
         <w:ind w:left="900" w:hanging="450"/>
         <w:rPr>
           <w:rFonts w:ascii="Times New Roman" w:eastAsia="Times New Roman" w:hAnsi="Times New Roman" w:cs="Times New Roman"/>
-          <w:color w:val="000000"/>
-          <w:sz w:val="32"/>
-          <w:szCs w:val="32"/>
-        </w:rPr>
-      </w:pPr>
-      <w:r>
-        <w:rPr>
-          <w:rFonts w:ascii="Times New Roman" w:eastAsia="Times New Roman" w:hAnsi="Times New Roman" w:cs="Times New Roman"/>
+          <w:b/>
+          <w:bCs/>
+          <w:color w:val="000000"/>
+          <w:sz w:val="32"/>
+          <w:szCs w:val="32"/>
+        </w:rPr>
+      </w:pPr>
+      <w:r>
+        <w:rPr>
+          <w:rFonts w:ascii="Times New Roman" w:eastAsia="Times New Roman" w:hAnsi="Times New Roman" w:cs="Times New Roman"/>
+          <w:b/>
+          <w:bCs/>
           <w:color w:val="000000"/>
           <w:sz w:val="32"/>
           <w:szCs w:val="32"/>
@@ -2093,7 +2063,7 @@
           <w:szCs w:val="32"/>
         </w:rPr>
       </w:pPr>
-      <w:hyperlink r:id="rId25" w:history="1">
+      <w:hyperlink r:id="rId26" w:history="1">
         <w:r>
           <w:rPr>
             <w:rStyle w:val="Hyperlink"/>
@@ -2328,7 +2298,7 @@
           <w:szCs w:val="32"/>
         </w:rPr>
       </w:pPr>
-      <w:hyperlink r:id="rId26" w:history="1">
+      <w:hyperlink r:id="rId27" w:history="1">
         <w:r>
           <w:rPr>
             <w:rStyle w:val="Hyperlink"/>
@@ -2561,6 +2531,28 @@
     <w:p>
       <w:pPr>
         <w:pStyle w:val="ListParagraph"/>
+        <w:pBdr>
+          <w:top w:val="nil"/>
+          <w:left w:val="nil"/>
+          <w:bottom w:val="nil"/>
+          <w:right w:val="nil"/>
+          <w:between w:val="nil"/>
+        </w:pBdr>
+        <w:spacing w:after="0"/>
+        <w:ind w:left="1440"/>
+        <w:rPr>
+          <w:rFonts w:ascii="Times New Roman" w:eastAsia="Times New Roman" w:hAnsi="Times New Roman" w:cs="Times New Roman"/>
+          <w:b/>
+          <w:bCs/>
+          <w:color w:val="000000"/>
+          <w:sz w:val="32"/>
+          <w:szCs w:val="32"/>
+        </w:rPr>
+      </w:pPr>
+    </w:p>
+    <w:p>
+      <w:pPr>
+        <w:pStyle w:val="ListParagraph"/>
         <w:numPr>
           <w:ilvl w:val="0"/>
           <w:numId w:val="2"/>
@@ -2573,6 +2565,7 @@
           <w:between w:val="nil"/>
         </w:pBdr>
         <w:spacing w:after="0"/>
+        <w:jc w:val="center"/>
         <w:rPr>
           <w:rFonts w:ascii="Times New Roman" w:eastAsia="Times New Roman" w:hAnsi="Times New Roman" w:cs="Times New Roman"/>
           <w:b/>
@@ -2580,8 +2573,8 @@
           <w:i/>
           <w:iCs/>
           <w:color w:val="000000"/>
-          <w:sz w:val="40"/>
-          <w:szCs w:val="40"/>
+          <w:sz w:val="44"/>
+          <w:szCs w:val="44"/>
           <w:u w:val="single"/>
         </w:rPr>
       </w:pPr>
@@ -2593,53 +2586,11 @@
           <w:i/>
           <w:iCs/>
           <w:color w:val="000000"/>
-          <w:sz w:val="40"/>
-          <w:szCs w:val="40"/>
+          <w:sz w:val="44"/>
+          <w:szCs w:val="44"/>
           <w:u w:val="single"/>
         </w:rPr>
-        <w:t xml:space="preserve">Digital Electronics &amp; </w:t>
-      </w:r>
-      <w:proofErr w:type="gramStart"/>
-      <w:r>
-        <w:rPr>
-          <w:rFonts w:ascii="Times New Roman" w:eastAsia="Times New Roman" w:hAnsi="Times New Roman" w:cs="Times New Roman"/>
-          <w:b/>
-          <w:bCs/>
-          <w:i/>
-          <w:iCs/>
-          <w:color w:val="000000"/>
-          <w:sz w:val="40"/>
-          <w:szCs w:val="40"/>
-          <w:u w:val="single"/>
-        </w:rPr>
-        <w:t>VLSI</w:t>
-      </w:r>
-      <w:r>
-        <w:rPr>
-          <w:rFonts w:ascii="Times New Roman" w:eastAsia="Times New Roman" w:hAnsi="Times New Roman" w:cs="Times New Roman"/>
-          <w:b/>
-          <w:bCs/>
-          <w:i/>
-          <w:iCs/>
-          <w:color w:val="000000"/>
-          <w:sz w:val="40"/>
-          <w:szCs w:val="40"/>
-        </w:rPr>
-        <w:t xml:space="preserve"> :</w:t>
-      </w:r>
-      <w:proofErr w:type="gramEnd"/>
-      <w:r>
-        <w:rPr>
-          <w:rFonts w:ascii="Times New Roman" w:eastAsia="Times New Roman" w:hAnsi="Times New Roman" w:cs="Times New Roman"/>
-          <w:b/>
-          <w:bCs/>
-          <w:i/>
-          <w:iCs/>
-          <w:color w:val="000000"/>
-          <w:sz w:val="40"/>
-          <w:szCs w:val="40"/>
-        </w:rPr>
-        <w:t>-</w:t>
+        <w:t>Digital Electronics &amp; VLSI</w:t>
       </w:r>
     </w:p>
     <w:p>
@@ -2684,17 +2635,23 @@
         <w:spacing w:after="0"/>
         <w:rPr>
           <w:rFonts w:ascii="Times New Roman" w:eastAsia="Times New Roman" w:hAnsi="Times New Roman" w:cs="Times New Roman"/>
-          <w:color w:val="000000"/>
-          <w:sz w:val="32"/>
-          <w:szCs w:val="32"/>
-        </w:rPr>
-      </w:pPr>
-      <w:r>
-        <w:rPr>
-          <w:rFonts w:ascii="Times New Roman" w:eastAsia="Times New Roman" w:hAnsi="Times New Roman" w:cs="Times New Roman"/>
-          <w:color w:val="000000"/>
-          <w:sz w:val="32"/>
-          <w:szCs w:val="32"/>
+          <w:b/>
+          <w:bCs/>
+          <w:color w:val="000000"/>
+          <w:sz w:val="36"/>
+          <w:szCs w:val="36"/>
+          <w:u w:val="single"/>
+        </w:rPr>
+      </w:pPr>
+      <w:r>
+        <w:rPr>
+          <w:rFonts w:ascii="Times New Roman" w:eastAsia="Times New Roman" w:hAnsi="Times New Roman" w:cs="Times New Roman"/>
+          <w:b/>
+          <w:bCs/>
+          <w:color w:val="000000"/>
+          <w:sz w:val="36"/>
+          <w:szCs w:val="36"/>
+          <w:u w:val="single"/>
         </w:rPr>
         <w:t xml:space="preserve">Logic </w:t>
       </w:r>
@@ -2702,9 +2659,12 @@
       <w:r>
         <w:rPr>
           <w:rFonts w:ascii="Times New Roman" w:eastAsia="Times New Roman" w:hAnsi="Times New Roman" w:cs="Times New Roman"/>
-          <w:color w:val="000000"/>
-          <w:sz w:val="32"/>
-          <w:szCs w:val="32"/>
+          <w:b/>
+          <w:bCs/>
+          <w:color w:val="000000"/>
+          <w:sz w:val="36"/>
+          <w:szCs w:val="36"/>
+          <w:u w:val="single"/>
         </w:rPr>
         <w:t>gates :</w:t>
       </w:r>
@@ -2730,7 +2690,7 @@
           <w:szCs w:val="32"/>
         </w:rPr>
       </w:pPr>
-      <w:hyperlink r:id="rId27" w:history="1">
+      <w:hyperlink r:id="rId28" w:history="1">
         <w:r>
           <w:rPr>
             <w:rStyle w:val="Hyperlink"/>
@@ -2782,17 +2742,23 @@
         <w:spacing w:after="0"/>
         <w:rPr>
           <w:rFonts w:ascii="Times New Roman" w:eastAsia="Times New Roman" w:hAnsi="Times New Roman" w:cs="Times New Roman"/>
-          <w:color w:val="000000"/>
-          <w:sz w:val="32"/>
-          <w:szCs w:val="32"/>
-        </w:rPr>
-      </w:pPr>
-      <w:r>
-        <w:rPr>
-          <w:rFonts w:ascii="Times New Roman" w:eastAsia="Times New Roman" w:hAnsi="Times New Roman" w:cs="Times New Roman"/>
-          <w:color w:val="000000"/>
-          <w:sz w:val="32"/>
-          <w:szCs w:val="32"/>
+          <w:b/>
+          <w:bCs/>
+          <w:color w:val="000000"/>
+          <w:sz w:val="36"/>
+          <w:szCs w:val="36"/>
+          <w:u w:val="single"/>
+        </w:rPr>
+      </w:pPr>
+      <w:r>
+        <w:rPr>
+          <w:rFonts w:ascii="Times New Roman" w:eastAsia="Times New Roman" w:hAnsi="Times New Roman" w:cs="Times New Roman"/>
+          <w:b/>
+          <w:bCs/>
+          <w:color w:val="000000"/>
+          <w:sz w:val="36"/>
+          <w:szCs w:val="36"/>
+          <w:u w:val="single"/>
         </w:rPr>
         <w:t xml:space="preserve">Boolean </w:t>
       </w:r>
@@ -2800,9 +2766,12 @@
       <w:r>
         <w:rPr>
           <w:rFonts w:ascii="Times New Roman" w:eastAsia="Times New Roman" w:hAnsi="Times New Roman" w:cs="Times New Roman"/>
-          <w:color w:val="000000"/>
-          <w:sz w:val="32"/>
-          <w:szCs w:val="32"/>
+          <w:b/>
+          <w:bCs/>
+          <w:color w:val="000000"/>
+          <w:sz w:val="36"/>
+          <w:szCs w:val="36"/>
+          <w:u w:val="single"/>
         </w:rPr>
         <w:t>Algebra :</w:t>
       </w:r>
@@ -2863,7 +2832,7 @@
         </w:rPr>
         <w:t xml:space="preserve"> </w:t>
       </w:r>
-      <w:hyperlink r:id="rId28" w:history="1">
+      <w:hyperlink r:id="rId29" w:history="1">
         <w:r>
           <w:rPr>
             <w:rStyle w:val="Hyperlink"/>
@@ -2932,7 +2901,7 @@
         </w:rPr>
         <w:t xml:space="preserve"> </w:t>
       </w:r>
-      <w:hyperlink r:id="rId29" w:history="1">
+      <w:hyperlink r:id="rId30" w:history="1">
         <w:r>
           <w:rPr>
             <w:rStyle w:val="Hyperlink"/>
@@ -3001,7 +2970,7 @@
         </w:rPr>
         <w:t xml:space="preserve"> </w:t>
       </w:r>
-      <w:hyperlink r:id="rId30" w:history="1">
+      <w:hyperlink r:id="rId31" w:history="1">
         <w:r>
           <w:rPr>
             <w:rStyle w:val="Hyperlink"/>
@@ -3070,7 +3039,7 @@
         </w:rPr>
         <w:t xml:space="preserve"> </w:t>
       </w:r>
-      <w:hyperlink r:id="rId31" w:history="1">
+      <w:hyperlink r:id="rId32" w:history="1">
         <w:r>
           <w:rPr>
             <w:rStyle w:val="Hyperlink"/>
@@ -3122,17 +3091,23 @@
         <w:spacing w:after="0"/>
         <w:rPr>
           <w:rFonts w:ascii="Times New Roman" w:eastAsia="Times New Roman" w:hAnsi="Times New Roman" w:cs="Times New Roman"/>
-          <w:color w:val="000000"/>
-          <w:sz w:val="32"/>
-          <w:szCs w:val="32"/>
-        </w:rPr>
-      </w:pPr>
-      <w:r>
-        <w:rPr>
-          <w:rFonts w:ascii="Times New Roman" w:eastAsia="Times New Roman" w:hAnsi="Times New Roman" w:cs="Times New Roman"/>
-          <w:color w:val="000000"/>
-          <w:sz w:val="32"/>
-          <w:szCs w:val="32"/>
+          <w:b/>
+          <w:bCs/>
+          <w:color w:val="000000"/>
+          <w:sz w:val="36"/>
+          <w:szCs w:val="36"/>
+          <w:u w:val="single"/>
+        </w:rPr>
+      </w:pPr>
+      <w:r>
+        <w:rPr>
+          <w:rFonts w:ascii="Times New Roman" w:eastAsia="Times New Roman" w:hAnsi="Times New Roman" w:cs="Times New Roman"/>
+          <w:b/>
+          <w:bCs/>
+          <w:color w:val="000000"/>
+          <w:sz w:val="36"/>
+          <w:szCs w:val="36"/>
+          <w:u w:val="single"/>
         </w:rPr>
         <w:t xml:space="preserve">Combinational </w:t>
       </w:r>
@@ -3140,9 +3115,12 @@
       <w:r>
         <w:rPr>
           <w:rFonts w:ascii="Times New Roman" w:eastAsia="Times New Roman" w:hAnsi="Times New Roman" w:cs="Times New Roman"/>
-          <w:color w:val="000000"/>
-          <w:sz w:val="32"/>
-          <w:szCs w:val="32"/>
+          <w:b/>
+          <w:bCs/>
+          <w:color w:val="000000"/>
+          <w:sz w:val="36"/>
+          <w:szCs w:val="36"/>
+          <w:u w:val="single"/>
         </w:rPr>
         <w:t>Circuits :</w:t>
       </w:r>
@@ -3161,28 +3139,47 @@
         <w:spacing w:after="0"/>
         <w:rPr>
           <w:rFonts w:ascii="Times New Roman" w:eastAsia="Times New Roman" w:hAnsi="Times New Roman" w:cs="Times New Roman"/>
-          <w:color w:val="000000"/>
-          <w:sz w:val="32"/>
-          <w:szCs w:val="32"/>
-        </w:rPr>
-      </w:pPr>
-      <w:r>
-        <w:rPr>
-          <w:rFonts w:ascii="Times New Roman" w:eastAsia="Times New Roman" w:hAnsi="Times New Roman" w:cs="Times New Roman"/>
-          <w:color w:val="000000"/>
-          <w:sz w:val="32"/>
-          <w:szCs w:val="32"/>
-        </w:rPr>
-        <w:t>*</w:t>
-      </w:r>
-      <w:r>
-        <w:rPr>
-          <w:rFonts w:ascii="Times New Roman" w:eastAsia="Times New Roman" w:hAnsi="Times New Roman" w:cs="Times New Roman"/>
-          <w:color w:val="000000"/>
-          <w:sz w:val="32"/>
-          <w:szCs w:val="32"/>
-        </w:rPr>
-        <w:t xml:space="preserve">You will need </w:t>
+          <w:b/>
+          <w:bCs/>
+          <w:color w:val="000000"/>
+          <w:sz w:val="32"/>
+          <w:szCs w:val="32"/>
+        </w:rPr>
+      </w:pPr>
+    </w:p>
+    <w:p>
+      <w:pPr>
+        <w:pStyle w:val="ListParagraph"/>
+        <w:numPr>
+          <w:ilvl w:val="0"/>
+          <w:numId w:val="17"/>
+        </w:numPr>
+        <w:pBdr>
+          <w:top w:val="nil"/>
+          <w:left w:val="nil"/>
+          <w:bottom w:val="nil"/>
+          <w:right w:val="nil"/>
+          <w:between w:val="nil"/>
+        </w:pBdr>
+        <w:spacing w:after="0"/>
+        <w:ind w:hanging="540"/>
+        <w:rPr>
+          <w:rFonts w:ascii="Times New Roman" w:eastAsia="Times New Roman" w:hAnsi="Times New Roman" w:cs="Times New Roman"/>
+          <w:color w:val="000000"/>
+          <w:sz w:val="32"/>
+          <w:szCs w:val="32"/>
+          <w:u w:val="single"/>
+        </w:rPr>
+      </w:pPr>
+      <w:r>
+        <w:rPr>
+          <w:rFonts w:ascii="Times New Roman" w:eastAsia="Times New Roman" w:hAnsi="Times New Roman" w:cs="Times New Roman"/>
+          <w:color w:val="000000"/>
+          <w:sz w:val="32"/>
+          <w:szCs w:val="32"/>
+          <w:u w:val="single"/>
+        </w:rPr>
+        <w:t xml:space="preserve">Extra but </w:t>
       </w:r>
       <w:proofErr w:type="gramStart"/>
       <w:r>
@@ -3191,22 +3188,91 @@
           <w:color w:val="000000"/>
           <w:sz w:val="32"/>
           <w:szCs w:val="32"/>
-        </w:rPr>
-        <w:t>this :</w:t>
+          <w:u w:val="single"/>
+        </w:rPr>
+        <w:t>necessary :</w:t>
       </w:r>
       <w:proofErr w:type="gramEnd"/>
       <w:r>
         <w:rPr>
           <w:rFonts w:ascii="Times New Roman" w:eastAsia="Times New Roman" w:hAnsi="Times New Roman" w:cs="Times New Roman"/>
-          <w:b/>
-          <w:bCs/>
-          <w:color w:val="000000"/>
-          <w:sz w:val="32"/>
-          <w:szCs w:val="32"/>
+          <w:color w:val="000000"/>
+          <w:sz w:val="32"/>
+          <w:szCs w:val="32"/>
+          <w:u w:val="single"/>
         </w:rPr>
         <w:t xml:space="preserve"> </w:t>
       </w:r>
-      <w:hyperlink r:id="rId32" w:history="1">
+    </w:p>
+    <w:p>
+      <w:pPr>
+        <w:pStyle w:val="ListParagraph"/>
+        <w:numPr>
+          <w:ilvl w:val="0"/>
+          <w:numId w:val="20"/>
+        </w:numPr>
+        <w:pBdr>
+          <w:top w:val="nil"/>
+          <w:left w:val="nil"/>
+          <w:bottom w:val="nil"/>
+          <w:right w:val="nil"/>
+          <w:between w:val="nil"/>
+        </w:pBdr>
+        <w:spacing w:after="0"/>
+        <w:ind w:left="1530"/>
+        <w:rPr>
+          <w:rFonts w:ascii="Times New Roman" w:eastAsia="Times New Roman" w:hAnsi="Times New Roman" w:cs="Times New Roman"/>
+          <w:b/>
+          <w:bCs/>
+          <w:color w:val="000000"/>
+          <w:sz w:val="32"/>
+          <w:szCs w:val="32"/>
+          <w:u w:val="single"/>
+        </w:rPr>
+      </w:pPr>
+      <w:r>
+        <w:rPr>
+          <w:rFonts w:ascii="Times New Roman" w:eastAsia="Times New Roman" w:hAnsi="Times New Roman" w:cs="Times New Roman"/>
+          <w:color w:val="000000"/>
+          <w:sz w:val="32"/>
+          <w:szCs w:val="32"/>
+        </w:rPr>
+        <w:t xml:space="preserve">Understand </w:t>
+      </w:r>
+      <w:proofErr w:type="gramStart"/>
+      <w:r>
+        <w:rPr>
+          <w:rFonts w:ascii="Times New Roman" w:eastAsia="Times New Roman" w:hAnsi="Times New Roman" w:cs="Times New Roman"/>
+          <w:b/>
+          <w:bCs/>
+          <w:color w:val="000000"/>
+          <w:sz w:val="32"/>
+          <w:szCs w:val="32"/>
+        </w:rPr>
+        <w:t>BCD</w:t>
+      </w:r>
+      <w:r>
+        <w:rPr>
+          <w:rFonts w:ascii="Times New Roman" w:eastAsia="Times New Roman" w:hAnsi="Times New Roman" w:cs="Times New Roman"/>
+          <w:color w:val="000000"/>
+          <w:sz w:val="32"/>
+          <w:szCs w:val="32"/>
+        </w:rPr>
+        <w:t xml:space="preserve"> :</w:t>
+      </w:r>
+      <w:proofErr w:type="gramEnd"/>
+      <w:r>
+        <w:rPr>
+          <w:rFonts w:ascii="Times New Roman" w:eastAsia="Times New Roman" w:hAnsi="Times New Roman" w:cs="Times New Roman"/>
+          <w:b/>
+          <w:bCs/>
+          <w:color w:val="000000"/>
+          <w:sz w:val="32"/>
+          <w:szCs w:val="32"/>
+        </w:rPr>
+        <w:t xml:space="preserve"> </w:t>
+      </w:r>
+      <w:hyperlink r:id="rId33" w:history="1">
         <w:r>
           <w:rPr>
             <w:rStyle w:val="Hyperlink"/>
@@ -3221,38 +3287,57 @@
     <w:p>
       <w:pPr>
         <w:pStyle w:val="ListParagraph"/>
-        <w:pBdr>
-          <w:top w:val="nil"/>
-          <w:left w:val="nil"/>
-          <w:bottom w:val="nil"/>
-          <w:right w:val="nil"/>
-          <w:between w:val="nil"/>
-        </w:pBdr>
-        <w:spacing w:after="0"/>
-        <w:rPr>
-          <w:rFonts w:ascii="Times New Roman" w:eastAsia="Times New Roman" w:hAnsi="Times New Roman" w:cs="Times New Roman"/>
-          <w:color w:val="000000"/>
-          <w:sz w:val="32"/>
-          <w:szCs w:val="32"/>
-        </w:rPr>
-      </w:pPr>
-      <w:r>
-        <w:rPr>
-          <w:rFonts w:ascii="Times New Roman" w:eastAsia="Times New Roman" w:hAnsi="Times New Roman" w:cs="Times New Roman"/>
-          <w:color w:val="000000"/>
-          <w:sz w:val="32"/>
-          <w:szCs w:val="32"/>
-        </w:rPr>
-        <w:t>*</w:t>
-      </w:r>
-      <w:r>
-        <w:rPr>
-          <w:rFonts w:ascii="Times New Roman" w:eastAsia="Times New Roman" w:hAnsi="Times New Roman" w:cs="Times New Roman"/>
-          <w:color w:val="000000"/>
-          <w:sz w:val="32"/>
-          <w:szCs w:val="32"/>
-        </w:rPr>
-        <w:t>&amp; this too:</w:t>
+        <w:numPr>
+          <w:ilvl w:val="0"/>
+          <w:numId w:val="20"/>
+        </w:numPr>
+        <w:pBdr>
+          <w:top w:val="nil"/>
+          <w:left w:val="nil"/>
+          <w:bottom w:val="nil"/>
+          <w:right w:val="nil"/>
+          <w:between w:val="nil"/>
+        </w:pBdr>
+        <w:spacing w:after="0"/>
+        <w:ind w:left="1530"/>
+        <w:rPr>
+          <w:rFonts w:ascii="Times New Roman" w:eastAsia="Times New Roman" w:hAnsi="Times New Roman" w:cs="Times New Roman"/>
+          <w:b/>
+          <w:bCs/>
+          <w:color w:val="000000"/>
+          <w:sz w:val="32"/>
+          <w:szCs w:val="32"/>
+          <w:u w:val="single"/>
+        </w:rPr>
+      </w:pPr>
+      <w:r>
+        <w:rPr>
+          <w:rFonts w:ascii="Times New Roman" w:eastAsia="Times New Roman" w:hAnsi="Times New Roman" w:cs="Times New Roman"/>
+          <w:b/>
+          <w:bCs/>
+          <w:color w:val="000000"/>
+          <w:sz w:val="32"/>
+          <w:szCs w:val="32"/>
+        </w:rPr>
+        <w:t>K-MAP</w:t>
+      </w:r>
+      <w:r>
+        <w:rPr>
+          <w:rFonts w:ascii="Times New Roman" w:eastAsia="Times New Roman" w:hAnsi="Times New Roman" w:cs="Times New Roman"/>
+          <w:color w:val="000000"/>
+          <w:sz w:val="32"/>
+          <w:szCs w:val="32"/>
+        </w:rPr>
+        <w:t xml:space="preserve"> for Combinational circuits </w:t>
+      </w:r>
+      <w:r>
+        <w:rPr>
+          <w:rFonts w:ascii="Times New Roman" w:eastAsia="Times New Roman" w:hAnsi="Times New Roman" w:cs="Times New Roman"/>
+          <w:color w:val="000000"/>
+          <w:sz w:val="32"/>
+          <w:szCs w:val="32"/>
+        </w:rPr>
+        <w:t>:</w:t>
       </w:r>
       <w:r>
         <w:rPr>
@@ -3263,7 +3348,7 @@
         </w:rPr>
         <w:t xml:space="preserve"> </w:t>
       </w:r>
-      <w:hyperlink r:id="rId33" w:history="1">
+      <w:hyperlink r:id="rId34" w:history="1">
         <w:r>
           <w:rPr>
             <w:rStyle w:val="Hyperlink"/>
@@ -3271,42 +3356,159 @@
             <w:sz w:val="32"/>
             <w:szCs w:val="32"/>
           </w:rPr>
-          <w:t>https://www.youtube.com/watch?v=6dneWcLv1HM&amp;list=PL-IC1WV1OE4noB2cXD_w3BZ0y1GoKwZuw</w:t>
+          <w:t>https://www.youtube.com/watch?v=6dneWcLv1HM&amp;list=PL-IC1WV1OE4noB</w:t>
+        </w:r>
+        <w:r>
+          <w:rPr>
+            <w:rStyle w:val="Hyperlink"/>
+            <w:rFonts w:ascii="Times New Roman" w:hAnsi="Times New Roman" w:cs="Times New Roman"/>
+            <w:sz w:val="32"/>
+            <w:szCs w:val="32"/>
+          </w:rPr>
+          <w:t>2</w:t>
+        </w:r>
+        <w:r>
+          <w:rPr>
+            <w:rStyle w:val="Hyperlink"/>
+            <w:rFonts w:ascii="Times New Roman" w:hAnsi="Times New Roman" w:cs="Times New Roman"/>
+            <w:sz w:val="32"/>
+            <w:szCs w:val="32"/>
+          </w:rPr>
+          <w:t>cXD_w3BZ0y1GoKwZuw</w:t>
         </w:r>
       </w:hyperlink>
     </w:p>
     <w:p>
       <w:pPr>
         <w:pStyle w:val="ListParagraph"/>
-        <w:pBdr>
-          <w:top w:val="nil"/>
-          <w:left w:val="nil"/>
-          <w:bottom w:val="nil"/>
-          <w:right w:val="nil"/>
-          <w:between w:val="nil"/>
-        </w:pBdr>
-        <w:spacing w:after="0"/>
-        <w:rPr>
-          <w:rFonts w:ascii="Times New Roman" w:eastAsia="Times New Roman" w:hAnsi="Times New Roman" w:cs="Times New Roman"/>
-          <w:b/>
-          <w:bCs/>
-          <w:color w:val="000000"/>
-          <w:sz w:val="32"/>
-          <w:szCs w:val="32"/>
-        </w:rPr>
-      </w:pPr>
-    </w:p>
-    <w:p>
-      <w:pPr>
-        <w:pStyle w:val="ListParagraph"/>
-        <w:pBdr>
-          <w:top w:val="nil"/>
-          <w:left w:val="nil"/>
-          <w:bottom w:val="nil"/>
-          <w:right w:val="nil"/>
-          <w:between w:val="nil"/>
-        </w:pBdr>
-        <w:spacing w:after="0"/>
+        <w:numPr>
+          <w:ilvl w:val="0"/>
+          <w:numId w:val="20"/>
+        </w:numPr>
+        <w:pBdr>
+          <w:top w:val="nil"/>
+          <w:left w:val="nil"/>
+          <w:bottom w:val="nil"/>
+          <w:right w:val="nil"/>
+          <w:between w:val="nil"/>
+        </w:pBdr>
+        <w:spacing w:after="0"/>
+        <w:ind w:left="1530"/>
+        <w:rPr>
+          <w:rFonts w:ascii="Times New Roman" w:eastAsia="Times New Roman" w:hAnsi="Times New Roman" w:cs="Times New Roman"/>
+          <w:b/>
+          <w:bCs/>
+          <w:color w:val="000000"/>
+          <w:sz w:val="32"/>
+          <w:szCs w:val="32"/>
+        </w:rPr>
+      </w:pPr>
+      <w:r>
+        <w:rPr>
+          <w:rFonts w:ascii="Times New Roman" w:eastAsia="Times New Roman" w:hAnsi="Times New Roman" w:cs="Times New Roman"/>
+          <w:b/>
+          <w:bCs/>
+          <w:color w:val="000000"/>
+          <w:sz w:val="32"/>
+          <w:szCs w:val="32"/>
+        </w:rPr>
+        <w:t>7-segment Display</w:t>
+      </w:r>
+      <w:r>
+        <w:rPr>
+          <w:rFonts w:ascii="Times New Roman" w:eastAsia="Times New Roman" w:hAnsi="Times New Roman" w:cs="Times New Roman"/>
+          <w:color w:val="000000"/>
+          <w:sz w:val="32"/>
+          <w:szCs w:val="32"/>
+        </w:rPr>
+        <w:t xml:space="preserve"> </w:t>
+      </w:r>
+      <w:proofErr w:type="gramStart"/>
+      <w:r>
+        <w:rPr>
+          <w:rFonts w:ascii="Times New Roman" w:eastAsia="Times New Roman" w:hAnsi="Times New Roman" w:cs="Times New Roman"/>
+          <w:color w:val="000000"/>
+          <w:sz w:val="32"/>
+          <w:szCs w:val="32"/>
+        </w:rPr>
+        <w:t>practical</w:t>
+      </w:r>
+      <w:r>
+        <w:rPr>
+          <w:rFonts w:ascii="Times New Roman" w:eastAsia="Times New Roman" w:hAnsi="Times New Roman" w:cs="Times New Roman"/>
+          <w:b/>
+          <w:bCs/>
+          <w:color w:val="000000"/>
+          <w:sz w:val="32"/>
+          <w:szCs w:val="32"/>
+        </w:rPr>
+        <w:t xml:space="preserve"> </w:t>
+      </w:r>
+      <w:r>
+        <w:rPr>
+          <w:rFonts w:ascii="Times New Roman" w:eastAsia="Times New Roman" w:hAnsi="Times New Roman" w:cs="Times New Roman"/>
+          <w:color w:val="000000"/>
+          <w:sz w:val="32"/>
+          <w:szCs w:val="32"/>
+        </w:rPr>
+        <w:t>:</w:t>
+      </w:r>
+      <w:proofErr w:type="gramEnd"/>
+      <w:r>
+        <w:rPr>
+          <w:rFonts w:ascii="Times New Roman" w:eastAsia="Times New Roman" w:hAnsi="Times New Roman" w:cs="Times New Roman"/>
+          <w:b/>
+          <w:bCs/>
+          <w:color w:val="000000"/>
+          <w:sz w:val="32"/>
+          <w:szCs w:val="32"/>
+        </w:rPr>
+        <w:t xml:space="preserve"> </w:t>
+      </w:r>
+    </w:p>
+    <w:p>
+      <w:pPr>
+        <w:pStyle w:val="ListParagraph"/>
+        <w:pBdr>
+          <w:top w:val="nil"/>
+          <w:left w:val="nil"/>
+          <w:bottom w:val="nil"/>
+          <w:right w:val="nil"/>
+          <w:between w:val="nil"/>
+        </w:pBdr>
+        <w:spacing w:after="0"/>
+        <w:ind w:left="1890" w:hanging="360"/>
+        <w:rPr>
+          <w:rFonts w:ascii="Times New Roman" w:eastAsia="Times New Roman" w:hAnsi="Times New Roman" w:cs="Times New Roman"/>
+          <w:color w:val="000000"/>
+          <w:sz w:val="32"/>
+          <w:szCs w:val="32"/>
+        </w:rPr>
+      </w:pPr>
+      <w:hyperlink r:id="rId35" w:history="1">
+        <w:r>
+          <w:rPr>
+            <w:rStyle w:val="Hyperlink"/>
+            <w:rFonts w:ascii="Times New Roman" w:eastAsia="Times New Roman" w:hAnsi="Times New Roman" w:cs="Times New Roman"/>
+            <w:sz w:val="32"/>
+            <w:szCs w:val="32"/>
+          </w:rPr>
+          <w:t>https://youtu.be/bV2lUdjOujc?si=ymv6fV0AnmifhfYe</w:t>
+        </w:r>
+      </w:hyperlink>
+    </w:p>
+    <w:p>
+      <w:pPr>
+        <w:pStyle w:val="ListParagraph"/>
+        <w:pBdr>
+          <w:top w:val="nil"/>
+          <w:left w:val="nil"/>
+          <w:bottom w:val="nil"/>
+          <w:right w:val="nil"/>
+          <w:between w:val="nil"/>
+        </w:pBdr>
+        <w:spacing w:after="0"/>
+        <w:ind w:left="1530" w:hanging="360"/>
         <w:rPr>
           <w:rFonts w:ascii="Times New Roman" w:eastAsia="Times New Roman" w:hAnsi="Times New Roman" w:cs="Times New Roman"/>
           <w:b/>
@@ -3317,7 +3519,1194 @@
           <w:u w:val="single"/>
         </w:rPr>
       </w:pPr>
-      <w:hyperlink r:id="rId34" w:history="1">
+    </w:p>
+    <w:p>
+      <w:pPr>
+        <w:pStyle w:val="ListParagraph"/>
+        <w:numPr>
+          <w:ilvl w:val="0"/>
+          <w:numId w:val="17"/>
+        </w:numPr>
+        <w:pBdr>
+          <w:top w:val="nil"/>
+          <w:left w:val="nil"/>
+          <w:bottom w:val="nil"/>
+          <w:right w:val="nil"/>
+          <w:between w:val="nil"/>
+        </w:pBdr>
+        <w:spacing w:after="0"/>
+        <w:ind w:hanging="540"/>
+        <w:rPr>
+          <w:rFonts w:ascii="Times New Roman" w:eastAsia="Times New Roman" w:hAnsi="Times New Roman" w:cs="Times New Roman"/>
+          <w:color w:val="000000"/>
+          <w:sz w:val="32"/>
+          <w:szCs w:val="32"/>
+          <w:u w:val="single"/>
+        </w:rPr>
+      </w:pPr>
+      <w:r>
+        <w:rPr>
+          <w:rFonts w:ascii="Times New Roman" w:eastAsia="Times New Roman" w:hAnsi="Times New Roman" w:cs="Times New Roman"/>
+          <w:color w:val="000000"/>
+          <w:sz w:val="32"/>
+          <w:szCs w:val="32"/>
+          <w:u w:val="single"/>
+        </w:rPr>
+        <w:t>Most</w:t>
+      </w:r>
+      <w:r>
+        <w:rPr>
+          <w:rFonts w:ascii="Times New Roman" w:eastAsia="Times New Roman" w:hAnsi="Times New Roman" w:cs="Times New Roman"/>
+          <w:color w:val="000000"/>
+          <w:sz w:val="32"/>
+          <w:szCs w:val="32"/>
+          <w:u w:val="single"/>
+        </w:rPr>
+        <w:t xml:space="preserve"> of the</w:t>
+      </w:r>
+      <w:r>
+        <w:rPr>
+          <w:rFonts w:ascii="Times New Roman" w:eastAsia="Times New Roman" w:hAnsi="Times New Roman" w:cs="Times New Roman"/>
+          <w:color w:val="000000"/>
+          <w:sz w:val="32"/>
+          <w:szCs w:val="32"/>
+          <w:u w:val="single"/>
+        </w:rPr>
+        <w:t xml:space="preserve"> topics of Combinational </w:t>
+      </w:r>
+      <w:proofErr w:type="gramStart"/>
+      <w:r>
+        <w:rPr>
+          <w:rFonts w:ascii="Times New Roman" w:eastAsia="Times New Roman" w:hAnsi="Times New Roman" w:cs="Times New Roman"/>
+          <w:color w:val="000000"/>
+          <w:sz w:val="32"/>
+          <w:szCs w:val="32"/>
+          <w:u w:val="single"/>
+        </w:rPr>
+        <w:t>circuits :</w:t>
+      </w:r>
+      <w:proofErr w:type="gramEnd"/>
+      <w:r>
+        <w:rPr>
+          <w:rFonts w:ascii="Times New Roman" w:eastAsia="Times New Roman" w:hAnsi="Times New Roman" w:cs="Times New Roman"/>
+          <w:color w:val="000000"/>
+          <w:sz w:val="32"/>
+          <w:szCs w:val="32"/>
+          <w:u w:val="single"/>
+        </w:rPr>
+        <w:t xml:space="preserve"> </w:t>
+      </w:r>
+    </w:p>
+    <w:p>
+      <w:pPr>
+        <w:pStyle w:val="ListParagraph"/>
+        <w:pBdr>
+          <w:top w:val="nil"/>
+          <w:left w:val="nil"/>
+          <w:bottom w:val="nil"/>
+          <w:right w:val="nil"/>
+          <w:between w:val="nil"/>
+        </w:pBdr>
+        <w:spacing w:after="0"/>
+        <w:ind w:left="1260"/>
+        <w:rPr>
+          <w:rFonts w:ascii="Times New Roman" w:eastAsia="Times New Roman" w:hAnsi="Times New Roman" w:cs="Times New Roman"/>
+          <w:color w:val="000000"/>
+          <w:sz w:val="32"/>
+          <w:szCs w:val="32"/>
+          <w:u w:val="single"/>
+        </w:rPr>
+      </w:pPr>
+      <w:hyperlink r:id="rId36" w:history="1">
+        <w:r>
+          <w:rPr>
+            <w:rStyle w:val="Hyperlink"/>
+            <w:rFonts w:ascii="Times New Roman" w:eastAsia="Times New Roman" w:hAnsi="Times New Roman" w:cs="Times New Roman"/>
+            <w:sz w:val="32"/>
+            <w:szCs w:val="32"/>
+          </w:rPr>
+          <w:t>https://www.youtube.com/watch?v=KDZ-SI7OHNY&amp;list=PL-IC1WV1OE4m3hb-LfCYJ</w:t>
+        </w:r>
+        <w:r>
+          <w:rPr>
+            <w:rStyle w:val="Hyperlink"/>
+            <w:rFonts w:ascii="Times New Roman" w:eastAsia="Times New Roman" w:hAnsi="Times New Roman" w:cs="Times New Roman"/>
+            <w:sz w:val="32"/>
+            <w:szCs w:val="32"/>
+          </w:rPr>
+          <w:t>3</w:t>
+        </w:r>
+        <w:r>
+          <w:rPr>
+            <w:rStyle w:val="Hyperlink"/>
+            <w:rFonts w:ascii="Times New Roman" w:eastAsia="Times New Roman" w:hAnsi="Times New Roman" w:cs="Times New Roman"/>
+            <w:sz w:val="32"/>
+            <w:szCs w:val="32"/>
+          </w:rPr>
+          <w:t>MOkJD3v9XQT&amp;pp=0gcJCbUEOCosWNin</w:t>
+        </w:r>
+      </w:hyperlink>
+    </w:p>
+    <w:p>
+      <w:pPr>
+        <w:pStyle w:val="ListParagraph"/>
+        <w:pBdr>
+          <w:top w:val="nil"/>
+          <w:left w:val="nil"/>
+          <w:bottom w:val="nil"/>
+          <w:right w:val="nil"/>
+          <w:between w:val="nil"/>
+        </w:pBdr>
+        <w:spacing w:after="0"/>
+        <w:ind w:left="1260"/>
+        <w:rPr>
+          <w:rFonts w:ascii="Times New Roman" w:eastAsia="Times New Roman" w:hAnsi="Times New Roman" w:cs="Times New Roman"/>
+          <w:b/>
+          <w:bCs/>
+          <w:color w:val="000000"/>
+          <w:sz w:val="32"/>
+          <w:szCs w:val="32"/>
+          <w:u w:val="single"/>
+        </w:rPr>
+      </w:pPr>
+    </w:p>
+    <w:p>
+      <w:pPr>
+        <w:pStyle w:val="ListParagraph"/>
+        <w:numPr>
+          <w:ilvl w:val="0"/>
+          <w:numId w:val="17"/>
+        </w:numPr>
+        <w:pBdr>
+          <w:top w:val="nil"/>
+          <w:left w:val="nil"/>
+          <w:bottom w:val="nil"/>
+          <w:right w:val="nil"/>
+          <w:between w:val="nil"/>
+        </w:pBdr>
+        <w:spacing w:after="0"/>
+        <w:ind w:hanging="540"/>
+        <w:rPr>
+          <w:rFonts w:ascii="Times New Roman" w:eastAsia="Times New Roman" w:hAnsi="Times New Roman" w:cs="Times New Roman"/>
+          <w:b/>
+          <w:bCs/>
+          <w:color w:val="000000"/>
+          <w:sz w:val="44"/>
+          <w:szCs w:val="44"/>
+          <w:u w:val="single"/>
+        </w:rPr>
+      </w:pPr>
+      <w:r>
+        <w:rPr>
+          <w:rFonts w:ascii="Times New Roman" w:hAnsi="Times New Roman" w:cs="Times New Roman"/>
+          <w:sz w:val="32"/>
+          <w:szCs w:val="32"/>
+          <w:u w:val="single"/>
+        </w:rPr>
+        <w:t xml:space="preserve">Multiplexers &amp; </w:t>
+      </w:r>
+      <w:proofErr w:type="gramStart"/>
+      <w:r>
+        <w:rPr>
+          <w:rFonts w:ascii="Times New Roman" w:hAnsi="Times New Roman" w:cs="Times New Roman"/>
+          <w:sz w:val="32"/>
+          <w:szCs w:val="32"/>
+          <w:u w:val="single"/>
+        </w:rPr>
+        <w:t>Demultiplexers :</w:t>
+      </w:r>
+      <w:proofErr w:type="gramEnd"/>
+      <w:r>
+        <w:rPr>
+          <w:rFonts w:ascii="Times New Roman" w:hAnsi="Times New Roman" w:cs="Times New Roman"/>
+          <w:sz w:val="32"/>
+          <w:szCs w:val="32"/>
+          <w:u w:val="single"/>
+        </w:rPr>
+        <w:t xml:space="preserve"> </w:t>
+      </w:r>
+    </w:p>
+    <w:p>
+      <w:pPr>
+        <w:pStyle w:val="ListParagraph"/>
+        <w:pBdr>
+          <w:top w:val="nil"/>
+          <w:left w:val="nil"/>
+          <w:bottom w:val="nil"/>
+          <w:right w:val="nil"/>
+          <w:between w:val="nil"/>
+        </w:pBdr>
+        <w:spacing w:after="0"/>
+        <w:ind w:left="1260"/>
+        <w:rPr>
+          <w:rFonts w:ascii="Times New Roman" w:eastAsia="Times New Roman" w:hAnsi="Times New Roman" w:cs="Times New Roman"/>
+          <w:color w:val="000000"/>
+          <w:sz w:val="32"/>
+          <w:szCs w:val="32"/>
+          <w:u w:val="single"/>
+        </w:rPr>
+      </w:pPr>
+      <w:hyperlink r:id="rId37" w:history="1">
+        <w:r>
+          <w:rPr>
+            <w:rStyle w:val="Hyperlink"/>
+            <w:rFonts w:ascii="Times New Roman" w:eastAsia="Times New Roman" w:hAnsi="Times New Roman" w:cs="Times New Roman"/>
+            <w:sz w:val="32"/>
+            <w:szCs w:val="32"/>
+          </w:rPr>
+          <w:t>https://www.youtube.com/watch?v=06VyGspXpMo&amp;list=PL-IC1WV1OE4lFJDyObue2N7X2A4i9HnBE</w:t>
+        </w:r>
+      </w:hyperlink>
+    </w:p>
+    <w:p>
+      <w:pPr>
+        <w:pStyle w:val="ListParagraph"/>
+        <w:pBdr>
+          <w:top w:val="nil"/>
+          <w:left w:val="nil"/>
+          <w:bottom w:val="nil"/>
+          <w:right w:val="nil"/>
+          <w:between w:val="nil"/>
+        </w:pBdr>
+        <w:spacing w:after="0"/>
+        <w:ind w:left="1260"/>
+        <w:rPr>
+          <w:rFonts w:ascii="Times New Roman" w:eastAsia="Times New Roman" w:hAnsi="Times New Roman" w:cs="Times New Roman"/>
+          <w:b/>
+          <w:bCs/>
+          <w:color w:val="000000"/>
+          <w:sz w:val="32"/>
+          <w:szCs w:val="32"/>
+          <w:u w:val="single"/>
+        </w:rPr>
+      </w:pPr>
+    </w:p>
+    <w:p>
+      <w:pPr>
+        <w:pStyle w:val="ListParagraph"/>
+        <w:numPr>
+          <w:ilvl w:val="0"/>
+          <w:numId w:val="17"/>
+        </w:numPr>
+        <w:pBdr>
+          <w:top w:val="nil"/>
+          <w:left w:val="nil"/>
+          <w:bottom w:val="nil"/>
+          <w:right w:val="nil"/>
+          <w:between w:val="nil"/>
+        </w:pBdr>
+        <w:spacing w:after="0"/>
+        <w:ind w:hanging="540"/>
+        <w:rPr>
+          <w:rFonts w:ascii="Times New Roman" w:eastAsia="Times New Roman" w:hAnsi="Times New Roman" w:cs="Times New Roman"/>
+          <w:color w:val="000000"/>
+          <w:sz w:val="32"/>
+          <w:szCs w:val="32"/>
+          <w:u w:val="single"/>
+        </w:rPr>
+      </w:pPr>
+      <w:r>
+        <w:rPr>
+          <w:rFonts w:ascii="Times New Roman" w:eastAsia="Times New Roman" w:hAnsi="Times New Roman" w:cs="Times New Roman"/>
+          <w:color w:val="000000"/>
+          <w:sz w:val="32"/>
+          <w:szCs w:val="32"/>
+          <w:u w:val="single"/>
+        </w:rPr>
+        <w:t xml:space="preserve">Encoders &amp; </w:t>
+      </w:r>
+      <w:proofErr w:type="gramStart"/>
+      <w:r>
+        <w:rPr>
+          <w:rFonts w:ascii="Times New Roman" w:eastAsia="Times New Roman" w:hAnsi="Times New Roman" w:cs="Times New Roman"/>
+          <w:color w:val="000000"/>
+          <w:sz w:val="32"/>
+          <w:szCs w:val="32"/>
+          <w:u w:val="single"/>
+        </w:rPr>
+        <w:t>Decoders :</w:t>
+      </w:r>
+      <w:proofErr w:type="gramEnd"/>
+      <w:r>
+        <w:rPr>
+          <w:rFonts w:ascii="Times New Roman" w:eastAsia="Times New Roman" w:hAnsi="Times New Roman" w:cs="Times New Roman"/>
+          <w:color w:val="000000"/>
+          <w:sz w:val="32"/>
+          <w:szCs w:val="32"/>
+          <w:u w:val="single"/>
+        </w:rPr>
+        <w:t xml:space="preserve"> </w:t>
+      </w:r>
+    </w:p>
+    <w:p>
+      <w:pPr>
+        <w:pStyle w:val="ListParagraph"/>
+        <w:numPr>
+          <w:ilvl w:val="0"/>
+          <w:numId w:val="18"/>
+        </w:numPr>
+        <w:pBdr>
+          <w:top w:val="nil"/>
+          <w:left w:val="nil"/>
+          <w:bottom w:val="nil"/>
+          <w:right w:val="nil"/>
+          <w:between w:val="nil"/>
+        </w:pBdr>
+        <w:spacing w:after="0"/>
+        <w:rPr>
+          <w:rFonts w:ascii="Times New Roman" w:eastAsia="Times New Roman" w:hAnsi="Times New Roman" w:cs="Times New Roman"/>
+          <w:color w:val="000000"/>
+          <w:sz w:val="32"/>
+          <w:szCs w:val="32"/>
+          <w:u w:val="single"/>
+        </w:rPr>
+      </w:pPr>
+      <w:r>
+        <w:rPr>
+          <w:rFonts w:ascii="Times New Roman" w:eastAsia="Times New Roman" w:hAnsi="Times New Roman" w:cs="Times New Roman"/>
+          <w:color w:val="000000"/>
+          <w:sz w:val="32"/>
+          <w:szCs w:val="32"/>
+          <w:u w:val="single"/>
+        </w:rPr>
+        <w:t xml:space="preserve">Intro. &amp; 2 X 4 </w:t>
+      </w:r>
+      <w:proofErr w:type="gramStart"/>
+      <w:r>
+        <w:rPr>
+          <w:rFonts w:ascii="Times New Roman" w:eastAsia="Times New Roman" w:hAnsi="Times New Roman" w:cs="Times New Roman"/>
+          <w:color w:val="000000"/>
+          <w:sz w:val="32"/>
+          <w:szCs w:val="32"/>
+          <w:u w:val="single"/>
+        </w:rPr>
+        <w:t>decoder :</w:t>
+      </w:r>
+      <w:proofErr w:type="gramEnd"/>
+      <w:r>
+        <w:rPr>
+          <w:rFonts w:ascii="Times New Roman" w:eastAsia="Times New Roman" w:hAnsi="Times New Roman" w:cs="Times New Roman"/>
+          <w:color w:val="000000"/>
+          <w:sz w:val="32"/>
+          <w:szCs w:val="32"/>
+          <w:u w:val="single"/>
+        </w:rPr>
+        <w:t xml:space="preserve"> </w:t>
+      </w:r>
+      <w:hyperlink r:id="rId38" w:history="1">
+        <w:r>
+          <w:rPr>
+            <w:rStyle w:val="Hyperlink"/>
+            <w:rFonts w:ascii="Times New Roman" w:eastAsia="Times New Roman" w:hAnsi="Times New Roman" w:cs="Times New Roman"/>
+            <w:sz w:val="32"/>
+            <w:szCs w:val="32"/>
+          </w:rPr>
+          <w:t>https://youtu.be/feBvhLFQEDk?si=l8gY0shMSyQI4v4Q</w:t>
+        </w:r>
+      </w:hyperlink>
+    </w:p>
+    <w:p>
+      <w:pPr>
+        <w:pStyle w:val="ListParagraph"/>
+        <w:numPr>
+          <w:ilvl w:val="0"/>
+          <w:numId w:val="18"/>
+        </w:numPr>
+        <w:pBdr>
+          <w:top w:val="nil"/>
+          <w:left w:val="nil"/>
+          <w:bottom w:val="nil"/>
+          <w:right w:val="nil"/>
+          <w:between w:val="nil"/>
+        </w:pBdr>
+        <w:spacing w:after="0"/>
+        <w:rPr>
+          <w:rFonts w:ascii="Times New Roman" w:eastAsia="Times New Roman" w:hAnsi="Times New Roman" w:cs="Times New Roman"/>
+          <w:color w:val="000000"/>
+          <w:sz w:val="32"/>
+          <w:szCs w:val="32"/>
+          <w:u w:val="single"/>
+        </w:rPr>
+      </w:pPr>
+      <w:r>
+        <w:rPr>
+          <w:rFonts w:ascii="Times New Roman" w:eastAsia="Times New Roman" w:hAnsi="Times New Roman" w:cs="Times New Roman"/>
+          <w:color w:val="000000"/>
+          <w:sz w:val="32"/>
+          <w:szCs w:val="32"/>
+          <w:u w:val="single"/>
+        </w:rPr>
+        <w:t xml:space="preserve">3 X 8 </w:t>
+      </w:r>
+      <w:proofErr w:type="gramStart"/>
+      <w:r>
+        <w:rPr>
+          <w:rFonts w:ascii="Times New Roman" w:eastAsia="Times New Roman" w:hAnsi="Times New Roman" w:cs="Times New Roman"/>
+          <w:color w:val="000000"/>
+          <w:sz w:val="32"/>
+          <w:szCs w:val="32"/>
+          <w:u w:val="single"/>
+        </w:rPr>
+        <w:t>Decoder :</w:t>
+      </w:r>
+      <w:proofErr w:type="gramEnd"/>
+    </w:p>
+    <w:p>
+      <w:pPr>
+        <w:pStyle w:val="ListParagraph"/>
+        <w:pBdr>
+          <w:top w:val="nil"/>
+          <w:left w:val="nil"/>
+          <w:bottom w:val="nil"/>
+          <w:right w:val="nil"/>
+          <w:between w:val="nil"/>
+        </w:pBdr>
+        <w:spacing w:after="0"/>
+        <w:ind w:left="1980"/>
+        <w:rPr>
+          <w:rFonts w:ascii="Times New Roman" w:eastAsia="Times New Roman" w:hAnsi="Times New Roman" w:cs="Times New Roman"/>
+          <w:color w:val="000000"/>
+          <w:sz w:val="32"/>
+          <w:szCs w:val="32"/>
+          <w:u w:val="single"/>
+        </w:rPr>
+      </w:pPr>
+      <w:hyperlink r:id="rId39" w:history="1">
+        <w:r>
+          <w:rPr>
+            <w:rStyle w:val="Hyperlink"/>
+            <w:rFonts w:ascii="Times New Roman" w:eastAsia="Times New Roman" w:hAnsi="Times New Roman" w:cs="Times New Roman"/>
+            <w:sz w:val="32"/>
+            <w:szCs w:val="32"/>
+          </w:rPr>
+          <w:t>https://youtu.be/GMi0iDQeyvY?si=OUTolDqj1jmm-Pg7</w:t>
+        </w:r>
+      </w:hyperlink>
+    </w:p>
+    <w:p>
+      <w:pPr>
+        <w:pStyle w:val="ListParagraph"/>
+        <w:numPr>
+          <w:ilvl w:val="0"/>
+          <w:numId w:val="18"/>
+        </w:numPr>
+        <w:pBdr>
+          <w:top w:val="nil"/>
+          <w:left w:val="nil"/>
+          <w:bottom w:val="nil"/>
+          <w:right w:val="nil"/>
+          <w:between w:val="nil"/>
+        </w:pBdr>
+        <w:spacing w:after="0"/>
+        <w:rPr>
+          <w:rFonts w:ascii="Times New Roman" w:eastAsia="Times New Roman" w:hAnsi="Times New Roman" w:cs="Times New Roman"/>
+          <w:color w:val="000000"/>
+          <w:sz w:val="32"/>
+          <w:szCs w:val="32"/>
+          <w:u w:val="single"/>
+        </w:rPr>
+      </w:pPr>
+      <w:r>
+        <w:rPr>
+          <w:rFonts w:ascii="Times New Roman" w:eastAsia="Times New Roman" w:hAnsi="Times New Roman" w:cs="Times New Roman"/>
+          <w:color w:val="000000"/>
+          <w:sz w:val="32"/>
+          <w:szCs w:val="32"/>
+          <w:u w:val="single"/>
+        </w:rPr>
+        <w:t xml:space="preserve">Priority </w:t>
+      </w:r>
+      <w:proofErr w:type="gramStart"/>
+      <w:r>
+        <w:rPr>
+          <w:rFonts w:ascii="Times New Roman" w:eastAsia="Times New Roman" w:hAnsi="Times New Roman" w:cs="Times New Roman"/>
+          <w:color w:val="000000"/>
+          <w:sz w:val="32"/>
+          <w:szCs w:val="32"/>
+          <w:u w:val="single"/>
+        </w:rPr>
+        <w:t>Encoder :</w:t>
+      </w:r>
+      <w:proofErr w:type="gramEnd"/>
+      <w:r>
+        <w:rPr>
+          <w:rFonts w:ascii="Times New Roman" w:eastAsia="Times New Roman" w:hAnsi="Times New Roman" w:cs="Times New Roman"/>
+          <w:color w:val="000000"/>
+          <w:sz w:val="32"/>
+          <w:szCs w:val="32"/>
+          <w:u w:val="single"/>
+        </w:rPr>
+        <w:t xml:space="preserve"> </w:t>
+      </w:r>
+    </w:p>
+    <w:p>
+      <w:pPr>
+        <w:pStyle w:val="ListParagraph"/>
+        <w:pBdr>
+          <w:top w:val="nil"/>
+          <w:left w:val="nil"/>
+          <w:bottom w:val="nil"/>
+          <w:right w:val="nil"/>
+          <w:between w:val="nil"/>
+        </w:pBdr>
+        <w:spacing w:after="0"/>
+        <w:ind w:left="1980"/>
+        <w:rPr>
+          <w:rFonts w:ascii="Times New Roman" w:eastAsia="Times New Roman" w:hAnsi="Times New Roman" w:cs="Times New Roman"/>
+          <w:color w:val="000000"/>
+          <w:sz w:val="32"/>
+          <w:szCs w:val="32"/>
+          <w:u w:val="single"/>
+        </w:rPr>
+      </w:pPr>
+      <w:hyperlink r:id="rId40" w:history="1">
+        <w:r>
+          <w:rPr>
+            <w:rStyle w:val="Hyperlink"/>
+            <w:rFonts w:ascii="Times New Roman" w:eastAsia="Times New Roman" w:hAnsi="Times New Roman" w:cs="Times New Roman"/>
+            <w:sz w:val="32"/>
+            <w:szCs w:val="32"/>
+          </w:rPr>
+          <w:t>https://youtu.be/jbghfcdj5Dc?si=IE66NIkIs__7WL5i</w:t>
+        </w:r>
+      </w:hyperlink>
+    </w:p>
+    <w:p>
+      <w:pPr>
+        <w:pStyle w:val="ListParagraph"/>
+        <w:numPr>
+          <w:ilvl w:val="0"/>
+          <w:numId w:val="18"/>
+        </w:numPr>
+        <w:pBdr>
+          <w:top w:val="nil"/>
+          <w:left w:val="nil"/>
+          <w:bottom w:val="nil"/>
+          <w:right w:val="nil"/>
+          <w:between w:val="nil"/>
+        </w:pBdr>
+        <w:spacing w:after="0"/>
+        <w:rPr>
+          <w:rFonts w:ascii="Times New Roman" w:eastAsia="Times New Roman" w:hAnsi="Times New Roman" w:cs="Times New Roman"/>
+          <w:color w:val="000000"/>
+          <w:sz w:val="32"/>
+          <w:szCs w:val="32"/>
+          <w:u w:val="single"/>
+        </w:rPr>
+      </w:pPr>
+      <w:r>
+        <w:rPr>
+          <w:rFonts w:ascii="Times New Roman" w:eastAsia="Times New Roman" w:hAnsi="Times New Roman" w:cs="Times New Roman"/>
+          <w:color w:val="000000"/>
+          <w:sz w:val="32"/>
+          <w:szCs w:val="32"/>
+          <w:u w:val="single"/>
+        </w:rPr>
+        <w:t xml:space="preserve">Decimal to BCD </w:t>
+      </w:r>
+      <w:proofErr w:type="gramStart"/>
+      <w:r>
+        <w:rPr>
+          <w:rFonts w:ascii="Times New Roman" w:eastAsia="Times New Roman" w:hAnsi="Times New Roman" w:cs="Times New Roman"/>
+          <w:color w:val="000000"/>
+          <w:sz w:val="32"/>
+          <w:szCs w:val="32"/>
+          <w:u w:val="single"/>
+        </w:rPr>
+        <w:t>encoder :</w:t>
+      </w:r>
+      <w:proofErr w:type="gramEnd"/>
+    </w:p>
+    <w:p>
+      <w:pPr>
+        <w:pStyle w:val="ListParagraph"/>
+        <w:pBdr>
+          <w:top w:val="nil"/>
+          <w:left w:val="nil"/>
+          <w:bottom w:val="nil"/>
+          <w:right w:val="nil"/>
+          <w:between w:val="nil"/>
+        </w:pBdr>
+        <w:spacing w:after="0"/>
+        <w:ind w:left="1980"/>
+        <w:rPr>
+          <w:rFonts w:ascii="Times New Roman" w:eastAsia="Times New Roman" w:hAnsi="Times New Roman" w:cs="Times New Roman"/>
+          <w:color w:val="000000"/>
+          <w:sz w:val="32"/>
+          <w:szCs w:val="32"/>
+          <w:u w:val="single"/>
+        </w:rPr>
+      </w:pPr>
+      <w:hyperlink r:id="rId41" w:history="1">
+        <w:r>
+          <w:rPr>
+            <w:rStyle w:val="Hyperlink"/>
+            <w:rFonts w:ascii="Times New Roman" w:eastAsia="Times New Roman" w:hAnsi="Times New Roman" w:cs="Times New Roman"/>
+            <w:sz w:val="32"/>
+            <w:szCs w:val="32"/>
+          </w:rPr>
+          <w:t>https://youtu.be/fViyGihzAeg?si=91956GD7HR71GUep</w:t>
+        </w:r>
+      </w:hyperlink>
+    </w:p>
+    <w:p>
+      <w:pPr>
+        <w:pStyle w:val="ListParagraph"/>
+        <w:numPr>
+          <w:ilvl w:val="0"/>
+          <w:numId w:val="18"/>
+        </w:numPr>
+        <w:pBdr>
+          <w:top w:val="nil"/>
+          <w:left w:val="nil"/>
+          <w:bottom w:val="nil"/>
+          <w:right w:val="nil"/>
+          <w:between w:val="nil"/>
+        </w:pBdr>
+        <w:spacing w:after="0"/>
+        <w:rPr>
+          <w:rFonts w:ascii="Times New Roman" w:eastAsia="Times New Roman" w:hAnsi="Times New Roman" w:cs="Times New Roman"/>
+          <w:color w:val="000000"/>
+          <w:sz w:val="32"/>
+          <w:szCs w:val="32"/>
+          <w:u w:val="single"/>
+        </w:rPr>
+      </w:pPr>
+      <w:r>
+        <w:rPr>
+          <w:rFonts w:ascii="Times New Roman" w:eastAsia="Times New Roman" w:hAnsi="Times New Roman" w:cs="Times New Roman"/>
+          <w:color w:val="000000"/>
+          <w:sz w:val="32"/>
+          <w:szCs w:val="32"/>
+          <w:u w:val="single"/>
+        </w:rPr>
+        <w:t xml:space="preserve">Octal to Binary </w:t>
+      </w:r>
+      <w:proofErr w:type="gramStart"/>
+      <w:r>
+        <w:rPr>
+          <w:rFonts w:ascii="Times New Roman" w:eastAsia="Times New Roman" w:hAnsi="Times New Roman" w:cs="Times New Roman"/>
+          <w:color w:val="000000"/>
+          <w:sz w:val="32"/>
+          <w:szCs w:val="32"/>
+          <w:u w:val="single"/>
+        </w:rPr>
+        <w:t>encoder :</w:t>
+      </w:r>
+      <w:proofErr w:type="gramEnd"/>
+      <w:r>
+        <w:rPr>
+          <w:rFonts w:ascii="Times New Roman" w:eastAsia="Times New Roman" w:hAnsi="Times New Roman" w:cs="Times New Roman"/>
+          <w:color w:val="000000"/>
+          <w:sz w:val="32"/>
+          <w:szCs w:val="32"/>
+          <w:u w:val="single"/>
+        </w:rPr>
+        <w:t xml:space="preserve"> </w:t>
+      </w:r>
+    </w:p>
+    <w:p>
+      <w:pPr>
+        <w:pStyle w:val="ListParagraph"/>
+        <w:pBdr>
+          <w:top w:val="nil"/>
+          <w:left w:val="nil"/>
+          <w:bottom w:val="nil"/>
+          <w:right w:val="nil"/>
+          <w:between w:val="nil"/>
+        </w:pBdr>
+        <w:spacing w:after="0"/>
+        <w:ind w:left="1980"/>
+        <w:rPr>
+          <w:rFonts w:ascii="Times New Roman" w:eastAsia="Times New Roman" w:hAnsi="Times New Roman" w:cs="Times New Roman"/>
+          <w:color w:val="000000"/>
+          <w:sz w:val="32"/>
+          <w:szCs w:val="32"/>
+          <w:u w:val="single"/>
+        </w:rPr>
+      </w:pPr>
+      <w:hyperlink r:id="rId42" w:history="1">
+        <w:r>
+          <w:rPr>
+            <w:rStyle w:val="Hyperlink"/>
+            <w:rFonts w:ascii="Times New Roman" w:eastAsia="Times New Roman" w:hAnsi="Times New Roman" w:cs="Times New Roman"/>
+            <w:sz w:val="32"/>
+            <w:szCs w:val="32"/>
+          </w:rPr>
+          <w:t>https://youtu.be/IgaTy_Tm2_M?si=-JHXjUS67daCjXib</w:t>
+        </w:r>
+      </w:hyperlink>
+    </w:p>
+    <w:p>
+      <w:pPr>
+        <w:pStyle w:val="ListParagraph"/>
+        <w:numPr>
+          <w:ilvl w:val="0"/>
+          <w:numId w:val="18"/>
+        </w:numPr>
+        <w:pBdr>
+          <w:top w:val="nil"/>
+          <w:left w:val="nil"/>
+          <w:bottom w:val="nil"/>
+          <w:right w:val="nil"/>
+          <w:between w:val="nil"/>
+        </w:pBdr>
+        <w:spacing w:after="0"/>
+        <w:rPr>
+          <w:rFonts w:ascii="Times New Roman" w:eastAsia="Times New Roman" w:hAnsi="Times New Roman" w:cs="Times New Roman"/>
+          <w:color w:val="000000"/>
+          <w:sz w:val="32"/>
+          <w:szCs w:val="32"/>
+          <w:u w:val="single"/>
+        </w:rPr>
+      </w:pPr>
+      <w:r>
+        <w:rPr>
+          <w:rFonts w:ascii="Times New Roman" w:eastAsia="Times New Roman" w:hAnsi="Times New Roman" w:cs="Times New Roman"/>
+          <w:color w:val="000000"/>
+          <w:sz w:val="32"/>
+          <w:szCs w:val="32"/>
+          <w:u w:val="single"/>
+        </w:rPr>
+        <w:t xml:space="preserve">HEX to binary </w:t>
+      </w:r>
+      <w:proofErr w:type="gramStart"/>
+      <w:r>
+        <w:rPr>
+          <w:rFonts w:ascii="Times New Roman" w:eastAsia="Times New Roman" w:hAnsi="Times New Roman" w:cs="Times New Roman"/>
+          <w:color w:val="000000"/>
+          <w:sz w:val="32"/>
+          <w:szCs w:val="32"/>
+          <w:u w:val="single"/>
+        </w:rPr>
+        <w:t>encoder :</w:t>
+      </w:r>
+      <w:proofErr w:type="gramEnd"/>
+    </w:p>
+    <w:p>
+      <w:pPr>
+        <w:pStyle w:val="ListParagraph"/>
+        <w:pBdr>
+          <w:top w:val="nil"/>
+          <w:left w:val="nil"/>
+          <w:bottom w:val="nil"/>
+          <w:right w:val="nil"/>
+          <w:between w:val="nil"/>
+        </w:pBdr>
+        <w:spacing w:after="0"/>
+        <w:ind w:left="1980"/>
+        <w:rPr>
+          <w:rFonts w:ascii="Times New Roman" w:eastAsia="Times New Roman" w:hAnsi="Times New Roman" w:cs="Times New Roman"/>
+          <w:color w:val="000000"/>
+          <w:sz w:val="32"/>
+          <w:szCs w:val="32"/>
+          <w:u w:val="single"/>
+        </w:rPr>
+      </w:pPr>
+      <w:hyperlink r:id="rId43" w:history="1">
+        <w:r>
+          <w:rPr>
+            <w:rStyle w:val="Hyperlink"/>
+            <w:rFonts w:ascii="Times New Roman" w:eastAsia="Times New Roman" w:hAnsi="Times New Roman" w:cs="Times New Roman"/>
+            <w:sz w:val="32"/>
+            <w:szCs w:val="32"/>
+          </w:rPr>
+          <w:t>https://youtu.be/6R-ZC8rLqm8?si=yOhcZXFT-17dZGh1</w:t>
+        </w:r>
+      </w:hyperlink>
+    </w:p>
+    <w:p>
+      <w:pPr>
+        <w:pStyle w:val="ListParagraph"/>
+        <w:numPr>
+          <w:ilvl w:val="0"/>
+          <w:numId w:val="18"/>
+        </w:numPr>
+        <w:pBdr>
+          <w:top w:val="nil"/>
+          <w:left w:val="nil"/>
+          <w:bottom w:val="nil"/>
+          <w:right w:val="nil"/>
+          <w:between w:val="nil"/>
+        </w:pBdr>
+        <w:spacing w:after="0"/>
+        <w:rPr>
+          <w:rFonts w:ascii="Times New Roman" w:eastAsia="Times New Roman" w:hAnsi="Times New Roman" w:cs="Times New Roman"/>
+          <w:color w:val="000000"/>
+          <w:sz w:val="32"/>
+          <w:szCs w:val="32"/>
+          <w:u w:val="single"/>
+        </w:rPr>
+      </w:pPr>
+      <w:r>
+        <w:rPr>
+          <w:rFonts w:ascii="Times New Roman" w:eastAsia="Times New Roman" w:hAnsi="Times New Roman" w:cs="Times New Roman"/>
+          <w:color w:val="000000"/>
+          <w:sz w:val="32"/>
+          <w:szCs w:val="32"/>
+          <w:u w:val="single"/>
+        </w:rPr>
+        <w:t xml:space="preserve">Full Adder using </w:t>
+      </w:r>
+      <w:proofErr w:type="gramStart"/>
+      <w:r>
+        <w:rPr>
+          <w:rFonts w:ascii="Times New Roman" w:eastAsia="Times New Roman" w:hAnsi="Times New Roman" w:cs="Times New Roman"/>
+          <w:color w:val="000000"/>
+          <w:sz w:val="32"/>
+          <w:szCs w:val="32"/>
+          <w:u w:val="single"/>
+        </w:rPr>
+        <w:t>Decoders :</w:t>
+      </w:r>
+      <w:proofErr w:type="gramEnd"/>
+    </w:p>
+    <w:p>
+      <w:pPr>
+        <w:pStyle w:val="ListParagraph"/>
+        <w:pBdr>
+          <w:top w:val="nil"/>
+          <w:left w:val="nil"/>
+          <w:bottom w:val="nil"/>
+          <w:right w:val="nil"/>
+          <w:between w:val="nil"/>
+        </w:pBdr>
+        <w:spacing w:after="0"/>
+        <w:ind w:left="1980"/>
+        <w:rPr>
+          <w:rFonts w:ascii="Times New Roman" w:eastAsia="Times New Roman" w:hAnsi="Times New Roman" w:cs="Times New Roman"/>
+          <w:color w:val="000000"/>
+          <w:sz w:val="32"/>
+          <w:szCs w:val="32"/>
+          <w:u w:val="single"/>
+        </w:rPr>
+      </w:pPr>
+      <w:hyperlink r:id="rId44" w:history="1">
+        <w:r>
+          <w:rPr>
+            <w:rStyle w:val="Hyperlink"/>
+            <w:rFonts w:ascii="Times New Roman" w:eastAsia="Times New Roman" w:hAnsi="Times New Roman" w:cs="Times New Roman"/>
+            <w:sz w:val="32"/>
+            <w:szCs w:val="32"/>
+          </w:rPr>
+          <w:t>https://youtu.be/z9jTPA4Q9b8?si=jVzH4Lkr9Cso6_Yk</w:t>
+        </w:r>
+      </w:hyperlink>
+    </w:p>
+    <w:p>
+      <w:pPr>
+        <w:pStyle w:val="ListParagraph"/>
+        <w:pBdr>
+          <w:top w:val="nil"/>
+          <w:left w:val="nil"/>
+          <w:bottom w:val="nil"/>
+          <w:right w:val="nil"/>
+          <w:between w:val="nil"/>
+        </w:pBdr>
+        <w:spacing w:after="0"/>
+        <w:rPr>
+          <w:rFonts w:ascii="Times New Roman" w:eastAsia="Times New Roman" w:hAnsi="Times New Roman" w:cs="Times New Roman"/>
+          <w:b/>
+          <w:bCs/>
+          <w:color w:val="000000"/>
+          <w:sz w:val="32"/>
+          <w:szCs w:val="32"/>
+        </w:rPr>
+      </w:pPr>
+    </w:p>
+    <w:p>
+      <w:pPr>
+        <w:pStyle w:val="ListParagraph"/>
+        <w:numPr>
+          <w:ilvl w:val="0"/>
+          <w:numId w:val="13"/>
+        </w:numPr>
+        <w:pBdr>
+          <w:top w:val="nil"/>
+          <w:left w:val="nil"/>
+          <w:bottom w:val="nil"/>
+          <w:right w:val="nil"/>
+          <w:between w:val="nil"/>
+        </w:pBdr>
+        <w:spacing w:after="0"/>
+        <w:rPr>
+          <w:rFonts w:ascii="Times New Roman" w:eastAsia="Times New Roman" w:hAnsi="Times New Roman" w:cs="Times New Roman"/>
+          <w:b/>
+          <w:bCs/>
+          <w:color w:val="000000"/>
+          <w:sz w:val="36"/>
+          <w:szCs w:val="36"/>
+          <w:u w:val="single"/>
+        </w:rPr>
+      </w:pPr>
+      <w:r>
+        <w:rPr>
+          <w:rFonts w:ascii="Times New Roman" w:eastAsia="Times New Roman" w:hAnsi="Times New Roman" w:cs="Times New Roman"/>
+          <w:b/>
+          <w:bCs/>
+          <w:color w:val="000000"/>
+          <w:sz w:val="36"/>
+          <w:szCs w:val="36"/>
+          <w:u w:val="single"/>
+        </w:rPr>
+        <w:t xml:space="preserve">Sequential </w:t>
+      </w:r>
+      <w:proofErr w:type="gramStart"/>
+      <w:r>
+        <w:rPr>
+          <w:rFonts w:ascii="Times New Roman" w:eastAsia="Times New Roman" w:hAnsi="Times New Roman" w:cs="Times New Roman"/>
+          <w:b/>
+          <w:bCs/>
+          <w:color w:val="000000"/>
+          <w:sz w:val="36"/>
+          <w:szCs w:val="36"/>
+          <w:u w:val="single"/>
+        </w:rPr>
+        <w:t>Circuits :</w:t>
+      </w:r>
+      <w:proofErr w:type="gramEnd"/>
+    </w:p>
+    <w:p>
+      <w:pPr>
+        <w:pStyle w:val="ListParagraph"/>
+        <w:numPr>
+          <w:ilvl w:val="0"/>
+          <w:numId w:val="21"/>
+        </w:numPr>
+        <w:pBdr>
+          <w:top w:val="nil"/>
+          <w:left w:val="nil"/>
+          <w:bottom w:val="nil"/>
+          <w:right w:val="nil"/>
+          <w:between w:val="nil"/>
+        </w:pBdr>
+        <w:spacing w:after="0"/>
+        <w:rPr>
+          <w:rFonts w:ascii="Times New Roman" w:eastAsia="Times New Roman" w:hAnsi="Times New Roman" w:cs="Times New Roman"/>
+          <w:b/>
+          <w:bCs/>
+          <w:color w:val="000000"/>
+          <w:sz w:val="36"/>
+          <w:szCs w:val="36"/>
+        </w:rPr>
+      </w:pPr>
+      <w:r>
+        <w:rPr>
+          <w:rFonts w:ascii="Times New Roman" w:eastAsia="Times New Roman" w:hAnsi="Times New Roman" w:cs="Times New Roman"/>
+          <w:b/>
+          <w:bCs/>
+          <w:color w:val="000000"/>
+          <w:sz w:val="36"/>
+          <w:szCs w:val="36"/>
+        </w:rPr>
+        <w:t>Flip-</w:t>
+      </w:r>
+      <w:proofErr w:type="gramStart"/>
+      <w:r>
+        <w:rPr>
+          <w:rFonts w:ascii="Times New Roman" w:eastAsia="Times New Roman" w:hAnsi="Times New Roman" w:cs="Times New Roman"/>
+          <w:b/>
+          <w:bCs/>
+          <w:color w:val="000000"/>
+          <w:sz w:val="36"/>
+          <w:szCs w:val="36"/>
+        </w:rPr>
+        <w:t>Flops :</w:t>
+      </w:r>
+      <w:proofErr w:type="gramEnd"/>
+    </w:p>
+    <w:p>
+      <w:pPr>
+        <w:pStyle w:val="ListParagraph"/>
+        <w:numPr>
+          <w:ilvl w:val="0"/>
+          <w:numId w:val="21"/>
+        </w:numPr>
+        <w:pBdr>
+          <w:top w:val="nil"/>
+          <w:left w:val="nil"/>
+          <w:bottom w:val="nil"/>
+          <w:right w:val="nil"/>
+          <w:between w:val="nil"/>
+        </w:pBdr>
+        <w:spacing w:after="0"/>
+        <w:rPr>
+          <w:rFonts w:ascii="Times New Roman" w:eastAsia="Times New Roman" w:hAnsi="Times New Roman" w:cs="Times New Roman"/>
+          <w:b/>
+          <w:bCs/>
+          <w:color w:val="000000"/>
+          <w:sz w:val="36"/>
+          <w:szCs w:val="36"/>
+        </w:rPr>
+      </w:pPr>
+      <w:proofErr w:type="gramStart"/>
+      <w:r>
+        <w:rPr>
+          <w:rFonts w:ascii="Times New Roman" w:eastAsia="Times New Roman" w:hAnsi="Times New Roman" w:cs="Times New Roman"/>
+          <w:b/>
+          <w:bCs/>
+          <w:color w:val="000000"/>
+          <w:sz w:val="36"/>
+          <w:szCs w:val="36"/>
+        </w:rPr>
+        <w:t>Counters :</w:t>
+      </w:r>
+      <w:proofErr w:type="gramEnd"/>
+    </w:p>
+    <w:p>
+      <w:pPr>
+        <w:pStyle w:val="ListParagraph"/>
+        <w:numPr>
+          <w:ilvl w:val="0"/>
+          <w:numId w:val="21"/>
+        </w:numPr>
+        <w:pBdr>
+          <w:top w:val="nil"/>
+          <w:left w:val="nil"/>
+          <w:bottom w:val="nil"/>
+          <w:right w:val="nil"/>
+          <w:between w:val="nil"/>
+        </w:pBdr>
+        <w:spacing w:after="0"/>
+        <w:rPr>
+          <w:rFonts w:ascii="Times New Roman" w:eastAsia="Times New Roman" w:hAnsi="Times New Roman" w:cs="Times New Roman"/>
+          <w:b/>
+          <w:bCs/>
+          <w:color w:val="000000"/>
+          <w:sz w:val="36"/>
+          <w:szCs w:val="36"/>
+        </w:rPr>
+      </w:pPr>
+      <w:proofErr w:type="gramStart"/>
+      <w:r>
+        <w:rPr>
+          <w:rFonts w:ascii="Times New Roman" w:eastAsia="Times New Roman" w:hAnsi="Times New Roman" w:cs="Times New Roman"/>
+          <w:b/>
+          <w:bCs/>
+          <w:color w:val="000000"/>
+          <w:sz w:val="36"/>
+          <w:szCs w:val="36"/>
+        </w:rPr>
+        <w:t>Registers :</w:t>
+      </w:r>
+      <w:proofErr w:type="gramEnd"/>
+    </w:p>
+    <w:p>
+      <w:pPr>
+        <w:pStyle w:val="ListParagraph"/>
+        <w:numPr>
+          <w:ilvl w:val="0"/>
+          <w:numId w:val="13"/>
+        </w:numPr>
+        <w:pBdr>
+          <w:top w:val="nil"/>
+          <w:left w:val="nil"/>
+          <w:bottom w:val="nil"/>
+          <w:right w:val="nil"/>
+          <w:between w:val="nil"/>
+        </w:pBdr>
+        <w:spacing w:after="0"/>
+        <w:rPr>
+          <w:rFonts w:ascii="Times New Roman" w:eastAsia="Times New Roman" w:hAnsi="Times New Roman" w:cs="Times New Roman"/>
+          <w:b/>
+          <w:bCs/>
+          <w:color w:val="000000"/>
+          <w:sz w:val="36"/>
+          <w:szCs w:val="36"/>
+        </w:rPr>
+      </w:pPr>
+      <w:r>
+        <w:rPr>
+          <w:rFonts w:ascii="Times New Roman" w:eastAsia="Times New Roman" w:hAnsi="Times New Roman" w:cs="Times New Roman"/>
+          <w:b/>
+          <w:bCs/>
+          <w:color w:val="000000"/>
+          <w:sz w:val="36"/>
+          <w:szCs w:val="36"/>
+        </w:rPr>
+        <w:t xml:space="preserve">RAM, ROM, PLA, PAL, ADC, </w:t>
+      </w:r>
+      <w:proofErr w:type="gramStart"/>
+      <w:r>
+        <w:rPr>
+          <w:rFonts w:ascii="Times New Roman" w:eastAsia="Times New Roman" w:hAnsi="Times New Roman" w:cs="Times New Roman"/>
+          <w:b/>
+          <w:bCs/>
+          <w:color w:val="000000"/>
+          <w:sz w:val="36"/>
+          <w:szCs w:val="36"/>
+        </w:rPr>
+        <w:t>DAC :</w:t>
+      </w:r>
+      <w:proofErr w:type="gramEnd"/>
+      <w:r>
+        <w:rPr>
+          <w:rFonts w:ascii="Times New Roman" w:eastAsia="Times New Roman" w:hAnsi="Times New Roman" w:cs="Times New Roman"/>
+          <w:b/>
+          <w:bCs/>
+          <w:color w:val="000000"/>
+          <w:sz w:val="36"/>
+          <w:szCs w:val="36"/>
+        </w:rPr>
+        <w:t>-</w:t>
+      </w:r>
+    </w:p>
+    <w:p>
+      <w:pPr>
+        <w:pStyle w:val="ListParagraph"/>
+        <w:pBdr>
+          <w:top w:val="nil"/>
+          <w:left w:val="nil"/>
+          <w:bottom w:val="nil"/>
+          <w:right w:val="nil"/>
+          <w:between w:val="nil"/>
+        </w:pBdr>
+        <w:spacing w:after="0"/>
+        <w:rPr>
+          <w:rFonts w:ascii="Times New Roman" w:eastAsia="Times New Roman" w:hAnsi="Times New Roman" w:cs="Times New Roman"/>
+          <w:b/>
+          <w:bCs/>
+          <w:color w:val="000000"/>
+          <w:sz w:val="32"/>
+          <w:szCs w:val="32"/>
+        </w:rPr>
+      </w:pPr>
+      <w:r>
+        <w:rPr>
+          <w:rFonts w:ascii="Times New Roman" w:eastAsia="Times New Roman" w:hAnsi="Times New Roman" w:cs="Times New Roman"/>
+          <w:b/>
+          <w:bCs/>
+          <w:color w:val="000000"/>
+          <w:sz w:val="32"/>
+          <w:szCs w:val="32"/>
+        </w:rPr>
+        <w:t xml:space="preserve">ROM, PLA, </w:t>
+      </w:r>
+      <w:proofErr w:type="gramStart"/>
+      <w:r>
+        <w:rPr>
+          <w:rFonts w:ascii="Times New Roman" w:eastAsia="Times New Roman" w:hAnsi="Times New Roman" w:cs="Times New Roman"/>
+          <w:b/>
+          <w:bCs/>
+          <w:color w:val="000000"/>
+          <w:sz w:val="32"/>
+          <w:szCs w:val="32"/>
+        </w:rPr>
+        <w:t>PAL :</w:t>
+      </w:r>
+      <w:proofErr w:type="gramEnd"/>
+      <w:r>
+        <w:rPr>
+          <w:rFonts w:ascii="Times New Roman" w:eastAsia="Times New Roman" w:hAnsi="Times New Roman" w:cs="Times New Roman"/>
+          <w:b/>
+          <w:bCs/>
+          <w:color w:val="000000"/>
+          <w:sz w:val="32"/>
+          <w:szCs w:val="32"/>
+        </w:rPr>
+        <w:t xml:space="preserve"> </w:t>
+      </w:r>
+      <w:hyperlink r:id="rId45" w:history="1">
         <w:r>
           <w:rPr>
             <w:rStyle w:val="Hyperlink"/>
@@ -3327,7 +4716,96 @@
             <w:sz w:val="32"/>
             <w:szCs w:val="32"/>
           </w:rPr>
-          <w:t>https://www.youtube.com/watch?v=KDZ-SI7OHNY&amp;list=PL-IC1WV1OE4m3hb-LfCYJ3MOkJD3v9XQT&amp;pp=0gcJCbUEOCosWNin</w:t>
+          <w:t>https://youtu.be/4QuTRDriPwc?si=VPCZStWsqlqOjfzl</w:t>
+        </w:r>
+      </w:hyperlink>
+    </w:p>
+    <w:p>
+      <w:pPr>
+        <w:pStyle w:val="ListParagraph"/>
+        <w:pBdr>
+          <w:top w:val="nil"/>
+          <w:left w:val="nil"/>
+          <w:bottom w:val="nil"/>
+          <w:right w:val="nil"/>
+          <w:between w:val="nil"/>
+        </w:pBdr>
+        <w:spacing w:after="0"/>
+        <w:rPr>
+          <w:rFonts w:ascii="Times New Roman" w:eastAsia="Times New Roman" w:hAnsi="Times New Roman" w:cs="Times New Roman"/>
+          <w:b/>
+          <w:bCs/>
+          <w:color w:val="000000"/>
+          <w:sz w:val="32"/>
+          <w:szCs w:val="32"/>
+        </w:rPr>
+      </w:pPr>
+    </w:p>
+    <w:p>
+      <w:pPr>
+        <w:pStyle w:val="ListParagraph"/>
+        <w:pBdr>
+          <w:top w:val="nil"/>
+          <w:left w:val="nil"/>
+          <w:bottom w:val="nil"/>
+          <w:right w:val="nil"/>
+          <w:between w:val="nil"/>
+        </w:pBdr>
+        <w:spacing w:after="0"/>
+        <w:rPr>
+          <w:rFonts w:ascii="Times New Roman" w:eastAsia="Times New Roman" w:hAnsi="Times New Roman" w:cs="Times New Roman"/>
+          <w:b/>
+          <w:bCs/>
+          <w:color w:val="000000"/>
+          <w:sz w:val="32"/>
+          <w:szCs w:val="32"/>
+        </w:rPr>
+      </w:pPr>
+      <w:proofErr w:type="gramStart"/>
+      <w:r>
+        <w:rPr>
+          <w:rFonts w:ascii="Times New Roman" w:eastAsia="Times New Roman" w:hAnsi="Times New Roman" w:cs="Times New Roman"/>
+          <w:b/>
+          <w:bCs/>
+          <w:color w:val="000000"/>
+          <w:sz w:val="32"/>
+          <w:szCs w:val="32"/>
+        </w:rPr>
+        <w:t>Playlist :</w:t>
+      </w:r>
+      <w:proofErr w:type="gramEnd"/>
+    </w:p>
+    <w:p>
+      <w:pPr>
+        <w:pStyle w:val="ListParagraph"/>
+        <w:pBdr>
+          <w:top w:val="nil"/>
+          <w:left w:val="nil"/>
+          <w:bottom w:val="nil"/>
+          <w:right w:val="nil"/>
+          <w:between w:val="nil"/>
+        </w:pBdr>
+        <w:spacing w:after="0"/>
+        <w:rPr>
+          <w:rFonts w:ascii="Times New Roman" w:eastAsia="Times New Roman" w:hAnsi="Times New Roman" w:cs="Times New Roman"/>
+          <w:b/>
+          <w:bCs/>
+          <w:color w:val="000000"/>
+          <w:sz w:val="32"/>
+          <w:szCs w:val="32"/>
+        </w:rPr>
+      </w:pPr>
+      <w:hyperlink r:id="rId46" w:history="1">
+        <w:r>
+          <w:rPr>
+            <w:rStyle w:val="Hyperlink"/>
+            <w:rFonts w:ascii="Times New Roman" w:eastAsia="Times New Roman" w:hAnsi="Times New Roman" w:cs="Times New Roman"/>
+            <w:b/>
+            <w:bCs/>
+            <w:sz w:val="32"/>
+            <w:szCs w:val="32"/>
+          </w:rPr>
+          <w:t>https://youtube.com/playlist?list=PLgwJf8NK-2e5u5TZVnnLVUJj2Ax-bYJPc&amp;si=HxgeY_x_0bbntr7M</w:t>
         </w:r>
       </w:hyperlink>
     </w:p>
@@ -3376,27 +4854,315 @@
           <w:szCs w:val="32"/>
         </w:rPr>
       </w:pPr>
-      <w:proofErr w:type="spellStart"/>
-      <w:r>
-        <w:rPr>
-          <w:rFonts w:ascii="Times New Roman" w:eastAsia="Times New Roman" w:hAnsi="Times New Roman" w:cs="Times New Roman"/>
-          <w:b/>
-          <w:bCs/>
-          <w:color w:val="000000"/>
-          <w:sz w:val="32"/>
-          <w:szCs w:val="32"/>
-        </w:rPr>
-        <w:t>Fd</w:t>
-      </w:r>
-      <w:proofErr w:type="spellEnd"/>
-    </w:p>
-    <w:p>
-      <w:pPr>
-        <w:pStyle w:val="ListParagraph"/>
-        <w:numPr>
-          <w:ilvl w:val="0"/>
-          <w:numId w:val="13"/>
-        </w:numPr>
+      <w:r>
+        <w:rPr>
+          <w:rFonts w:ascii="Times New Roman" w:eastAsia="Times New Roman" w:hAnsi="Times New Roman" w:cs="Times New Roman"/>
+          <w:b/>
+          <w:bCs/>
+          <w:color w:val="000000"/>
+          <w:sz w:val="32"/>
+          <w:szCs w:val="32"/>
+        </w:rPr>
+        <w:t>F</w:t>
+      </w:r>
+    </w:p>
+    <w:p>
+      <w:pPr>
+        <w:pStyle w:val="ListParagraph"/>
+        <w:pBdr>
+          <w:top w:val="nil"/>
+          <w:left w:val="nil"/>
+          <w:bottom w:val="nil"/>
+          <w:right w:val="nil"/>
+          <w:between w:val="nil"/>
+        </w:pBdr>
+        <w:spacing w:after="0"/>
+        <w:rPr>
+          <w:rFonts w:ascii="Times New Roman" w:eastAsia="Times New Roman" w:hAnsi="Times New Roman" w:cs="Times New Roman"/>
+          <w:b/>
+          <w:bCs/>
+          <w:color w:val="000000"/>
+          <w:sz w:val="32"/>
+          <w:szCs w:val="32"/>
+        </w:rPr>
+      </w:pPr>
+    </w:p>
+    <w:p>
+      <w:pPr>
+        <w:pStyle w:val="ListParagraph"/>
+        <w:pBdr>
+          <w:top w:val="nil"/>
+          <w:left w:val="nil"/>
+          <w:bottom w:val="nil"/>
+          <w:right w:val="nil"/>
+          <w:between w:val="nil"/>
+        </w:pBdr>
+        <w:spacing w:after="0"/>
+        <w:rPr>
+          <w:rFonts w:ascii="Times New Roman" w:eastAsia="Times New Roman" w:hAnsi="Times New Roman" w:cs="Times New Roman"/>
+          <w:b/>
+          <w:bCs/>
+          <w:color w:val="000000"/>
+          <w:sz w:val="32"/>
+          <w:szCs w:val="32"/>
+        </w:rPr>
+      </w:pPr>
+    </w:p>
+    <w:p>
+      <w:pPr>
+        <w:pStyle w:val="ListParagraph"/>
+        <w:pBdr>
+          <w:top w:val="nil"/>
+          <w:left w:val="nil"/>
+          <w:bottom w:val="nil"/>
+          <w:right w:val="nil"/>
+          <w:between w:val="nil"/>
+        </w:pBdr>
+        <w:spacing w:after="0"/>
+        <w:rPr>
+          <w:rFonts w:ascii="Times New Roman" w:eastAsia="Times New Roman" w:hAnsi="Times New Roman" w:cs="Times New Roman"/>
+          <w:b/>
+          <w:bCs/>
+          <w:color w:val="000000"/>
+          <w:sz w:val="32"/>
+          <w:szCs w:val="32"/>
+        </w:rPr>
+      </w:pPr>
+    </w:p>
+    <w:p>
+      <w:pPr>
+        <w:pStyle w:val="ListParagraph"/>
+        <w:pBdr>
+          <w:top w:val="nil"/>
+          <w:left w:val="nil"/>
+          <w:bottom w:val="nil"/>
+          <w:right w:val="nil"/>
+          <w:between w:val="nil"/>
+        </w:pBdr>
+        <w:spacing w:after="0"/>
+        <w:rPr>
+          <w:rFonts w:ascii="Times New Roman" w:eastAsia="Times New Roman" w:hAnsi="Times New Roman" w:cs="Times New Roman"/>
+          <w:b/>
+          <w:bCs/>
+          <w:color w:val="000000"/>
+          <w:sz w:val="32"/>
+          <w:szCs w:val="32"/>
+        </w:rPr>
+      </w:pPr>
+    </w:p>
+    <w:p>
+      <w:pPr>
+        <w:pStyle w:val="ListParagraph"/>
+        <w:pBdr>
+          <w:top w:val="nil"/>
+          <w:left w:val="nil"/>
+          <w:bottom w:val="nil"/>
+          <w:right w:val="nil"/>
+          <w:between w:val="nil"/>
+        </w:pBdr>
+        <w:spacing w:after="0"/>
+        <w:rPr>
+          <w:rFonts w:ascii="Times New Roman" w:eastAsia="Times New Roman" w:hAnsi="Times New Roman" w:cs="Times New Roman"/>
+          <w:b/>
+          <w:bCs/>
+          <w:color w:val="000000"/>
+          <w:sz w:val="32"/>
+          <w:szCs w:val="32"/>
+        </w:rPr>
+      </w:pPr>
+    </w:p>
+    <w:p>
+      <w:pPr>
+        <w:pStyle w:val="ListParagraph"/>
+        <w:pBdr>
+          <w:top w:val="nil"/>
+          <w:left w:val="nil"/>
+          <w:bottom w:val="nil"/>
+          <w:right w:val="nil"/>
+          <w:between w:val="nil"/>
+        </w:pBdr>
+        <w:spacing w:after="0"/>
+        <w:rPr>
+          <w:rFonts w:ascii="Times New Roman" w:eastAsia="Times New Roman" w:hAnsi="Times New Roman" w:cs="Times New Roman"/>
+          <w:b/>
+          <w:bCs/>
+          <w:color w:val="000000"/>
+          <w:sz w:val="32"/>
+          <w:szCs w:val="32"/>
+        </w:rPr>
+      </w:pPr>
+    </w:p>
+    <w:p>
+      <w:pPr>
+        <w:pStyle w:val="ListParagraph"/>
+        <w:pBdr>
+          <w:top w:val="nil"/>
+          <w:left w:val="nil"/>
+          <w:bottom w:val="nil"/>
+          <w:right w:val="nil"/>
+          <w:between w:val="nil"/>
+        </w:pBdr>
+        <w:spacing w:after="0"/>
+        <w:rPr>
+          <w:rFonts w:ascii="Times New Roman" w:eastAsia="Times New Roman" w:hAnsi="Times New Roman" w:cs="Times New Roman"/>
+          <w:b/>
+          <w:bCs/>
+          <w:color w:val="000000"/>
+          <w:sz w:val="32"/>
+          <w:szCs w:val="32"/>
+        </w:rPr>
+      </w:pPr>
+    </w:p>
+    <w:p>
+      <w:pPr>
+        <w:pStyle w:val="ListParagraph"/>
+        <w:pBdr>
+          <w:top w:val="nil"/>
+          <w:left w:val="nil"/>
+          <w:bottom w:val="nil"/>
+          <w:right w:val="nil"/>
+          <w:between w:val="nil"/>
+        </w:pBdr>
+        <w:spacing w:after="0"/>
+        <w:rPr>
+          <w:rFonts w:ascii="Times New Roman" w:eastAsia="Times New Roman" w:hAnsi="Times New Roman" w:cs="Times New Roman"/>
+          <w:b/>
+          <w:bCs/>
+          <w:color w:val="000000"/>
+          <w:sz w:val="32"/>
+          <w:szCs w:val="32"/>
+        </w:rPr>
+      </w:pPr>
+    </w:p>
+    <w:p>
+      <w:pPr>
+        <w:pStyle w:val="ListParagraph"/>
+        <w:pBdr>
+          <w:top w:val="nil"/>
+          <w:left w:val="nil"/>
+          <w:bottom w:val="nil"/>
+          <w:right w:val="nil"/>
+          <w:between w:val="nil"/>
+        </w:pBdr>
+        <w:spacing w:after="0"/>
+        <w:rPr>
+          <w:rFonts w:ascii="Times New Roman" w:eastAsia="Times New Roman" w:hAnsi="Times New Roman" w:cs="Times New Roman"/>
+          <w:b/>
+          <w:bCs/>
+          <w:color w:val="000000"/>
+          <w:sz w:val="32"/>
+          <w:szCs w:val="32"/>
+        </w:rPr>
+      </w:pPr>
+    </w:p>
+    <w:p>
+      <w:pPr>
+        <w:pStyle w:val="ListParagraph"/>
+        <w:pBdr>
+          <w:top w:val="nil"/>
+          <w:left w:val="nil"/>
+          <w:bottom w:val="nil"/>
+          <w:right w:val="nil"/>
+          <w:between w:val="nil"/>
+        </w:pBdr>
+        <w:spacing w:after="0"/>
+        <w:rPr>
+          <w:rFonts w:ascii="Times New Roman" w:eastAsia="Times New Roman" w:hAnsi="Times New Roman" w:cs="Times New Roman"/>
+          <w:b/>
+          <w:bCs/>
+          <w:color w:val="000000"/>
+          <w:sz w:val="32"/>
+          <w:szCs w:val="32"/>
+        </w:rPr>
+      </w:pPr>
+    </w:p>
+    <w:p>
+      <w:pPr>
+        <w:pStyle w:val="ListParagraph"/>
+        <w:pBdr>
+          <w:top w:val="nil"/>
+          <w:left w:val="nil"/>
+          <w:bottom w:val="nil"/>
+          <w:right w:val="nil"/>
+          <w:between w:val="nil"/>
+        </w:pBdr>
+        <w:spacing w:after="0"/>
+        <w:rPr>
+          <w:rFonts w:ascii="Times New Roman" w:eastAsia="Times New Roman" w:hAnsi="Times New Roman" w:cs="Times New Roman"/>
+          <w:b/>
+          <w:bCs/>
+          <w:color w:val="000000"/>
+          <w:sz w:val="32"/>
+          <w:szCs w:val="32"/>
+        </w:rPr>
+      </w:pPr>
+    </w:p>
+    <w:p>
+      <w:pPr>
+        <w:pStyle w:val="ListParagraph"/>
+        <w:pBdr>
+          <w:top w:val="nil"/>
+          <w:left w:val="nil"/>
+          <w:bottom w:val="nil"/>
+          <w:right w:val="nil"/>
+          <w:between w:val="nil"/>
+        </w:pBdr>
+        <w:spacing w:after="0"/>
+        <w:rPr>
+          <w:rFonts w:ascii="Times New Roman" w:eastAsia="Times New Roman" w:hAnsi="Times New Roman" w:cs="Times New Roman"/>
+          <w:b/>
+          <w:bCs/>
+          <w:color w:val="000000"/>
+          <w:sz w:val="32"/>
+          <w:szCs w:val="32"/>
+        </w:rPr>
+      </w:pPr>
+    </w:p>
+    <w:p>
+      <w:pPr>
+        <w:pStyle w:val="ListParagraph"/>
+        <w:pBdr>
+          <w:top w:val="nil"/>
+          <w:left w:val="nil"/>
+          <w:bottom w:val="nil"/>
+          <w:right w:val="nil"/>
+          <w:between w:val="nil"/>
+        </w:pBdr>
+        <w:spacing w:after="0"/>
+        <w:rPr>
+          <w:rFonts w:ascii="Times New Roman" w:eastAsia="Times New Roman" w:hAnsi="Times New Roman" w:cs="Times New Roman"/>
+          <w:b/>
+          <w:bCs/>
+          <w:color w:val="000000"/>
+          <w:sz w:val="32"/>
+          <w:szCs w:val="32"/>
+        </w:rPr>
+      </w:pPr>
+    </w:p>
+    <w:p>
+      <w:pPr>
+        <w:pStyle w:val="ListParagraph"/>
+        <w:pBdr>
+          <w:top w:val="nil"/>
+          <w:left w:val="nil"/>
+          <w:bottom w:val="nil"/>
+          <w:right w:val="nil"/>
+          <w:between w:val="nil"/>
+        </w:pBdr>
+        <w:spacing w:after="0"/>
+        <w:rPr>
+          <w:rFonts w:ascii="Times New Roman" w:eastAsia="Times New Roman" w:hAnsi="Times New Roman" w:cs="Times New Roman"/>
+          <w:b/>
+          <w:bCs/>
+          <w:color w:val="000000"/>
+          <w:sz w:val="32"/>
+          <w:szCs w:val="32"/>
+        </w:rPr>
+      </w:pPr>
+    </w:p>
+    <w:p>
+      <w:pPr>
+        <w:pStyle w:val="ListParagraph"/>
         <w:pBdr>
           <w:top w:val="nil"/>
           <w:left w:val="nil"/>
@@ -3429,6 +5195,7 @@
           <w:between w:val="nil"/>
         </w:pBdr>
         <w:spacing w:after="0"/>
+        <w:jc w:val="center"/>
         <w:rPr>
           <w:rFonts w:ascii="Times New Roman" w:eastAsia="Times New Roman" w:hAnsi="Times New Roman" w:cs="Times New Roman"/>
           <w:b/>
@@ -3436,8 +5203,8 @@
           <w:i/>
           <w:iCs/>
           <w:color w:val="000000"/>
-          <w:sz w:val="40"/>
-          <w:szCs w:val="40"/>
+          <w:sz w:val="42"/>
+          <w:szCs w:val="42"/>
           <w:u w:val="single"/>
         </w:rPr>
       </w:pPr>
@@ -3449,64 +5216,11 @@
           <w:i/>
           <w:iCs/>
           <w:color w:val="000000"/>
-          <w:sz w:val="40"/>
-          <w:szCs w:val="40"/>
+          <w:sz w:val="42"/>
+          <w:szCs w:val="42"/>
           <w:u w:val="single"/>
         </w:rPr>
-        <w:t xml:space="preserve">Electronics Networks and Instruments &amp; </w:t>
-      </w:r>
-      <w:proofErr w:type="gramStart"/>
-      <w:r>
-        <w:rPr>
-          <w:rFonts w:ascii="Times New Roman" w:eastAsia="Times New Roman" w:hAnsi="Times New Roman" w:cs="Times New Roman"/>
-          <w:b/>
-          <w:bCs/>
-          <w:i/>
-          <w:iCs/>
-          <w:color w:val="000000"/>
-          <w:sz w:val="40"/>
-          <w:szCs w:val="40"/>
-          <w:u w:val="single"/>
-        </w:rPr>
-        <w:t>Measurements</w:t>
-      </w:r>
-      <w:r>
-        <w:rPr>
-          <w:rFonts w:ascii="Times New Roman" w:eastAsia="Times New Roman" w:hAnsi="Times New Roman" w:cs="Times New Roman"/>
-          <w:i/>
-          <w:iCs/>
-          <w:color w:val="000000"/>
-          <w:sz w:val="40"/>
-          <w:szCs w:val="40"/>
-        </w:rPr>
-        <w:t xml:space="preserve"> </w:t>
-      </w:r>
-      <w:r>
-        <w:rPr>
-          <w:rFonts w:ascii="Times New Roman" w:eastAsia="Times New Roman" w:hAnsi="Times New Roman" w:cs="Times New Roman"/>
-          <w:b/>
-          <w:bCs/>
-          <w:i/>
-          <w:iCs/>
-          <w:color w:val="000000"/>
-          <w:sz w:val="40"/>
-          <w:szCs w:val="40"/>
-        </w:rPr>
-        <w:t>:</w:t>
-      </w:r>
-      <w:proofErr w:type="gramEnd"/>
-      <w:r>
-        <w:rPr>
-          <w:rFonts w:ascii="Times New Roman" w:eastAsia="Times New Roman" w:hAnsi="Times New Roman" w:cs="Times New Roman"/>
-          <w:b/>
-          <w:bCs/>
-          <w:i/>
-          <w:iCs/>
-          <w:color w:val="000000"/>
-          <w:sz w:val="40"/>
-          <w:szCs w:val="40"/>
-        </w:rPr>
-        <w:t>-</w:t>
+        <w:t>Electronics Networks and Instruments &amp; Measurements</w:t>
       </w:r>
     </w:p>
     <w:p>
@@ -3658,7 +5372,7 @@
         </w:rPr>
         <w:br/>
       </w:r>
-      <w:hyperlink r:id="rId35" w:history="1">
+      <w:hyperlink r:id="rId47" w:history="1">
         <w:r>
           <w:rPr>
             <w:rStyle w:val="Hyperlink"/>
@@ -3753,7 +5467,7 @@
         </w:rPr>
         <w:t xml:space="preserve">Concept 1: </w:t>
       </w:r>
-      <w:hyperlink r:id="rId36" w:history="1">
+      <w:hyperlink r:id="rId48" w:history="1">
         <w:r>
           <w:rPr>
             <w:rStyle w:val="Hyperlink"/>
@@ -3816,7 +5530,7 @@
         </w:rPr>
         <w:t xml:space="preserve"> </w:t>
       </w:r>
-      <w:hyperlink r:id="rId37" w:history="1">
+      <w:hyperlink r:id="rId49" w:history="1">
         <w:r>
           <w:rPr>
             <w:rStyle w:val="Hyperlink"/>
@@ -3879,7 +5593,7 @@
         </w:rPr>
         <w:t xml:space="preserve"> </w:t>
       </w:r>
-      <w:hyperlink r:id="rId38" w:history="1">
+      <w:hyperlink r:id="rId50" w:history="1">
         <w:r>
           <w:rPr>
             <w:rStyle w:val="Hyperlink"/>
@@ -3933,7 +5647,7 @@
         </w:rPr>
         <w:t xml:space="preserve"> </w:t>
       </w:r>
-      <w:hyperlink r:id="rId39" w:history="1">
+      <w:hyperlink r:id="rId51" w:history="1">
         <w:r>
           <w:rPr>
             <w:rStyle w:val="Hyperlink"/>
@@ -3996,7 +5710,7 @@
         </w:rPr>
         <w:t xml:space="preserve"> </w:t>
       </w:r>
-      <w:hyperlink r:id="rId40" w:history="1">
+      <w:hyperlink r:id="rId52" w:history="1">
         <w:r>
           <w:rPr>
             <w:rStyle w:val="Hyperlink"/>
@@ -4050,7 +5764,7 @@
         </w:rPr>
         <w:t xml:space="preserve"> </w:t>
       </w:r>
-      <w:hyperlink r:id="rId41" w:history="1">
+      <w:hyperlink r:id="rId53" w:history="1">
         <w:r>
           <w:rPr>
             <w:rStyle w:val="Hyperlink"/>
@@ -4104,7 +5818,7 @@
         </w:rPr>
         <w:t xml:space="preserve"> </w:t>
       </w:r>
-      <w:hyperlink r:id="rId42" w:history="1">
+      <w:hyperlink r:id="rId54" w:history="1">
         <w:r>
           <w:rPr>
             <w:rStyle w:val="Hyperlink"/>
@@ -4158,7 +5872,7 @@
         </w:rPr>
         <w:t xml:space="preserve"> </w:t>
       </w:r>
-      <w:hyperlink r:id="rId43" w:history="1">
+      <w:hyperlink r:id="rId55" w:history="1">
         <w:r>
           <w:rPr>
             <w:rStyle w:val="Hyperlink"/>
@@ -4212,7 +5926,7 @@
         </w:rPr>
         <w:t xml:space="preserve"> </w:t>
       </w:r>
-      <w:hyperlink r:id="rId44" w:history="1">
+      <w:hyperlink r:id="rId56" w:history="1">
         <w:r>
           <w:rPr>
             <w:rStyle w:val="Hyperlink"/>
@@ -4260,7 +5974,7 @@
       <w:r>
         <w:t xml:space="preserve"> </w:t>
       </w:r>
-      <w:hyperlink r:id="rId45" w:history="1">
+      <w:hyperlink r:id="rId57" w:history="1">
         <w:r>
           <w:rPr>
             <w:rStyle w:val="Hyperlink"/>
@@ -4314,7 +6028,7 @@
         </w:rPr>
         <w:t xml:space="preserve"> </w:t>
       </w:r>
-      <w:hyperlink r:id="rId46" w:history="1">
+      <w:hyperlink r:id="rId58" w:history="1">
         <w:r>
           <w:rPr>
             <w:rStyle w:val="Hyperlink"/>
@@ -4368,7 +6082,7 @@
         </w:rPr>
         <w:t xml:space="preserve"> </w:t>
       </w:r>
-      <w:hyperlink r:id="rId47" w:history="1">
+      <w:hyperlink r:id="rId59" w:history="1">
         <w:r>
           <w:rPr>
             <w:rStyle w:val="Hyperlink"/>
@@ -4422,7 +6136,7 @@
         </w:rPr>
         <w:t xml:space="preserve"> </w:t>
       </w:r>
-      <w:hyperlink r:id="rId48" w:history="1">
+      <w:hyperlink r:id="rId60" w:history="1">
         <w:r>
           <w:rPr>
             <w:rStyle w:val="Hyperlink"/>
@@ -4476,7 +6190,7 @@
         </w:rPr>
         <w:t xml:space="preserve"> </w:t>
       </w:r>
-      <w:hyperlink r:id="rId49" w:history="1">
+      <w:hyperlink r:id="rId61" w:history="1">
         <w:r>
           <w:rPr>
             <w:rStyle w:val="Hyperlink"/>
@@ -4689,7 +6403,7 @@
           <w:szCs w:val="32"/>
         </w:rPr>
       </w:pPr>
-      <w:hyperlink r:id="rId50" w:history="1">
+      <w:hyperlink r:id="rId62" w:history="1">
         <w:r>
           <w:rPr>
             <w:rStyle w:val="Hyperlink"/>
@@ -4744,7 +6458,7 @@
           <w:szCs w:val="32"/>
         </w:rPr>
       </w:pPr>
-      <w:hyperlink r:id="rId51" w:history="1">
+      <w:hyperlink r:id="rId63" w:history="1">
         <w:r>
           <w:rPr>
             <w:rStyle w:val="Hyperlink"/>
@@ -4858,7 +6572,7 @@
           <w:szCs w:val="32"/>
         </w:rPr>
       </w:pPr>
-      <w:hyperlink r:id="rId52" w:history="1">
+      <w:hyperlink r:id="rId64" w:history="1">
         <w:r>
           <w:rPr>
             <w:rStyle w:val="Hyperlink"/>
@@ -4930,6 +6644,7 @@
           <w:between w:val="nil"/>
         </w:pBdr>
         <w:spacing w:after="0"/>
+        <w:jc w:val="center"/>
         <w:rPr>
           <w:rFonts w:ascii="Times New Roman" w:eastAsia="Times New Roman" w:hAnsi="Times New Roman" w:cs="Times New Roman"/>
           <w:b/>
@@ -4937,8 +6652,8 @@
           <w:i/>
           <w:iCs/>
           <w:color w:val="000000"/>
-          <w:sz w:val="40"/>
-          <w:szCs w:val="40"/>
+          <w:sz w:val="44"/>
+          <w:szCs w:val="44"/>
           <w:u w:val="single"/>
         </w:rPr>
       </w:pPr>
@@ -4950,14 +6665,24 @@
           <w:i/>
           <w:iCs/>
           <w:color w:val="000000"/>
-          <w:sz w:val="40"/>
-          <w:szCs w:val="40"/>
+          <w:sz w:val="44"/>
+          <w:szCs w:val="44"/>
           <w:u w:val="single"/>
         </w:rPr>
-        <w:t xml:space="preserve">Communication </w:t>
-      </w:r>
-      <w:proofErr w:type="gramStart"/>
-      <w:r>
+        <w:t>Communication Engineering</w:t>
+      </w:r>
+    </w:p>
+    <w:p>
+      <w:pPr>
+        <w:pBdr>
+          <w:top w:val="nil"/>
+          <w:left w:val="nil"/>
+          <w:bottom w:val="nil"/>
+          <w:right w:val="nil"/>
+          <w:between w:val="nil"/>
+        </w:pBdr>
+        <w:spacing w:after="0"/>
+        <w:ind w:left="360"/>
         <w:rPr>
           <w:rFonts w:ascii="Times New Roman" w:eastAsia="Times New Roman" w:hAnsi="Times New Roman" w:cs="Times New Roman"/>
           <w:b/>
@@ -4965,58 +6690,8 @@
           <w:i/>
           <w:iCs/>
           <w:color w:val="000000"/>
-          <w:sz w:val="40"/>
-          <w:szCs w:val="40"/>
-          <w:u w:val="single"/>
-        </w:rPr>
-        <w:t>Engineering</w:t>
-      </w:r>
-      <w:r>
-        <w:rPr>
-          <w:rFonts w:ascii="Times New Roman" w:eastAsia="Times New Roman" w:hAnsi="Times New Roman" w:cs="Times New Roman"/>
-          <w:i/>
-          <w:iCs/>
-          <w:color w:val="000000"/>
-          <w:sz w:val="40"/>
-          <w:szCs w:val="40"/>
-          <w:u w:val="single"/>
-        </w:rPr>
-        <w:t xml:space="preserve"> :</w:t>
-      </w:r>
-      <w:proofErr w:type="gramEnd"/>
-      <w:r>
-        <w:rPr>
-          <w:rFonts w:ascii="Times New Roman" w:eastAsia="Times New Roman" w:hAnsi="Times New Roman" w:cs="Times New Roman"/>
-          <w:i/>
-          <w:iCs/>
-          <w:color w:val="000000"/>
-          <w:sz w:val="40"/>
-          <w:szCs w:val="40"/>
-          <w:u w:val="single"/>
-        </w:rPr>
-        <w:t>-</w:t>
-      </w:r>
-    </w:p>
-    <w:p>
-      <w:pPr>
-        <w:pBdr>
-          <w:top w:val="nil"/>
-          <w:left w:val="nil"/>
-          <w:bottom w:val="nil"/>
-          <w:right w:val="nil"/>
-          <w:between w:val="nil"/>
-        </w:pBdr>
-        <w:spacing w:after="0"/>
-        <w:ind w:left="360"/>
-        <w:rPr>
-          <w:rFonts w:ascii="Times New Roman" w:eastAsia="Times New Roman" w:hAnsi="Times New Roman" w:cs="Times New Roman"/>
-          <w:b/>
-          <w:bCs/>
-          <w:i/>
-          <w:iCs/>
-          <w:color w:val="000000"/>
-          <w:sz w:val="40"/>
-          <w:szCs w:val="40"/>
+          <w:sz w:val="44"/>
+          <w:szCs w:val="44"/>
           <w:u w:val="single"/>
         </w:rPr>
       </w:pPr>
@@ -5035,6 +6710,7 @@
           <w:between w:val="nil"/>
         </w:pBdr>
         <w:spacing w:after="0"/>
+        <w:jc w:val="center"/>
         <w:rPr>
           <w:rFonts w:ascii="Times New Roman" w:eastAsia="Times New Roman" w:hAnsi="Times New Roman" w:cs="Times New Roman"/>
           <w:b/>
@@ -5042,8 +6718,8 @@
           <w:i/>
           <w:iCs/>
           <w:color w:val="000000"/>
-          <w:sz w:val="40"/>
-          <w:szCs w:val="40"/>
+          <w:sz w:val="42"/>
+          <w:szCs w:val="42"/>
           <w:u w:val="single"/>
         </w:rPr>
       </w:pPr>
@@ -5055,14 +6731,24 @@
           <w:i/>
           <w:iCs/>
           <w:color w:val="000000"/>
-          <w:sz w:val="40"/>
-          <w:szCs w:val="40"/>
+          <w:sz w:val="42"/>
+          <w:szCs w:val="42"/>
           <w:u w:val="single"/>
         </w:rPr>
-        <w:t xml:space="preserve">Communication Applications &amp; Microwave </w:t>
-      </w:r>
-      <w:proofErr w:type="gramStart"/>
-      <w:r>
+        <w:t>Communication Applications &amp; Microwave Engineering</w:t>
+      </w:r>
+    </w:p>
+    <w:p>
+      <w:pPr>
+        <w:pBdr>
+          <w:top w:val="nil"/>
+          <w:left w:val="nil"/>
+          <w:bottom w:val="nil"/>
+          <w:right w:val="nil"/>
+          <w:between w:val="nil"/>
+        </w:pBdr>
+        <w:spacing w:after="0"/>
+        <w:ind w:left="360"/>
         <w:rPr>
           <w:rFonts w:ascii="Times New Roman" w:eastAsia="Times New Roman" w:hAnsi="Times New Roman" w:cs="Times New Roman"/>
           <w:b/>
@@ -5070,60 +6756,8 @@
           <w:i/>
           <w:iCs/>
           <w:color w:val="000000"/>
-          <w:sz w:val="40"/>
-          <w:szCs w:val="40"/>
-          <w:u w:val="single"/>
-        </w:rPr>
-        <w:t>Engineering</w:t>
-      </w:r>
-      <w:r>
-        <w:rPr>
-          <w:rFonts w:ascii="Times New Roman" w:eastAsia="Times New Roman" w:hAnsi="Times New Roman" w:cs="Times New Roman"/>
-          <w:b/>
-          <w:bCs/>
-          <w:i/>
-          <w:iCs/>
-          <w:color w:val="000000"/>
-          <w:sz w:val="40"/>
-          <w:szCs w:val="40"/>
-        </w:rPr>
-        <w:t xml:space="preserve"> :</w:t>
-      </w:r>
-      <w:proofErr w:type="gramEnd"/>
-      <w:r>
-        <w:rPr>
-          <w:rFonts w:ascii="Times New Roman" w:eastAsia="Times New Roman" w:hAnsi="Times New Roman" w:cs="Times New Roman"/>
-          <w:b/>
-          <w:bCs/>
-          <w:i/>
-          <w:iCs/>
-          <w:color w:val="000000"/>
-          <w:sz w:val="40"/>
-          <w:szCs w:val="40"/>
-        </w:rPr>
-        <w:t>-</w:t>
-      </w:r>
-    </w:p>
-    <w:p>
-      <w:pPr>
-        <w:pBdr>
-          <w:top w:val="nil"/>
-          <w:left w:val="nil"/>
-          <w:bottom w:val="nil"/>
-          <w:right w:val="nil"/>
-          <w:between w:val="nil"/>
-        </w:pBdr>
-        <w:spacing w:after="0"/>
-        <w:ind w:left="360"/>
-        <w:rPr>
-          <w:rFonts w:ascii="Times New Roman" w:eastAsia="Times New Roman" w:hAnsi="Times New Roman" w:cs="Times New Roman"/>
-          <w:b/>
-          <w:bCs/>
-          <w:i/>
-          <w:iCs/>
-          <w:color w:val="000000"/>
-          <w:sz w:val="40"/>
-          <w:szCs w:val="40"/>
+          <w:sz w:val="44"/>
+          <w:szCs w:val="44"/>
           <w:u w:val="single"/>
         </w:rPr>
       </w:pPr>
@@ -5142,6 +6776,7 @@
           <w:between w:val="nil"/>
         </w:pBdr>
         <w:spacing w:after="0"/>
+        <w:jc w:val="center"/>
         <w:rPr>
           <w:rFonts w:ascii="Times New Roman" w:eastAsia="Times New Roman" w:hAnsi="Times New Roman" w:cs="Times New Roman"/>
           <w:b/>
@@ -5149,8 +6784,8 @@
           <w:i/>
           <w:iCs/>
           <w:color w:val="000000"/>
-          <w:sz w:val="40"/>
-          <w:szCs w:val="40"/>
+          <w:sz w:val="44"/>
+          <w:szCs w:val="44"/>
           <w:u w:val="single"/>
         </w:rPr>
       </w:pPr>
@@ -5162,14 +6797,24 @@
           <w:i/>
           <w:iCs/>
           <w:color w:val="000000"/>
-          <w:sz w:val="40"/>
-          <w:szCs w:val="40"/>
+          <w:sz w:val="44"/>
+          <w:szCs w:val="44"/>
           <w:u w:val="single"/>
         </w:rPr>
-        <w:t xml:space="preserve">Microprocessors &amp; </w:t>
-      </w:r>
-      <w:proofErr w:type="gramStart"/>
-      <w:r>
+        <w:t>Microprocessors &amp; Microcontrollers</w:t>
+      </w:r>
+    </w:p>
+    <w:p>
+      <w:pPr>
+        <w:pBdr>
+          <w:top w:val="nil"/>
+          <w:left w:val="nil"/>
+          <w:bottom w:val="nil"/>
+          <w:right w:val="nil"/>
+          <w:between w:val="nil"/>
+        </w:pBdr>
+        <w:spacing w:after="0"/>
+        <w:ind w:left="360"/>
         <w:rPr>
           <w:rFonts w:ascii="Times New Roman" w:eastAsia="Times New Roman" w:hAnsi="Times New Roman" w:cs="Times New Roman"/>
           <w:b/>
@@ -5177,60 +6822,8 @@
           <w:i/>
           <w:iCs/>
           <w:color w:val="000000"/>
-          <w:sz w:val="40"/>
-          <w:szCs w:val="40"/>
-          <w:u w:val="single"/>
-        </w:rPr>
-        <w:t>Microcontrollers</w:t>
-      </w:r>
-      <w:r>
-        <w:rPr>
-          <w:rFonts w:ascii="Times New Roman" w:eastAsia="Times New Roman" w:hAnsi="Times New Roman" w:cs="Times New Roman"/>
-          <w:b/>
-          <w:bCs/>
-          <w:i/>
-          <w:iCs/>
-          <w:color w:val="000000"/>
-          <w:sz w:val="40"/>
-          <w:szCs w:val="40"/>
-        </w:rPr>
-        <w:t xml:space="preserve"> :</w:t>
-      </w:r>
-      <w:proofErr w:type="gramEnd"/>
-      <w:r>
-        <w:rPr>
-          <w:rFonts w:ascii="Times New Roman" w:eastAsia="Times New Roman" w:hAnsi="Times New Roman" w:cs="Times New Roman"/>
-          <w:b/>
-          <w:bCs/>
-          <w:i/>
-          <w:iCs/>
-          <w:color w:val="000000"/>
-          <w:sz w:val="40"/>
-          <w:szCs w:val="40"/>
-        </w:rPr>
-        <w:t>-</w:t>
-      </w:r>
-    </w:p>
-    <w:p>
-      <w:pPr>
-        <w:pBdr>
-          <w:top w:val="nil"/>
-          <w:left w:val="nil"/>
-          <w:bottom w:val="nil"/>
-          <w:right w:val="nil"/>
-          <w:between w:val="nil"/>
-        </w:pBdr>
-        <w:spacing w:after="0"/>
-        <w:ind w:left="360"/>
-        <w:rPr>
-          <w:rFonts w:ascii="Times New Roman" w:eastAsia="Times New Roman" w:hAnsi="Times New Roman" w:cs="Times New Roman"/>
-          <w:b/>
-          <w:bCs/>
-          <w:i/>
-          <w:iCs/>
-          <w:color w:val="000000"/>
-          <w:sz w:val="40"/>
-          <w:szCs w:val="40"/>
+          <w:sz w:val="44"/>
+          <w:szCs w:val="44"/>
           <w:u w:val="single"/>
         </w:rPr>
       </w:pPr>
@@ -5249,6 +6842,7 @@
           <w:between w:val="nil"/>
         </w:pBdr>
         <w:spacing w:after="0"/>
+        <w:jc w:val="center"/>
         <w:rPr>
           <w:rFonts w:ascii="Times New Roman" w:eastAsia="Times New Roman" w:hAnsi="Times New Roman" w:cs="Times New Roman"/>
           <w:b/>
@@ -5256,8 +6850,8 @@
           <w:i/>
           <w:iCs/>
           <w:color w:val="000000"/>
-          <w:sz w:val="40"/>
-          <w:szCs w:val="40"/>
+          <w:sz w:val="44"/>
+          <w:szCs w:val="44"/>
           <w:u w:val="single"/>
         </w:rPr>
       </w:pPr>
@@ -5269,53 +6863,11 @@
           <w:i/>
           <w:iCs/>
           <w:color w:val="000000"/>
-          <w:sz w:val="40"/>
-          <w:szCs w:val="40"/>
+          <w:sz w:val="44"/>
+          <w:szCs w:val="44"/>
           <w:u w:val="single"/>
         </w:rPr>
-        <w:t xml:space="preserve">Computer </w:t>
-      </w:r>
-      <w:proofErr w:type="gramStart"/>
-      <w:r>
-        <w:rPr>
-          <w:rFonts w:ascii="Times New Roman" w:eastAsia="Times New Roman" w:hAnsi="Times New Roman" w:cs="Times New Roman"/>
-          <w:b/>
-          <w:bCs/>
-          <w:i/>
-          <w:iCs/>
-          <w:color w:val="000000"/>
-          <w:sz w:val="40"/>
-          <w:szCs w:val="40"/>
-          <w:u w:val="single"/>
-        </w:rPr>
-        <w:t>Networks</w:t>
-      </w:r>
-      <w:r>
-        <w:rPr>
-          <w:rFonts w:ascii="Times New Roman" w:eastAsia="Times New Roman" w:hAnsi="Times New Roman" w:cs="Times New Roman"/>
-          <w:b/>
-          <w:bCs/>
-          <w:i/>
-          <w:iCs/>
-          <w:color w:val="000000"/>
-          <w:sz w:val="40"/>
-          <w:szCs w:val="40"/>
-        </w:rPr>
-        <w:t xml:space="preserve"> :</w:t>
-      </w:r>
-      <w:proofErr w:type="gramEnd"/>
-      <w:r>
-        <w:rPr>
-          <w:rFonts w:ascii="Times New Roman" w:eastAsia="Times New Roman" w:hAnsi="Times New Roman" w:cs="Times New Roman"/>
-          <w:b/>
-          <w:bCs/>
-          <w:i/>
-          <w:iCs/>
-          <w:color w:val="000000"/>
-          <w:sz w:val="40"/>
-          <w:szCs w:val="40"/>
-        </w:rPr>
-        <w:t>-</w:t>
+        <w:t>Computer Networks</w:t>
       </w:r>
     </w:p>
     <w:p>
@@ -5407,7 +6959,7 @@
           <w:szCs w:val="28"/>
         </w:rPr>
       </w:pPr>
-      <w:hyperlink r:id="rId53">
+      <w:hyperlink r:id="rId65">
         <w:r>
           <w:rPr>
             <w:rFonts w:ascii="Times New Roman" w:eastAsia="Times New Roman" w:hAnsi="Times New Roman" w:cs="Times New Roman"/>
@@ -5526,7 +7078,7 @@
           <w:szCs w:val="28"/>
         </w:rPr>
       </w:pPr>
-      <w:hyperlink r:id="rId54">
+      <w:hyperlink r:id="rId66">
         <w:r>
           <w:rPr>
             <w:rFonts w:ascii="Times New Roman" w:eastAsia="Times New Roman" w:hAnsi="Times New Roman" w:cs="Times New Roman"/>
@@ -5638,7 +7190,7 @@
           <w:szCs w:val="28"/>
         </w:rPr>
       </w:pPr>
-      <w:hyperlink r:id="rId55">
+      <w:hyperlink r:id="rId67">
         <w:r>
           <w:rPr>
             <w:rFonts w:ascii="Times New Roman" w:eastAsia="Times New Roman" w:hAnsi="Times New Roman" w:cs="Times New Roman"/>
@@ -5686,7 +7238,7 @@
           <w:szCs w:val="28"/>
         </w:rPr>
       </w:pPr>
-      <w:hyperlink r:id="rId56">
+      <w:hyperlink r:id="rId68">
         <w:r>
           <w:rPr>
             <w:rFonts w:ascii="Times New Roman" w:eastAsia="Times New Roman" w:hAnsi="Times New Roman" w:cs="Times New Roman"/>
@@ -5862,7 +7414,7 @@
           <w:szCs w:val="28"/>
         </w:rPr>
       </w:pPr>
-      <w:hyperlink r:id="rId57">
+      <w:hyperlink r:id="rId69">
         <w:r>
           <w:rPr>
             <w:rFonts w:ascii="Times New Roman" w:eastAsia="Times New Roman" w:hAnsi="Times New Roman" w:cs="Times New Roman"/>
@@ -5924,7 +7476,7 @@
           <w:szCs w:val="28"/>
         </w:rPr>
       </w:pPr>
-      <w:hyperlink r:id="rId58">
+      <w:hyperlink r:id="rId70">
         <w:r>
           <w:rPr>
             <w:rFonts w:ascii="Times New Roman" w:eastAsia="Times New Roman" w:hAnsi="Times New Roman" w:cs="Times New Roman"/>
@@ -6005,7 +7557,7 @@
           <w:szCs w:val="28"/>
         </w:rPr>
       </w:pPr>
-      <w:hyperlink r:id="rId59">
+      <w:hyperlink r:id="rId71">
         <w:r>
           <w:rPr>
             <w:rFonts w:ascii="Times New Roman" w:eastAsia="Times New Roman" w:hAnsi="Times New Roman" w:cs="Times New Roman"/>
@@ -6139,7 +7691,7 @@
         <w:spacing w:after="0"/>
         <w:ind w:left="1080"/>
       </w:pPr>
-      <w:hyperlink r:id="rId60" w:history="1">
+      <w:hyperlink r:id="rId72" w:history="1">
         <w:r>
           <w:rPr>
             <w:rStyle w:val="Hyperlink"/>
@@ -6239,7 +7791,7 @@
           <w:szCs w:val="28"/>
         </w:rPr>
       </w:pPr>
-      <w:hyperlink r:id="rId61" w:history="1">
+      <w:hyperlink r:id="rId73" w:history="1">
         <w:r>
           <w:rPr>
             <w:rStyle w:val="Hyperlink"/>
@@ -6349,7 +7901,7 @@
           <w:szCs w:val="28"/>
         </w:rPr>
       </w:pPr>
-      <w:hyperlink r:id="rId62" w:history="1">
+      <w:hyperlink r:id="rId74" w:history="1">
         <w:r>
           <w:rPr>
             <w:rStyle w:val="Hyperlink"/>
@@ -6499,7 +8051,7 @@
           <w:szCs w:val="28"/>
         </w:rPr>
       </w:pPr>
-      <w:hyperlink r:id="rId63">
+      <w:hyperlink r:id="rId75">
         <w:r>
           <w:rPr>
             <w:rFonts w:ascii="Times New Roman" w:eastAsia="Times New Roman" w:hAnsi="Times New Roman" w:cs="Times New Roman"/>
@@ -6600,7 +8152,7 @@
           <w:szCs w:val="28"/>
         </w:rPr>
       </w:pPr>
-      <w:hyperlink r:id="rId64">
+      <w:hyperlink r:id="rId76">
         <w:r>
           <w:rPr>
             <w:rFonts w:ascii="Times New Roman" w:eastAsia="Times New Roman" w:hAnsi="Times New Roman" w:cs="Times New Roman"/>
@@ -6720,7 +8272,7 @@
           <w:szCs w:val="28"/>
         </w:rPr>
       </w:pPr>
-      <w:hyperlink r:id="rId65">
+      <w:hyperlink r:id="rId77">
         <w:r>
           <w:rPr>
             <w:rFonts w:ascii="Times New Roman" w:eastAsia="Times New Roman" w:hAnsi="Times New Roman" w:cs="Times New Roman"/>
@@ -6770,7 +8322,7 @@
           <w:szCs w:val="28"/>
         </w:rPr>
       </w:pPr>
-      <w:hyperlink r:id="rId66">
+      <w:hyperlink r:id="rId78">
         <w:r>
           <w:rPr>
             <w:rFonts w:ascii="Times New Roman" w:eastAsia="Times New Roman" w:hAnsi="Times New Roman" w:cs="Times New Roman"/>
@@ -6871,7 +8423,7 @@
           <w:szCs w:val="28"/>
         </w:rPr>
       </w:pPr>
-      <w:hyperlink r:id="rId67">
+      <w:hyperlink r:id="rId79">
         <w:r>
           <w:rPr>
             <w:rFonts w:ascii="Times New Roman" w:eastAsia="Times New Roman" w:hAnsi="Times New Roman" w:cs="Times New Roman"/>
@@ -6896,7 +8448,7 @@
         <w:spacing w:after="0"/>
         <w:ind w:left="1080"/>
       </w:pPr>
-      <w:hyperlink r:id="rId68">
+      <w:hyperlink r:id="rId80">
         <w:r>
           <w:rPr>
             <w:rFonts w:ascii="Times New Roman" w:eastAsia="Times New Roman" w:hAnsi="Times New Roman" w:cs="Times New Roman"/>
@@ -6946,7 +8498,7 @@
           <w:szCs w:val="28"/>
         </w:rPr>
       </w:pPr>
-      <w:hyperlink r:id="rId69">
+      <w:hyperlink r:id="rId81">
         <w:r>
           <w:rPr>
             <w:rFonts w:ascii="Times New Roman" w:eastAsia="Times New Roman" w:hAnsi="Times New Roman" w:cs="Times New Roman"/>
@@ -7030,6 +8582,7 @@
           <w:between w:val="nil"/>
         </w:pBdr>
         <w:spacing w:after="0"/>
+        <w:jc w:val="center"/>
         <w:rPr>
           <w:rFonts w:ascii="Times New Roman" w:eastAsia="Times New Roman" w:hAnsi="Times New Roman" w:cs="Times New Roman"/>
           <w:b/>
@@ -7037,8 +8590,8 @@
           <w:i/>
           <w:iCs/>
           <w:color w:val="000000"/>
-          <w:sz w:val="40"/>
-          <w:szCs w:val="40"/>
+          <w:sz w:val="44"/>
+          <w:szCs w:val="44"/>
           <w:u w:val="single"/>
         </w:rPr>
       </w:pPr>
@@ -7050,53 +8603,11 @@
           <w:i/>
           <w:iCs/>
           <w:color w:val="000000"/>
-          <w:sz w:val="40"/>
-          <w:szCs w:val="40"/>
+          <w:sz w:val="44"/>
+          <w:szCs w:val="44"/>
           <w:u w:val="single"/>
         </w:rPr>
-        <w:t xml:space="preserve">Essentials of Network </w:t>
-      </w:r>
-      <w:proofErr w:type="gramStart"/>
-      <w:r>
-        <w:rPr>
-          <w:rFonts w:ascii="Times New Roman" w:eastAsia="Times New Roman" w:hAnsi="Times New Roman" w:cs="Times New Roman"/>
-          <w:b/>
-          <w:bCs/>
-          <w:i/>
-          <w:iCs/>
-          <w:color w:val="000000"/>
-          <w:sz w:val="40"/>
-          <w:szCs w:val="40"/>
-          <w:u w:val="single"/>
-        </w:rPr>
-        <w:t>Security</w:t>
-      </w:r>
-      <w:r>
-        <w:rPr>
-          <w:rFonts w:ascii="Times New Roman" w:eastAsia="Times New Roman" w:hAnsi="Times New Roman" w:cs="Times New Roman"/>
-          <w:b/>
-          <w:bCs/>
-          <w:i/>
-          <w:iCs/>
-          <w:color w:val="000000"/>
-          <w:sz w:val="40"/>
-          <w:szCs w:val="40"/>
-        </w:rPr>
-        <w:t xml:space="preserve"> :</w:t>
-      </w:r>
-      <w:proofErr w:type="gramEnd"/>
-      <w:r>
-        <w:rPr>
-          <w:rFonts w:ascii="Times New Roman" w:eastAsia="Times New Roman" w:hAnsi="Times New Roman" w:cs="Times New Roman"/>
-          <w:b/>
-          <w:bCs/>
-          <w:i/>
-          <w:iCs/>
-          <w:color w:val="000000"/>
-          <w:sz w:val="40"/>
-          <w:szCs w:val="40"/>
-        </w:rPr>
-        <w:t>-</w:t>
+        <w:t>Essentials of Network Security</w:t>
       </w:r>
     </w:p>
     <w:p>
@@ -7179,7 +8690,7 @@
           <w:szCs w:val="28"/>
         </w:rPr>
       </w:pPr>
-      <w:hyperlink r:id="rId70" w:history="1">
+      <w:hyperlink r:id="rId82" w:history="1">
         <w:r>
           <w:rPr>
             <w:rStyle w:val="Hyperlink"/>
@@ -7313,7 +8824,7 @@
           <w:szCs w:val="28"/>
         </w:rPr>
       </w:pPr>
-      <w:hyperlink r:id="rId71" w:history="1">
+      <w:hyperlink r:id="rId83" w:history="1">
         <w:r>
           <w:rPr>
             <w:rStyle w:val="Hyperlink"/>
@@ -7422,6 +8933,7 @@
           <w:between w:val="nil"/>
         </w:pBdr>
         <w:spacing w:after="0"/>
+        <w:jc w:val="center"/>
         <w:rPr>
           <w:rFonts w:ascii="Times New Roman" w:eastAsia="Times New Roman" w:hAnsi="Times New Roman" w:cs="Times New Roman"/>
           <w:b/>
@@ -7429,8 +8941,8 @@
           <w:i/>
           <w:iCs/>
           <w:color w:val="000000"/>
-          <w:sz w:val="40"/>
-          <w:szCs w:val="40"/>
+          <w:sz w:val="44"/>
+          <w:szCs w:val="44"/>
           <w:u w:val="single"/>
         </w:rPr>
       </w:pPr>
@@ -7442,14 +8954,25 @@
           <w:i/>
           <w:iCs/>
           <w:color w:val="000000"/>
-          <w:sz w:val="40"/>
-          <w:szCs w:val="40"/>
+          <w:sz w:val="44"/>
+          <w:szCs w:val="44"/>
           <w:u w:val="single"/>
         </w:rPr>
-        <w:t xml:space="preserve">Web </w:t>
-      </w:r>
-      <w:proofErr w:type="gramStart"/>
-      <w:r>
+        <w:t>Web Technology</w:t>
+      </w:r>
+    </w:p>
+    <w:p>
+      <w:pPr>
+        <w:pBdr>
+          <w:top w:val="nil"/>
+          <w:left w:val="nil"/>
+          <w:bottom w:val="nil"/>
+          <w:right w:val="nil"/>
+          <w:between w:val="nil"/>
+        </w:pBdr>
+        <w:spacing w:after="0"/>
+        <w:ind w:left="360"/>
+        <w:jc w:val="center"/>
         <w:rPr>
           <w:rFonts w:ascii="Times New Roman" w:eastAsia="Times New Roman" w:hAnsi="Times New Roman" w:cs="Times New Roman"/>
           <w:b/>
@@ -7457,60 +8980,8 @@
           <w:i/>
           <w:iCs/>
           <w:color w:val="000000"/>
-          <w:sz w:val="40"/>
-          <w:szCs w:val="40"/>
-          <w:u w:val="single"/>
-        </w:rPr>
-        <w:t>Technology</w:t>
-      </w:r>
-      <w:r>
-        <w:rPr>
-          <w:rFonts w:ascii="Times New Roman" w:eastAsia="Times New Roman" w:hAnsi="Times New Roman" w:cs="Times New Roman"/>
-          <w:b/>
-          <w:bCs/>
-          <w:i/>
-          <w:iCs/>
-          <w:color w:val="000000"/>
-          <w:sz w:val="40"/>
-          <w:szCs w:val="40"/>
-        </w:rPr>
-        <w:t xml:space="preserve"> :</w:t>
-      </w:r>
-      <w:proofErr w:type="gramEnd"/>
-      <w:r>
-        <w:rPr>
-          <w:rFonts w:ascii="Times New Roman" w:eastAsia="Times New Roman" w:hAnsi="Times New Roman" w:cs="Times New Roman"/>
-          <w:b/>
-          <w:bCs/>
-          <w:i/>
-          <w:iCs/>
-          <w:color w:val="000000"/>
-          <w:sz w:val="40"/>
-          <w:szCs w:val="40"/>
-        </w:rPr>
-        <w:t>-</w:t>
-      </w:r>
-    </w:p>
-    <w:p>
-      <w:pPr>
-        <w:pBdr>
-          <w:top w:val="nil"/>
-          <w:left w:val="nil"/>
-          <w:bottom w:val="nil"/>
-          <w:right w:val="nil"/>
-          <w:between w:val="nil"/>
-        </w:pBdr>
-        <w:spacing w:after="0"/>
-        <w:ind w:left="360"/>
-        <w:rPr>
-          <w:rFonts w:ascii="Times New Roman" w:eastAsia="Times New Roman" w:hAnsi="Times New Roman" w:cs="Times New Roman"/>
-          <w:b/>
-          <w:bCs/>
-          <w:i/>
-          <w:iCs/>
-          <w:color w:val="000000"/>
-          <w:sz w:val="40"/>
-          <w:szCs w:val="40"/>
+          <w:sz w:val="44"/>
+          <w:szCs w:val="44"/>
           <w:u w:val="single"/>
         </w:rPr>
       </w:pPr>
@@ -7529,6 +9000,7 @@
           <w:between w:val="nil"/>
         </w:pBdr>
         <w:spacing w:after="0"/>
+        <w:jc w:val="center"/>
         <w:rPr>
           <w:rFonts w:ascii="Times New Roman" w:eastAsia="Times New Roman" w:hAnsi="Times New Roman" w:cs="Times New Roman"/>
           <w:b/>
@@ -7536,8 +9008,8 @@
           <w:i/>
           <w:iCs/>
           <w:color w:val="000000"/>
-          <w:sz w:val="40"/>
-          <w:szCs w:val="40"/>
+          <w:sz w:val="44"/>
+          <w:szCs w:val="44"/>
           <w:u w:val="single"/>
         </w:rPr>
       </w:pPr>
@@ -7549,14 +9021,25 @@
           <w:i/>
           <w:iCs/>
           <w:color w:val="000000"/>
-          <w:sz w:val="40"/>
-          <w:szCs w:val="40"/>
+          <w:sz w:val="44"/>
+          <w:szCs w:val="44"/>
           <w:u w:val="single"/>
         </w:rPr>
-        <w:t xml:space="preserve">Android Application </w:t>
-      </w:r>
-      <w:proofErr w:type="gramStart"/>
-      <w:r>
+        <w:t>Android Application Development</w:t>
+      </w:r>
+    </w:p>
+    <w:p>
+      <w:pPr>
+        <w:pBdr>
+          <w:top w:val="nil"/>
+          <w:left w:val="nil"/>
+          <w:bottom w:val="nil"/>
+          <w:right w:val="nil"/>
+          <w:between w:val="nil"/>
+        </w:pBdr>
+        <w:spacing w:after="0"/>
+        <w:ind w:left="360"/>
+        <w:jc w:val="center"/>
         <w:rPr>
           <w:rFonts w:ascii="Times New Roman" w:eastAsia="Times New Roman" w:hAnsi="Times New Roman" w:cs="Times New Roman"/>
           <w:b/>
@@ -7564,60 +9047,8 @@
           <w:i/>
           <w:iCs/>
           <w:color w:val="000000"/>
-          <w:sz w:val="40"/>
-          <w:szCs w:val="40"/>
-          <w:u w:val="single"/>
-        </w:rPr>
-        <w:t>Development</w:t>
-      </w:r>
-      <w:r>
-        <w:rPr>
-          <w:rFonts w:ascii="Times New Roman" w:eastAsia="Times New Roman" w:hAnsi="Times New Roman" w:cs="Times New Roman"/>
-          <w:b/>
-          <w:bCs/>
-          <w:i/>
-          <w:iCs/>
-          <w:color w:val="000000"/>
-          <w:sz w:val="40"/>
-          <w:szCs w:val="40"/>
-        </w:rPr>
-        <w:t xml:space="preserve"> :</w:t>
-      </w:r>
-      <w:proofErr w:type="gramEnd"/>
-      <w:r>
-        <w:rPr>
-          <w:rFonts w:ascii="Times New Roman" w:eastAsia="Times New Roman" w:hAnsi="Times New Roman" w:cs="Times New Roman"/>
-          <w:b/>
-          <w:bCs/>
-          <w:i/>
-          <w:iCs/>
-          <w:color w:val="000000"/>
-          <w:sz w:val="40"/>
-          <w:szCs w:val="40"/>
-        </w:rPr>
-        <w:t>-</w:t>
-      </w:r>
-    </w:p>
-    <w:p>
-      <w:pPr>
-        <w:pBdr>
-          <w:top w:val="nil"/>
-          <w:left w:val="nil"/>
-          <w:bottom w:val="nil"/>
-          <w:right w:val="nil"/>
-          <w:between w:val="nil"/>
-        </w:pBdr>
-        <w:spacing w:after="0"/>
-        <w:ind w:left="360"/>
-        <w:rPr>
-          <w:rFonts w:ascii="Times New Roman" w:eastAsia="Times New Roman" w:hAnsi="Times New Roman" w:cs="Times New Roman"/>
-          <w:b/>
-          <w:bCs/>
-          <w:i/>
-          <w:iCs/>
-          <w:color w:val="000000"/>
-          <w:sz w:val="40"/>
-          <w:szCs w:val="40"/>
+          <w:sz w:val="44"/>
+          <w:szCs w:val="44"/>
           <w:u w:val="single"/>
         </w:rPr>
       </w:pPr>
@@ -7635,6 +9066,7 @@
           <w:right w:val="nil"/>
           <w:between w:val="nil"/>
         </w:pBdr>
+        <w:jc w:val="center"/>
         <w:rPr>
           <w:rFonts w:ascii="Times New Roman" w:eastAsia="Times New Roman" w:hAnsi="Times New Roman" w:cs="Times New Roman"/>
           <w:b/>
@@ -7642,8 +9074,8 @@
           <w:i/>
           <w:iCs/>
           <w:color w:val="000000"/>
-          <w:sz w:val="40"/>
-          <w:szCs w:val="40"/>
+          <w:sz w:val="44"/>
+          <w:szCs w:val="44"/>
           <w:u w:val="single"/>
         </w:rPr>
       </w:pPr>
@@ -7655,53 +9087,11 @@
           <w:i/>
           <w:iCs/>
           <w:color w:val="000000"/>
-          <w:sz w:val="40"/>
-          <w:szCs w:val="40"/>
+          <w:sz w:val="44"/>
+          <w:szCs w:val="44"/>
           <w:u w:val="single"/>
         </w:rPr>
-        <w:t xml:space="preserve">Current </w:t>
-      </w:r>
-      <w:proofErr w:type="gramStart"/>
-      <w:r>
-        <w:rPr>
-          <w:rFonts w:ascii="Times New Roman" w:eastAsia="Times New Roman" w:hAnsi="Times New Roman" w:cs="Times New Roman"/>
-          <w:b/>
-          <w:bCs/>
-          <w:i/>
-          <w:iCs/>
-          <w:color w:val="000000"/>
-          <w:sz w:val="40"/>
-          <w:szCs w:val="40"/>
-          <w:u w:val="single"/>
-        </w:rPr>
-        <w:t>Trends</w:t>
-      </w:r>
-      <w:r>
-        <w:rPr>
-          <w:rFonts w:ascii="Times New Roman" w:eastAsia="Times New Roman" w:hAnsi="Times New Roman" w:cs="Times New Roman"/>
-          <w:b/>
-          <w:bCs/>
-          <w:i/>
-          <w:iCs/>
-          <w:color w:val="000000"/>
-          <w:sz w:val="40"/>
-          <w:szCs w:val="40"/>
-        </w:rPr>
-        <w:t xml:space="preserve"> :</w:t>
-      </w:r>
-      <w:proofErr w:type="gramEnd"/>
-      <w:r>
-        <w:rPr>
-          <w:rFonts w:ascii="Times New Roman" w:eastAsia="Times New Roman" w:hAnsi="Times New Roman" w:cs="Times New Roman"/>
-          <w:b/>
-          <w:bCs/>
-          <w:i/>
-          <w:iCs/>
-          <w:color w:val="000000"/>
-          <w:sz w:val="40"/>
-          <w:szCs w:val="40"/>
-        </w:rPr>
-        <w:t>-</w:t>
+        <w:t>Current Trends</w:t>
       </w:r>
     </w:p>
     <w:p>
@@ -8296,6 +9686,99 @@
     </w:lvl>
   </w:abstractNum>
   <w:abstractNum w:abstractNumId="5" w15:restartNumberingAfterBreak="0">
+    <w:nsid w:val="31FB20D6"/>
+    <w:multiLevelType w:val="hybridMultilevel"/>
+    <w:tmpl w:val="464C5DE2"/>
+    <w:lvl w:ilvl="0" w:tplc="1B28161C">
+      <w:start w:val="1"/>
+      <w:numFmt w:val="decimal"/>
+      <w:lvlText w:val="(%1)"/>
+      <w:lvlJc w:val="left"/>
+      <w:pPr>
+        <w:ind w:left="1260" w:hanging="360"/>
+      </w:pPr>
+      <w:rPr>
+        <w:rFonts w:hint="default"/>
+        <w:b/>
+        <w:bCs/>
+        <w:sz w:val="32"/>
+        <w:szCs w:val="32"/>
+      </w:rPr>
+    </w:lvl>
+    <w:lvl w:ilvl="1" w:tplc="FFFFFFFF">
+      <w:start w:val="1"/>
+      <w:numFmt w:val="lowerLetter"/>
+      <w:lvlText w:val="%2."/>
+      <w:lvlJc w:val="left"/>
+      <w:pPr>
+        <w:ind w:left="1980" w:hanging="360"/>
+      </w:pPr>
+    </w:lvl>
+    <w:lvl w:ilvl="2" w:tplc="FFFFFFFF" w:tentative="1">
+      <w:start w:val="1"/>
+      <w:numFmt w:val="lowerRoman"/>
+      <w:lvlText w:val="%3."/>
+      <w:lvlJc w:val="right"/>
+      <w:pPr>
+        <w:ind w:left="2700" w:hanging="180"/>
+      </w:pPr>
+    </w:lvl>
+    <w:lvl w:ilvl="3" w:tplc="FFFFFFFF" w:tentative="1">
+      <w:start w:val="1"/>
+      <w:numFmt w:val="decimal"/>
+      <w:lvlText w:val="%4."/>
+      <w:lvlJc w:val="left"/>
+      <w:pPr>
+        <w:ind w:left="3420" w:hanging="360"/>
+      </w:pPr>
+    </w:lvl>
+    <w:lvl w:ilvl="4" w:tplc="FFFFFFFF" w:tentative="1">
+      <w:start w:val="1"/>
+      <w:numFmt w:val="lowerLetter"/>
+      <w:lvlText w:val="%5."/>
+      <w:lvlJc w:val="left"/>
+      <w:pPr>
+        <w:ind w:left="4140" w:hanging="360"/>
+      </w:pPr>
+    </w:lvl>
+    <w:lvl w:ilvl="5" w:tplc="FFFFFFFF" w:tentative="1">
+      <w:start w:val="1"/>
+      <w:numFmt w:val="lowerRoman"/>
+      <w:lvlText w:val="%6."/>
+      <w:lvlJc w:val="right"/>
+      <w:pPr>
+        <w:ind w:left="4860" w:hanging="180"/>
+      </w:pPr>
+    </w:lvl>
+    <w:lvl w:ilvl="6" w:tplc="FFFFFFFF" w:tentative="1">
+      <w:start w:val="1"/>
+      <w:numFmt w:val="decimal"/>
+      <w:lvlText w:val="%7."/>
+      <w:lvlJc w:val="left"/>
+      <w:pPr>
+        <w:ind w:left="5580" w:hanging="360"/>
+      </w:pPr>
+    </w:lvl>
+    <w:lvl w:ilvl="7" w:tplc="FFFFFFFF" w:tentative="1">
+      <w:start w:val="1"/>
+      <w:numFmt w:val="lowerLetter"/>
+      <w:lvlText w:val="%8."/>
+      <w:lvlJc w:val="left"/>
+      <w:pPr>
+        <w:ind w:left="6300" w:hanging="360"/>
+      </w:pPr>
+    </w:lvl>
+    <w:lvl w:ilvl="8" w:tplc="FFFFFFFF" w:tentative="1">
+      <w:start w:val="1"/>
+      <w:numFmt w:val="lowerRoman"/>
+      <w:lvlText w:val="%9."/>
+      <w:lvlJc w:val="right"/>
+      <w:pPr>
+        <w:ind w:left="7020" w:hanging="180"/>
+      </w:pPr>
+    </w:lvl>
+  </w:abstractNum>
+  <w:abstractNum w:abstractNumId="6" w15:restartNumberingAfterBreak="0">
     <w:nsid w:val="33CE22B6"/>
     <w:multiLevelType w:val="hybridMultilevel"/>
     <w:tmpl w:val="B6102FBC"/>
@@ -8381,7 +9864,7 @@
       </w:pPr>
     </w:lvl>
   </w:abstractNum>
-  <w:abstractNum w:abstractNumId="6" w15:restartNumberingAfterBreak="0">
+  <w:abstractNum w:abstractNumId="7" w15:restartNumberingAfterBreak="0">
     <w:nsid w:val="342958CD"/>
     <w:multiLevelType w:val="hybridMultilevel"/>
     <w:tmpl w:val="CF745382"/>
@@ -8467,10 +9950,96 @@
       </w:pPr>
     </w:lvl>
   </w:abstractNum>
-  <w:abstractNum w:abstractNumId="7" w15:restartNumberingAfterBreak="0">
+  <w:abstractNum w:abstractNumId="8" w15:restartNumberingAfterBreak="0">
+    <w:nsid w:val="3AC71FC8"/>
+    <w:multiLevelType w:val="hybridMultilevel"/>
+    <w:tmpl w:val="C4BE6376"/>
+    <w:lvl w:ilvl="0" w:tplc="40090013">
+      <w:start w:val="1"/>
+      <w:numFmt w:val="upperRoman"/>
+      <w:lvlText w:val="%1."/>
+      <w:lvlJc w:val="right"/>
+      <w:pPr>
+        <w:ind w:left="1980" w:hanging="360"/>
+      </w:pPr>
+    </w:lvl>
+    <w:lvl w:ilvl="1" w:tplc="40090019" w:tentative="1">
+      <w:start w:val="1"/>
+      <w:numFmt w:val="lowerLetter"/>
+      <w:lvlText w:val="%2."/>
+      <w:lvlJc w:val="left"/>
+      <w:pPr>
+        <w:ind w:left="2700" w:hanging="360"/>
+      </w:pPr>
+    </w:lvl>
+    <w:lvl w:ilvl="2" w:tplc="4009001B" w:tentative="1">
+      <w:start w:val="1"/>
+      <w:numFmt w:val="lowerRoman"/>
+      <w:lvlText w:val="%3."/>
+      <w:lvlJc w:val="right"/>
+      <w:pPr>
+        <w:ind w:left="3420" w:hanging="180"/>
+      </w:pPr>
+    </w:lvl>
+    <w:lvl w:ilvl="3" w:tplc="4009000F" w:tentative="1">
+      <w:start w:val="1"/>
+      <w:numFmt w:val="decimal"/>
+      <w:lvlText w:val="%4."/>
+      <w:lvlJc w:val="left"/>
+      <w:pPr>
+        <w:ind w:left="4140" w:hanging="360"/>
+      </w:pPr>
+    </w:lvl>
+    <w:lvl w:ilvl="4" w:tplc="40090019" w:tentative="1">
+      <w:start w:val="1"/>
+      <w:numFmt w:val="lowerLetter"/>
+      <w:lvlText w:val="%5."/>
+      <w:lvlJc w:val="left"/>
+      <w:pPr>
+        <w:ind w:left="4860" w:hanging="360"/>
+      </w:pPr>
+    </w:lvl>
+    <w:lvl w:ilvl="5" w:tplc="4009001B" w:tentative="1">
+      <w:start w:val="1"/>
+      <w:numFmt w:val="lowerRoman"/>
+      <w:lvlText w:val="%6."/>
+      <w:lvlJc w:val="right"/>
+      <w:pPr>
+        <w:ind w:left="5580" w:hanging="180"/>
+      </w:pPr>
+    </w:lvl>
+    <w:lvl w:ilvl="6" w:tplc="4009000F" w:tentative="1">
+      <w:start w:val="1"/>
+      <w:numFmt w:val="decimal"/>
+      <w:lvlText w:val="%7."/>
+      <w:lvlJc w:val="left"/>
+      <w:pPr>
+        <w:ind w:left="6300" w:hanging="360"/>
+      </w:pPr>
+    </w:lvl>
+    <w:lvl w:ilvl="7" w:tplc="40090019" w:tentative="1">
+      <w:start w:val="1"/>
+      <w:numFmt w:val="lowerLetter"/>
+      <w:lvlText w:val="%8."/>
+      <w:lvlJc w:val="left"/>
+      <w:pPr>
+        <w:ind w:left="7020" w:hanging="360"/>
+      </w:pPr>
+    </w:lvl>
+    <w:lvl w:ilvl="8" w:tplc="4009001B" w:tentative="1">
+      <w:start w:val="1"/>
+      <w:numFmt w:val="lowerRoman"/>
+      <w:lvlText w:val="%9."/>
+      <w:lvlJc w:val="right"/>
+      <w:pPr>
+        <w:ind w:left="7740" w:hanging="180"/>
+      </w:pPr>
+    </w:lvl>
+  </w:abstractNum>
+  <w:abstractNum w:abstractNumId="9" w15:restartNumberingAfterBreak="0">
     <w:nsid w:val="3F65527D"/>
     <w:multiLevelType w:val="hybridMultilevel"/>
-    <w:tmpl w:val="7B4445C0"/>
+    <w:tmpl w:val="DDEE89CC"/>
     <w:lvl w:ilvl="0" w:tplc="54D6F6C8">
       <w:start w:val="1"/>
       <w:numFmt w:val="decimal"/>
@@ -8556,7 +10125,7 @@
       </w:pPr>
     </w:lvl>
   </w:abstractNum>
-  <w:abstractNum w:abstractNumId="8" w15:restartNumberingAfterBreak="0">
+  <w:abstractNum w:abstractNumId="10" w15:restartNumberingAfterBreak="0">
     <w:nsid w:val="4C0D43C3"/>
     <w:multiLevelType w:val="multilevel"/>
     <w:tmpl w:val="C194D866"/>
@@ -8642,7 +10211,93 @@
       </w:pPr>
     </w:lvl>
   </w:abstractNum>
-  <w:abstractNum w:abstractNumId="9" w15:restartNumberingAfterBreak="0">
+  <w:abstractNum w:abstractNumId="11" w15:restartNumberingAfterBreak="0">
+    <w:nsid w:val="4DAD2BB7"/>
+    <w:multiLevelType w:val="hybridMultilevel"/>
+    <w:tmpl w:val="16169982"/>
+    <w:lvl w:ilvl="0" w:tplc="40090019">
+      <w:start w:val="1"/>
+      <w:numFmt w:val="lowerLetter"/>
+      <w:lvlText w:val="%1."/>
+      <w:lvlJc w:val="left"/>
+      <w:pPr>
+        <w:ind w:left="1800" w:hanging="360"/>
+      </w:pPr>
+    </w:lvl>
+    <w:lvl w:ilvl="1" w:tplc="40090019" w:tentative="1">
+      <w:start w:val="1"/>
+      <w:numFmt w:val="lowerLetter"/>
+      <w:lvlText w:val="%2."/>
+      <w:lvlJc w:val="left"/>
+      <w:pPr>
+        <w:ind w:left="2520" w:hanging="360"/>
+      </w:pPr>
+    </w:lvl>
+    <w:lvl w:ilvl="2" w:tplc="4009001B" w:tentative="1">
+      <w:start w:val="1"/>
+      <w:numFmt w:val="lowerRoman"/>
+      <w:lvlText w:val="%3."/>
+      <w:lvlJc w:val="right"/>
+      <w:pPr>
+        <w:ind w:left="3240" w:hanging="180"/>
+      </w:pPr>
+    </w:lvl>
+    <w:lvl w:ilvl="3" w:tplc="4009000F" w:tentative="1">
+      <w:start w:val="1"/>
+      <w:numFmt w:val="decimal"/>
+      <w:lvlText w:val="%4."/>
+      <w:lvlJc w:val="left"/>
+      <w:pPr>
+        <w:ind w:left="3960" w:hanging="360"/>
+      </w:pPr>
+    </w:lvl>
+    <w:lvl w:ilvl="4" w:tplc="40090019" w:tentative="1">
+      <w:start w:val="1"/>
+      <w:numFmt w:val="lowerLetter"/>
+      <w:lvlText w:val="%5."/>
+      <w:lvlJc w:val="left"/>
+      <w:pPr>
+        <w:ind w:left="4680" w:hanging="360"/>
+      </w:pPr>
+    </w:lvl>
+    <w:lvl w:ilvl="5" w:tplc="4009001B" w:tentative="1">
+      <w:start w:val="1"/>
+      <w:numFmt w:val="lowerRoman"/>
+      <w:lvlText w:val="%6."/>
+      <w:lvlJc w:val="right"/>
+      <w:pPr>
+        <w:ind w:left="5400" w:hanging="180"/>
+      </w:pPr>
+    </w:lvl>
+    <w:lvl w:ilvl="6" w:tplc="4009000F" w:tentative="1">
+      <w:start w:val="1"/>
+      <w:numFmt w:val="decimal"/>
+      <w:lvlText w:val="%7."/>
+      <w:lvlJc w:val="left"/>
+      <w:pPr>
+        <w:ind w:left="6120" w:hanging="360"/>
+      </w:pPr>
+    </w:lvl>
+    <w:lvl w:ilvl="7" w:tplc="40090019" w:tentative="1">
+      <w:start w:val="1"/>
+      <w:numFmt w:val="lowerLetter"/>
+      <w:lvlText w:val="%8."/>
+      <w:lvlJc w:val="left"/>
+      <w:pPr>
+        <w:ind w:left="6840" w:hanging="360"/>
+      </w:pPr>
+    </w:lvl>
+    <w:lvl w:ilvl="8" w:tplc="4009001B" w:tentative="1">
+      <w:start w:val="1"/>
+      <w:numFmt w:val="lowerRoman"/>
+      <w:lvlText w:val="%9."/>
+      <w:lvlJc w:val="right"/>
+      <w:pPr>
+        <w:ind w:left="7560" w:hanging="180"/>
+      </w:pPr>
+    </w:lvl>
+  </w:abstractNum>
+  <w:abstractNum w:abstractNumId="12" w15:restartNumberingAfterBreak="0">
     <w:nsid w:val="4FE54EE8"/>
     <w:multiLevelType w:val="multilevel"/>
     <w:tmpl w:val="9F307DE2"/>
@@ -8728,7 +10383,96 @@
       </w:pPr>
     </w:lvl>
   </w:abstractNum>
-  <w:abstractNum w:abstractNumId="10" w15:restartNumberingAfterBreak="0">
+  <w:abstractNum w:abstractNumId="13" w15:restartNumberingAfterBreak="0">
+    <w:nsid w:val="50964967"/>
+    <w:multiLevelType w:val="hybridMultilevel"/>
+    <w:tmpl w:val="DDEE89CC"/>
+    <w:lvl w:ilvl="0" w:tplc="FFFFFFFF">
+      <w:start w:val="1"/>
+      <w:numFmt w:val="decimal"/>
+      <w:lvlText w:val="(%1)"/>
+      <w:lvlJc w:val="left"/>
+      <w:pPr>
+        <w:ind w:left="1260" w:hanging="360"/>
+      </w:pPr>
+      <w:rPr>
+        <w:rFonts w:hint="default"/>
+      </w:rPr>
+    </w:lvl>
+    <w:lvl w:ilvl="1" w:tplc="FFFFFFFF" w:tentative="1">
+      <w:start w:val="1"/>
+      <w:numFmt w:val="lowerLetter"/>
+      <w:lvlText w:val="%2."/>
+      <w:lvlJc w:val="left"/>
+      <w:pPr>
+        <w:ind w:left="1980" w:hanging="360"/>
+      </w:pPr>
+    </w:lvl>
+    <w:lvl w:ilvl="2" w:tplc="FFFFFFFF" w:tentative="1">
+      <w:start w:val="1"/>
+      <w:numFmt w:val="lowerRoman"/>
+      <w:lvlText w:val="%3."/>
+      <w:lvlJc w:val="right"/>
+      <w:pPr>
+        <w:ind w:left="2700" w:hanging="180"/>
+      </w:pPr>
+    </w:lvl>
+    <w:lvl w:ilvl="3" w:tplc="FFFFFFFF" w:tentative="1">
+      <w:start w:val="1"/>
+      <w:numFmt w:val="decimal"/>
+      <w:lvlText w:val="%4."/>
+      <w:lvlJc w:val="left"/>
+      <w:pPr>
+        <w:ind w:left="3420" w:hanging="360"/>
+      </w:pPr>
+    </w:lvl>
+    <w:lvl w:ilvl="4" w:tplc="FFFFFFFF" w:tentative="1">
+      <w:start w:val="1"/>
+      <w:numFmt w:val="lowerLetter"/>
+      <w:lvlText w:val="%5."/>
+      <w:lvlJc w:val="left"/>
+      <w:pPr>
+        <w:ind w:left="4140" w:hanging="360"/>
+      </w:pPr>
+    </w:lvl>
+    <w:lvl w:ilvl="5" w:tplc="FFFFFFFF" w:tentative="1">
+      <w:start w:val="1"/>
+      <w:numFmt w:val="lowerRoman"/>
+      <w:lvlText w:val="%6."/>
+      <w:lvlJc w:val="right"/>
+      <w:pPr>
+        <w:ind w:left="4860" w:hanging="180"/>
+      </w:pPr>
+    </w:lvl>
+    <w:lvl w:ilvl="6" w:tplc="FFFFFFFF" w:tentative="1">
+      <w:start w:val="1"/>
+      <w:numFmt w:val="decimal"/>
+      <w:lvlText w:val="%7."/>
+      <w:lvlJc w:val="left"/>
+      <w:pPr>
+        <w:ind w:left="5580" w:hanging="360"/>
+      </w:pPr>
+    </w:lvl>
+    <w:lvl w:ilvl="7" w:tplc="FFFFFFFF" w:tentative="1">
+      <w:start w:val="1"/>
+      <w:numFmt w:val="lowerLetter"/>
+      <w:lvlText w:val="%8."/>
+      <w:lvlJc w:val="left"/>
+      <w:pPr>
+        <w:ind w:left="6300" w:hanging="360"/>
+      </w:pPr>
+    </w:lvl>
+    <w:lvl w:ilvl="8" w:tplc="FFFFFFFF" w:tentative="1">
+      <w:start w:val="1"/>
+      <w:numFmt w:val="lowerRoman"/>
+      <w:lvlText w:val="%9."/>
+      <w:lvlJc w:val="right"/>
+      <w:pPr>
+        <w:ind w:left="7020" w:hanging="180"/>
+      </w:pPr>
+    </w:lvl>
+  </w:abstractNum>
+  <w:abstractNum w:abstractNumId="14" w15:restartNumberingAfterBreak="0">
     <w:nsid w:val="546329B7"/>
     <w:multiLevelType w:val="hybridMultilevel"/>
     <w:tmpl w:val="627EEBF0"/>
@@ -8818,7 +10562,7 @@
       </w:pPr>
     </w:lvl>
   </w:abstractNum>
-  <w:abstractNum w:abstractNumId="11" w15:restartNumberingAfterBreak="0">
+  <w:abstractNum w:abstractNumId="15" w15:restartNumberingAfterBreak="0">
     <w:nsid w:val="581D2824"/>
     <w:multiLevelType w:val="hybridMultilevel"/>
     <w:tmpl w:val="41C0C86A"/>
@@ -8931,7 +10675,7 @@
       </w:rPr>
     </w:lvl>
   </w:abstractNum>
-  <w:abstractNum w:abstractNumId="12" w15:restartNumberingAfterBreak="0">
+  <w:abstractNum w:abstractNumId="16" w15:restartNumberingAfterBreak="0">
     <w:nsid w:val="58C84917"/>
     <w:multiLevelType w:val="hybridMultilevel"/>
     <w:tmpl w:val="567AFC1A"/>
@@ -9044,7 +10788,97 @@
       </w:rPr>
     </w:lvl>
   </w:abstractNum>
-  <w:abstractNum w:abstractNumId="13" w15:restartNumberingAfterBreak="0">
+  <w:abstractNum w:abstractNumId="17" w15:restartNumberingAfterBreak="0">
+    <w:nsid w:val="5FE50CB1"/>
+    <w:multiLevelType w:val="hybridMultilevel"/>
+    <w:tmpl w:val="4514A332"/>
+    <w:lvl w:ilvl="0" w:tplc="40090019">
+      <w:start w:val="1"/>
+      <w:numFmt w:val="lowerLetter"/>
+      <w:lvlText w:val="%1."/>
+      <w:lvlJc w:val="left"/>
+      <w:pPr>
+        <w:ind w:left="1620" w:hanging="360"/>
+      </w:pPr>
+      <w:rPr>
+        <w:b w:val="0"/>
+        <w:bCs w:val="0"/>
+      </w:rPr>
+    </w:lvl>
+    <w:lvl w:ilvl="1" w:tplc="40090019" w:tentative="1">
+      <w:start w:val="1"/>
+      <w:numFmt w:val="lowerLetter"/>
+      <w:lvlText w:val="%2."/>
+      <w:lvlJc w:val="left"/>
+      <w:pPr>
+        <w:ind w:left="2340" w:hanging="360"/>
+      </w:pPr>
+    </w:lvl>
+    <w:lvl w:ilvl="2" w:tplc="4009001B" w:tentative="1">
+      <w:start w:val="1"/>
+      <w:numFmt w:val="lowerRoman"/>
+      <w:lvlText w:val="%3."/>
+      <w:lvlJc w:val="right"/>
+      <w:pPr>
+        <w:ind w:left="3060" w:hanging="180"/>
+      </w:pPr>
+    </w:lvl>
+    <w:lvl w:ilvl="3" w:tplc="4009000F" w:tentative="1">
+      <w:start w:val="1"/>
+      <w:numFmt w:val="decimal"/>
+      <w:lvlText w:val="%4."/>
+      <w:lvlJc w:val="left"/>
+      <w:pPr>
+        <w:ind w:left="3780" w:hanging="360"/>
+      </w:pPr>
+    </w:lvl>
+    <w:lvl w:ilvl="4" w:tplc="40090019" w:tentative="1">
+      <w:start w:val="1"/>
+      <w:numFmt w:val="lowerLetter"/>
+      <w:lvlText w:val="%5."/>
+      <w:lvlJc w:val="left"/>
+      <w:pPr>
+        <w:ind w:left="4500" w:hanging="360"/>
+      </w:pPr>
+    </w:lvl>
+    <w:lvl w:ilvl="5" w:tplc="4009001B" w:tentative="1">
+      <w:start w:val="1"/>
+      <w:numFmt w:val="lowerRoman"/>
+      <w:lvlText w:val="%6."/>
+      <w:lvlJc w:val="right"/>
+      <w:pPr>
+        <w:ind w:left="5220" w:hanging="180"/>
+      </w:pPr>
+    </w:lvl>
+    <w:lvl w:ilvl="6" w:tplc="4009000F" w:tentative="1">
+      <w:start w:val="1"/>
+      <w:numFmt w:val="decimal"/>
+      <w:lvlText w:val="%7."/>
+      <w:lvlJc w:val="left"/>
+      <w:pPr>
+        <w:ind w:left="5940" w:hanging="360"/>
+      </w:pPr>
+    </w:lvl>
+    <w:lvl w:ilvl="7" w:tplc="40090019" w:tentative="1">
+      <w:start w:val="1"/>
+      <w:numFmt w:val="lowerLetter"/>
+      <w:lvlText w:val="%8."/>
+      <w:lvlJc w:val="left"/>
+      <w:pPr>
+        <w:ind w:left="6660" w:hanging="360"/>
+      </w:pPr>
+    </w:lvl>
+    <w:lvl w:ilvl="8" w:tplc="4009001B" w:tentative="1">
+      <w:start w:val="1"/>
+      <w:numFmt w:val="lowerRoman"/>
+      <w:lvlText w:val="%9."/>
+      <w:lvlJc w:val="right"/>
+      <w:pPr>
+        <w:ind w:left="7380" w:hanging="180"/>
+      </w:pPr>
+    </w:lvl>
+  </w:abstractNum>
+  <w:abstractNum w:abstractNumId="18" w15:restartNumberingAfterBreak="0">
     <w:nsid w:val="62872F81"/>
     <w:multiLevelType w:val="hybridMultilevel"/>
     <w:tmpl w:val="09963F74"/>
@@ -9134,7 +10968,7 @@
       </w:pPr>
     </w:lvl>
   </w:abstractNum>
-  <w:abstractNum w:abstractNumId="14" w15:restartNumberingAfterBreak="0">
+  <w:abstractNum w:abstractNumId="19" w15:restartNumberingAfterBreak="0">
     <w:nsid w:val="7397314D"/>
     <w:multiLevelType w:val="hybridMultilevel"/>
     <w:tmpl w:val="1AE4F7FA"/>
@@ -9247,7 +11081,7 @@
       </w:rPr>
     </w:lvl>
   </w:abstractNum>
-  <w:abstractNum w:abstractNumId="15" w15:restartNumberingAfterBreak="0">
+  <w:abstractNum w:abstractNumId="20" w15:restartNumberingAfterBreak="0">
     <w:nsid w:val="7AB015C5"/>
     <w:multiLevelType w:val="hybridMultilevel"/>
     <w:tmpl w:val="AC70AFD6"/>
@@ -9364,10 +11198,10 @@
     <w:abstractNumId w:val="0"/>
   </w:num>
   <w:num w:numId="2" w16cid:durableId="74521518">
-    <w:abstractNumId w:val="8"/>
+    <w:abstractNumId w:val="10"/>
   </w:num>
   <w:num w:numId="3" w16cid:durableId="696739033">
-    <w:abstractNumId w:val="9"/>
+    <w:abstractNumId w:val="12"/>
   </w:num>
   <w:num w:numId="4" w16cid:durableId="396051932">
     <w:abstractNumId w:val="3"/>
@@ -9376,13 +11210,13 @@
     <w:abstractNumId w:val="1"/>
   </w:num>
   <w:num w:numId="6" w16cid:durableId="792485075">
-    <w:abstractNumId w:val="13"/>
+    <w:abstractNumId w:val="18"/>
   </w:num>
   <w:num w:numId="7" w16cid:durableId="1622876310">
-    <w:abstractNumId w:val="12"/>
+    <w:abstractNumId w:val="16"/>
   </w:num>
   <w:num w:numId="8" w16cid:durableId="818570542">
-    <w:abstractNumId w:val="10"/>
+    <w:abstractNumId w:val="14"/>
   </w:num>
   <w:num w:numId="9" w16cid:durableId="344674794">
     <w:abstractNumId w:val="4"/>
@@ -9391,22 +11225,37 @@
     <w:abstractNumId w:val="2"/>
   </w:num>
   <w:num w:numId="11" w16cid:durableId="1725984708">
+    <w:abstractNumId w:val="20"/>
+  </w:num>
+  <w:num w:numId="12" w16cid:durableId="1092355393">
+    <w:abstractNumId w:val="7"/>
+  </w:num>
+  <w:num w:numId="13" w16cid:durableId="1932377">
+    <w:abstractNumId w:val="6"/>
+  </w:num>
+  <w:num w:numId="14" w16cid:durableId="97332818">
+    <w:abstractNumId w:val="9"/>
+  </w:num>
+  <w:num w:numId="15" w16cid:durableId="1516533306">
     <w:abstractNumId w:val="15"/>
   </w:num>
-  <w:num w:numId="12" w16cid:durableId="1092355393">
-    <w:abstractNumId w:val="6"/>
+  <w:num w:numId="16" w16cid:durableId="556473261">
+    <w:abstractNumId w:val="19"/>
   </w:num>
-  <w:num w:numId="13" w16cid:durableId="1932377">
+  <w:num w:numId="17" w16cid:durableId="1587348393">
     <w:abstractNumId w:val="5"/>
   </w:num>
-  <w:num w:numId="14" w16cid:durableId="97332818">
-    <w:abstractNumId w:val="7"/>
+  <w:num w:numId="18" w16cid:durableId="1506288457">
+    <w:abstractNumId w:val="17"/>
   </w:num>
-  <w:num w:numId="15" w16cid:durableId="1516533306">
+  <w:num w:numId="19" w16cid:durableId="14118627">
+    <w:abstractNumId w:val="8"/>
+  </w:num>
+  <w:num w:numId="20" w16cid:durableId="1165513481">
     <w:abstractNumId w:val="11"/>
   </w:num>
-  <w:num w:numId="16" w16cid:durableId="556473261">
-    <w:abstractNumId w:val="14"/>
+  <w:num w:numId="21" w16cid:durableId="1250654850">
+    <w:abstractNumId w:val="13"/>
   </w:num>
 </w:numbering>
 </file>

</xml_diff>

<commit_message>
Added Regulated Power Supply in 1st chapter + Links of FET in link PDF
</commit_message>
<xml_diff>
--- a/PSI syllabus Links.docx
+++ b/PSI syllabus Links.docx
@@ -1815,22 +1815,178 @@
         <w:ind w:left="900" w:hanging="450"/>
         <w:rPr>
           <w:rFonts w:ascii="Times New Roman" w:eastAsia="Times New Roman" w:hAnsi="Times New Roman" w:cs="Times New Roman"/>
-          <w:color w:val="000000"/>
-          <w:sz w:val="32"/>
-          <w:szCs w:val="32"/>
-        </w:rPr>
-      </w:pPr>
-      <w:proofErr w:type="spellStart"/>
-      <w:r>
-        <w:rPr>
-          <w:rFonts w:ascii="Times New Roman" w:eastAsia="Times New Roman" w:hAnsi="Times New Roman" w:cs="Times New Roman"/>
-          <w:color w:val="000000"/>
-          <w:sz w:val="32"/>
-          <w:szCs w:val="32"/>
-        </w:rPr>
-        <w:t>Hj</w:t>
-      </w:r>
-      <w:proofErr w:type="spellEnd"/>
+          <w:b/>
+          <w:bCs/>
+          <w:color w:val="000000"/>
+          <w:sz w:val="32"/>
+          <w:szCs w:val="32"/>
+        </w:rPr>
+      </w:pPr>
+      <w:r>
+        <w:rPr>
+          <w:rFonts w:ascii="Times New Roman" w:eastAsia="Times New Roman" w:hAnsi="Times New Roman" w:cs="Times New Roman"/>
+          <w:b/>
+          <w:bCs/>
+          <w:color w:val="000000"/>
+          <w:sz w:val="32"/>
+          <w:szCs w:val="32"/>
+        </w:rPr>
+        <w:t xml:space="preserve">Field Effect </w:t>
+      </w:r>
+      <w:proofErr w:type="gramStart"/>
+      <w:r>
+        <w:rPr>
+          <w:rFonts w:ascii="Times New Roman" w:eastAsia="Times New Roman" w:hAnsi="Times New Roman" w:cs="Times New Roman"/>
+          <w:b/>
+          <w:bCs/>
+          <w:color w:val="000000"/>
+          <w:sz w:val="32"/>
+          <w:szCs w:val="32"/>
+        </w:rPr>
+        <w:t>Transistors :</w:t>
+      </w:r>
+      <w:proofErr w:type="gramEnd"/>
+    </w:p>
+    <w:p>
+      <w:pPr>
+        <w:pStyle w:val="ListParagraph"/>
+        <w:numPr>
+          <w:ilvl w:val="0"/>
+          <w:numId w:val="22"/>
+        </w:numPr>
+        <w:pBdr>
+          <w:top w:val="nil"/>
+          <w:left w:val="nil"/>
+          <w:bottom w:val="nil"/>
+          <w:right w:val="nil"/>
+          <w:between w:val="nil"/>
+        </w:pBdr>
+        <w:spacing w:after="0"/>
+        <w:ind w:left="1260"/>
+        <w:rPr>
+          <w:rFonts w:ascii="Times New Roman" w:eastAsia="Times New Roman" w:hAnsi="Times New Roman" w:cs="Times New Roman"/>
+          <w:color w:val="000000"/>
+          <w:sz w:val="32"/>
+          <w:szCs w:val="32"/>
+        </w:rPr>
+      </w:pPr>
+      <w:r>
+        <w:rPr>
+          <w:rFonts w:ascii="Times New Roman" w:eastAsia="Times New Roman" w:hAnsi="Times New Roman" w:cs="Times New Roman"/>
+          <w:color w:val="000000"/>
+          <w:sz w:val="32"/>
+          <w:szCs w:val="32"/>
+        </w:rPr>
+        <w:t xml:space="preserve">FET intro. &amp; </w:t>
+      </w:r>
+      <w:proofErr w:type="gramStart"/>
+      <w:r>
+        <w:rPr>
+          <w:rFonts w:ascii="Times New Roman" w:eastAsia="Times New Roman" w:hAnsi="Times New Roman" w:cs="Times New Roman"/>
+          <w:color w:val="000000"/>
+          <w:sz w:val="32"/>
+          <w:szCs w:val="32"/>
+        </w:rPr>
+        <w:t>JFET :</w:t>
+      </w:r>
+      <w:proofErr w:type="gramEnd"/>
+    </w:p>
+    <w:p>
+      <w:pPr>
+        <w:pStyle w:val="ListParagraph"/>
+        <w:pBdr>
+          <w:top w:val="nil"/>
+          <w:left w:val="nil"/>
+          <w:bottom w:val="nil"/>
+          <w:right w:val="nil"/>
+          <w:between w:val="nil"/>
+        </w:pBdr>
+        <w:spacing w:after="0"/>
+        <w:ind w:left="1260"/>
+        <w:rPr>
+          <w:rFonts w:ascii="Times New Roman" w:eastAsia="Times New Roman" w:hAnsi="Times New Roman" w:cs="Times New Roman"/>
+          <w:color w:val="000000"/>
+          <w:sz w:val="32"/>
+          <w:szCs w:val="32"/>
+        </w:rPr>
+      </w:pPr>
+      <w:hyperlink r:id="rId26" w:history="1">
+        <w:r>
+          <w:rPr>
+            <w:rStyle w:val="Hyperlink"/>
+            <w:rFonts w:ascii="Times New Roman" w:eastAsia="Times New Roman" w:hAnsi="Times New Roman" w:cs="Times New Roman"/>
+            <w:sz w:val="32"/>
+            <w:szCs w:val="32"/>
+          </w:rPr>
+          <w:t>https://www.youtube.com/watch?v=PMOaS967Yus&amp;list=PLBlnK6fEyqRhY9vWd-InOr1g1FSA_B3MF</w:t>
+        </w:r>
+      </w:hyperlink>
+    </w:p>
+    <w:p>
+      <w:pPr>
+        <w:pStyle w:val="ListParagraph"/>
+        <w:numPr>
+          <w:ilvl w:val="0"/>
+          <w:numId w:val="22"/>
+        </w:numPr>
+        <w:pBdr>
+          <w:top w:val="nil"/>
+          <w:left w:val="nil"/>
+          <w:bottom w:val="nil"/>
+          <w:right w:val="nil"/>
+          <w:between w:val="nil"/>
+        </w:pBdr>
+        <w:spacing w:after="0"/>
+        <w:ind w:left="1260"/>
+        <w:rPr>
+          <w:rFonts w:ascii="Times New Roman" w:eastAsia="Times New Roman" w:hAnsi="Times New Roman" w:cs="Times New Roman"/>
+          <w:color w:val="000000"/>
+          <w:sz w:val="32"/>
+          <w:szCs w:val="32"/>
+        </w:rPr>
+      </w:pPr>
+      <w:proofErr w:type="gramStart"/>
+      <w:r>
+        <w:rPr>
+          <w:rFonts w:ascii="Times New Roman" w:eastAsia="Times New Roman" w:hAnsi="Times New Roman" w:cs="Times New Roman"/>
+          <w:color w:val="000000"/>
+          <w:sz w:val="32"/>
+          <w:szCs w:val="32"/>
+        </w:rPr>
+        <w:t>MOSFET :</w:t>
+      </w:r>
+      <w:proofErr w:type="gramEnd"/>
+    </w:p>
+    <w:p>
+      <w:pPr>
+        <w:pStyle w:val="ListParagraph"/>
+        <w:pBdr>
+          <w:top w:val="nil"/>
+          <w:left w:val="nil"/>
+          <w:bottom w:val="nil"/>
+          <w:right w:val="nil"/>
+          <w:between w:val="nil"/>
+        </w:pBdr>
+        <w:spacing w:after="0"/>
+        <w:ind w:left="1260"/>
+        <w:rPr>
+          <w:rFonts w:ascii="Times New Roman" w:eastAsia="Times New Roman" w:hAnsi="Times New Roman" w:cs="Times New Roman"/>
+          <w:color w:val="000000"/>
+          <w:sz w:val="32"/>
+          <w:szCs w:val="32"/>
+        </w:rPr>
+      </w:pPr>
+      <w:hyperlink r:id="rId27" w:history="1">
+        <w:r>
+          <w:rPr>
+            <w:rStyle w:val="Hyperlink"/>
+            <w:rFonts w:ascii="Times New Roman" w:eastAsia="Times New Roman" w:hAnsi="Times New Roman" w:cs="Times New Roman"/>
+            <w:sz w:val="32"/>
+            <w:szCs w:val="32"/>
+          </w:rPr>
+          <w:t>https://www.youtube.com/watch?v=PMOaS967Yus&amp;list=PLBlnK6fEyqRhIApybwpWUhq3Y8eFsdvD0</w:t>
+        </w:r>
+      </w:hyperlink>
     </w:p>
     <w:p>
       <w:pPr>
@@ -1990,41 +2146,6 @@
         <w:ind w:left="900" w:hanging="450"/>
         <w:rPr>
           <w:rFonts w:ascii="Times New Roman" w:eastAsia="Times New Roman" w:hAnsi="Times New Roman" w:cs="Times New Roman"/>
-          <w:color w:val="000000"/>
-          <w:sz w:val="32"/>
-          <w:szCs w:val="32"/>
-        </w:rPr>
-      </w:pPr>
-      <w:proofErr w:type="spellStart"/>
-      <w:r>
-        <w:rPr>
-          <w:rFonts w:ascii="Times New Roman" w:eastAsia="Times New Roman" w:hAnsi="Times New Roman" w:cs="Times New Roman"/>
-          <w:color w:val="000000"/>
-          <w:sz w:val="32"/>
-          <w:szCs w:val="32"/>
-        </w:rPr>
-        <w:t>Hj</w:t>
-      </w:r>
-      <w:proofErr w:type="spellEnd"/>
-    </w:p>
-    <w:p>
-      <w:pPr>
-        <w:pStyle w:val="ListParagraph"/>
-        <w:numPr>
-          <w:ilvl w:val="0"/>
-          <w:numId w:val="10"/>
-        </w:numPr>
-        <w:pBdr>
-          <w:top w:val="nil"/>
-          <w:left w:val="nil"/>
-          <w:bottom w:val="nil"/>
-          <w:right w:val="nil"/>
-          <w:between w:val="nil"/>
-        </w:pBdr>
-        <w:spacing w:after="0"/>
-        <w:ind w:left="900" w:hanging="450"/>
-        <w:rPr>
-          <w:rFonts w:ascii="Times New Roman" w:eastAsia="Times New Roman" w:hAnsi="Times New Roman" w:cs="Times New Roman"/>
           <w:b/>
           <w:bCs/>
           <w:color w:val="000000"/>
@@ -2063,7 +2184,7 @@
           <w:szCs w:val="32"/>
         </w:rPr>
       </w:pPr>
-      <w:hyperlink r:id="rId26" w:history="1">
+      <w:hyperlink r:id="rId28" w:history="1">
         <w:r>
           <w:rPr>
             <w:rStyle w:val="Hyperlink"/>
@@ -2298,7 +2419,7 @@
           <w:szCs w:val="32"/>
         </w:rPr>
       </w:pPr>
-      <w:hyperlink r:id="rId27" w:history="1">
+      <w:hyperlink r:id="rId29" w:history="1">
         <w:r>
           <w:rPr>
             <w:rStyle w:val="Hyperlink"/>
@@ -2690,7 +2811,7 @@
           <w:szCs w:val="32"/>
         </w:rPr>
       </w:pPr>
-      <w:hyperlink r:id="rId28" w:history="1">
+      <w:hyperlink r:id="rId30" w:history="1">
         <w:r>
           <w:rPr>
             <w:rStyle w:val="Hyperlink"/>
@@ -2832,7 +2953,7 @@
         </w:rPr>
         <w:t xml:space="preserve"> </w:t>
       </w:r>
-      <w:hyperlink r:id="rId29" w:history="1">
+      <w:hyperlink r:id="rId31" w:history="1">
         <w:r>
           <w:rPr>
             <w:rStyle w:val="Hyperlink"/>
@@ -2901,7 +3022,7 @@
         </w:rPr>
         <w:t xml:space="preserve"> </w:t>
       </w:r>
-      <w:hyperlink r:id="rId30" w:history="1">
+      <w:hyperlink r:id="rId32" w:history="1">
         <w:r>
           <w:rPr>
             <w:rStyle w:val="Hyperlink"/>
@@ -2970,7 +3091,7 @@
         </w:rPr>
         <w:t xml:space="preserve"> </w:t>
       </w:r>
-      <w:hyperlink r:id="rId31" w:history="1">
+      <w:hyperlink r:id="rId33" w:history="1">
         <w:r>
           <w:rPr>
             <w:rStyle w:val="Hyperlink"/>
@@ -3039,7 +3160,7 @@
         </w:rPr>
         <w:t xml:space="preserve"> </w:t>
       </w:r>
-      <w:hyperlink r:id="rId32" w:history="1">
+      <w:hyperlink r:id="rId34" w:history="1">
         <w:r>
           <w:rPr>
             <w:rStyle w:val="Hyperlink"/>
@@ -3272,7 +3393,7 @@
         </w:rPr>
         <w:t xml:space="preserve"> </w:t>
       </w:r>
-      <w:hyperlink r:id="rId33" w:history="1">
+      <w:hyperlink r:id="rId35" w:history="1">
         <w:r>
           <w:rPr>
             <w:rStyle w:val="Hyperlink"/>
@@ -3348,7 +3469,7 @@
         </w:rPr>
         <w:t xml:space="preserve"> </w:t>
       </w:r>
-      <w:hyperlink r:id="rId34" w:history="1">
+      <w:hyperlink r:id="rId36" w:history="1">
         <w:r>
           <w:rPr>
             <w:rStyle w:val="Hyperlink"/>
@@ -3356,25 +3477,7 @@
             <w:sz w:val="32"/>
             <w:szCs w:val="32"/>
           </w:rPr>
-          <w:t>https://www.youtube.com/watch?v=6dneWcLv1HM&amp;list=PL-IC1WV1OE4noB</w:t>
-        </w:r>
-        <w:r>
-          <w:rPr>
-            <w:rStyle w:val="Hyperlink"/>
-            <w:rFonts w:ascii="Times New Roman" w:hAnsi="Times New Roman" w:cs="Times New Roman"/>
-            <w:sz w:val="32"/>
-            <w:szCs w:val="32"/>
-          </w:rPr>
-          <w:t>2</w:t>
-        </w:r>
-        <w:r>
-          <w:rPr>
-            <w:rStyle w:val="Hyperlink"/>
-            <w:rFonts w:ascii="Times New Roman" w:hAnsi="Times New Roman" w:cs="Times New Roman"/>
-            <w:sz w:val="32"/>
-            <w:szCs w:val="32"/>
-          </w:rPr>
-          <w:t>cXD_w3BZ0y1GoKwZuw</w:t>
+          <w:t>https://www.youtube.com/watch?v=6dneWcLv1HM&amp;list=PL-IC1WV1OE4noB2cXD_w3BZ0y1GoKwZuw</w:t>
         </w:r>
       </w:hyperlink>
     </w:p>
@@ -3485,7 +3588,7 @@
           <w:szCs w:val="32"/>
         </w:rPr>
       </w:pPr>
-      <w:hyperlink r:id="rId35" w:history="1">
+      <w:hyperlink r:id="rId37" w:history="1">
         <w:r>
           <w:rPr>
             <w:rStyle w:val="Hyperlink"/>
@@ -3617,7 +3720,7 @@
           <w:u w:val="single"/>
         </w:rPr>
       </w:pPr>
-      <w:hyperlink r:id="rId36" w:history="1">
+      <w:hyperlink r:id="rId38" w:history="1">
         <w:r>
           <w:rPr>
             <w:rStyle w:val="Hyperlink"/>
@@ -3625,25 +3728,7 @@
             <w:sz w:val="32"/>
             <w:szCs w:val="32"/>
           </w:rPr>
-          <w:t>https://www.youtube.com/watch?v=KDZ-SI7OHNY&amp;list=PL-IC1WV1OE4m3hb-LfCYJ</w:t>
-        </w:r>
-        <w:r>
-          <w:rPr>
-            <w:rStyle w:val="Hyperlink"/>
-            <w:rFonts w:ascii="Times New Roman" w:eastAsia="Times New Roman" w:hAnsi="Times New Roman" w:cs="Times New Roman"/>
-            <w:sz w:val="32"/>
-            <w:szCs w:val="32"/>
-          </w:rPr>
-          <w:t>3</w:t>
-        </w:r>
-        <w:r>
-          <w:rPr>
-            <w:rStyle w:val="Hyperlink"/>
-            <w:rFonts w:ascii="Times New Roman" w:eastAsia="Times New Roman" w:hAnsi="Times New Roman" w:cs="Times New Roman"/>
-            <w:sz w:val="32"/>
-            <w:szCs w:val="32"/>
-          </w:rPr>
-          <w:t>MOkJD3v9XQT&amp;pp=0gcJCbUEOCosWNin</w:t>
+          <w:t>https://www.youtube.com/watch?v=KDZ-SI7OHNY&amp;list=PL-IC1WV1OE4m3hb-LfCYJ3MOkJD3v9XQT&amp;pp=0gcJCbUEOCosWNin</w:t>
         </w:r>
       </w:hyperlink>
     </w:p>
@@ -3746,7 +3831,7 @@
           <w:u w:val="single"/>
         </w:rPr>
       </w:pPr>
-      <w:hyperlink r:id="rId37" w:history="1">
+      <w:hyperlink r:id="rId39" w:history="1">
         <w:r>
           <w:rPr>
             <w:rStyle w:val="Hyperlink"/>
@@ -3893,7 +3978,7 @@
         </w:rPr>
         <w:t xml:space="preserve"> </w:t>
       </w:r>
-      <w:hyperlink r:id="rId38" w:history="1">
+      <w:hyperlink r:id="rId40" w:history="1">
         <w:r>
           <w:rPr>
             <w:rStyle w:val="Hyperlink"/>
@@ -3971,7 +4056,7 @@
           <w:u w:val="single"/>
         </w:rPr>
       </w:pPr>
-      <w:hyperlink r:id="rId39" w:history="1">
+      <w:hyperlink r:id="rId41" w:history="1">
         <w:r>
           <w:rPr>
             <w:rStyle w:val="Hyperlink"/>
@@ -4059,7 +4144,7 @@
           <w:u w:val="single"/>
         </w:rPr>
       </w:pPr>
-      <w:hyperlink r:id="rId40" w:history="1">
+      <w:hyperlink r:id="rId42" w:history="1">
         <w:r>
           <w:rPr>
             <w:rStyle w:val="Hyperlink"/>
@@ -4137,7 +4222,7 @@
           <w:u w:val="single"/>
         </w:rPr>
       </w:pPr>
-      <w:hyperlink r:id="rId41" w:history="1">
+      <w:hyperlink r:id="rId43" w:history="1">
         <w:r>
           <w:rPr>
             <w:rStyle w:val="Hyperlink"/>
@@ -4225,7 +4310,7 @@
           <w:u w:val="single"/>
         </w:rPr>
       </w:pPr>
-      <w:hyperlink r:id="rId42" w:history="1">
+      <w:hyperlink r:id="rId44" w:history="1">
         <w:r>
           <w:rPr>
             <w:rStyle w:val="Hyperlink"/>
@@ -4303,7 +4388,7 @@
           <w:u w:val="single"/>
         </w:rPr>
       </w:pPr>
-      <w:hyperlink r:id="rId43" w:history="1">
+      <w:hyperlink r:id="rId45" w:history="1">
         <w:r>
           <w:rPr>
             <w:rStyle w:val="Hyperlink"/>
@@ -4381,7 +4466,7 @@
           <w:u w:val="single"/>
         </w:rPr>
       </w:pPr>
-      <w:hyperlink r:id="rId44" w:history="1">
+      <w:hyperlink r:id="rId46" w:history="1">
         <w:r>
           <w:rPr>
             <w:rStyle w:val="Hyperlink"/>
@@ -4706,7 +4791,7 @@
         </w:rPr>
         <w:t xml:space="preserve"> </w:t>
       </w:r>
-      <w:hyperlink r:id="rId45" w:history="1">
+      <w:hyperlink r:id="rId47" w:history="1">
         <w:r>
           <w:rPr>
             <w:rStyle w:val="Hyperlink"/>
@@ -4795,7 +4880,7 @@
           <w:szCs w:val="32"/>
         </w:rPr>
       </w:pPr>
-      <w:hyperlink r:id="rId46" w:history="1">
+      <w:hyperlink r:id="rId48" w:history="1">
         <w:r>
           <w:rPr>
             <w:rStyle w:val="Hyperlink"/>
@@ -5372,7 +5457,7 @@
         </w:rPr>
         <w:br/>
       </w:r>
-      <w:hyperlink r:id="rId47" w:history="1">
+      <w:hyperlink r:id="rId49" w:history="1">
         <w:r>
           <w:rPr>
             <w:rStyle w:val="Hyperlink"/>
@@ -5467,7 +5552,7 @@
         </w:rPr>
         <w:t xml:space="preserve">Concept 1: </w:t>
       </w:r>
-      <w:hyperlink r:id="rId48" w:history="1">
+      <w:hyperlink r:id="rId50" w:history="1">
         <w:r>
           <w:rPr>
             <w:rStyle w:val="Hyperlink"/>
@@ -5530,7 +5615,7 @@
         </w:rPr>
         <w:t xml:space="preserve"> </w:t>
       </w:r>
-      <w:hyperlink r:id="rId49" w:history="1">
+      <w:hyperlink r:id="rId51" w:history="1">
         <w:r>
           <w:rPr>
             <w:rStyle w:val="Hyperlink"/>
@@ -5593,7 +5678,7 @@
         </w:rPr>
         <w:t xml:space="preserve"> </w:t>
       </w:r>
-      <w:hyperlink r:id="rId50" w:history="1">
+      <w:hyperlink r:id="rId52" w:history="1">
         <w:r>
           <w:rPr>
             <w:rStyle w:val="Hyperlink"/>
@@ -5647,7 +5732,7 @@
         </w:rPr>
         <w:t xml:space="preserve"> </w:t>
       </w:r>
-      <w:hyperlink r:id="rId51" w:history="1">
+      <w:hyperlink r:id="rId53" w:history="1">
         <w:r>
           <w:rPr>
             <w:rStyle w:val="Hyperlink"/>
@@ -5710,7 +5795,7 @@
         </w:rPr>
         <w:t xml:space="preserve"> </w:t>
       </w:r>
-      <w:hyperlink r:id="rId52" w:history="1">
+      <w:hyperlink r:id="rId54" w:history="1">
         <w:r>
           <w:rPr>
             <w:rStyle w:val="Hyperlink"/>
@@ -5764,7 +5849,7 @@
         </w:rPr>
         <w:t xml:space="preserve"> </w:t>
       </w:r>
-      <w:hyperlink r:id="rId53" w:history="1">
+      <w:hyperlink r:id="rId55" w:history="1">
         <w:r>
           <w:rPr>
             <w:rStyle w:val="Hyperlink"/>
@@ -5818,7 +5903,7 @@
         </w:rPr>
         <w:t xml:space="preserve"> </w:t>
       </w:r>
-      <w:hyperlink r:id="rId54" w:history="1">
+      <w:hyperlink r:id="rId56" w:history="1">
         <w:r>
           <w:rPr>
             <w:rStyle w:val="Hyperlink"/>
@@ -5872,7 +5957,7 @@
         </w:rPr>
         <w:t xml:space="preserve"> </w:t>
       </w:r>
-      <w:hyperlink r:id="rId55" w:history="1">
+      <w:hyperlink r:id="rId57" w:history="1">
         <w:r>
           <w:rPr>
             <w:rStyle w:val="Hyperlink"/>
@@ -5926,7 +6011,7 @@
         </w:rPr>
         <w:t xml:space="preserve"> </w:t>
       </w:r>
-      <w:hyperlink r:id="rId56" w:history="1">
+      <w:hyperlink r:id="rId58" w:history="1">
         <w:r>
           <w:rPr>
             <w:rStyle w:val="Hyperlink"/>
@@ -5974,7 +6059,7 @@
       <w:r>
         <w:t xml:space="preserve"> </w:t>
       </w:r>
-      <w:hyperlink r:id="rId57" w:history="1">
+      <w:hyperlink r:id="rId59" w:history="1">
         <w:r>
           <w:rPr>
             <w:rStyle w:val="Hyperlink"/>
@@ -6028,7 +6113,7 @@
         </w:rPr>
         <w:t xml:space="preserve"> </w:t>
       </w:r>
-      <w:hyperlink r:id="rId58" w:history="1">
+      <w:hyperlink r:id="rId60" w:history="1">
         <w:r>
           <w:rPr>
             <w:rStyle w:val="Hyperlink"/>
@@ -6082,7 +6167,7 @@
         </w:rPr>
         <w:t xml:space="preserve"> </w:t>
       </w:r>
-      <w:hyperlink r:id="rId59" w:history="1">
+      <w:hyperlink r:id="rId61" w:history="1">
         <w:r>
           <w:rPr>
             <w:rStyle w:val="Hyperlink"/>
@@ -6136,7 +6221,7 @@
         </w:rPr>
         <w:t xml:space="preserve"> </w:t>
       </w:r>
-      <w:hyperlink r:id="rId60" w:history="1">
+      <w:hyperlink r:id="rId62" w:history="1">
         <w:r>
           <w:rPr>
             <w:rStyle w:val="Hyperlink"/>
@@ -6190,7 +6275,7 @@
         </w:rPr>
         <w:t xml:space="preserve"> </w:t>
       </w:r>
-      <w:hyperlink r:id="rId61" w:history="1">
+      <w:hyperlink r:id="rId63" w:history="1">
         <w:r>
           <w:rPr>
             <w:rStyle w:val="Hyperlink"/>
@@ -6403,7 +6488,7 @@
           <w:szCs w:val="32"/>
         </w:rPr>
       </w:pPr>
-      <w:hyperlink r:id="rId62" w:history="1">
+      <w:hyperlink r:id="rId64" w:history="1">
         <w:r>
           <w:rPr>
             <w:rStyle w:val="Hyperlink"/>
@@ -6458,7 +6543,7 @@
           <w:szCs w:val="32"/>
         </w:rPr>
       </w:pPr>
-      <w:hyperlink r:id="rId63" w:history="1">
+      <w:hyperlink r:id="rId65" w:history="1">
         <w:r>
           <w:rPr>
             <w:rStyle w:val="Hyperlink"/>
@@ -6572,7 +6657,7 @@
           <w:szCs w:val="32"/>
         </w:rPr>
       </w:pPr>
-      <w:hyperlink r:id="rId64" w:history="1">
+      <w:hyperlink r:id="rId66" w:history="1">
         <w:r>
           <w:rPr>
             <w:rStyle w:val="Hyperlink"/>
@@ -6959,7 +7044,7 @@
           <w:szCs w:val="28"/>
         </w:rPr>
       </w:pPr>
-      <w:hyperlink r:id="rId65">
+      <w:hyperlink r:id="rId67">
         <w:r>
           <w:rPr>
             <w:rFonts w:ascii="Times New Roman" w:eastAsia="Times New Roman" w:hAnsi="Times New Roman" w:cs="Times New Roman"/>
@@ -7078,7 +7163,7 @@
           <w:szCs w:val="28"/>
         </w:rPr>
       </w:pPr>
-      <w:hyperlink r:id="rId66">
+      <w:hyperlink r:id="rId68">
         <w:r>
           <w:rPr>
             <w:rFonts w:ascii="Times New Roman" w:eastAsia="Times New Roman" w:hAnsi="Times New Roman" w:cs="Times New Roman"/>
@@ -7190,7 +7275,7 @@
           <w:szCs w:val="28"/>
         </w:rPr>
       </w:pPr>
-      <w:hyperlink r:id="rId67">
+      <w:hyperlink r:id="rId69">
         <w:r>
           <w:rPr>
             <w:rFonts w:ascii="Times New Roman" w:eastAsia="Times New Roman" w:hAnsi="Times New Roman" w:cs="Times New Roman"/>
@@ -7238,7 +7323,7 @@
           <w:szCs w:val="28"/>
         </w:rPr>
       </w:pPr>
-      <w:hyperlink r:id="rId68">
+      <w:hyperlink r:id="rId70">
         <w:r>
           <w:rPr>
             <w:rFonts w:ascii="Times New Roman" w:eastAsia="Times New Roman" w:hAnsi="Times New Roman" w:cs="Times New Roman"/>
@@ -7414,7 +7499,7 @@
           <w:szCs w:val="28"/>
         </w:rPr>
       </w:pPr>
-      <w:hyperlink r:id="rId69">
+      <w:hyperlink r:id="rId71">
         <w:r>
           <w:rPr>
             <w:rFonts w:ascii="Times New Roman" w:eastAsia="Times New Roman" w:hAnsi="Times New Roman" w:cs="Times New Roman"/>
@@ -7476,7 +7561,7 @@
           <w:szCs w:val="28"/>
         </w:rPr>
       </w:pPr>
-      <w:hyperlink r:id="rId70">
+      <w:hyperlink r:id="rId72">
         <w:r>
           <w:rPr>
             <w:rFonts w:ascii="Times New Roman" w:eastAsia="Times New Roman" w:hAnsi="Times New Roman" w:cs="Times New Roman"/>
@@ -7557,7 +7642,7 @@
           <w:szCs w:val="28"/>
         </w:rPr>
       </w:pPr>
-      <w:hyperlink r:id="rId71">
+      <w:hyperlink r:id="rId73">
         <w:r>
           <w:rPr>
             <w:rFonts w:ascii="Times New Roman" w:eastAsia="Times New Roman" w:hAnsi="Times New Roman" w:cs="Times New Roman"/>
@@ -7691,7 +7776,7 @@
         <w:spacing w:after="0"/>
         <w:ind w:left="1080"/>
       </w:pPr>
-      <w:hyperlink r:id="rId72" w:history="1">
+      <w:hyperlink r:id="rId74" w:history="1">
         <w:r>
           <w:rPr>
             <w:rStyle w:val="Hyperlink"/>
@@ -7791,7 +7876,7 @@
           <w:szCs w:val="28"/>
         </w:rPr>
       </w:pPr>
-      <w:hyperlink r:id="rId73" w:history="1">
+      <w:hyperlink r:id="rId75" w:history="1">
         <w:r>
           <w:rPr>
             <w:rStyle w:val="Hyperlink"/>
@@ -7901,7 +7986,7 @@
           <w:szCs w:val="28"/>
         </w:rPr>
       </w:pPr>
-      <w:hyperlink r:id="rId74" w:history="1">
+      <w:hyperlink r:id="rId76" w:history="1">
         <w:r>
           <w:rPr>
             <w:rStyle w:val="Hyperlink"/>
@@ -8051,7 +8136,7 @@
           <w:szCs w:val="28"/>
         </w:rPr>
       </w:pPr>
-      <w:hyperlink r:id="rId75">
+      <w:hyperlink r:id="rId77">
         <w:r>
           <w:rPr>
             <w:rFonts w:ascii="Times New Roman" w:eastAsia="Times New Roman" w:hAnsi="Times New Roman" w:cs="Times New Roman"/>
@@ -8152,7 +8237,7 @@
           <w:szCs w:val="28"/>
         </w:rPr>
       </w:pPr>
-      <w:hyperlink r:id="rId76">
+      <w:hyperlink r:id="rId78">
         <w:r>
           <w:rPr>
             <w:rFonts w:ascii="Times New Roman" w:eastAsia="Times New Roman" w:hAnsi="Times New Roman" w:cs="Times New Roman"/>
@@ -8272,7 +8357,7 @@
           <w:szCs w:val="28"/>
         </w:rPr>
       </w:pPr>
-      <w:hyperlink r:id="rId77">
+      <w:hyperlink r:id="rId79">
         <w:r>
           <w:rPr>
             <w:rFonts w:ascii="Times New Roman" w:eastAsia="Times New Roman" w:hAnsi="Times New Roman" w:cs="Times New Roman"/>
@@ -8322,7 +8407,7 @@
           <w:szCs w:val="28"/>
         </w:rPr>
       </w:pPr>
-      <w:hyperlink r:id="rId78">
+      <w:hyperlink r:id="rId80">
         <w:r>
           <w:rPr>
             <w:rFonts w:ascii="Times New Roman" w:eastAsia="Times New Roman" w:hAnsi="Times New Roman" w:cs="Times New Roman"/>
@@ -8423,7 +8508,7 @@
           <w:szCs w:val="28"/>
         </w:rPr>
       </w:pPr>
-      <w:hyperlink r:id="rId79">
+      <w:hyperlink r:id="rId81">
         <w:r>
           <w:rPr>
             <w:rFonts w:ascii="Times New Roman" w:eastAsia="Times New Roman" w:hAnsi="Times New Roman" w:cs="Times New Roman"/>
@@ -8448,7 +8533,7 @@
         <w:spacing w:after="0"/>
         <w:ind w:left="1080"/>
       </w:pPr>
-      <w:hyperlink r:id="rId80">
+      <w:hyperlink r:id="rId82">
         <w:r>
           <w:rPr>
             <w:rFonts w:ascii="Times New Roman" w:eastAsia="Times New Roman" w:hAnsi="Times New Roman" w:cs="Times New Roman"/>
@@ -8498,7 +8583,7 @@
           <w:szCs w:val="28"/>
         </w:rPr>
       </w:pPr>
-      <w:hyperlink r:id="rId81">
+      <w:hyperlink r:id="rId83">
         <w:r>
           <w:rPr>
             <w:rFonts w:ascii="Times New Roman" w:eastAsia="Times New Roman" w:hAnsi="Times New Roman" w:cs="Times New Roman"/>
@@ -8690,7 +8775,7 @@
           <w:szCs w:val="28"/>
         </w:rPr>
       </w:pPr>
-      <w:hyperlink r:id="rId82" w:history="1">
+      <w:hyperlink r:id="rId84" w:history="1">
         <w:r>
           <w:rPr>
             <w:rStyle w:val="Hyperlink"/>
@@ -8824,7 +8909,7 @@
           <w:szCs w:val="28"/>
         </w:rPr>
       </w:pPr>
-      <w:hyperlink r:id="rId83" w:history="1">
+      <w:hyperlink r:id="rId85" w:history="1">
         <w:r>
           <w:rPr>
             <w:rStyle w:val="Hyperlink"/>
@@ -9372,8 +9457,8 @@
   <w:abstractNum w:abstractNumId="2" w15:restartNumberingAfterBreak="0">
     <w:nsid w:val="29212259"/>
     <w:multiLevelType w:val="hybridMultilevel"/>
-    <w:tmpl w:val="6DA02E36"/>
-    <w:lvl w:ilvl="0" w:tplc="5372C732">
+    <w:tmpl w:val="5CDCF1A6"/>
+    <w:lvl w:ilvl="0" w:tplc="2312EAA0">
       <w:start w:val="1"/>
       <w:numFmt w:val="decimal"/>
       <w:lvlText w:val="%1."/>
@@ -9382,8 +9467,8 @@
         <w:ind w:left="1080" w:hanging="360"/>
       </w:pPr>
       <w:rPr>
-        <w:b w:val="0"/>
-        <w:bCs w:val="0"/>
+        <w:b/>
+        <w:bCs/>
       </w:rPr>
     </w:lvl>
     <w:lvl w:ilvl="1" w:tplc="40090019" w:tentative="1">
@@ -9688,11 +9773,11 @@
   <w:abstractNum w:abstractNumId="5" w15:restartNumberingAfterBreak="0">
     <w:nsid w:val="31FB20D6"/>
     <w:multiLevelType w:val="hybridMultilevel"/>
-    <w:tmpl w:val="464C5DE2"/>
-    <w:lvl w:ilvl="0" w:tplc="1B28161C">
+    <w:tmpl w:val="7EE46FCC"/>
+    <w:lvl w:ilvl="0" w:tplc="40090011">
       <w:start w:val="1"/>
       <w:numFmt w:val="decimal"/>
-      <w:lvlText w:val="(%1)"/>
+      <w:lvlText w:val="%1)"/>
       <w:lvlJc w:val="left"/>
       <w:pPr>
         <w:ind w:left="1260" w:hanging="360"/>
@@ -9951,6 +10036,92 @@
     </w:lvl>
   </w:abstractNum>
   <w:abstractNum w:abstractNumId="8" w15:restartNumberingAfterBreak="0">
+    <w:nsid w:val="36615831"/>
+    <w:multiLevelType w:val="hybridMultilevel"/>
+    <w:tmpl w:val="4266C6C8"/>
+    <w:lvl w:ilvl="0" w:tplc="40090011">
+      <w:start w:val="1"/>
+      <w:numFmt w:val="decimal"/>
+      <w:lvlText w:val="%1)"/>
+      <w:lvlJc w:val="left"/>
+      <w:pPr>
+        <w:ind w:left="1620" w:hanging="360"/>
+      </w:pPr>
+    </w:lvl>
+    <w:lvl w:ilvl="1" w:tplc="40090019" w:tentative="1">
+      <w:start w:val="1"/>
+      <w:numFmt w:val="lowerLetter"/>
+      <w:lvlText w:val="%2."/>
+      <w:lvlJc w:val="left"/>
+      <w:pPr>
+        <w:ind w:left="2340" w:hanging="360"/>
+      </w:pPr>
+    </w:lvl>
+    <w:lvl w:ilvl="2" w:tplc="4009001B" w:tentative="1">
+      <w:start w:val="1"/>
+      <w:numFmt w:val="lowerRoman"/>
+      <w:lvlText w:val="%3."/>
+      <w:lvlJc w:val="right"/>
+      <w:pPr>
+        <w:ind w:left="3060" w:hanging="180"/>
+      </w:pPr>
+    </w:lvl>
+    <w:lvl w:ilvl="3" w:tplc="4009000F" w:tentative="1">
+      <w:start w:val="1"/>
+      <w:numFmt w:val="decimal"/>
+      <w:lvlText w:val="%4."/>
+      <w:lvlJc w:val="left"/>
+      <w:pPr>
+        <w:ind w:left="3780" w:hanging="360"/>
+      </w:pPr>
+    </w:lvl>
+    <w:lvl w:ilvl="4" w:tplc="40090019" w:tentative="1">
+      <w:start w:val="1"/>
+      <w:numFmt w:val="lowerLetter"/>
+      <w:lvlText w:val="%5."/>
+      <w:lvlJc w:val="left"/>
+      <w:pPr>
+        <w:ind w:left="4500" w:hanging="360"/>
+      </w:pPr>
+    </w:lvl>
+    <w:lvl w:ilvl="5" w:tplc="4009001B" w:tentative="1">
+      <w:start w:val="1"/>
+      <w:numFmt w:val="lowerRoman"/>
+      <w:lvlText w:val="%6."/>
+      <w:lvlJc w:val="right"/>
+      <w:pPr>
+        <w:ind w:left="5220" w:hanging="180"/>
+      </w:pPr>
+    </w:lvl>
+    <w:lvl w:ilvl="6" w:tplc="4009000F" w:tentative="1">
+      <w:start w:val="1"/>
+      <w:numFmt w:val="decimal"/>
+      <w:lvlText w:val="%7."/>
+      <w:lvlJc w:val="left"/>
+      <w:pPr>
+        <w:ind w:left="5940" w:hanging="360"/>
+      </w:pPr>
+    </w:lvl>
+    <w:lvl w:ilvl="7" w:tplc="40090019" w:tentative="1">
+      <w:start w:val="1"/>
+      <w:numFmt w:val="lowerLetter"/>
+      <w:lvlText w:val="%8."/>
+      <w:lvlJc w:val="left"/>
+      <w:pPr>
+        <w:ind w:left="6660" w:hanging="360"/>
+      </w:pPr>
+    </w:lvl>
+    <w:lvl w:ilvl="8" w:tplc="4009001B" w:tentative="1">
+      <w:start w:val="1"/>
+      <w:numFmt w:val="lowerRoman"/>
+      <w:lvlText w:val="%9."/>
+      <w:lvlJc w:val="right"/>
+      <w:pPr>
+        <w:ind w:left="7380" w:hanging="180"/>
+      </w:pPr>
+    </w:lvl>
+  </w:abstractNum>
+  <w:abstractNum w:abstractNumId="9" w15:restartNumberingAfterBreak="0">
     <w:nsid w:val="3AC71FC8"/>
     <w:multiLevelType w:val="hybridMultilevel"/>
     <w:tmpl w:val="C4BE6376"/>
@@ -10036,14 +10207,14 @@
       </w:pPr>
     </w:lvl>
   </w:abstractNum>
-  <w:abstractNum w:abstractNumId="9" w15:restartNumberingAfterBreak="0">
+  <w:abstractNum w:abstractNumId="10" w15:restartNumberingAfterBreak="0">
     <w:nsid w:val="3F65527D"/>
     <w:multiLevelType w:val="hybridMultilevel"/>
-    <w:tmpl w:val="DDEE89CC"/>
-    <w:lvl w:ilvl="0" w:tplc="54D6F6C8">
+    <w:tmpl w:val="3360578A"/>
+    <w:lvl w:ilvl="0" w:tplc="40090011">
       <w:start w:val="1"/>
       <w:numFmt w:val="decimal"/>
-      <w:lvlText w:val="(%1)"/>
+      <w:lvlText w:val="%1)"/>
       <w:lvlJc w:val="left"/>
       <w:pPr>
         <w:ind w:left="1260" w:hanging="360"/>
@@ -10125,7 +10296,7 @@
       </w:pPr>
     </w:lvl>
   </w:abstractNum>
-  <w:abstractNum w:abstractNumId="10" w15:restartNumberingAfterBreak="0">
+  <w:abstractNum w:abstractNumId="11" w15:restartNumberingAfterBreak="0">
     <w:nsid w:val="4C0D43C3"/>
     <w:multiLevelType w:val="multilevel"/>
     <w:tmpl w:val="C194D866"/>
@@ -10211,7 +10382,7 @@
       </w:pPr>
     </w:lvl>
   </w:abstractNum>
-  <w:abstractNum w:abstractNumId="11" w15:restartNumberingAfterBreak="0">
+  <w:abstractNum w:abstractNumId="12" w15:restartNumberingAfterBreak="0">
     <w:nsid w:val="4DAD2BB7"/>
     <w:multiLevelType w:val="hybridMultilevel"/>
     <w:tmpl w:val="16169982"/>
@@ -10297,7 +10468,7 @@
       </w:pPr>
     </w:lvl>
   </w:abstractNum>
-  <w:abstractNum w:abstractNumId="12" w15:restartNumberingAfterBreak="0">
+  <w:abstractNum w:abstractNumId="13" w15:restartNumberingAfterBreak="0">
     <w:nsid w:val="4FE54EE8"/>
     <w:multiLevelType w:val="multilevel"/>
     <w:tmpl w:val="9F307DE2"/>
@@ -10383,7 +10554,7 @@
       </w:pPr>
     </w:lvl>
   </w:abstractNum>
-  <w:abstractNum w:abstractNumId="13" w15:restartNumberingAfterBreak="0">
+  <w:abstractNum w:abstractNumId="14" w15:restartNumberingAfterBreak="0">
     <w:nsid w:val="50964967"/>
     <w:multiLevelType w:val="hybridMultilevel"/>
     <w:tmpl w:val="DDEE89CC"/>
@@ -10472,7 +10643,7 @@
       </w:pPr>
     </w:lvl>
   </w:abstractNum>
-  <w:abstractNum w:abstractNumId="14" w15:restartNumberingAfterBreak="0">
+  <w:abstractNum w:abstractNumId="15" w15:restartNumberingAfterBreak="0">
     <w:nsid w:val="546329B7"/>
     <w:multiLevelType w:val="hybridMultilevel"/>
     <w:tmpl w:val="627EEBF0"/>
@@ -10562,7 +10733,7 @@
       </w:pPr>
     </w:lvl>
   </w:abstractNum>
-  <w:abstractNum w:abstractNumId="15" w15:restartNumberingAfterBreak="0">
+  <w:abstractNum w:abstractNumId="16" w15:restartNumberingAfterBreak="0">
     <w:nsid w:val="581D2824"/>
     <w:multiLevelType w:val="hybridMultilevel"/>
     <w:tmpl w:val="41C0C86A"/>
@@ -10675,7 +10846,7 @@
       </w:rPr>
     </w:lvl>
   </w:abstractNum>
-  <w:abstractNum w:abstractNumId="16" w15:restartNumberingAfterBreak="0">
+  <w:abstractNum w:abstractNumId="17" w15:restartNumberingAfterBreak="0">
     <w:nsid w:val="58C84917"/>
     <w:multiLevelType w:val="hybridMultilevel"/>
     <w:tmpl w:val="567AFC1A"/>
@@ -10788,7 +10959,7 @@
       </w:rPr>
     </w:lvl>
   </w:abstractNum>
-  <w:abstractNum w:abstractNumId="17" w15:restartNumberingAfterBreak="0">
+  <w:abstractNum w:abstractNumId="18" w15:restartNumberingAfterBreak="0">
     <w:nsid w:val="5FE50CB1"/>
     <w:multiLevelType w:val="hybridMultilevel"/>
     <w:tmpl w:val="4514A332"/>
@@ -10878,7 +11049,7 @@
       </w:pPr>
     </w:lvl>
   </w:abstractNum>
-  <w:abstractNum w:abstractNumId="18" w15:restartNumberingAfterBreak="0">
+  <w:abstractNum w:abstractNumId="19" w15:restartNumberingAfterBreak="0">
     <w:nsid w:val="62872F81"/>
     <w:multiLevelType w:val="hybridMultilevel"/>
     <w:tmpl w:val="09963F74"/>
@@ -10968,7 +11139,7 @@
       </w:pPr>
     </w:lvl>
   </w:abstractNum>
-  <w:abstractNum w:abstractNumId="19" w15:restartNumberingAfterBreak="0">
+  <w:abstractNum w:abstractNumId="20" w15:restartNumberingAfterBreak="0">
     <w:nsid w:val="7397314D"/>
     <w:multiLevelType w:val="hybridMultilevel"/>
     <w:tmpl w:val="1AE4F7FA"/>
@@ -11081,7 +11252,7 @@
       </w:rPr>
     </w:lvl>
   </w:abstractNum>
-  <w:abstractNum w:abstractNumId="20" w15:restartNumberingAfterBreak="0">
+  <w:abstractNum w:abstractNumId="21" w15:restartNumberingAfterBreak="0">
     <w:nsid w:val="7AB015C5"/>
     <w:multiLevelType w:val="hybridMultilevel"/>
     <w:tmpl w:val="AC70AFD6"/>
@@ -11198,10 +11369,10 @@
     <w:abstractNumId w:val="0"/>
   </w:num>
   <w:num w:numId="2" w16cid:durableId="74521518">
-    <w:abstractNumId w:val="10"/>
+    <w:abstractNumId w:val="11"/>
   </w:num>
   <w:num w:numId="3" w16cid:durableId="696739033">
-    <w:abstractNumId w:val="12"/>
+    <w:abstractNumId w:val="13"/>
   </w:num>
   <w:num w:numId="4" w16cid:durableId="396051932">
     <w:abstractNumId w:val="3"/>
@@ -11210,13 +11381,13 @@
     <w:abstractNumId w:val="1"/>
   </w:num>
   <w:num w:numId="6" w16cid:durableId="792485075">
-    <w:abstractNumId w:val="18"/>
+    <w:abstractNumId w:val="19"/>
   </w:num>
   <w:num w:numId="7" w16cid:durableId="1622876310">
-    <w:abstractNumId w:val="16"/>
+    <w:abstractNumId w:val="17"/>
   </w:num>
   <w:num w:numId="8" w16cid:durableId="818570542">
-    <w:abstractNumId w:val="14"/>
+    <w:abstractNumId w:val="15"/>
   </w:num>
   <w:num w:numId="9" w16cid:durableId="344674794">
     <w:abstractNumId w:val="4"/>
@@ -11225,7 +11396,7 @@
     <w:abstractNumId w:val="2"/>
   </w:num>
   <w:num w:numId="11" w16cid:durableId="1725984708">
-    <w:abstractNumId w:val="20"/>
+    <w:abstractNumId w:val="21"/>
   </w:num>
   <w:num w:numId="12" w16cid:durableId="1092355393">
     <w:abstractNumId w:val="7"/>
@@ -11234,28 +11405,31 @@
     <w:abstractNumId w:val="6"/>
   </w:num>
   <w:num w:numId="14" w16cid:durableId="97332818">
-    <w:abstractNumId w:val="9"/>
+    <w:abstractNumId w:val="10"/>
   </w:num>
   <w:num w:numId="15" w16cid:durableId="1516533306">
-    <w:abstractNumId w:val="15"/>
+    <w:abstractNumId w:val="16"/>
   </w:num>
   <w:num w:numId="16" w16cid:durableId="556473261">
-    <w:abstractNumId w:val="19"/>
+    <w:abstractNumId w:val="20"/>
   </w:num>
   <w:num w:numId="17" w16cid:durableId="1587348393">
     <w:abstractNumId w:val="5"/>
   </w:num>
   <w:num w:numId="18" w16cid:durableId="1506288457">
-    <w:abstractNumId w:val="17"/>
+    <w:abstractNumId w:val="18"/>
   </w:num>
   <w:num w:numId="19" w16cid:durableId="14118627">
-    <w:abstractNumId w:val="8"/>
+    <w:abstractNumId w:val="9"/>
   </w:num>
   <w:num w:numId="20" w16cid:durableId="1165513481">
-    <w:abstractNumId w:val="11"/>
+    <w:abstractNumId w:val="12"/>
   </w:num>
   <w:num w:numId="21" w16cid:durableId="1250654850">
-    <w:abstractNumId w:val="13"/>
+    <w:abstractNumId w:val="14"/>
+  </w:num>
+  <w:num w:numId="22" w16cid:durableId="1027947538">
+    <w:abstractNumId w:val="8"/>
   </w:num>
 </w:numbering>
 </file>

</xml_diff>

<commit_message>
Added New links for μp and Z_Extras
</commit_message>
<xml_diff>
--- a/PSI syllabus Links.docx
+++ b/PSI syllabus Links.docx
@@ -6408,29 +6408,6 @@
     <w:p>
       <w:pPr>
         <w:pStyle w:val="ListParagraph"/>
-        <w:numPr>
-          <w:ilvl w:val="0"/>
-          <w:numId w:val="8"/>
-        </w:numPr>
-        <w:pBdr>
-          <w:top w:val="nil"/>
-          <w:left w:val="nil"/>
-          <w:bottom w:val="nil"/>
-          <w:right w:val="nil"/>
-          <w:between w:val="nil"/>
-        </w:pBdr>
-        <w:spacing w:after="0"/>
-        <w:rPr>
-          <w:rFonts w:ascii="Times New Roman" w:eastAsia="Times New Roman" w:hAnsi="Times New Roman" w:cs="Times New Roman"/>
-          <w:color w:val="000000"/>
-          <w:sz w:val="32"/>
-          <w:szCs w:val="32"/>
-        </w:rPr>
-      </w:pPr>
-    </w:p>
-    <w:p>
-      <w:pPr>
-        <w:pStyle w:val="ListParagraph"/>
         <w:pBdr>
           <w:top w:val="nil"/>
           <w:left w:val="nil"/>
@@ -6518,6 +6495,25 @@
     <w:p>
       <w:pPr>
         <w:pStyle w:val="ListParagraph"/>
+        <w:pBdr>
+          <w:top w:val="nil"/>
+          <w:left w:val="nil"/>
+          <w:bottom w:val="nil"/>
+          <w:right w:val="nil"/>
+          <w:between w:val="nil"/>
+        </w:pBdr>
+        <w:spacing w:after="0"/>
+        <w:rPr>
+          <w:rFonts w:ascii="Times New Roman" w:eastAsia="Times New Roman" w:hAnsi="Times New Roman" w:cs="Times New Roman"/>
+          <w:color w:val="000000"/>
+          <w:sz w:val="32"/>
+          <w:szCs w:val="32"/>
+        </w:rPr>
+      </w:pPr>
+    </w:p>
+    <w:p>
+      <w:pPr>
+        <w:pStyle w:val="ListParagraph"/>
         <w:numPr>
           <w:ilvl w:val="0"/>
           <w:numId w:val="8"/>
@@ -6544,8 +6540,38 @@
           <w:sz w:val="32"/>
           <w:szCs w:val="32"/>
         </w:rPr>
-        <w:t>Sd</w:t>
-      </w:r>
+        <w:t>Attenuators :</w:t>
+      </w:r>
+    </w:p>
+    <w:p>
+      <w:pPr>
+        <w:pStyle w:val="ListParagraph"/>
+        <w:pBdr>
+          <w:top w:val="nil"/>
+          <w:left w:val="nil"/>
+          <w:bottom w:val="nil"/>
+          <w:right w:val="nil"/>
+          <w:between w:val="nil"/>
+        </w:pBdr>
+        <w:spacing w:after="0"/>
+        <w:rPr>
+          <w:rFonts w:ascii="Times New Roman" w:eastAsia="Times New Roman" w:hAnsi="Times New Roman" w:cs="Times New Roman"/>
+          <w:color w:val="000000"/>
+          <w:sz w:val="32"/>
+          <w:szCs w:val="32"/>
+        </w:rPr>
+      </w:pPr>
+      <w:hyperlink r:id="rId79" w:history="1">
+        <w:r>
+          <w:rPr>
+            <w:rStyle w:val="Hyperlink"/>
+            <w:rFonts w:ascii="Times New Roman" w:eastAsia="Times New Roman" w:hAnsi="Times New Roman" w:cs="Times New Roman"/>
+            <w:sz w:val="32"/>
+            <w:szCs w:val="32"/>
+          </w:rPr>
+          <w:t>https://youtu.be/DL6ZvNhxU3E?si=m3716iXYuijLTd6E</w:t>
+        </w:r>
+      </w:hyperlink>
     </w:p>
     <w:p>
       <w:pPr>
@@ -6569,6 +6595,40 @@
           <w:szCs w:val="32"/>
         </w:rPr>
       </w:pPr>
+      <w:proofErr w:type="spellStart"/>
+      <w:r>
+        <w:rPr>
+          <w:rFonts w:ascii="Times New Roman" w:eastAsia="Times New Roman" w:hAnsi="Times New Roman" w:cs="Times New Roman"/>
+          <w:color w:val="000000"/>
+          <w:sz w:val="32"/>
+          <w:szCs w:val="32"/>
+        </w:rPr>
+        <w:t>fd</w:t>
+      </w:r>
+      <w:proofErr w:type="spellEnd"/>
+    </w:p>
+    <w:p>
+      <w:pPr>
+        <w:pStyle w:val="ListParagraph"/>
+        <w:numPr>
+          <w:ilvl w:val="0"/>
+          <w:numId w:val="8"/>
+        </w:numPr>
+        <w:pBdr>
+          <w:top w:val="nil"/>
+          <w:left w:val="nil"/>
+          <w:bottom w:val="nil"/>
+          <w:right w:val="nil"/>
+          <w:between w:val="nil"/>
+        </w:pBdr>
+        <w:spacing w:after="0"/>
+        <w:rPr>
+          <w:rFonts w:ascii="Times New Roman" w:eastAsia="Times New Roman" w:hAnsi="Times New Roman" w:cs="Times New Roman"/>
+          <w:color w:val="000000"/>
+          <w:sz w:val="32"/>
+          <w:szCs w:val="32"/>
+        </w:rPr>
+      </w:pPr>
       <w:r>
         <w:rPr>
           <w:rFonts w:ascii="Times New Roman" w:eastAsia="Times New Roman" w:hAnsi="Times New Roman" w:cs="Times New Roman"/>
@@ -6597,7 +6657,7 @@
           <w:szCs w:val="32"/>
         </w:rPr>
       </w:pPr>
-      <w:hyperlink r:id="rId79" w:history="1">
+      <w:hyperlink r:id="rId80" w:history="1">
         <w:r>
           <w:rPr>
             <w:rStyle w:val="Hyperlink"/>
@@ -6831,6 +6891,1456 @@
     </w:p>
     <w:p>
       <w:pPr>
+        <w:pStyle w:val="ListParagraph"/>
+        <w:pBdr>
+          <w:top w:val="nil"/>
+          <w:left w:val="nil"/>
+          <w:bottom w:val="nil"/>
+          <w:right w:val="nil"/>
+          <w:between w:val="nil"/>
+        </w:pBdr>
+        <w:spacing w:after="0"/>
+        <w:ind w:left="792"/>
+        <w:rPr>
+          <w:rFonts w:ascii="Times New Roman" w:eastAsia="Times New Roman" w:hAnsi="Times New Roman" w:cs="Times New Roman"/>
+          <w:b/>
+          <w:bCs/>
+          <w:color w:val="000000"/>
+          <w:sz w:val="36"/>
+          <w:szCs w:val="36"/>
+          <w:u w:val="single"/>
+        </w:rPr>
+      </w:pPr>
+    </w:p>
+    <w:p>
+      <w:pPr>
+        <w:pStyle w:val="ListParagraph"/>
+        <w:numPr>
+          <w:ilvl w:val="0"/>
+          <w:numId w:val="28"/>
+        </w:numPr>
+        <w:pBdr>
+          <w:top w:val="nil"/>
+          <w:left w:val="nil"/>
+          <w:bottom w:val="nil"/>
+          <w:right w:val="nil"/>
+          <w:between w:val="nil"/>
+        </w:pBdr>
+        <w:spacing w:after="0"/>
+        <w:rPr>
+          <w:rFonts w:ascii="Times New Roman" w:eastAsia="Times New Roman" w:hAnsi="Times New Roman" w:cs="Times New Roman"/>
+          <w:b/>
+          <w:bCs/>
+          <w:color w:val="000000"/>
+          <w:sz w:val="36"/>
+          <w:szCs w:val="36"/>
+          <w:u w:val="single"/>
+        </w:rPr>
+      </w:pPr>
+      <w:r>
+        <w:rPr>
+          <w:rFonts w:ascii="Times New Roman" w:eastAsia="Times New Roman" w:hAnsi="Times New Roman" w:cs="Times New Roman"/>
+          <w:b/>
+          <w:bCs/>
+          <w:color w:val="000000"/>
+          <w:sz w:val="36"/>
+          <w:szCs w:val="36"/>
+          <w:u w:val="single"/>
+        </w:rPr>
+        <w:t>Microprocessor Architecture &amp; Microprocessor system</w:t>
+      </w:r>
+      <w:r>
+        <w:rPr>
+          <w:rFonts w:ascii="Times New Roman" w:eastAsia="Times New Roman" w:hAnsi="Times New Roman" w:cs="Times New Roman"/>
+          <w:b/>
+          <w:bCs/>
+          <w:color w:val="000000"/>
+          <w:sz w:val="36"/>
+          <w:szCs w:val="36"/>
+        </w:rPr>
+        <w:t xml:space="preserve"> :-</w:t>
+      </w:r>
+    </w:p>
+    <w:p>
+      <w:pPr>
+        <w:pStyle w:val="ListParagraph"/>
+        <w:pBdr>
+          <w:top w:val="nil"/>
+          <w:left w:val="nil"/>
+          <w:bottom w:val="nil"/>
+          <w:right w:val="nil"/>
+          <w:between w:val="nil"/>
+        </w:pBdr>
+        <w:spacing w:after="0"/>
+        <w:ind w:left="1170"/>
+        <w:rPr>
+          <w:rFonts w:ascii="Times New Roman" w:eastAsia="Times New Roman" w:hAnsi="Times New Roman" w:cs="Times New Roman"/>
+          <w:color w:val="000000"/>
+          <w:sz w:val="20"/>
+          <w:szCs w:val="20"/>
+        </w:rPr>
+      </w:pPr>
+    </w:p>
+    <w:p>
+      <w:pPr>
+        <w:pStyle w:val="ListParagraph"/>
+        <w:numPr>
+          <w:ilvl w:val="1"/>
+          <w:numId w:val="13"/>
+        </w:numPr>
+        <w:pBdr>
+          <w:top w:val="nil"/>
+          <w:left w:val="nil"/>
+          <w:bottom w:val="nil"/>
+          <w:right w:val="nil"/>
+          <w:between w:val="nil"/>
+        </w:pBdr>
+        <w:spacing w:after="0"/>
+        <w:ind w:left="1080"/>
+        <w:rPr>
+          <w:rFonts w:ascii="Times New Roman" w:eastAsia="Times New Roman" w:hAnsi="Times New Roman" w:cs="Times New Roman"/>
+          <w:color w:val="000000"/>
+          <w:sz w:val="32"/>
+          <w:szCs w:val="32"/>
+        </w:rPr>
+      </w:pPr>
+      <w:r>
+        <w:rPr>
+          <w:rFonts w:ascii="Times New Roman" w:eastAsia="Times New Roman" w:hAnsi="Times New Roman" w:cs="Times New Roman"/>
+          <w:color w:val="000000"/>
+          <w:sz w:val="32"/>
+          <w:szCs w:val="32"/>
+          <w:u w:val="single"/>
+        </w:rPr>
+        <w:t xml:space="preserve">Intro to </w:t>
+      </w:r>
+      <w:proofErr w:type="spellStart"/>
+      <w:r>
+        <w:rPr>
+          <w:rFonts w:ascii="Times New Roman" w:eastAsia="Times New Roman" w:hAnsi="Times New Roman" w:cs="Times New Roman"/>
+          <w:color w:val="000000"/>
+          <w:sz w:val="32"/>
+          <w:szCs w:val="32"/>
+          <w:u w:val="single"/>
+        </w:rPr>
+        <w:t>μp</w:t>
+      </w:r>
+      <w:proofErr w:type="spellEnd"/>
+      <w:r>
+        <w:rPr>
+          <w:rFonts w:ascii="Times New Roman" w:eastAsia="Times New Roman" w:hAnsi="Times New Roman" w:cs="Times New Roman"/>
+          <w:color w:val="000000"/>
+          <w:sz w:val="32"/>
+          <w:szCs w:val="32"/>
+          <w:u w:val="single"/>
+        </w:rPr>
+        <w:t xml:space="preserve"> :- </w:t>
+      </w:r>
+    </w:p>
+    <w:p>
+      <w:pPr>
+        <w:pStyle w:val="ListParagraph"/>
+        <w:pBdr>
+          <w:top w:val="nil"/>
+          <w:left w:val="nil"/>
+          <w:bottom w:val="nil"/>
+          <w:right w:val="nil"/>
+          <w:between w:val="nil"/>
+        </w:pBdr>
+        <w:spacing w:after="0"/>
+        <w:ind w:left="1080"/>
+        <w:rPr>
+          <w:rFonts w:ascii="Times New Roman" w:eastAsia="Times New Roman" w:hAnsi="Times New Roman" w:cs="Times New Roman"/>
+          <w:color w:val="000000"/>
+          <w:sz w:val="32"/>
+          <w:szCs w:val="32"/>
+        </w:rPr>
+      </w:pPr>
+      <w:hyperlink r:id="rId81" w:history="1">
+        <w:r>
+          <w:rPr>
+            <w:rStyle w:val="Hyperlink"/>
+            <w:rFonts w:ascii="Times New Roman" w:eastAsia="Times New Roman" w:hAnsi="Times New Roman" w:cs="Times New Roman"/>
+            <w:sz w:val="32"/>
+            <w:szCs w:val="32"/>
+          </w:rPr>
+          <w:t>https://youtu.be/0M74z5jEAyA?si=yXIeUyaVMNSG71S5</w:t>
+        </w:r>
+      </w:hyperlink>
+    </w:p>
+    <w:p>
+      <w:pPr>
+        <w:pStyle w:val="ListParagraph"/>
+        <w:numPr>
+          <w:ilvl w:val="1"/>
+          <w:numId w:val="13"/>
+        </w:numPr>
+        <w:pBdr>
+          <w:top w:val="nil"/>
+          <w:left w:val="nil"/>
+          <w:bottom w:val="nil"/>
+          <w:right w:val="nil"/>
+          <w:between w:val="nil"/>
+        </w:pBdr>
+        <w:spacing w:after="0"/>
+        <w:ind w:left="1080"/>
+        <w:rPr>
+          <w:rFonts w:ascii="Times New Roman" w:eastAsia="Times New Roman" w:hAnsi="Times New Roman" w:cs="Times New Roman"/>
+          <w:color w:val="000000"/>
+          <w:sz w:val="32"/>
+          <w:szCs w:val="32"/>
+          <w:u w:val="single"/>
+        </w:rPr>
+      </w:pPr>
+      <w:r>
+        <w:rPr>
+          <w:rFonts w:ascii="Times New Roman" w:eastAsia="Times New Roman" w:hAnsi="Times New Roman" w:cs="Times New Roman"/>
+          <w:color w:val="000000"/>
+          <w:sz w:val="32"/>
+          <w:szCs w:val="32"/>
+          <w:u w:val="single"/>
+        </w:rPr>
+        <w:t>8085 Basics :-</w:t>
+      </w:r>
+      <w:r>
+        <w:rPr>
+          <w:sz w:val="20"/>
+          <w:szCs w:val="20"/>
+          <w:u w:val="single"/>
+        </w:rPr>
+        <w:t xml:space="preserve"> </w:t>
+      </w:r>
+      <w:hyperlink r:id="rId82" w:history="1">
+        <w:r>
+          <w:rPr>
+            <w:rStyle w:val="Hyperlink"/>
+            <w:rFonts w:ascii="Times New Roman" w:eastAsia="Times New Roman" w:hAnsi="Times New Roman" w:cs="Times New Roman"/>
+            <w:sz w:val="32"/>
+            <w:szCs w:val="32"/>
+            <w:u w:val="none"/>
+          </w:rPr>
+          <w:t>https://youtu.be/0M74z5jEAyA?si=yXIeUyaVMNSG71S5</w:t>
+        </w:r>
+      </w:hyperlink>
+    </w:p>
+    <w:p>
+      <w:pPr>
+        <w:pStyle w:val="ListParagraph"/>
+        <w:numPr>
+          <w:ilvl w:val="1"/>
+          <w:numId w:val="13"/>
+        </w:numPr>
+        <w:pBdr>
+          <w:top w:val="nil"/>
+          <w:left w:val="nil"/>
+          <w:bottom w:val="nil"/>
+          <w:right w:val="nil"/>
+          <w:between w:val="nil"/>
+        </w:pBdr>
+        <w:spacing w:after="0"/>
+        <w:ind w:left="1080"/>
+        <w:rPr>
+          <w:rFonts w:ascii="Times New Roman" w:eastAsia="Times New Roman" w:hAnsi="Times New Roman" w:cs="Times New Roman"/>
+          <w:color w:val="000000"/>
+          <w:sz w:val="32"/>
+          <w:szCs w:val="32"/>
+          <w:u w:val="single"/>
+        </w:rPr>
+      </w:pPr>
+      <w:r>
+        <w:rPr>
+          <w:rFonts w:ascii="Times New Roman" w:eastAsia="Times New Roman" w:hAnsi="Times New Roman" w:cs="Times New Roman"/>
+          <w:color w:val="000000"/>
+          <w:sz w:val="32"/>
+          <w:szCs w:val="32"/>
+          <w:u w:val="single"/>
+        </w:rPr>
+        <w:t>8085 Architecture :-</w:t>
+      </w:r>
+    </w:p>
+    <w:p>
+      <w:pPr>
+        <w:pStyle w:val="ListParagraph"/>
+        <w:numPr>
+          <w:ilvl w:val="0"/>
+          <w:numId w:val="30"/>
+        </w:numPr>
+        <w:pBdr>
+          <w:top w:val="nil"/>
+          <w:left w:val="nil"/>
+          <w:bottom w:val="nil"/>
+          <w:right w:val="nil"/>
+          <w:between w:val="nil"/>
+        </w:pBdr>
+        <w:tabs>
+          <w:tab w:val="left" w:pos="1350"/>
+        </w:tabs>
+        <w:spacing w:after="0"/>
+        <w:ind w:hanging="450"/>
+        <w:rPr>
+          <w:rFonts w:ascii="Times New Roman" w:eastAsia="Times New Roman" w:hAnsi="Times New Roman" w:cs="Times New Roman"/>
+          <w:color w:val="000000"/>
+          <w:sz w:val="32"/>
+          <w:szCs w:val="32"/>
+          <w:u w:val="single"/>
+        </w:rPr>
+      </w:pPr>
+      <w:r>
+        <w:rPr>
+          <w:rFonts w:ascii="Times New Roman" w:eastAsia="Times New Roman" w:hAnsi="Times New Roman" w:cs="Times New Roman"/>
+          <w:color w:val="000000"/>
+          <w:sz w:val="32"/>
+          <w:szCs w:val="32"/>
+        </w:rPr>
+        <w:t xml:space="preserve">Concept : </w:t>
+      </w:r>
+    </w:p>
+    <w:p>
+      <w:pPr>
+        <w:pStyle w:val="ListParagraph"/>
+        <w:pBdr>
+          <w:top w:val="nil"/>
+          <w:left w:val="nil"/>
+          <w:bottom w:val="nil"/>
+          <w:right w:val="nil"/>
+          <w:between w:val="nil"/>
+        </w:pBdr>
+        <w:spacing w:after="0"/>
+        <w:ind w:left="1440"/>
+        <w:rPr>
+          <w:rFonts w:ascii="Times New Roman" w:eastAsia="Times New Roman" w:hAnsi="Times New Roman" w:cs="Times New Roman"/>
+          <w:color w:val="000000"/>
+          <w:sz w:val="32"/>
+          <w:szCs w:val="32"/>
+        </w:rPr>
+      </w:pPr>
+      <w:hyperlink r:id="rId83" w:history="1">
+        <w:r>
+          <w:rPr>
+            <w:rStyle w:val="Hyperlink"/>
+            <w:rFonts w:ascii="Times New Roman" w:eastAsia="Times New Roman" w:hAnsi="Times New Roman" w:cs="Times New Roman"/>
+            <w:sz w:val="32"/>
+            <w:szCs w:val="32"/>
+            <w:u w:val="none"/>
+          </w:rPr>
+          <w:t>https://youtu.be/UWekjor55pc?si=wSj6WDBJfKJG-F6F</w:t>
+        </w:r>
+      </w:hyperlink>
+    </w:p>
+    <w:p>
+      <w:pPr>
+        <w:pStyle w:val="ListParagraph"/>
+        <w:numPr>
+          <w:ilvl w:val="0"/>
+          <w:numId w:val="30"/>
+        </w:numPr>
+        <w:pBdr>
+          <w:top w:val="nil"/>
+          <w:left w:val="nil"/>
+          <w:bottom w:val="nil"/>
+          <w:right w:val="nil"/>
+          <w:between w:val="nil"/>
+        </w:pBdr>
+        <w:spacing w:after="0"/>
+        <w:ind w:left="1350" w:hanging="270"/>
+        <w:rPr>
+          <w:rFonts w:ascii="Times New Roman" w:eastAsia="Times New Roman" w:hAnsi="Times New Roman" w:cs="Times New Roman"/>
+          <w:color w:val="000000"/>
+          <w:sz w:val="32"/>
+          <w:szCs w:val="32"/>
+          <w:u w:val="single"/>
+        </w:rPr>
+      </w:pPr>
+      <w:r>
+        <w:rPr>
+          <w:rFonts w:ascii="Times New Roman" w:eastAsia="Times New Roman" w:hAnsi="Times New Roman" w:cs="Times New Roman"/>
+          <w:color w:val="000000"/>
+          <w:sz w:val="32"/>
+          <w:szCs w:val="32"/>
+        </w:rPr>
+        <w:t xml:space="preserve">Trick to remember Diagram : </w:t>
+      </w:r>
+    </w:p>
+    <w:p>
+      <w:pPr>
+        <w:pStyle w:val="ListParagraph"/>
+        <w:pBdr>
+          <w:top w:val="nil"/>
+          <w:left w:val="nil"/>
+          <w:bottom w:val="nil"/>
+          <w:right w:val="nil"/>
+          <w:between w:val="nil"/>
+        </w:pBdr>
+        <w:spacing w:after="0"/>
+        <w:ind w:left="1440"/>
+        <w:rPr>
+          <w:rFonts w:ascii="Times New Roman" w:eastAsia="Times New Roman" w:hAnsi="Times New Roman" w:cs="Times New Roman"/>
+          <w:color w:val="000000"/>
+          <w:sz w:val="32"/>
+          <w:szCs w:val="32"/>
+        </w:rPr>
+      </w:pPr>
+      <w:hyperlink r:id="rId84" w:history="1">
+        <w:r>
+          <w:rPr>
+            <w:rStyle w:val="Hyperlink"/>
+            <w:rFonts w:ascii="Times New Roman" w:eastAsia="Times New Roman" w:hAnsi="Times New Roman" w:cs="Times New Roman"/>
+            <w:sz w:val="32"/>
+            <w:szCs w:val="32"/>
+            <w:u w:val="none"/>
+          </w:rPr>
+          <w:t>https://youtu.be/l_tqbZ-7UKk?si=gd-D2s6XEGh6xrpw</w:t>
+        </w:r>
+      </w:hyperlink>
+    </w:p>
+    <w:p>
+      <w:pPr>
+        <w:pStyle w:val="ListParagraph"/>
+        <w:numPr>
+          <w:ilvl w:val="1"/>
+          <w:numId w:val="13"/>
+        </w:numPr>
+        <w:pBdr>
+          <w:top w:val="nil"/>
+          <w:left w:val="nil"/>
+          <w:bottom w:val="nil"/>
+          <w:right w:val="nil"/>
+          <w:between w:val="nil"/>
+        </w:pBdr>
+        <w:tabs>
+          <w:tab w:val="left" w:pos="1260"/>
+        </w:tabs>
+        <w:spacing w:after="0"/>
+        <w:ind w:left="1080"/>
+        <w:rPr>
+          <w:rFonts w:ascii="Times New Roman" w:eastAsia="Times New Roman" w:hAnsi="Times New Roman" w:cs="Times New Roman"/>
+          <w:color w:val="000000"/>
+          <w:sz w:val="32"/>
+          <w:szCs w:val="32"/>
+          <w:u w:val="single"/>
+        </w:rPr>
+      </w:pPr>
+      <w:r>
+        <w:rPr>
+          <w:rFonts w:ascii="Times New Roman" w:eastAsia="Times New Roman" w:hAnsi="Times New Roman" w:cs="Times New Roman"/>
+          <w:color w:val="000000"/>
+          <w:sz w:val="32"/>
+          <w:szCs w:val="32"/>
+          <w:u w:val="single"/>
+        </w:rPr>
+        <w:t>8085 Pin Diagram :-</w:t>
+      </w:r>
+    </w:p>
+    <w:p>
+      <w:pPr>
+        <w:pStyle w:val="ListParagraph"/>
+        <w:numPr>
+          <w:ilvl w:val="0"/>
+          <w:numId w:val="29"/>
+        </w:numPr>
+        <w:pBdr>
+          <w:top w:val="nil"/>
+          <w:left w:val="nil"/>
+          <w:bottom w:val="nil"/>
+          <w:right w:val="nil"/>
+          <w:between w:val="nil"/>
+        </w:pBdr>
+        <w:spacing w:after="0"/>
+        <w:ind w:left="1350" w:hanging="270"/>
+        <w:rPr>
+          <w:rFonts w:ascii="Times New Roman" w:eastAsia="Times New Roman" w:hAnsi="Times New Roman" w:cs="Times New Roman"/>
+          <w:color w:val="000000"/>
+          <w:sz w:val="32"/>
+          <w:szCs w:val="32"/>
+        </w:rPr>
+      </w:pPr>
+      <w:r>
+        <w:rPr>
+          <w:rFonts w:ascii="Times New Roman" w:eastAsia="Times New Roman" w:hAnsi="Times New Roman" w:cs="Times New Roman"/>
+          <w:color w:val="000000"/>
+          <w:sz w:val="32"/>
+          <w:szCs w:val="32"/>
+        </w:rPr>
+        <w:t>Concept  :</w:t>
+      </w:r>
+    </w:p>
+    <w:p>
+      <w:pPr>
+        <w:pStyle w:val="ListParagraph"/>
+        <w:pBdr>
+          <w:top w:val="nil"/>
+          <w:left w:val="nil"/>
+          <w:bottom w:val="nil"/>
+          <w:right w:val="nil"/>
+          <w:between w:val="nil"/>
+        </w:pBdr>
+        <w:spacing w:after="0"/>
+        <w:ind w:left="1350" w:firstLine="90"/>
+        <w:rPr>
+          <w:rFonts w:ascii="Times New Roman" w:eastAsia="Times New Roman" w:hAnsi="Times New Roman" w:cs="Times New Roman"/>
+          <w:color w:val="000000"/>
+          <w:sz w:val="32"/>
+          <w:szCs w:val="32"/>
+        </w:rPr>
+      </w:pPr>
+      <w:hyperlink r:id="rId85" w:history="1">
+        <w:r>
+          <w:rPr>
+            <w:rStyle w:val="Hyperlink"/>
+            <w:rFonts w:ascii="Times New Roman" w:eastAsia="Times New Roman" w:hAnsi="Times New Roman" w:cs="Times New Roman"/>
+            <w:sz w:val="32"/>
+            <w:szCs w:val="32"/>
+          </w:rPr>
+          <w:t>https://youtu.be/Lheqx3Q0aPA?si=n2G3W6JQAzTYOKbO</w:t>
+        </w:r>
+      </w:hyperlink>
+    </w:p>
+    <w:p>
+      <w:pPr>
+        <w:pStyle w:val="ListParagraph"/>
+        <w:numPr>
+          <w:ilvl w:val="0"/>
+          <w:numId w:val="29"/>
+        </w:numPr>
+        <w:pBdr>
+          <w:top w:val="nil"/>
+          <w:left w:val="nil"/>
+          <w:bottom w:val="nil"/>
+          <w:right w:val="nil"/>
+          <w:between w:val="nil"/>
+        </w:pBdr>
+        <w:spacing w:after="0"/>
+        <w:ind w:left="1350" w:hanging="270"/>
+        <w:rPr>
+          <w:rFonts w:ascii="Times New Roman" w:eastAsia="Times New Roman" w:hAnsi="Times New Roman" w:cs="Times New Roman"/>
+          <w:color w:val="000000"/>
+          <w:sz w:val="32"/>
+          <w:szCs w:val="32"/>
+        </w:rPr>
+      </w:pPr>
+      <w:r>
+        <w:rPr>
+          <w:rFonts w:ascii="Times New Roman" w:eastAsia="Times New Roman" w:hAnsi="Times New Roman" w:cs="Times New Roman"/>
+          <w:color w:val="000000"/>
+          <w:sz w:val="32"/>
+          <w:szCs w:val="32"/>
+        </w:rPr>
+        <w:t xml:space="preserve">Trick to remember Pins : </w:t>
+      </w:r>
+    </w:p>
+    <w:p>
+      <w:pPr>
+        <w:pStyle w:val="ListParagraph"/>
+        <w:pBdr>
+          <w:top w:val="nil"/>
+          <w:left w:val="nil"/>
+          <w:bottom w:val="nil"/>
+          <w:right w:val="nil"/>
+          <w:between w:val="nil"/>
+        </w:pBdr>
+        <w:spacing w:after="0"/>
+        <w:ind w:left="1350" w:firstLine="90"/>
+        <w:rPr>
+          <w:rFonts w:ascii="Times New Roman" w:eastAsia="Times New Roman" w:hAnsi="Times New Roman" w:cs="Times New Roman"/>
+          <w:color w:val="000000"/>
+          <w:sz w:val="32"/>
+          <w:szCs w:val="32"/>
+        </w:rPr>
+      </w:pPr>
+      <w:hyperlink r:id="rId86" w:history="1">
+        <w:r>
+          <w:rPr>
+            <w:rStyle w:val="Hyperlink"/>
+            <w:rFonts w:ascii="Times New Roman" w:eastAsia="Times New Roman" w:hAnsi="Times New Roman" w:cs="Times New Roman"/>
+            <w:sz w:val="32"/>
+            <w:szCs w:val="32"/>
+          </w:rPr>
+          <w:t>https://youtu.be/wvVVbEDpRvk?si=7oy22psw8RRJyo8Z</w:t>
+        </w:r>
+      </w:hyperlink>
+    </w:p>
+    <w:p>
+      <w:pPr>
+        <w:pStyle w:val="ListParagraph"/>
+        <w:numPr>
+          <w:ilvl w:val="1"/>
+          <w:numId w:val="13"/>
+        </w:numPr>
+        <w:pBdr>
+          <w:top w:val="nil"/>
+          <w:left w:val="nil"/>
+          <w:bottom w:val="nil"/>
+          <w:right w:val="nil"/>
+          <w:between w:val="nil"/>
+        </w:pBdr>
+        <w:spacing w:after="0"/>
+        <w:ind w:left="1080"/>
+        <w:rPr>
+          <w:rFonts w:ascii="Times New Roman" w:eastAsia="Times New Roman" w:hAnsi="Times New Roman" w:cs="Times New Roman"/>
+          <w:color w:val="000000"/>
+          <w:sz w:val="32"/>
+          <w:szCs w:val="32"/>
+          <w:u w:val="single"/>
+        </w:rPr>
+      </w:pPr>
+      <w:r>
+        <w:rPr>
+          <w:rFonts w:ascii="Times New Roman" w:eastAsia="Times New Roman" w:hAnsi="Times New Roman" w:cs="Times New Roman"/>
+          <w:color w:val="000000"/>
+          <w:sz w:val="32"/>
+          <w:szCs w:val="32"/>
+          <w:u w:val="single"/>
+        </w:rPr>
+        <w:t>8085 Flag Register :-</w:t>
+      </w:r>
+    </w:p>
+    <w:p>
+      <w:pPr>
+        <w:pStyle w:val="ListParagraph"/>
+        <w:numPr>
+          <w:ilvl w:val="0"/>
+          <w:numId w:val="31"/>
+        </w:numPr>
+        <w:pBdr>
+          <w:top w:val="nil"/>
+          <w:left w:val="nil"/>
+          <w:bottom w:val="nil"/>
+          <w:right w:val="nil"/>
+          <w:between w:val="nil"/>
+        </w:pBdr>
+        <w:spacing w:after="0"/>
+        <w:rPr>
+          <w:rFonts w:ascii="Times New Roman" w:eastAsia="Times New Roman" w:hAnsi="Times New Roman" w:cs="Times New Roman"/>
+          <w:color w:val="000000"/>
+          <w:sz w:val="32"/>
+          <w:szCs w:val="32"/>
+        </w:rPr>
+      </w:pPr>
+      <w:r>
+        <w:rPr>
+          <w:rFonts w:ascii="Times New Roman" w:eastAsia="Times New Roman" w:hAnsi="Times New Roman" w:cs="Times New Roman"/>
+          <w:color w:val="000000"/>
+          <w:sz w:val="32"/>
+          <w:szCs w:val="32"/>
+        </w:rPr>
+        <w:t>Concept</w:t>
+      </w:r>
+      <w:r>
+        <w:rPr>
+          <w:rFonts w:ascii="Times New Roman" w:eastAsia="Times New Roman" w:hAnsi="Times New Roman" w:cs="Times New Roman"/>
+          <w:color w:val="000000"/>
+          <w:sz w:val="32"/>
+          <w:szCs w:val="32"/>
+        </w:rPr>
+        <w:t xml:space="preserve"> : </w:t>
+      </w:r>
+      <w:hyperlink r:id="rId87" w:history="1">
+        <w:r>
+          <w:rPr>
+            <w:rStyle w:val="Hyperlink"/>
+            <w:rFonts w:ascii="Times New Roman" w:eastAsia="Times New Roman" w:hAnsi="Times New Roman" w:cs="Times New Roman"/>
+            <w:sz w:val="32"/>
+            <w:szCs w:val="32"/>
+            <w:u w:val="none"/>
+          </w:rPr>
+          <w:t>https://youtu.be/Cei5Vr0OWCo?si=qFo8_ij3bCy2BxSC</w:t>
+        </w:r>
+      </w:hyperlink>
+    </w:p>
+    <w:p>
+      <w:pPr>
+        <w:pStyle w:val="ListParagraph"/>
+        <w:numPr>
+          <w:ilvl w:val="0"/>
+          <w:numId w:val="31"/>
+        </w:numPr>
+        <w:pBdr>
+          <w:top w:val="nil"/>
+          <w:left w:val="nil"/>
+          <w:bottom w:val="nil"/>
+          <w:right w:val="nil"/>
+          <w:between w:val="nil"/>
+        </w:pBdr>
+        <w:spacing w:after="0"/>
+        <w:rPr>
+          <w:rFonts w:ascii="Times New Roman" w:eastAsia="Times New Roman" w:hAnsi="Times New Roman" w:cs="Times New Roman"/>
+          <w:color w:val="000000"/>
+          <w:sz w:val="32"/>
+          <w:szCs w:val="32"/>
+        </w:rPr>
+      </w:pPr>
+      <w:r>
+        <w:rPr>
+          <w:rFonts w:ascii="Times New Roman" w:eastAsia="Times New Roman" w:hAnsi="Times New Roman" w:cs="Times New Roman"/>
+          <w:color w:val="000000"/>
+          <w:sz w:val="32"/>
+          <w:szCs w:val="32"/>
+        </w:rPr>
+        <w:t xml:space="preserve">Article : </w:t>
+      </w:r>
+      <w:hyperlink r:id="rId88" w:history="1">
+        <w:r>
+          <w:rPr>
+            <w:rStyle w:val="Hyperlink"/>
+            <w:rFonts w:ascii="Times New Roman" w:eastAsia="Times New Roman" w:hAnsi="Times New Roman" w:cs="Times New Roman"/>
+            <w:sz w:val="32"/>
+            <w:szCs w:val="32"/>
+            <w:u w:val="none"/>
+          </w:rPr>
+          <w:t>Flags register in 8085 Microprocessor</w:t>
+        </w:r>
+      </w:hyperlink>
+    </w:p>
+    <w:p>
+      <w:pPr>
+        <w:pStyle w:val="ListParagraph"/>
+        <w:numPr>
+          <w:ilvl w:val="1"/>
+          <w:numId w:val="13"/>
+        </w:numPr>
+        <w:pBdr>
+          <w:top w:val="nil"/>
+          <w:left w:val="nil"/>
+          <w:bottom w:val="nil"/>
+          <w:right w:val="nil"/>
+          <w:between w:val="nil"/>
+        </w:pBdr>
+        <w:spacing w:after="0"/>
+        <w:ind w:left="1080"/>
+        <w:rPr>
+          <w:rFonts w:ascii="Times New Roman" w:eastAsia="Times New Roman" w:hAnsi="Times New Roman" w:cs="Times New Roman"/>
+          <w:color w:val="000000"/>
+          <w:sz w:val="32"/>
+          <w:szCs w:val="32"/>
+          <w:u w:val="single"/>
+        </w:rPr>
+      </w:pPr>
+      <w:r>
+        <w:rPr>
+          <w:rFonts w:ascii="Times New Roman" w:eastAsia="Times New Roman" w:hAnsi="Times New Roman" w:cs="Times New Roman"/>
+          <w:color w:val="000000"/>
+          <w:sz w:val="32"/>
+          <w:szCs w:val="32"/>
+          <w:u w:val="single"/>
+        </w:rPr>
+        <w:t>8085 Addressing Modes :-</w:t>
+      </w:r>
+    </w:p>
+    <w:p>
+      <w:pPr>
+        <w:pStyle w:val="ListParagraph"/>
+        <w:numPr>
+          <w:ilvl w:val="0"/>
+          <w:numId w:val="32"/>
+        </w:numPr>
+        <w:pBdr>
+          <w:top w:val="nil"/>
+          <w:left w:val="nil"/>
+          <w:bottom w:val="nil"/>
+          <w:right w:val="nil"/>
+          <w:between w:val="nil"/>
+        </w:pBdr>
+        <w:spacing w:after="0"/>
+        <w:ind w:hanging="270"/>
+        <w:rPr>
+          <w:rFonts w:ascii="Times New Roman" w:eastAsia="Times New Roman" w:hAnsi="Times New Roman" w:cs="Times New Roman"/>
+          <w:color w:val="000000"/>
+          <w:sz w:val="32"/>
+          <w:szCs w:val="32"/>
+        </w:rPr>
+      </w:pPr>
+      <w:r>
+        <w:rPr>
+          <w:rFonts w:ascii="Times New Roman" w:eastAsia="Times New Roman" w:hAnsi="Times New Roman" w:cs="Times New Roman"/>
+          <w:color w:val="000000"/>
+          <w:sz w:val="32"/>
+          <w:szCs w:val="32"/>
+        </w:rPr>
+        <w:t xml:space="preserve">Concept : </w:t>
+      </w:r>
+      <w:hyperlink r:id="rId89" w:history="1">
+        <w:r>
+          <w:rPr>
+            <w:rStyle w:val="Hyperlink"/>
+            <w:rFonts w:ascii="Times New Roman" w:eastAsia="Times New Roman" w:hAnsi="Times New Roman" w:cs="Times New Roman"/>
+            <w:sz w:val="32"/>
+            <w:szCs w:val="32"/>
+            <w:u w:val="none"/>
+          </w:rPr>
+          <w:t>https://youtu.be/moqMIxEs1SI?si=5hrBdb5vBUR-Wmf6</w:t>
+        </w:r>
+      </w:hyperlink>
+    </w:p>
+    <w:p>
+      <w:pPr>
+        <w:pStyle w:val="ListParagraph"/>
+        <w:numPr>
+          <w:ilvl w:val="0"/>
+          <w:numId w:val="32"/>
+        </w:numPr>
+        <w:pBdr>
+          <w:top w:val="nil"/>
+          <w:left w:val="nil"/>
+          <w:bottom w:val="nil"/>
+          <w:right w:val="nil"/>
+          <w:between w:val="nil"/>
+        </w:pBdr>
+        <w:spacing w:after="0"/>
+        <w:ind w:hanging="270"/>
+        <w:rPr>
+          <w:rFonts w:ascii="Times New Roman" w:eastAsia="Times New Roman" w:hAnsi="Times New Roman" w:cs="Times New Roman"/>
+          <w:color w:val="000000"/>
+          <w:sz w:val="32"/>
+          <w:szCs w:val="32"/>
+        </w:rPr>
+      </w:pPr>
+      <w:r>
+        <w:rPr>
+          <w:rFonts w:ascii="Times New Roman" w:eastAsia="Times New Roman" w:hAnsi="Times New Roman" w:cs="Times New Roman"/>
+          <w:color w:val="000000"/>
+          <w:sz w:val="32"/>
+          <w:szCs w:val="32"/>
+        </w:rPr>
+        <w:t xml:space="preserve">Article : </w:t>
+      </w:r>
+      <w:hyperlink r:id="rId90" w:history="1">
+        <w:r>
+          <w:rPr>
+            <w:rStyle w:val="Hyperlink"/>
+            <w:rFonts w:ascii="Times New Roman" w:eastAsia="Times New Roman" w:hAnsi="Times New Roman" w:cs="Times New Roman"/>
+            <w:sz w:val="32"/>
+            <w:szCs w:val="32"/>
+            <w:u w:val="none"/>
+          </w:rPr>
+          <w:t>8085 Addressing Modes &amp; Interrupts</w:t>
+        </w:r>
+      </w:hyperlink>
+    </w:p>
+    <w:p>
+      <w:pPr>
+        <w:pBdr>
+          <w:top w:val="nil"/>
+          <w:left w:val="nil"/>
+          <w:bottom w:val="nil"/>
+          <w:right w:val="nil"/>
+          <w:between w:val="nil"/>
+        </w:pBdr>
+        <w:spacing w:after="0"/>
+        <w:rPr>
+          <w:rFonts w:ascii="Times New Roman" w:eastAsia="Times New Roman" w:hAnsi="Times New Roman" w:cs="Times New Roman"/>
+          <w:color w:val="000000"/>
+          <w:sz w:val="36"/>
+          <w:szCs w:val="36"/>
+          <w:u w:val="single"/>
+        </w:rPr>
+      </w:pPr>
+    </w:p>
+    <w:p>
+      <w:pPr>
+        <w:pStyle w:val="ListParagraph"/>
+        <w:numPr>
+          <w:ilvl w:val="0"/>
+          <w:numId w:val="28"/>
+        </w:numPr>
+        <w:pBdr>
+          <w:top w:val="nil"/>
+          <w:left w:val="nil"/>
+          <w:bottom w:val="nil"/>
+          <w:right w:val="nil"/>
+          <w:between w:val="nil"/>
+        </w:pBdr>
+        <w:spacing w:after="0"/>
+        <w:rPr>
+          <w:rFonts w:ascii="Times New Roman" w:eastAsia="Times New Roman" w:hAnsi="Times New Roman" w:cs="Times New Roman"/>
+          <w:b/>
+          <w:bCs/>
+          <w:color w:val="000000"/>
+          <w:sz w:val="36"/>
+          <w:szCs w:val="36"/>
+          <w:u w:val="single"/>
+        </w:rPr>
+      </w:pPr>
+      <w:r>
+        <w:rPr>
+          <w:rFonts w:ascii="Times New Roman" w:eastAsia="Times New Roman" w:hAnsi="Times New Roman" w:cs="Times New Roman"/>
+          <w:b/>
+          <w:bCs/>
+          <w:color w:val="000000"/>
+          <w:sz w:val="36"/>
+          <w:szCs w:val="36"/>
+          <w:u w:val="single"/>
+        </w:rPr>
+        <w:t>8085 instruction and timing</w:t>
+      </w:r>
+      <w:r>
+        <w:rPr>
+          <w:rFonts w:ascii="Times New Roman" w:eastAsia="Times New Roman" w:hAnsi="Times New Roman" w:cs="Times New Roman"/>
+          <w:b/>
+          <w:bCs/>
+          <w:color w:val="000000"/>
+          <w:sz w:val="36"/>
+          <w:szCs w:val="36"/>
+        </w:rPr>
+        <w:t xml:space="preserve"> :-</w:t>
+      </w:r>
+    </w:p>
+    <w:p>
+      <w:pPr>
+        <w:pStyle w:val="ListParagraph"/>
+        <w:pBdr>
+          <w:top w:val="nil"/>
+          <w:left w:val="nil"/>
+          <w:bottom w:val="nil"/>
+          <w:right w:val="nil"/>
+          <w:between w:val="nil"/>
+        </w:pBdr>
+        <w:spacing w:after="0"/>
+        <w:ind w:left="810" w:firstLine="450"/>
+        <w:rPr>
+          <w:rFonts w:ascii="Times New Roman" w:eastAsia="Times New Roman" w:hAnsi="Times New Roman" w:cs="Times New Roman"/>
+          <w:b/>
+          <w:bCs/>
+          <w:color w:val="000000"/>
+          <w:sz w:val="16"/>
+          <w:szCs w:val="16"/>
+          <w:u w:val="single"/>
+        </w:rPr>
+      </w:pPr>
+    </w:p>
+    <w:p>
+      <w:pPr>
+        <w:pStyle w:val="ListParagraph"/>
+        <w:numPr>
+          <w:ilvl w:val="0"/>
+          <w:numId w:val="34"/>
+        </w:numPr>
+        <w:pBdr>
+          <w:top w:val="nil"/>
+          <w:left w:val="nil"/>
+          <w:bottom w:val="nil"/>
+          <w:right w:val="nil"/>
+          <w:between w:val="nil"/>
+        </w:pBdr>
+        <w:spacing w:after="0"/>
+        <w:rPr>
+          <w:rFonts w:ascii="Times New Roman" w:eastAsia="Times New Roman" w:hAnsi="Times New Roman" w:cs="Times New Roman"/>
+          <w:color w:val="000000"/>
+          <w:sz w:val="32"/>
+          <w:szCs w:val="32"/>
+          <w:u w:val="single"/>
+        </w:rPr>
+      </w:pPr>
+      <w:r>
+        <w:rPr>
+          <w:rFonts w:ascii="Times New Roman" w:eastAsia="Times New Roman" w:hAnsi="Times New Roman" w:cs="Times New Roman"/>
+          <w:color w:val="000000"/>
+          <w:sz w:val="32"/>
+          <w:szCs w:val="32"/>
+          <w:u w:val="single"/>
+        </w:rPr>
+        <w:t>8085 Instruction Set :-</w:t>
+      </w:r>
+    </w:p>
+    <w:p>
+      <w:pPr>
+        <w:pStyle w:val="ListParagraph"/>
+        <w:numPr>
+          <w:ilvl w:val="0"/>
+          <w:numId w:val="33"/>
+        </w:numPr>
+        <w:pBdr>
+          <w:top w:val="nil"/>
+          <w:left w:val="nil"/>
+          <w:bottom w:val="nil"/>
+          <w:right w:val="nil"/>
+          <w:between w:val="nil"/>
+        </w:pBdr>
+        <w:spacing w:after="0"/>
+        <w:ind w:left="1440" w:hanging="270"/>
+        <w:rPr>
+          <w:rFonts w:ascii="Times New Roman" w:eastAsia="Times New Roman" w:hAnsi="Times New Roman" w:cs="Times New Roman"/>
+          <w:color w:val="000000"/>
+          <w:sz w:val="32"/>
+          <w:szCs w:val="32"/>
+        </w:rPr>
+      </w:pPr>
+      <w:r>
+        <w:rPr>
+          <w:rFonts w:ascii="Times New Roman" w:eastAsia="Times New Roman" w:hAnsi="Times New Roman" w:cs="Times New Roman"/>
+          <w:color w:val="000000"/>
+          <w:sz w:val="32"/>
+          <w:szCs w:val="32"/>
+        </w:rPr>
+        <w:t>ISA-1 Data Transfer Group :</w:t>
+      </w:r>
+    </w:p>
+    <w:p>
+      <w:pPr>
+        <w:pStyle w:val="ListParagraph"/>
+        <w:numPr>
+          <w:ilvl w:val="0"/>
+          <w:numId w:val="33"/>
+        </w:numPr>
+        <w:pBdr>
+          <w:top w:val="nil"/>
+          <w:left w:val="nil"/>
+          <w:bottom w:val="nil"/>
+          <w:right w:val="nil"/>
+          <w:between w:val="nil"/>
+        </w:pBdr>
+        <w:spacing w:after="0"/>
+        <w:ind w:left="1440" w:hanging="270"/>
+        <w:rPr>
+          <w:rFonts w:ascii="Times New Roman" w:eastAsia="Times New Roman" w:hAnsi="Times New Roman" w:cs="Times New Roman"/>
+          <w:color w:val="000000"/>
+          <w:sz w:val="32"/>
+          <w:szCs w:val="32"/>
+        </w:rPr>
+      </w:pPr>
+      <w:r>
+        <w:rPr>
+          <w:rFonts w:ascii="Times New Roman" w:eastAsia="Times New Roman" w:hAnsi="Times New Roman" w:cs="Times New Roman"/>
+          <w:color w:val="000000"/>
+          <w:sz w:val="32"/>
+          <w:szCs w:val="32"/>
+        </w:rPr>
+        <w:t>ISA-2 :</w:t>
+      </w:r>
+    </w:p>
+    <w:p>
+      <w:pPr>
+        <w:pStyle w:val="ListParagraph"/>
+        <w:numPr>
+          <w:ilvl w:val="0"/>
+          <w:numId w:val="33"/>
+        </w:numPr>
+        <w:pBdr>
+          <w:top w:val="nil"/>
+          <w:left w:val="nil"/>
+          <w:bottom w:val="nil"/>
+          <w:right w:val="nil"/>
+          <w:between w:val="nil"/>
+        </w:pBdr>
+        <w:spacing w:after="0"/>
+        <w:ind w:left="1440" w:hanging="270"/>
+        <w:rPr>
+          <w:rFonts w:ascii="Times New Roman" w:eastAsia="Times New Roman" w:hAnsi="Times New Roman" w:cs="Times New Roman"/>
+          <w:color w:val="000000"/>
+          <w:sz w:val="32"/>
+          <w:szCs w:val="32"/>
+        </w:rPr>
+      </w:pPr>
+      <w:r>
+        <w:rPr>
+          <w:rFonts w:ascii="Times New Roman" w:eastAsia="Times New Roman" w:hAnsi="Times New Roman" w:cs="Times New Roman"/>
+          <w:color w:val="000000"/>
+          <w:sz w:val="32"/>
+          <w:szCs w:val="32"/>
+        </w:rPr>
+        <w:t>ISA-3 :</w:t>
+      </w:r>
+    </w:p>
+    <w:p>
+      <w:pPr>
+        <w:pStyle w:val="ListParagraph"/>
+        <w:numPr>
+          <w:ilvl w:val="0"/>
+          <w:numId w:val="33"/>
+        </w:numPr>
+        <w:pBdr>
+          <w:top w:val="nil"/>
+          <w:left w:val="nil"/>
+          <w:bottom w:val="nil"/>
+          <w:right w:val="nil"/>
+          <w:between w:val="nil"/>
+        </w:pBdr>
+        <w:spacing w:after="0"/>
+        <w:ind w:left="1440" w:hanging="270"/>
+        <w:rPr>
+          <w:rFonts w:ascii="Times New Roman" w:eastAsia="Times New Roman" w:hAnsi="Times New Roman" w:cs="Times New Roman"/>
+          <w:color w:val="000000"/>
+          <w:sz w:val="32"/>
+          <w:szCs w:val="32"/>
+        </w:rPr>
+      </w:pPr>
+      <w:r>
+        <w:rPr>
+          <w:rFonts w:ascii="Times New Roman" w:eastAsia="Times New Roman" w:hAnsi="Times New Roman" w:cs="Times New Roman"/>
+          <w:color w:val="000000"/>
+          <w:sz w:val="32"/>
+          <w:szCs w:val="32"/>
+        </w:rPr>
+        <w:t>ISA-4 :</w:t>
+      </w:r>
+    </w:p>
+    <w:p>
+      <w:pPr>
+        <w:pStyle w:val="ListParagraph"/>
+        <w:numPr>
+          <w:ilvl w:val="0"/>
+          <w:numId w:val="34"/>
+        </w:numPr>
+        <w:pBdr>
+          <w:top w:val="nil"/>
+          <w:left w:val="nil"/>
+          <w:bottom w:val="nil"/>
+          <w:right w:val="nil"/>
+          <w:between w:val="nil"/>
+        </w:pBdr>
+        <w:spacing w:after="0"/>
+        <w:rPr>
+          <w:rFonts w:ascii="Times New Roman" w:eastAsia="Times New Roman" w:hAnsi="Times New Roman" w:cs="Times New Roman"/>
+          <w:color w:val="000000"/>
+          <w:sz w:val="36"/>
+          <w:szCs w:val="36"/>
+          <w:u w:val="single"/>
+        </w:rPr>
+      </w:pPr>
+      <w:r>
+        <w:rPr>
+          <w:rFonts w:ascii="Times New Roman" w:eastAsia="Times New Roman" w:hAnsi="Times New Roman" w:cs="Times New Roman"/>
+          <w:color w:val="000000"/>
+          <w:sz w:val="36"/>
+          <w:szCs w:val="36"/>
+          <w:u w:val="single"/>
+        </w:rPr>
+        <w:t>8085 Timing Diagrams :-</w:t>
+      </w:r>
+    </w:p>
+    <w:p>
+      <w:pPr>
+        <w:pStyle w:val="ListParagraph"/>
+        <w:numPr>
+          <w:ilvl w:val="0"/>
+          <w:numId w:val="34"/>
+        </w:numPr>
+        <w:pBdr>
+          <w:top w:val="nil"/>
+          <w:left w:val="nil"/>
+          <w:bottom w:val="nil"/>
+          <w:right w:val="nil"/>
+          <w:between w:val="nil"/>
+        </w:pBdr>
+        <w:spacing w:after="0"/>
+        <w:rPr>
+          <w:rFonts w:ascii="Times New Roman" w:eastAsia="Times New Roman" w:hAnsi="Times New Roman" w:cs="Times New Roman"/>
+          <w:color w:val="000000"/>
+          <w:sz w:val="36"/>
+          <w:szCs w:val="36"/>
+          <w:u w:val="single"/>
+        </w:rPr>
+      </w:pPr>
+      <w:r>
+        <w:rPr>
+          <w:rFonts w:ascii="Times New Roman" w:eastAsia="Times New Roman" w:hAnsi="Times New Roman" w:cs="Times New Roman"/>
+          <w:color w:val="000000"/>
+          <w:sz w:val="36"/>
+          <w:szCs w:val="36"/>
+          <w:u w:val="single"/>
+        </w:rPr>
+        <w:t>8085 Programs :-</w:t>
+      </w:r>
+    </w:p>
+    <w:p>
+      <w:pPr>
+        <w:pStyle w:val="ListParagraph"/>
+        <w:pBdr>
+          <w:top w:val="nil"/>
+          <w:left w:val="nil"/>
+          <w:bottom w:val="nil"/>
+          <w:right w:val="nil"/>
+          <w:between w:val="nil"/>
+        </w:pBdr>
+        <w:spacing w:after="0"/>
+        <w:rPr>
+          <w:rFonts w:ascii="Times New Roman" w:eastAsia="Times New Roman" w:hAnsi="Times New Roman" w:cs="Times New Roman"/>
+          <w:b/>
+          <w:bCs/>
+          <w:color w:val="000000"/>
+          <w:sz w:val="36"/>
+          <w:szCs w:val="36"/>
+          <w:u w:val="single"/>
+        </w:rPr>
+      </w:pPr>
+    </w:p>
+    <w:p>
+      <w:pPr>
+        <w:pStyle w:val="ListParagraph"/>
+        <w:numPr>
+          <w:ilvl w:val="0"/>
+          <w:numId w:val="28"/>
+        </w:numPr>
+        <w:pBdr>
+          <w:top w:val="nil"/>
+          <w:left w:val="nil"/>
+          <w:bottom w:val="nil"/>
+          <w:right w:val="nil"/>
+          <w:between w:val="nil"/>
+        </w:pBdr>
+        <w:spacing w:after="0"/>
+        <w:rPr>
+          <w:rFonts w:ascii="Times New Roman" w:eastAsia="Times New Roman" w:hAnsi="Times New Roman" w:cs="Times New Roman"/>
+          <w:b/>
+          <w:bCs/>
+          <w:color w:val="000000"/>
+          <w:sz w:val="36"/>
+          <w:szCs w:val="36"/>
+          <w:u w:val="single"/>
+        </w:rPr>
+      </w:pPr>
+      <w:r>
+        <w:rPr>
+          <w:rFonts w:ascii="Times New Roman" w:eastAsia="Times New Roman" w:hAnsi="Times New Roman" w:cs="Times New Roman"/>
+          <w:b/>
+          <w:bCs/>
+          <w:color w:val="000000"/>
+          <w:sz w:val="36"/>
+          <w:szCs w:val="36"/>
+          <w:u w:val="single"/>
+        </w:rPr>
+        <w:t>Advance Microprocessor</w:t>
+      </w:r>
+      <w:r>
+        <w:rPr>
+          <w:rFonts w:ascii="Times New Roman" w:eastAsia="Times New Roman" w:hAnsi="Times New Roman" w:cs="Times New Roman"/>
+          <w:b/>
+          <w:bCs/>
+          <w:color w:val="000000"/>
+          <w:sz w:val="36"/>
+          <w:szCs w:val="36"/>
+          <w:u w:val="single"/>
+        </w:rPr>
+        <w:t xml:space="preserve"> :-</w:t>
+      </w:r>
+    </w:p>
+    <w:p>
+      <w:pPr>
+        <w:pStyle w:val="ListParagraph"/>
+        <w:pBdr>
+          <w:top w:val="nil"/>
+          <w:left w:val="nil"/>
+          <w:bottom w:val="nil"/>
+          <w:right w:val="nil"/>
+          <w:between w:val="nil"/>
+        </w:pBdr>
+        <w:spacing w:after="0"/>
+        <w:rPr>
+          <w:rFonts w:ascii="Times New Roman" w:eastAsia="Times New Roman" w:hAnsi="Times New Roman" w:cs="Times New Roman"/>
+          <w:b/>
+          <w:bCs/>
+          <w:color w:val="000000"/>
+          <w:sz w:val="36"/>
+          <w:szCs w:val="36"/>
+        </w:rPr>
+      </w:pPr>
+      <w:hyperlink r:id="rId91" w:history="1">
+        <w:r>
+          <w:rPr>
+            <w:rStyle w:val="Hyperlink"/>
+            <w:rFonts w:ascii="Times New Roman" w:eastAsia="Times New Roman" w:hAnsi="Times New Roman" w:cs="Times New Roman"/>
+            <w:b/>
+            <w:bCs/>
+            <w:sz w:val="36"/>
+            <w:szCs w:val="36"/>
+            <w:u w:val="none"/>
+          </w:rPr>
+          <w:t>https://youtu.be/EUrcjGRAxyI</w:t>
+        </w:r>
+      </w:hyperlink>
+    </w:p>
+    <w:p>
+      <w:pPr>
+        <w:pStyle w:val="ListParagraph"/>
+        <w:pBdr>
+          <w:top w:val="nil"/>
+          <w:left w:val="nil"/>
+          <w:bottom w:val="nil"/>
+          <w:right w:val="nil"/>
+          <w:between w:val="nil"/>
+        </w:pBdr>
+        <w:spacing w:after="0"/>
+        <w:rPr>
+          <w:rFonts w:ascii="Times New Roman" w:eastAsia="Times New Roman" w:hAnsi="Times New Roman" w:cs="Times New Roman"/>
+          <w:b/>
+          <w:bCs/>
+          <w:color w:val="000000"/>
+          <w:sz w:val="36"/>
+          <w:szCs w:val="36"/>
+          <w:u w:val="single"/>
+        </w:rPr>
+      </w:pPr>
+    </w:p>
+    <w:p>
+      <w:pPr>
+        <w:pStyle w:val="ListParagraph"/>
+        <w:numPr>
+          <w:ilvl w:val="0"/>
+          <w:numId w:val="28"/>
+        </w:numPr>
+        <w:pBdr>
+          <w:top w:val="nil"/>
+          <w:left w:val="nil"/>
+          <w:bottom w:val="nil"/>
+          <w:right w:val="nil"/>
+          <w:between w:val="nil"/>
+        </w:pBdr>
+        <w:spacing w:after="0"/>
+        <w:rPr>
+          <w:rFonts w:ascii="Times New Roman" w:eastAsia="Times New Roman" w:hAnsi="Times New Roman" w:cs="Times New Roman"/>
+          <w:b/>
+          <w:bCs/>
+          <w:color w:val="000000"/>
+          <w:sz w:val="36"/>
+          <w:szCs w:val="36"/>
+          <w:u w:val="single"/>
+        </w:rPr>
+      </w:pPr>
+      <w:r>
+        <w:rPr>
+          <w:rFonts w:ascii="Times New Roman" w:eastAsia="Times New Roman" w:hAnsi="Times New Roman" w:cs="Times New Roman"/>
+          <w:b/>
+          <w:bCs/>
+          <w:color w:val="000000"/>
+          <w:sz w:val="36"/>
+          <w:szCs w:val="36"/>
+          <w:u w:val="single"/>
+        </w:rPr>
+        <w:t>RISC Vs. CISC :-</w:t>
+      </w:r>
+    </w:p>
+    <w:p>
+      <w:pPr>
+        <w:pStyle w:val="ListParagraph"/>
+        <w:pBdr>
+          <w:top w:val="nil"/>
+          <w:left w:val="nil"/>
+          <w:bottom w:val="nil"/>
+          <w:right w:val="nil"/>
+          <w:between w:val="nil"/>
+        </w:pBdr>
+        <w:spacing w:after="0"/>
+        <w:rPr>
+          <w:rFonts w:ascii="Times New Roman" w:eastAsia="Times New Roman" w:hAnsi="Times New Roman" w:cs="Times New Roman"/>
+          <w:b/>
+          <w:bCs/>
+          <w:color w:val="000000"/>
+          <w:sz w:val="36"/>
+          <w:szCs w:val="36"/>
+        </w:rPr>
+      </w:pPr>
+      <w:hyperlink r:id="rId92" w:history="1">
+        <w:r>
+          <w:rPr>
+            <w:rStyle w:val="Hyperlink"/>
+            <w:rFonts w:ascii="Times New Roman" w:eastAsia="Times New Roman" w:hAnsi="Times New Roman" w:cs="Times New Roman"/>
+            <w:b/>
+            <w:bCs/>
+            <w:sz w:val="36"/>
+            <w:szCs w:val="36"/>
+            <w:u w:val="none"/>
+          </w:rPr>
+          <w:t>https://youtu.be/VtR-J8TiZXE?si=s4Lz8SjEO1wjwc28</w:t>
+        </w:r>
+      </w:hyperlink>
+    </w:p>
+    <w:p>
+      <w:pPr>
+        <w:pStyle w:val="ListParagraph"/>
+        <w:pBdr>
+          <w:top w:val="nil"/>
+          <w:left w:val="nil"/>
+          <w:bottom w:val="nil"/>
+          <w:right w:val="nil"/>
+          <w:between w:val="nil"/>
+        </w:pBdr>
+        <w:spacing w:after="0"/>
+        <w:rPr>
+          <w:rFonts w:ascii="Times New Roman" w:eastAsia="Times New Roman" w:hAnsi="Times New Roman" w:cs="Times New Roman"/>
+          <w:b/>
+          <w:bCs/>
+          <w:color w:val="000000"/>
+          <w:sz w:val="36"/>
+          <w:szCs w:val="36"/>
+          <w:u w:val="single"/>
+        </w:rPr>
+      </w:pPr>
+    </w:p>
+    <w:p>
+      <w:pPr>
+        <w:pStyle w:val="ListParagraph"/>
+        <w:numPr>
+          <w:ilvl w:val="0"/>
+          <w:numId w:val="28"/>
+        </w:numPr>
+        <w:pBdr>
+          <w:top w:val="nil"/>
+          <w:left w:val="nil"/>
+          <w:bottom w:val="nil"/>
+          <w:right w:val="nil"/>
+          <w:between w:val="nil"/>
+        </w:pBdr>
+        <w:spacing w:after="0"/>
+        <w:rPr>
+          <w:rFonts w:ascii="Times New Roman" w:eastAsia="Times New Roman" w:hAnsi="Times New Roman" w:cs="Times New Roman"/>
+          <w:b/>
+          <w:bCs/>
+          <w:color w:val="000000"/>
+          <w:sz w:val="36"/>
+          <w:szCs w:val="36"/>
+          <w:u w:val="single"/>
+        </w:rPr>
+      </w:pPr>
+    </w:p>
+    <w:p>
+      <w:pPr>
+        <w:pBdr>
+          <w:top w:val="nil"/>
+          <w:left w:val="nil"/>
+          <w:bottom w:val="nil"/>
+          <w:right w:val="nil"/>
+          <w:between w:val="nil"/>
+        </w:pBdr>
+        <w:spacing w:after="0"/>
+        <w:ind w:left="360"/>
+        <w:rPr>
+          <w:rFonts w:ascii="Times New Roman" w:eastAsia="Times New Roman" w:hAnsi="Times New Roman" w:cs="Times New Roman"/>
+          <w:b/>
+          <w:bCs/>
+          <w:i/>
+          <w:iCs/>
+          <w:color w:val="000000"/>
+          <w:sz w:val="44"/>
+          <w:szCs w:val="44"/>
+          <w:u w:val="single"/>
+        </w:rPr>
+      </w:pPr>
+    </w:p>
+    <w:p>
+      <w:pPr>
+        <w:pBdr>
+          <w:top w:val="nil"/>
+          <w:left w:val="nil"/>
+          <w:bottom w:val="nil"/>
+          <w:right w:val="nil"/>
+          <w:between w:val="nil"/>
+        </w:pBdr>
+        <w:spacing w:after="0"/>
+        <w:ind w:left="360"/>
+        <w:rPr>
+          <w:rFonts w:ascii="Times New Roman" w:eastAsia="Times New Roman" w:hAnsi="Times New Roman" w:cs="Times New Roman"/>
+          <w:b/>
+          <w:bCs/>
+          <w:i/>
+          <w:iCs/>
+          <w:color w:val="000000"/>
+          <w:sz w:val="44"/>
+          <w:szCs w:val="44"/>
+          <w:u w:val="single"/>
+        </w:rPr>
+      </w:pPr>
+    </w:p>
+    <w:p>
+      <w:pPr>
         <w:pBdr>
           <w:top w:val="nil"/>
           <w:left w:val="nil"/>
@@ -6944,7 +8454,7 @@
           <w:szCs w:val="28"/>
         </w:rPr>
       </w:pPr>
-      <w:hyperlink r:id="rId80">
+      <w:hyperlink r:id="rId93">
         <w:r>
           <w:rPr>
             <w:rFonts w:ascii="Times New Roman" w:eastAsia="Times New Roman" w:hAnsi="Times New Roman" w:cs="Times New Roman"/>
@@ -7043,7 +8553,7 @@
           <w:szCs w:val="28"/>
         </w:rPr>
       </w:pPr>
-      <w:hyperlink r:id="rId81">
+      <w:hyperlink r:id="rId94">
         <w:r>
           <w:rPr>
             <w:rFonts w:ascii="Times New Roman" w:eastAsia="Times New Roman" w:hAnsi="Times New Roman" w:cs="Times New Roman"/>
@@ -7137,7 +8647,7 @@
           <w:szCs w:val="28"/>
         </w:rPr>
       </w:pPr>
-      <w:hyperlink r:id="rId82">
+      <w:hyperlink r:id="rId95">
         <w:r>
           <w:rPr>
             <w:rFonts w:ascii="Times New Roman" w:eastAsia="Times New Roman" w:hAnsi="Times New Roman" w:cs="Times New Roman"/>
@@ -7185,7 +8695,7 @@
           <w:szCs w:val="28"/>
         </w:rPr>
       </w:pPr>
-      <w:hyperlink r:id="rId83">
+      <w:hyperlink r:id="rId96">
         <w:r>
           <w:rPr>
             <w:rFonts w:ascii="Times New Roman" w:eastAsia="Times New Roman" w:hAnsi="Times New Roman" w:cs="Times New Roman"/>
@@ -7343,7 +8853,7 @@
           <w:szCs w:val="28"/>
         </w:rPr>
       </w:pPr>
-      <w:hyperlink r:id="rId84">
+      <w:hyperlink r:id="rId97">
         <w:r>
           <w:rPr>
             <w:rFonts w:ascii="Times New Roman" w:eastAsia="Times New Roman" w:hAnsi="Times New Roman" w:cs="Times New Roman"/>
@@ -7405,7 +8915,7 @@
           <w:szCs w:val="28"/>
         </w:rPr>
       </w:pPr>
-      <w:hyperlink r:id="rId85">
+      <w:hyperlink r:id="rId98">
         <w:r>
           <w:rPr>
             <w:rFonts w:ascii="Times New Roman" w:eastAsia="Times New Roman" w:hAnsi="Times New Roman" w:cs="Times New Roman"/>
@@ -7486,7 +8996,7 @@
           <w:szCs w:val="28"/>
         </w:rPr>
       </w:pPr>
-      <w:hyperlink r:id="rId86">
+      <w:hyperlink r:id="rId99">
         <w:r>
           <w:rPr>
             <w:rFonts w:ascii="Times New Roman" w:eastAsia="Times New Roman" w:hAnsi="Times New Roman" w:cs="Times New Roman"/>
@@ -7600,7 +9110,7 @@
         <w:spacing w:after="0"/>
         <w:ind w:left="1080"/>
       </w:pPr>
-      <w:hyperlink r:id="rId87" w:history="1">
+      <w:hyperlink r:id="rId100" w:history="1">
         <w:r>
           <w:rPr>
             <w:rStyle w:val="Hyperlink"/>
@@ -7680,7 +9190,7 @@
           <w:szCs w:val="28"/>
         </w:rPr>
       </w:pPr>
-      <w:hyperlink r:id="rId88" w:history="1">
+      <w:hyperlink r:id="rId101" w:history="1">
         <w:r>
           <w:rPr>
             <w:rStyle w:val="Hyperlink"/>
@@ -7759,7 +9269,7 @@
           <w:szCs w:val="28"/>
         </w:rPr>
       </w:pPr>
-      <w:hyperlink r:id="rId89" w:history="1">
+      <w:hyperlink r:id="rId102" w:history="1">
         <w:r>
           <w:rPr>
             <w:rStyle w:val="Hyperlink"/>
@@ -7898,7 +9408,7 @@
           <w:szCs w:val="28"/>
         </w:rPr>
       </w:pPr>
-      <w:hyperlink r:id="rId90">
+      <w:hyperlink r:id="rId103">
         <w:r>
           <w:rPr>
             <w:rFonts w:ascii="Times New Roman" w:eastAsia="Times New Roman" w:hAnsi="Times New Roman" w:cs="Times New Roman"/>
@@ -7979,7 +9489,7 @@
           <w:szCs w:val="28"/>
         </w:rPr>
       </w:pPr>
-      <w:hyperlink r:id="rId91">
+      <w:hyperlink r:id="rId104">
         <w:r>
           <w:rPr>
             <w:rFonts w:ascii="Times New Roman" w:eastAsia="Times New Roman" w:hAnsi="Times New Roman" w:cs="Times New Roman"/>
@@ -8079,7 +9589,7 @@
           <w:szCs w:val="28"/>
         </w:rPr>
       </w:pPr>
-      <w:hyperlink r:id="rId92">
+      <w:hyperlink r:id="rId105">
         <w:r>
           <w:rPr>
             <w:rFonts w:ascii="Times New Roman" w:eastAsia="Times New Roman" w:hAnsi="Times New Roman" w:cs="Times New Roman"/>
@@ -8129,7 +9639,7 @@
           <w:szCs w:val="28"/>
         </w:rPr>
       </w:pPr>
-      <w:hyperlink r:id="rId93">
+      <w:hyperlink r:id="rId106">
         <w:r>
           <w:rPr>
             <w:rFonts w:ascii="Times New Roman" w:eastAsia="Times New Roman" w:hAnsi="Times New Roman" w:cs="Times New Roman"/>
@@ -8210,7 +9720,7 @@
           <w:szCs w:val="28"/>
         </w:rPr>
       </w:pPr>
-      <w:hyperlink r:id="rId94">
+      <w:hyperlink r:id="rId107">
         <w:r>
           <w:rPr>
             <w:rFonts w:ascii="Times New Roman" w:eastAsia="Times New Roman" w:hAnsi="Times New Roman" w:cs="Times New Roman"/>
@@ -8235,7 +9745,7 @@
         <w:spacing w:after="0"/>
         <w:ind w:left="1080"/>
       </w:pPr>
-      <w:hyperlink r:id="rId95">
+      <w:hyperlink r:id="rId108">
         <w:r>
           <w:rPr>
             <w:rFonts w:ascii="Times New Roman" w:eastAsia="Times New Roman" w:hAnsi="Times New Roman" w:cs="Times New Roman"/>
@@ -8285,7 +9795,7 @@
           <w:szCs w:val="28"/>
         </w:rPr>
       </w:pPr>
-      <w:hyperlink r:id="rId96">
+      <w:hyperlink r:id="rId109">
         <w:r>
           <w:rPr>
             <w:rFonts w:ascii="Times New Roman" w:eastAsia="Times New Roman" w:hAnsi="Times New Roman" w:cs="Times New Roman"/>
@@ -8457,7 +9967,7 @@
           <w:szCs w:val="28"/>
         </w:rPr>
       </w:pPr>
-      <w:hyperlink r:id="rId97" w:history="1">
+      <w:hyperlink r:id="rId110" w:history="1">
         <w:r>
           <w:rPr>
             <w:rStyle w:val="Hyperlink"/>
@@ -8551,7 +10061,7 @@
           <w:szCs w:val="28"/>
         </w:rPr>
       </w:pPr>
-      <w:hyperlink r:id="rId98" w:history="1">
+      <w:hyperlink r:id="rId111" w:history="1">
         <w:r>
           <w:rPr>
             <w:rStyle w:val="Hyperlink"/>
@@ -8823,23 +10333,126 @@
     </w:p>
     <w:p>
       <w:pPr>
-        <w:rPr>
-          <w:rFonts w:ascii="Times New Roman" w:eastAsia="Times New Roman" w:hAnsi="Times New Roman" w:cs="Times New Roman"/>
-          <w:b/>
-          <w:bCs/>
-          <w:sz w:val="32"/>
-          <w:szCs w:val="32"/>
-        </w:rPr>
-      </w:pPr>
-      <w:r>
-        <w:br w:type="page"/>
-      </w:r>
-    </w:p>
-    <w:p>
-      <w:pPr>
+        <w:pBdr>
+          <w:top w:val="nil"/>
+          <w:left w:val="nil"/>
+          <w:bottom w:val="nil"/>
+          <w:right w:val="nil"/>
+          <w:between w:val="nil"/>
+        </w:pBdr>
+        <w:ind w:left="360"/>
+        <w:rPr>
+          <w:rFonts w:ascii="Times New Roman" w:eastAsia="Times New Roman" w:hAnsi="Times New Roman" w:cs="Times New Roman"/>
+          <w:b/>
+          <w:bCs/>
+          <w:i/>
+          <w:iCs/>
+          <w:color w:val="000000"/>
+          <w:sz w:val="2"/>
+          <w:szCs w:val="2"/>
+          <w:u w:val="single"/>
+        </w:rPr>
+      </w:pPr>
+    </w:p>
+    <w:p>
+      <w:pPr>
+        <w:pBdr>
+          <w:top w:val="nil"/>
+          <w:left w:val="nil"/>
+          <w:bottom w:val="nil"/>
+          <w:right w:val="nil"/>
+          <w:between w:val="nil"/>
+        </w:pBdr>
+        <w:ind w:left="360"/>
+        <w:rPr>
+          <w:rFonts w:ascii="Times New Roman" w:eastAsia="Times New Roman" w:hAnsi="Times New Roman" w:cs="Times New Roman"/>
+          <w:b/>
+          <w:bCs/>
+          <w:color w:val="000000"/>
+          <w:sz w:val="36"/>
+          <w:szCs w:val="36"/>
+        </w:rPr>
+      </w:pPr>
+      <w:hyperlink r:id="rId112" w:history="1">
+        <w:r>
+          <w:rPr>
+            <w:rStyle w:val="Hyperlink"/>
+            <w:rFonts w:ascii="Times New Roman" w:eastAsia="Times New Roman" w:hAnsi="Times New Roman" w:cs="Times New Roman"/>
+            <w:b/>
+            <w:bCs/>
+            <w:sz w:val="36"/>
+            <w:szCs w:val="36"/>
+            <w:u w:val="none"/>
+          </w:rPr>
+          <w:t>https://www.youtube.com/watch?v=dcNk0urQsQM&amp;list=PLwjK_iyK4LLDew546gmrJhB8zU9q_AmOy</w:t>
+        </w:r>
+      </w:hyperlink>
+    </w:p>
+    <w:p>
+      <w:pPr>
+        <w:pBdr>
+          <w:top w:val="nil"/>
+          <w:left w:val="nil"/>
+          <w:bottom w:val="nil"/>
+          <w:right w:val="nil"/>
+          <w:between w:val="nil"/>
+        </w:pBdr>
+        <w:rPr>
+          <w:rFonts w:ascii="Times New Roman" w:eastAsia="Times New Roman" w:hAnsi="Times New Roman" w:cs="Times New Roman"/>
+          <w:b/>
+          <w:bCs/>
+          <w:i/>
+          <w:iCs/>
+          <w:color w:val="000000"/>
+          <w:sz w:val="44"/>
+          <w:szCs w:val="44"/>
+          <w:u w:val="single"/>
+        </w:rPr>
+      </w:pPr>
+    </w:p>
+    <w:p>
+      <w:pPr>
+        <w:pBdr>
+          <w:top w:val="nil"/>
+          <w:left w:val="nil"/>
+          <w:bottom w:val="nil"/>
+          <w:right w:val="nil"/>
+          <w:between w:val="nil"/>
+        </w:pBdr>
+        <w:jc w:val="center"/>
+        <w:rPr>
+          <w:rFonts w:ascii="Times New Roman" w:eastAsia="Times New Roman" w:hAnsi="Times New Roman" w:cs="Times New Roman"/>
+          <w:b/>
+          <w:bCs/>
+          <w:i/>
+          <w:iCs/>
+          <w:color w:val="000000"/>
+          <w:sz w:val="44"/>
+          <w:szCs w:val="44"/>
+          <w:u w:val="single"/>
+        </w:rPr>
+      </w:pPr>
+      <w:r>
+        <w:rPr>
+          <w:rFonts w:ascii="Times New Roman" w:eastAsia="Times New Roman" w:hAnsi="Times New Roman" w:cs="Times New Roman"/>
+          <w:b/>
+          <w:bCs/>
+          <w:i/>
+          <w:iCs/>
+          <w:color w:val="000000"/>
+          <w:sz w:val="44"/>
+          <w:szCs w:val="44"/>
+          <w:u w:val="single"/>
+        </w:rPr>
+        <w:t>Z Extras</w:t>
+      </w:r>
+    </w:p>
+    <w:p>
+      <w:pPr>
+        <w:pStyle w:val="ListParagraph"/>
         <w:numPr>
           <w:ilvl w:val="0"/>
-          <w:numId w:val="2"/>
+          <w:numId w:val="35"/>
         </w:numPr>
         <w:pBdr>
           <w:top w:val="nil"/>
@@ -8850,9 +10463,426 @@
         </w:pBdr>
         <w:rPr>
           <w:rFonts w:ascii="Times New Roman" w:eastAsia="Times New Roman" w:hAnsi="Times New Roman" w:cs="Times New Roman"/>
-          <w:color w:val="000000"/>
-          <w:sz w:val="28"/>
-          <w:szCs w:val="28"/>
+          <w:b/>
+          <w:bCs/>
+          <w:i/>
+          <w:iCs/>
+          <w:color w:val="000000"/>
+          <w:sz w:val="36"/>
+          <w:szCs w:val="36"/>
+          <w:u w:val="single"/>
+        </w:rPr>
+      </w:pPr>
+      <w:r>
+        <w:rPr>
+          <w:rFonts w:ascii="Times New Roman" w:eastAsia="Times New Roman" w:hAnsi="Times New Roman" w:cs="Times New Roman"/>
+          <w:b/>
+          <w:bCs/>
+          <w:i/>
+          <w:iCs/>
+          <w:color w:val="000000"/>
+          <w:sz w:val="36"/>
+          <w:szCs w:val="36"/>
+          <w:u w:val="single"/>
+        </w:rPr>
+        <w:t xml:space="preserve">Memory hierarchy &amp; </w:t>
+      </w:r>
+      <w:proofErr w:type="spellStart"/>
+      <w:r>
+        <w:rPr>
+          <w:rFonts w:ascii="Times New Roman" w:eastAsia="Times New Roman" w:hAnsi="Times New Roman" w:cs="Times New Roman"/>
+          <w:b/>
+          <w:bCs/>
+          <w:i/>
+          <w:iCs/>
+          <w:color w:val="000000"/>
+          <w:sz w:val="36"/>
+          <w:szCs w:val="36"/>
+          <w:u w:val="single"/>
+        </w:rPr>
+        <w:t>Adressing</w:t>
+      </w:r>
+      <w:proofErr w:type="spellEnd"/>
+      <w:r>
+        <w:rPr>
+          <w:rFonts w:ascii="Times New Roman" w:eastAsia="Times New Roman" w:hAnsi="Times New Roman" w:cs="Times New Roman"/>
+          <w:b/>
+          <w:bCs/>
+          <w:i/>
+          <w:iCs/>
+          <w:color w:val="000000"/>
+          <w:sz w:val="36"/>
+          <w:szCs w:val="36"/>
+          <w:u w:val="single"/>
+        </w:rPr>
+        <w:t xml:space="preserve"> :</w:t>
+      </w:r>
+    </w:p>
+    <w:p>
+      <w:pPr>
+        <w:pStyle w:val="ListParagraph"/>
+        <w:pBdr>
+          <w:top w:val="nil"/>
+          <w:left w:val="nil"/>
+          <w:bottom w:val="nil"/>
+          <w:right w:val="nil"/>
+          <w:between w:val="nil"/>
+        </w:pBdr>
+        <w:rPr>
+          <w:rFonts w:ascii="Times New Roman" w:eastAsia="Times New Roman" w:hAnsi="Times New Roman" w:cs="Times New Roman"/>
+          <w:b/>
+          <w:bCs/>
+          <w:color w:val="000000"/>
+          <w:sz w:val="36"/>
+          <w:szCs w:val="36"/>
+        </w:rPr>
+      </w:pPr>
+      <w:hyperlink r:id="rId113" w:history="1">
+        <w:r>
+          <w:rPr>
+            <w:rStyle w:val="Hyperlink"/>
+            <w:rFonts w:ascii="Times New Roman" w:eastAsia="Times New Roman" w:hAnsi="Times New Roman" w:cs="Times New Roman"/>
+            <w:b/>
+            <w:bCs/>
+            <w:sz w:val="36"/>
+            <w:szCs w:val="36"/>
+            <w:u w:val="none"/>
+          </w:rPr>
+          <w:t>https://www.youtube.com/live/9_m-EJcpBKo</w:t>
+        </w:r>
+      </w:hyperlink>
+    </w:p>
+    <w:p>
+      <w:pPr>
+        <w:pStyle w:val="ListParagraph"/>
+        <w:numPr>
+          <w:ilvl w:val="0"/>
+          <w:numId w:val="35"/>
+        </w:numPr>
+        <w:pBdr>
+          <w:top w:val="nil"/>
+          <w:left w:val="nil"/>
+          <w:bottom w:val="nil"/>
+          <w:right w:val="nil"/>
+          <w:between w:val="nil"/>
+        </w:pBdr>
+        <w:rPr>
+          <w:rFonts w:ascii="Times New Roman" w:eastAsia="Times New Roman" w:hAnsi="Times New Roman" w:cs="Times New Roman"/>
+          <w:b/>
+          <w:bCs/>
+          <w:i/>
+          <w:iCs/>
+          <w:color w:val="000000"/>
+          <w:sz w:val="36"/>
+          <w:szCs w:val="36"/>
+          <w:u w:val="single"/>
+        </w:rPr>
+      </w:pPr>
+      <w:r>
+        <w:rPr>
+          <w:rFonts w:ascii="Times New Roman" w:eastAsia="Times New Roman" w:hAnsi="Times New Roman" w:cs="Times New Roman"/>
+          <w:b/>
+          <w:bCs/>
+          <w:i/>
+          <w:iCs/>
+          <w:color w:val="000000"/>
+          <w:sz w:val="36"/>
+          <w:szCs w:val="36"/>
+          <w:u w:val="single"/>
+        </w:rPr>
+        <w:t>Main memory : RAM &amp; ROM</w:t>
+      </w:r>
+    </w:p>
+    <w:p>
+      <w:pPr>
+        <w:pStyle w:val="ListParagraph"/>
+        <w:pBdr>
+          <w:top w:val="nil"/>
+          <w:left w:val="nil"/>
+          <w:bottom w:val="nil"/>
+          <w:right w:val="nil"/>
+          <w:between w:val="nil"/>
+        </w:pBdr>
+        <w:rPr>
+          <w:rFonts w:ascii="Times New Roman" w:eastAsia="Times New Roman" w:hAnsi="Times New Roman" w:cs="Times New Roman"/>
+          <w:b/>
+          <w:bCs/>
+          <w:color w:val="000000"/>
+          <w:sz w:val="36"/>
+          <w:szCs w:val="36"/>
+        </w:rPr>
+      </w:pPr>
+      <w:hyperlink r:id="rId114" w:history="1">
+        <w:r>
+          <w:rPr>
+            <w:rStyle w:val="Hyperlink"/>
+            <w:rFonts w:ascii="Times New Roman" w:eastAsia="Times New Roman" w:hAnsi="Times New Roman" w:cs="Times New Roman"/>
+            <w:b/>
+            <w:bCs/>
+            <w:sz w:val="36"/>
+            <w:szCs w:val="36"/>
+            <w:u w:val="none"/>
+          </w:rPr>
+          <w:t>https://www.youtube.com/live/hERCN-7OWNU</w:t>
+        </w:r>
+      </w:hyperlink>
+    </w:p>
+    <w:p>
+      <w:pPr>
+        <w:pStyle w:val="ListParagraph"/>
+        <w:numPr>
+          <w:ilvl w:val="0"/>
+          <w:numId w:val="35"/>
+        </w:numPr>
+        <w:pBdr>
+          <w:top w:val="nil"/>
+          <w:left w:val="nil"/>
+          <w:bottom w:val="nil"/>
+          <w:right w:val="nil"/>
+          <w:between w:val="nil"/>
+        </w:pBdr>
+        <w:rPr>
+          <w:rFonts w:ascii="Times New Roman" w:eastAsia="Times New Roman" w:hAnsi="Times New Roman" w:cs="Times New Roman"/>
+          <w:b/>
+          <w:bCs/>
+          <w:i/>
+          <w:iCs/>
+          <w:color w:val="000000"/>
+          <w:sz w:val="36"/>
+          <w:szCs w:val="36"/>
+          <w:u w:val="single"/>
+        </w:rPr>
+      </w:pPr>
+      <w:r>
+        <w:rPr>
+          <w:rFonts w:ascii="Times New Roman" w:eastAsia="Times New Roman" w:hAnsi="Times New Roman" w:cs="Times New Roman"/>
+          <w:b/>
+          <w:bCs/>
+          <w:i/>
+          <w:iCs/>
+          <w:color w:val="000000"/>
+          <w:sz w:val="36"/>
+          <w:szCs w:val="36"/>
+          <w:u w:val="single"/>
+        </w:rPr>
+        <w:t xml:space="preserve">AMD </w:t>
+      </w:r>
+      <w:proofErr w:type="spellStart"/>
+      <w:r>
+        <w:rPr>
+          <w:rFonts w:ascii="Times New Roman" w:eastAsia="Times New Roman" w:hAnsi="Times New Roman" w:cs="Times New Roman"/>
+          <w:b/>
+          <w:bCs/>
+          <w:i/>
+          <w:iCs/>
+          <w:color w:val="000000"/>
+          <w:sz w:val="36"/>
+          <w:szCs w:val="36"/>
+          <w:u w:val="single"/>
+        </w:rPr>
+        <w:t>Ryzen</w:t>
+      </w:r>
+      <w:proofErr w:type="spellEnd"/>
+      <w:r>
+        <w:rPr>
+          <w:rFonts w:ascii="Times New Roman" w:eastAsia="Times New Roman" w:hAnsi="Times New Roman" w:cs="Times New Roman"/>
+          <w:b/>
+          <w:bCs/>
+          <w:i/>
+          <w:iCs/>
+          <w:color w:val="000000"/>
+          <w:sz w:val="36"/>
+          <w:szCs w:val="36"/>
+          <w:u w:val="single"/>
+        </w:rPr>
+        <w:t xml:space="preserve"> CPU evolution</w:t>
+      </w:r>
+    </w:p>
+    <w:p>
+      <w:pPr>
+        <w:pStyle w:val="ListParagraph"/>
+        <w:pBdr>
+          <w:top w:val="nil"/>
+          <w:left w:val="nil"/>
+          <w:bottom w:val="nil"/>
+          <w:right w:val="nil"/>
+          <w:between w:val="nil"/>
+        </w:pBdr>
+        <w:rPr>
+          <w:rFonts w:ascii="Times New Roman" w:eastAsia="Times New Roman" w:hAnsi="Times New Roman" w:cs="Times New Roman"/>
+          <w:b/>
+          <w:bCs/>
+          <w:color w:val="000000"/>
+          <w:sz w:val="36"/>
+          <w:szCs w:val="36"/>
+        </w:rPr>
+      </w:pPr>
+      <w:hyperlink r:id="rId115" w:history="1">
+        <w:r>
+          <w:rPr>
+            <w:rStyle w:val="Hyperlink"/>
+            <w:rFonts w:ascii="Times New Roman" w:eastAsia="Times New Roman" w:hAnsi="Times New Roman" w:cs="Times New Roman"/>
+            <w:b/>
+            <w:bCs/>
+            <w:sz w:val="36"/>
+            <w:szCs w:val="36"/>
+            <w:u w:val="none"/>
+          </w:rPr>
+          <w:t xml:space="preserve">Timeline of AMD </w:t>
+        </w:r>
+        <w:proofErr w:type="spellStart"/>
+        <w:r>
+          <w:rPr>
+            <w:rStyle w:val="Hyperlink"/>
+            <w:rFonts w:ascii="Times New Roman" w:eastAsia="Times New Roman" w:hAnsi="Times New Roman" w:cs="Times New Roman"/>
+            <w:b/>
+            <w:bCs/>
+            <w:sz w:val="36"/>
+            <w:szCs w:val="36"/>
+            <w:u w:val="none"/>
+          </w:rPr>
+          <w:t>Ryzen</w:t>
+        </w:r>
+        <w:proofErr w:type="spellEnd"/>
+        <w:r>
+          <w:rPr>
+            <w:rStyle w:val="Hyperlink"/>
+            <w:rFonts w:ascii="Times New Roman" w:eastAsia="Times New Roman" w:hAnsi="Times New Roman" w:cs="Times New Roman"/>
+            <w:b/>
+            <w:bCs/>
+            <w:sz w:val="36"/>
+            <w:szCs w:val="36"/>
+            <w:u w:val="none"/>
+          </w:rPr>
+          <w:t xml:space="preserve"> CPU Releases by </w:t>
+        </w:r>
+        <w:proofErr w:type="spellStart"/>
+        <w:r>
+          <w:rPr>
+            <w:rStyle w:val="Hyperlink"/>
+            <w:rFonts w:ascii="Times New Roman" w:eastAsia="Times New Roman" w:hAnsi="Times New Roman" w:cs="Times New Roman"/>
+            <w:b/>
+            <w:bCs/>
+            <w:sz w:val="36"/>
+            <w:szCs w:val="36"/>
+            <w:u w:val="none"/>
+          </w:rPr>
+          <w:t>Norsyamimi</w:t>
+        </w:r>
+        <w:proofErr w:type="spellEnd"/>
+        <w:r>
+          <w:rPr>
+            <w:rStyle w:val="Hyperlink"/>
+            <w:rFonts w:ascii="Times New Roman" w:eastAsia="Times New Roman" w:hAnsi="Times New Roman" w:cs="Times New Roman"/>
+            <w:b/>
+            <w:bCs/>
+            <w:sz w:val="36"/>
+            <w:szCs w:val="36"/>
+            <w:u w:val="none"/>
+          </w:rPr>
+          <w:t xml:space="preserve"> Hasran on Prezi</w:t>
+        </w:r>
+      </w:hyperlink>
+    </w:p>
+    <w:p>
+      <w:pPr>
+        <w:pStyle w:val="ListParagraph"/>
+        <w:numPr>
+          <w:ilvl w:val="0"/>
+          <w:numId w:val="35"/>
+        </w:numPr>
+        <w:pBdr>
+          <w:top w:val="nil"/>
+          <w:left w:val="nil"/>
+          <w:bottom w:val="nil"/>
+          <w:right w:val="nil"/>
+          <w:between w:val="nil"/>
+        </w:pBdr>
+        <w:rPr>
+          <w:rFonts w:ascii="Times New Roman" w:eastAsia="Times New Roman" w:hAnsi="Times New Roman" w:cs="Times New Roman"/>
+          <w:b/>
+          <w:bCs/>
+          <w:i/>
+          <w:iCs/>
+          <w:color w:val="000000"/>
+          <w:sz w:val="36"/>
+          <w:szCs w:val="36"/>
+          <w:u w:val="single"/>
+        </w:rPr>
+      </w:pPr>
+      <w:r>
+        <w:rPr>
+          <w:rFonts w:ascii="Times New Roman" w:eastAsia="Times New Roman" w:hAnsi="Times New Roman" w:cs="Times New Roman"/>
+          <w:b/>
+          <w:bCs/>
+          <w:i/>
+          <w:iCs/>
+          <w:color w:val="000000"/>
+          <w:sz w:val="36"/>
+          <w:szCs w:val="36"/>
+          <w:u w:val="single"/>
+        </w:rPr>
+        <w:t xml:space="preserve">Intel Processors Evolution </w:t>
+      </w:r>
+    </w:p>
+    <w:p>
+      <w:pPr>
+        <w:pStyle w:val="ListParagraph"/>
+        <w:pBdr>
+          <w:top w:val="nil"/>
+          <w:left w:val="nil"/>
+          <w:bottom w:val="nil"/>
+          <w:right w:val="nil"/>
+          <w:between w:val="nil"/>
+        </w:pBdr>
+        <w:rPr>
+          <w:rFonts w:ascii="Times New Roman" w:eastAsia="Times New Roman" w:hAnsi="Times New Roman" w:cs="Times New Roman"/>
+          <w:b/>
+          <w:bCs/>
+          <w:color w:val="000000"/>
+          <w:sz w:val="36"/>
+          <w:szCs w:val="36"/>
+        </w:rPr>
+      </w:pPr>
+      <w:hyperlink r:id="rId116" w:history="1">
+        <w:r>
+          <w:rPr>
+            <w:rStyle w:val="Hyperlink"/>
+            <w:rFonts w:ascii="Times New Roman" w:eastAsia="Times New Roman" w:hAnsi="Times New Roman" w:cs="Times New Roman"/>
+            <w:b/>
+            <w:bCs/>
+            <w:sz w:val="36"/>
+            <w:szCs w:val="36"/>
+            <w:u w:val="none"/>
+          </w:rPr>
+          <w:t>The Evolution of Intel Processors: A Historical Overview by Apple Galiza on Prezi</w:t>
+        </w:r>
+      </w:hyperlink>
+    </w:p>
+    <w:p>
+      <w:pPr>
+        <w:pStyle w:val="ListParagraph"/>
+        <w:numPr>
+          <w:ilvl w:val="0"/>
+          <w:numId w:val="35"/>
+        </w:numPr>
+        <w:pBdr>
+          <w:top w:val="nil"/>
+          <w:left w:val="nil"/>
+          <w:bottom w:val="nil"/>
+          <w:right w:val="nil"/>
+          <w:between w:val="nil"/>
+        </w:pBdr>
+        <w:rPr>
+          <w:rFonts w:ascii="Times New Roman" w:eastAsia="Times New Roman" w:hAnsi="Times New Roman" w:cs="Times New Roman"/>
+          <w:b/>
+          <w:bCs/>
+          <w:i/>
+          <w:iCs/>
+          <w:color w:val="000000"/>
+          <w:sz w:val="44"/>
+          <w:szCs w:val="44"/>
+          <w:u w:val="single"/>
         </w:rPr>
       </w:pPr>
     </w:p>
@@ -8869,6 +10899,232 @@
 <file path=word/numbering.xml><?xml version="1.0" encoding="utf-8"?>
 <w:numbering xmlns:wpc="http://schemas.microsoft.com/office/word/2010/wordprocessingCanvas" xmlns:cx="http://schemas.microsoft.com/office/drawing/2014/chartex" xmlns:cx1="http://schemas.microsoft.com/office/drawing/2015/9/8/chartex" xmlns:cx2="http://schemas.microsoft.com/office/drawing/2015/10/21/chartex" xmlns:cx3="http://schemas.microsoft.com/office/drawing/2016/5/9/chartex" xmlns:cx4="http://schemas.microsoft.com/office/drawing/2016/5/10/chartex" xmlns:cx5="http://schemas.microsoft.com/office/drawing/2016/5/11/chartex" xmlns:cx6="http://schemas.microsoft.com/office/drawing/2016/5/12/chartex" xmlns:cx7="http://schemas.microsoft.com/office/drawing/2016/5/13/chartex" xmlns:cx8="http://schemas.microsoft.com/office/drawing/2016/5/14/chartex" xmlns:mc="http://schemas.openxmlformats.org/markup-compatibility/2006" xmlns:aink="http://schemas.microsoft.com/office/drawing/2016/ink" xmlns:am3d="http://schemas.microsoft.com/office/drawing/2017/model3d" xmlns:o="urn:schemas-microsoft-com:office:office" xmlns:oel="http://schemas.microsoft.com/office/2019/extlst" xmlns:r="http://schemas.openxmlformats.org/officeDocument/2006/relationships" xmlns:m="http://schemas.openxmlformats.org/officeDocument/2006/math" xmlns:v="urn:schemas-microsoft-com:vml" xmlns:wp14="http://schemas.microsoft.com/office/word/2010/wordprocessingDrawing" xmlns:wp="http://schemas.openxmlformats.org/drawingml/2006/wordprocessingDrawing" xmlns:w10="urn:schemas-microsoft-com:office:word" xmlns:w="http://schemas.openxmlformats.org/wordprocessingml/2006/main" xmlns:w14="http://schemas.microsoft.com/office/word/2010/wordml" xmlns:w15="http://schemas.microsoft.com/office/word/2012/wordml" xmlns:w16cex="http://schemas.microsoft.com/office/word/2018/wordml/cex" xmlns:w16cid="http://schemas.microsoft.com/office/word/2016/wordml/cid" xmlns:w16="http://schemas.microsoft.com/office/word/2018/wordml" xmlns:w16du="http://schemas.microsoft.com/office/word/2023/wordml/word16du" xmlns:w16sdtdh="http://schemas.microsoft.com/office/word/2020/wordml/sdtdatahash" xmlns:w16sdtfl="http://schemas.microsoft.com/office/word/2024/wordml/sdtformatlock" xmlns:w16se="http://schemas.microsoft.com/office/word/2015/wordml/symex" xmlns:wpg="http://schemas.microsoft.com/office/word/2010/wordprocessingGroup" xmlns:wpi="http://schemas.microsoft.com/office/word/2010/wordprocessingInk" xmlns:wne="http://schemas.microsoft.com/office/word/2006/wordml" xmlns:wps="http://schemas.microsoft.com/office/word/2010/wordprocessingShape" mc:Ignorable="w14 w15 w16se w16cid w16 w16cex w16sdtdh w16sdtfl w16du wp14">
   <w:abstractNum w:abstractNumId="0" w15:restartNumberingAfterBreak="0">
+    <w:nsid w:val="165275D6"/>
+    <w:multiLevelType w:val="hybridMultilevel"/>
+    <w:tmpl w:val="BF04B7B8"/>
+    <w:lvl w:ilvl="0" w:tplc="40090003">
+      <w:start w:val="1"/>
+      <w:numFmt w:val="bullet"/>
+      <w:lvlText w:val="o"/>
+      <w:lvlJc w:val="left"/>
+      <w:pPr>
+        <w:ind w:left="1530" w:hanging="360"/>
+      </w:pPr>
+      <w:rPr>
+        <w:rFonts w:ascii="Courier New" w:hAnsi="Courier New" w:cs="Courier New" w:hint="default"/>
+      </w:rPr>
+    </w:lvl>
+    <w:lvl w:ilvl="1" w:tplc="40090003" w:tentative="1">
+      <w:start w:val="1"/>
+      <w:numFmt w:val="bullet"/>
+      <w:lvlText w:val="o"/>
+      <w:lvlJc w:val="left"/>
+      <w:pPr>
+        <w:ind w:left="2250" w:hanging="360"/>
+      </w:pPr>
+      <w:rPr>
+        <w:rFonts w:ascii="Courier New" w:hAnsi="Courier New" w:cs="Courier New" w:hint="default"/>
+      </w:rPr>
+    </w:lvl>
+    <w:lvl w:ilvl="2" w:tplc="40090005" w:tentative="1">
+      <w:start w:val="1"/>
+      <w:numFmt w:val="bullet"/>
+      <w:lvlText w:val=""/>
+      <w:lvlJc w:val="left"/>
+      <w:pPr>
+        <w:ind w:left="2970" w:hanging="360"/>
+      </w:pPr>
+      <w:rPr>
+        <w:rFonts w:ascii="Wingdings" w:hAnsi="Wingdings" w:hint="default"/>
+      </w:rPr>
+    </w:lvl>
+    <w:lvl w:ilvl="3" w:tplc="40090001" w:tentative="1">
+      <w:start w:val="1"/>
+      <w:numFmt w:val="bullet"/>
+      <w:lvlText w:val=""/>
+      <w:lvlJc w:val="left"/>
+      <w:pPr>
+        <w:ind w:left="3690" w:hanging="360"/>
+      </w:pPr>
+      <w:rPr>
+        <w:rFonts w:ascii="Symbol" w:hAnsi="Symbol" w:hint="default"/>
+      </w:rPr>
+    </w:lvl>
+    <w:lvl w:ilvl="4" w:tplc="40090003" w:tentative="1">
+      <w:start w:val="1"/>
+      <w:numFmt w:val="bullet"/>
+      <w:lvlText w:val="o"/>
+      <w:lvlJc w:val="left"/>
+      <w:pPr>
+        <w:ind w:left="4410" w:hanging="360"/>
+      </w:pPr>
+      <w:rPr>
+        <w:rFonts w:ascii="Courier New" w:hAnsi="Courier New" w:cs="Courier New" w:hint="default"/>
+      </w:rPr>
+    </w:lvl>
+    <w:lvl w:ilvl="5" w:tplc="40090005" w:tentative="1">
+      <w:start w:val="1"/>
+      <w:numFmt w:val="bullet"/>
+      <w:lvlText w:val=""/>
+      <w:lvlJc w:val="left"/>
+      <w:pPr>
+        <w:ind w:left="5130" w:hanging="360"/>
+      </w:pPr>
+      <w:rPr>
+        <w:rFonts w:ascii="Wingdings" w:hAnsi="Wingdings" w:hint="default"/>
+      </w:rPr>
+    </w:lvl>
+    <w:lvl w:ilvl="6" w:tplc="40090001" w:tentative="1">
+      <w:start w:val="1"/>
+      <w:numFmt w:val="bullet"/>
+      <w:lvlText w:val=""/>
+      <w:lvlJc w:val="left"/>
+      <w:pPr>
+        <w:ind w:left="5850" w:hanging="360"/>
+      </w:pPr>
+      <w:rPr>
+        <w:rFonts w:ascii="Symbol" w:hAnsi="Symbol" w:hint="default"/>
+      </w:rPr>
+    </w:lvl>
+    <w:lvl w:ilvl="7" w:tplc="40090003" w:tentative="1">
+      <w:start w:val="1"/>
+      <w:numFmt w:val="bullet"/>
+      <w:lvlText w:val="o"/>
+      <w:lvlJc w:val="left"/>
+      <w:pPr>
+        <w:ind w:left="6570" w:hanging="360"/>
+      </w:pPr>
+      <w:rPr>
+        <w:rFonts w:ascii="Courier New" w:hAnsi="Courier New" w:cs="Courier New" w:hint="default"/>
+      </w:rPr>
+    </w:lvl>
+    <w:lvl w:ilvl="8" w:tplc="40090005" w:tentative="1">
+      <w:start w:val="1"/>
+      <w:numFmt w:val="bullet"/>
+      <w:lvlText w:val=""/>
+      <w:lvlJc w:val="left"/>
+      <w:pPr>
+        <w:ind w:left="7290" w:hanging="360"/>
+      </w:pPr>
+      <w:rPr>
+        <w:rFonts w:ascii="Wingdings" w:hAnsi="Wingdings" w:hint="default"/>
+      </w:rPr>
+    </w:lvl>
+  </w:abstractNum>
+  <w:abstractNum w:abstractNumId="1" w15:restartNumberingAfterBreak="0">
+    <w:nsid w:val="172F1087"/>
+    <w:multiLevelType w:val="hybridMultilevel"/>
+    <w:tmpl w:val="9C0C0238"/>
+    <w:lvl w:ilvl="0" w:tplc="40090003">
+      <w:start w:val="1"/>
+      <w:numFmt w:val="bullet"/>
+      <w:lvlText w:val="o"/>
+      <w:lvlJc w:val="left"/>
+      <w:pPr>
+        <w:ind w:left="5040" w:hanging="360"/>
+      </w:pPr>
+      <w:rPr>
+        <w:rFonts w:ascii="Courier New" w:hAnsi="Courier New" w:cs="Courier New" w:hint="default"/>
+      </w:rPr>
+    </w:lvl>
+    <w:lvl w:ilvl="1" w:tplc="40090003" w:tentative="1">
+      <w:start w:val="1"/>
+      <w:numFmt w:val="bullet"/>
+      <w:lvlText w:val="o"/>
+      <w:lvlJc w:val="left"/>
+      <w:pPr>
+        <w:ind w:left="5760" w:hanging="360"/>
+      </w:pPr>
+      <w:rPr>
+        <w:rFonts w:ascii="Courier New" w:hAnsi="Courier New" w:cs="Courier New" w:hint="default"/>
+      </w:rPr>
+    </w:lvl>
+    <w:lvl w:ilvl="2" w:tplc="40090005" w:tentative="1">
+      <w:start w:val="1"/>
+      <w:numFmt w:val="bullet"/>
+      <w:lvlText w:val=""/>
+      <w:lvlJc w:val="left"/>
+      <w:pPr>
+        <w:ind w:left="6480" w:hanging="360"/>
+      </w:pPr>
+      <w:rPr>
+        <w:rFonts w:ascii="Wingdings" w:hAnsi="Wingdings" w:hint="default"/>
+      </w:rPr>
+    </w:lvl>
+    <w:lvl w:ilvl="3" w:tplc="40090001" w:tentative="1">
+      <w:start w:val="1"/>
+      <w:numFmt w:val="bullet"/>
+      <w:lvlText w:val=""/>
+      <w:lvlJc w:val="left"/>
+      <w:pPr>
+        <w:ind w:left="7200" w:hanging="360"/>
+      </w:pPr>
+      <w:rPr>
+        <w:rFonts w:ascii="Symbol" w:hAnsi="Symbol" w:hint="default"/>
+      </w:rPr>
+    </w:lvl>
+    <w:lvl w:ilvl="4" w:tplc="40090003" w:tentative="1">
+      <w:start w:val="1"/>
+      <w:numFmt w:val="bullet"/>
+      <w:lvlText w:val="o"/>
+      <w:lvlJc w:val="left"/>
+      <w:pPr>
+        <w:ind w:left="7920" w:hanging="360"/>
+      </w:pPr>
+      <w:rPr>
+        <w:rFonts w:ascii="Courier New" w:hAnsi="Courier New" w:cs="Courier New" w:hint="default"/>
+      </w:rPr>
+    </w:lvl>
+    <w:lvl w:ilvl="5" w:tplc="40090005" w:tentative="1">
+      <w:start w:val="1"/>
+      <w:numFmt w:val="bullet"/>
+      <w:lvlText w:val=""/>
+      <w:lvlJc w:val="left"/>
+      <w:pPr>
+        <w:ind w:left="8640" w:hanging="360"/>
+      </w:pPr>
+      <w:rPr>
+        <w:rFonts w:ascii="Wingdings" w:hAnsi="Wingdings" w:hint="default"/>
+      </w:rPr>
+    </w:lvl>
+    <w:lvl w:ilvl="6" w:tplc="40090001" w:tentative="1">
+      <w:start w:val="1"/>
+      <w:numFmt w:val="bullet"/>
+      <w:lvlText w:val=""/>
+      <w:lvlJc w:val="left"/>
+      <w:pPr>
+        <w:ind w:left="9360" w:hanging="360"/>
+      </w:pPr>
+      <w:rPr>
+        <w:rFonts w:ascii="Symbol" w:hAnsi="Symbol" w:hint="default"/>
+      </w:rPr>
+    </w:lvl>
+    <w:lvl w:ilvl="7" w:tplc="40090003" w:tentative="1">
+      <w:start w:val="1"/>
+      <w:numFmt w:val="bullet"/>
+      <w:lvlText w:val="o"/>
+      <w:lvlJc w:val="left"/>
+      <w:pPr>
+        <w:ind w:left="10080" w:hanging="360"/>
+      </w:pPr>
+      <w:rPr>
+        <w:rFonts w:ascii="Courier New" w:hAnsi="Courier New" w:cs="Courier New" w:hint="default"/>
+      </w:rPr>
+    </w:lvl>
+    <w:lvl w:ilvl="8" w:tplc="40090005" w:tentative="1">
+      <w:start w:val="1"/>
+      <w:numFmt w:val="bullet"/>
+      <w:lvlText w:val=""/>
+      <w:lvlJc w:val="left"/>
+      <w:pPr>
+        <w:ind w:left="10800" w:hanging="360"/>
+      </w:pPr>
+      <w:rPr>
+        <w:rFonts w:ascii="Wingdings" w:hAnsi="Wingdings" w:hint="default"/>
+      </w:rPr>
+    </w:lvl>
+  </w:abstractNum>
+  <w:abstractNum w:abstractNumId="2" w15:restartNumberingAfterBreak="0">
     <w:nsid w:val="1A3403C8"/>
     <w:multiLevelType w:val="multilevel"/>
     <w:tmpl w:val="6B8A141A"/>
@@ -8981,7 +11237,7 @@
       </w:rPr>
     </w:lvl>
   </w:abstractNum>
-  <w:abstractNum w:abstractNumId="1" w15:restartNumberingAfterBreak="0">
+  <w:abstractNum w:abstractNumId="3" w15:restartNumberingAfterBreak="0">
     <w:nsid w:val="23B22071"/>
     <w:multiLevelType w:val="hybridMultilevel"/>
     <w:tmpl w:val="1D70A7A6"/>
@@ -9074,7 +11330,7 @@
       </w:pPr>
     </w:lvl>
   </w:abstractNum>
-  <w:abstractNum w:abstractNumId="2" w15:restartNumberingAfterBreak="0">
+  <w:abstractNum w:abstractNumId="4" w15:restartNumberingAfterBreak="0">
     <w:nsid w:val="290863A0"/>
     <w:multiLevelType w:val="multilevel"/>
     <w:tmpl w:val="A80098FE"/>
@@ -9189,7 +11445,7 @@
       </w:rPr>
     </w:lvl>
   </w:abstractNum>
-  <w:abstractNum w:abstractNumId="3" w15:restartNumberingAfterBreak="0">
+  <w:abstractNum w:abstractNumId="5" w15:restartNumberingAfterBreak="0">
     <w:nsid w:val="29212259"/>
     <w:multiLevelType w:val="hybridMultilevel"/>
     <w:tmpl w:val="5CDCF1A6"/>
@@ -9279,7 +11535,120 @@
       </w:pPr>
     </w:lvl>
   </w:abstractNum>
-  <w:abstractNum w:abstractNumId="4" w15:restartNumberingAfterBreak="0">
+  <w:abstractNum w:abstractNumId="6" w15:restartNumberingAfterBreak="0">
+    <w:nsid w:val="29641D92"/>
+    <w:multiLevelType w:val="hybridMultilevel"/>
+    <w:tmpl w:val="3E1627C6"/>
+    <w:lvl w:ilvl="0" w:tplc="40090003">
+      <w:start w:val="1"/>
+      <w:numFmt w:val="bullet"/>
+      <w:lvlText w:val="o"/>
+      <w:lvlJc w:val="left"/>
+      <w:pPr>
+        <w:ind w:left="1530" w:hanging="360"/>
+      </w:pPr>
+      <w:rPr>
+        <w:rFonts w:ascii="Courier New" w:hAnsi="Courier New" w:cs="Courier New" w:hint="default"/>
+      </w:rPr>
+    </w:lvl>
+    <w:lvl w:ilvl="1" w:tplc="40090003" w:tentative="1">
+      <w:start w:val="1"/>
+      <w:numFmt w:val="bullet"/>
+      <w:lvlText w:val="o"/>
+      <w:lvlJc w:val="left"/>
+      <w:pPr>
+        <w:ind w:left="2250" w:hanging="360"/>
+      </w:pPr>
+      <w:rPr>
+        <w:rFonts w:ascii="Courier New" w:hAnsi="Courier New" w:cs="Courier New" w:hint="default"/>
+      </w:rPr>
+    </w:lvl>
+    <w:lvl w:ilvl="2" w:tplc="40090005" w:tentative="1">
+      <w:start w:val="1"/>
+      <w:numFmt w:val="bullet"/>
+      <w:lvlText w:val=""/>
+      <w:lvlJc w:val="left"/>
+      <w:pPr>
+        <w:ind w:left="2970" w:hanging="360"/>
+      </w:pPr>
+      <w:rPr>
+        <w:rFonts w:ascii="Wingdings" w:hAnsi="Wingdings" w:hint="default"/>
+      </w:rPr>
+    </w:lvl>
+    <w:lvl w:ilvl="3" w:tplc="40090001" w:tentative="1">
+      <w:start w:val="1"/>
+      <w:numFmt w:val="bullet"/>
+      <w:lvlText w:val=""/>
+      <w:lvlJc w:val="left"/>
+      <w:pPr>
+        <w:ind w:left="3690" w:hanging="360"/>
+      </w:pPr>
+      <w:rPr>
+        <w:rFonts w:ascii="Symbol" w:hAnsi="Symbol" w:hint="default"/>
+      </w:rPr>
+    </w:lvl>
+    <w:lvl w:ilvl="4" w:tplc="40090003" w:tentative="1">
+      <w:start w:val="1"/>
+      <w:numFmt w:val="bullet"/>
+      <w:lvlText w:val="o"/>
+      <w:lvlJc w:val="left"/>
+      <w:pPr>
+        <w:ind w:left="4410" w:hanging="360"/>
+      </w:pPr>
+      <w:rPr>
+        <w:rFonts w:ascii="Courier New" w:hAnsi="Courier New" w:cs="Courier New" w:hint="default"/>
+      </w:rPr>
+    </w:lvl>
+    <w:lvl w:ilvl="5" w:tplc="40090005" w:tentative="1">
+      <w:start w:val="1"/>
+      <w:numFmt w:val="bullet"/>
+      <w:lvlText w:val=""/>
+      <w:lvlJc w:val="left"/>
+      <w:pPr>
+        <w:ind w:left="5130" w:hanging="360"/>
+      </w:pPr>
+      <w:rPr>
+        <w:rFonts w:ascii="Wingdings" w:hAnsi="Wingdings" w:hint="default"/>
+      </w:rPr>
+    </w:lvl>
+    <w:lvl w:ilvl="6" w:tplc="40090001" w:tentative="1">
+      <w:start w:val="1"/>
+      <w:numFmt w:val="bullet"/>
+      <w:lvlText w:val=""/>
+      <w:lvlJc w:val="left"/>
+      <w:pPr>
+        <w:ind w:left="5850" w:hanging="360"/>
+      </w:pPr>
+      <w:rPr>
+        <w:rFonts w:ascii="Symbol" w:hAnsi="Symbol" w:hint="default"/>
+      </w:rPr>
+    </w:lvl>
+    <w:lvl w:ilvl="7" w:tplc="40090003" w:tentative="1">
+      <w:start w:val="1"/>
+      <w:numFmt w:val="bullet"/>
+      <w:lvlText w:val="o"/>
+      <w:lvlJc w:val="left"/>
+      <w:pPr>
+        <w:ind w:left="6570" w:hanging="360"/>
+      </w:pPr>
+      <w:rPr>
+        <w:rFonts w:ascii="Courier New" w:hAnsi="Courier New" w:cs="Courier New" w:hint="default"/>
+      </w:rPr>
+    </w:lvl>
+    <w:lvl w:ilvl="8" w:tplc="40090005" w:tentative="1">
+      <w:start w:val="1"/>
+      <w:numFmt w:val="bullet"/>
+      <w:lvlText w:val=""/>
+      <w:lvlJc w:val="left"/>
+      <w:pPr>
+        <w:ind w:left="7290" w:hanging="360"/>
+      </w:pPr>
+      <w:rPr>
+        <w:rFonts w:ascii="Wingdings" w:hAnsi="Wingdings" w:hint="default"/>
+      </w:rPr>
+    </w:lvl>
+  </w:abstractNum>
+  <w:abstractNum w:abstractNumId="7" w15:restartNumberingAfterBreak="0">
     <w:nsid w:val="2B190B8C"/>
     <w:multiLevelType w:val="multilevel"/>
     <w:tmpl w:val="48BA9030"/>
@@ -9392,7 +11761,97 @@
       </w:rPr>
     </w:lvl>
   </w:abstractNum>
-  <w:abstractNum w:abstractNumId="5" w15:restartNumberingAfterBreak="0">
+  <w:abstractNum w:abstractNumId="8" w15:restartNumberingAfterBreak="0">
+    <w:nsid w:val="31967782"/>
+    <w:multiLevelType w:val="hybridMultilevel"/>
+    <w:tmpl w:val="426A6540"/>
+    <w:lvl w:ilvl="0" w:tplc="AE00C91C">
+      <w:start w:val="1"/>
+      <w:numFmt w:val="decimal"/>
+      <w:lvlText w:val="%1."/>
+      <w:lvlJc w:val="left"/>
+      <w:pPr>
+        <w:ind w:left="720" w:hanging="360"/>
+      </w:pPr>
+      <w:rPr>
+        <w:sz w:val="36"/>
+        <w:szCs w:val="36"/>
+      </w:rPr>
+    </w:lvl>
+    <w:lvl w:ilvl="1" w:tplc="FFFFFFFF">
+      <w:start w:val="1"/>
+      <w:numFmt w:val="decimal"/>
+      <w:lvlText w:val="%2)"/>
+      <w:lvlJc w:val="left"/>
+      <w:pPr>
+        <w:ind w:left="1260" w:hanging="360"/>
+      </w:pPr>
+    </w:lvl>
+    <w:lvl w:ilvl="2" w:tplc="FFFFFFFF" w:tentative="1">
+      <w:start w:val="1"/>
+      <w:numFmt w:val="lowerRoman"/>
+      <w:lvlText w:val="%3."/>
+      <w:lvlJc w:val="right"/>
+      <w:pPr>
+        <w:ind w:left="2160" w:hanging="180"/>
+      </w:pPr>
+    </w:lvl>
+    <w:lvl w:ilvl="3" w:tplc="FFFFFFFF" w:tentative="1">
+      <w:start w:val="1"/>
+      <w:numFmt w:val="decimal"/>
+      <w:lvlText w:val="%4."/>
+      <w:lvlJc w:val="left"/>
+      <w:pPr>
+        <w:ind w:left="2880" w:hanging="360"/>
+      </w:pPr>
+    </w:lvl>
+    <w:lvl w:ilvl="4" w:tplc="FFFFFFFF" w:tentative="1">
+      <w:start w:val="1"/>
+      <w:numFmt w:val="lowerLetter"/>
+      <w:lvlText w:val="%5."/>
+      <w:lvlJc w:val="left"/>
+      <w:pPr>
+        <w:ind w:left="3600" w:hanging="360"/>
+      </w:pPr>
+    </w:lvl>
+    <w:lvl w:ilvl="5" w:tplc="FFFFFFFF" w:tentative="1">
+      <w:start w:val="1"/>
+      <w:numFmt w:val="lowerRoman"/>
+      <w:lvlText w:val="%6."/>
+      <w:lvlJc w:val="right"/>
+      <w:pPr>
+        <w:ind w:left="4320" w:hanging="180"/>
+      </w:pPr>
+    </w:lvl>
+    <w:lvl w:ilvl="6" w:tplc="FFFFFFFF" w:tentative="1">
+      <w:start w:val="1"/>
+      <w:numFmt w:val="decimal"/>
+      <w:lvlText w:val="%7."/>
+      <w:lvlJc w:val="left"/>
+      <w:pPr>
+        <w:ind w:left="5040" w:hanging="360"/>
+      </w:pPr>
+    </w:lvl>
+    <w:lvl w:ilvl="7" w:tplc="FFFFFFFF" w:tentative="1">
+      <w:start w:val="1"/>
+      <w:numFmt w:val="lowerLetter"/>
+      <w:lvlText w:val="%8."/>
+      <w:lvlJc w:val="left"/>
+      <w:pPr>
+        <w:ind w:left="5760" w:hanging="360"/>
+      </w:pPr>
+    </w:lvl>
+    <w:lvl w:ilvl="8" w:tplc="FFFFFFFF" w:tentative="1">
+      <w:start w:val="1"/>
+      <w:numFmt w:val="lowerRoman"/>
+      <w:lvlText w:val="%9."/>
+      <w:lvlJc w:val="right"/>
+      <w:pPr>
+        <w:ind w:left="6480" w:hanging="180"/>
+      </w:pPr>
+    </w:lvl>
+  </w:abstractNum>
+  <w:abstractNum w:abstractNumId="9" w15:restartNumberingAfterBreak="0">
     <w:nsid w:val="31BB0F2C"/>
     <w:multiLevelType w:val="hybridMultilevel"/>
     <w:tmpl w:val="7ABCDB48"/>
@@ -9505,7 +11964,7 @@
       </w:rPr>
     </w:lvl>
   </w:abstractNum>
-  <w:abstractNum w:abstractNumId="6" w15:restartNumberingAfterBreak="0">
+  <w:abstractNum w:abstractNumId="10" w15:restartNumberingAfterBreak="0">
     <w:nsid w:val="31FB20D6"/>
     <w:multiLevelType w:val="hybridMultilevel"/>
     <w:tmpl w:val="44F49BA0"/>
@@ -9598,10 +12057,10 @@
       </w:pPr>
     </w:lvl>
   </w:abstractNum>
-  <w:abstractNum w:abstractNumId="7" w15:restartNumberingAfterBreak="0">
+  <w:abstractNum w:abstractNumId="11" w15:restartNumberingAfterBreak="0">
     <w:nsid w:val="33CE22B6"/>
     <w:multiLevelType w:val="hybridMultilevel"/>
-    <w:tmpl w:val="B6102FBC"/>
+    <w:tmpl w:val="F0AC7696"/>
     <w:lvl w:ilvl="0" w:tplc="4009000F">
       <w:start w:val="1"/>
       <w:numFmt w:val="decimal"/>
@@ -9611,13 +12070,13 @@
         <w:ind w:left="720" w:hanging="360"/>
       </w:pPr>
     </w:lvl>
-    <w:lvl w:ilvl="1" w:tplc="40090019" w:tentative="1">
-      <w:start w:val="1"/>
-      <w:numFmt w:val="lowerLetter"/>
-      <w:lvlText w:val="%2."/>
-      <w:lvlJc w:val="left"/>
-      <w:pPr>
-        <w:ind w:left="1440" w:hanging="360"/>
+    <w:lvl w:ilvl="1" w:tplc="40090011">
+      <w:start w:val="1"/>
+      <w:numFmt w:val="decimal"/>
+      <w:lvlText w:val="%2)"/>
+      <w:lvlJc w:val="left"/>
+      <w:pPr>
+        <w:ind w:left="1260" w:hanging="360"/>
       </w:pPr>
     </w:lvl>
     <w:lvl w:ilvl="2" w:tplc="4009001B" w:tentative="1">
@@ -9684,7 +12143,7 @@
       </w:pPr>
     </w:lvl>
   </w:abstractNum>
-  <w:abstractNum w:abstractNumId="8" w15:restartNumberingAfterBreak="0">
+  <w:abstractNum w:abstractNumId="12" w15:restartNumberingAfterBreak="0">
     <w:nsid w:val="342958CD"/>
     <w:multiLevelType w:val="hybridMultilevel"/>
     <w:tmpl w:val="CF745382"/>
@@ -9770,7 +12229,7 @@
       </w:pPr>
     </w:lvl>
   </w:abstractNum>
-  <w:abstractNum w:abstractNumId="9" w15:restartNumberingAfterBreak="0">
+  <w:abstractNum w:abstractNumId="13" w15:restartNumberingAfterBreak="0">
     <w:nsid w:val="36615831"/>
     <w:multiLevelType w:val="hybridMultilevel"/>
     <w:tmpl w:val="4266C6C8"/>
@@ -9856,7 +12315,7 @@
       </w:pPr>
     </w:lvl>
   </w:abstractNum>
-  <w:abstractNum w:abstractNumId="10" w15:restartNumberingAfterBreak="0">
+  <w:abstractNum w:abstractNumId="14" w15:restartNumberingAfterBreak="0">
     <w:nsid w:val="39DC5B7A"/>
     <w:multiLevelType w:val="hybridMultilevel"/>
     <w:tmpl w:val="44F49BA0"/>
@@ -9949,7 +12408,7 @@
       </w:pPr>
     </w:lvl>
   </w:abstractNum>
-  <w:abstractNum w:abstractNumId="11" w15:restartNumberingAfterBreak="0">
+  <w:abstractNum w:abstractNumId="15" w15:restartNumberingAfterBreak="0">
     <w:nsid w:val="3AC71FC8"/>
     <w:multiLevelType w:val="hybridMultilevel"/>
     <w:tmpl w:val="C4BE6376"/>
@@ -10035,7 +12494,120 @@
       </w:pPr>
     </w:lvl>
   </w:abstractNum>
-  <w:abstractNum w:abstractNumId="12" w15:restartNumberingAfterBreak="0">
+  <w:abstractNum w:abstractNumId="16" w15:restartNumberingAfterBreak="0">
+    <w:nsid w:val="3D0A79DE"/>
+    <w:multiLevelType w:val="hybridMultilevel"/>
+    <w:tmpl w:val="24D209C4"/>
+    <w:lvl w:ilvl="0" w:tplc="40090003">
+      <w:start w:val="1"/>
+      <w:numFmt w:val="bullet"/>
+      <w:lvlText w:val="o"/>
+      <w:lvlJc w:val="left"/>
+      <w:pPr>
+        <w:ind w:left="1440" w:hanging="360"/>
+      </w:pPr>
+      <w:rPr>
+        <w:rFonts w:ascii="Courier New" w:hAnsi="Courier New" w:cs="Courier New" w:hint="default"/>
+      </w:rPr>
+    </w:lvl>
+    <w:lvl w:ilvl="1" w:tplc="40090003" w:tentative="1">
+      <w:start w:val="1"/>
+      <w:numFmt w:val="bullet"/>
+      <w:lvlText w:val="o"/>
+      <w:lvlJc w:val="left"/>
+      <w:pPr>
+        <w:ind w:left="2160" w:hanging="360"/>
+      </w:pPr>
+      <w:rPr>
+        <w:rFonts w:ascii="Courier New" w:hAnsi="Courier New" w:cs="Courier New" w:hint="default"/>
+      </w:rPr>
+    </w:lvl>
+    <w:lvl w:ilvl="2" w:tplc="40090005" w:tentative="1">
+      <w:start w:val="1"/>
+      <w:numFmt w:val="bullet"/>
+      <w:lvlText w:val=""/>
+      <w:lvlJc w:val="left"/>
+      <w:pPr>
+        <w:ind w:left="2880" w:hanging="360"/>
+      </w:pPr>
+      <w:rPr>
+        <w:rFonts w:ascii="Wingdings" w:hAnsi="Wingdings" w:hint="default"/>
+      </w:rPr>
+    </w:lvl>
+    <w:lvl w:ilvl="3" w:tplc="40090001" w:tentative="1">
+      <w:start w:val="1"/>
+      <w:numFmt w:val="bullet"/>
+      <w:lvlText w:val=""/>
+      <w:lvlJc w:val="left"/>
+      <w:pPr>
+        <w:ind w:left="3600" w:hanging="360"/>
+      </w:pPr>
+      <w:rPr>
+        <w:rFonts w:ascii="Symbol" w:hAnsi="Symbol" w:hint="default"/>
+      </w:rPr>
+    </w:lvl>
+    <w:lvl w:ilvl="4" w:tplc="40090003" w:tentative="1">
+      <w:start w:val="1"/>
+      <w:numFmt w:val="bullet"/>
+      <w:lvlText w:val="o"/>
+      <w:lvlJc w:val="left"/>
+      <w:pPr>
+        <w:ind w:left="4320" w:hanging="360"/>
+      </w:pPr>
+      <w:rPr>
+        <w:rFonts w:ascii="Courier New" w:hAnsi="Courier New" w:cs="Courier New" w:hint="default"/>
+      </w:rPr>
+    </w:lvl>
+    <w:lvl w:ilvl="5" w:tplc="40090005" w:tentative="1">
+      <w:start w:val="1"/>
+      <w:numFmt w:val="bullet"/>
+      <w:lvlText w:val=""/>
+      <w:lvlJc w:val="left"/>
+      <w:pPr>
+        <w:ind w:left="5040" w:hanging="360"/>
+      </w:pPr>
+      <w:rPr>
+        <w:rFonts w:ascii="Wingdings" w:hAnsi="Wingdings" w:hint="default"/>
+      </w:rPr>
+    </w:lvl>
+    <w:lvl w:ilvl="6" w:tplc="40090001" w:tentative="1">
+      <w:start w:val="1"/>
+      <w:numFmt w:val="bullet"/>
+      <w:lvlText w:val=""/>
+      <w:lvlJc w:val="left"/>
+      <w:pPr>
+        <w:ind w:left="5760" w:hanging="360"/>
+      </w:pPr>
+      <w:rPr>
+        <w:rFonts w:ascii="Symbol" w:hAnsi="Symbol" w:hint="default"/>
+      </w:rPr>
+    </w:lvl>
+    <w:lvl w:ilvl="7" w:tplc="40090003" w:tentative="1">
+      <w:start w:val="1"/>
+      <w:numFmt w:val="bullet"/>
+      <w:lvlText w:val="o"/>
+      <w:lvlJc w:val="left"/>
+      <w:pPr>
+        <w:ind w:left="6480" w:hanging="360"/>
+      </w:pPr>
+      <w:rPr>
+        <w:rFonts w:ascii="Courier New" w:hAnsi="Courier New" w:cs="Courier New" w:hint="default"/>
+      </w:rPr>
+    </w:lvl>
+    <w:lvl w:ilvl="8" w:tplc="40090005" w:tentative="1">
+      <w:start w:val="1"/>
+      <w:numFmt w:val="bullet"/>
+      <w:lvlText w:val=""/>
+      <w:lvlJc w:val="left"/>
+      <w:pPr>
+        <w:ind w:left="7200" w:hanging="360"/>
+      </w:pPr>
+      <w:rPr>
+        <w:rFonts w:ascii="Wingdings" w:hAnsi="Wingdings" w:hint="default"/>
+      </w:rPr>
+    </w:lvl>
+  </w:abstractNum>
+  <w:abstractNum w:abstractNumId="17" w15:restartNumberingAfterBreak="0">
     <w:nsid w:val="3EA92057"/>
     <w:multiLevelType w:val="hybridMultilevel"/>
     <w:tmpl w:val="4380078C"/>
@@ -10125,7 +12697,7 @@
       </w:pPr>
     </w:lvl>
   </w:abstractNum>
-  <w:abstractNum w:abstractNumId="13" w15:restartNumberingAfterBreak="0">
+  <w:abstractNum w:abstractNumId="18" w15:restartNumberingAfterBreak="0">
     <w:nsid w:val="3F65527D"/>
     <w:multiLevelType w:val="hybridMultilevel"/>
     <w:tmpl w:val="3360578A"/>
@@ -10214,7 +12786,93 @@
       </w:pPr>
     </w:lvl>
   </w:abstractNum>
-  <w:abstractNum w:abstractNumId="14" w15:restartNumberingAfterBreak="0">
+  <w:abstractNum w:abstractNumId="19" w15:restartNumberingAfterBreak="0">
+    <w:nsid w:val="42B84DF1"/>
+    <w:multiLevelType w:val="hybridMultilevel"/>
+    <w:tmpl w:val="955420B2"/>
+    <w:lvl w:ilvl="0" w:tplc="40090011">
+      <w:start w:val="1"/>
+      <w:numFmt w:val="decimal"/>
+      <w:lvlText w:val="%1)"/>
+      <w:lvlJc w:val="left"/>
+      <w:pPr>
+        <w:ind w:left="1080" w:hanging="360"/>
+      </w:pPr>
+    </w:lvl>
+    <w:lvl w:ilvl="1" w:tplc="40090019" w:tentative="1">
+      <w:start w:val="1"/>
+      <w:numFmt w:val="lowerLetter"/>
+      <w:lvlText w:val="%2."/>
+      <w:lvlJc w:val="left"/>
+      <w:pPr>
+        <w:ind w:left="1800" w:hanging="360"/>
+      </w:pPr>
+    </w:lvl>
+    <w:lvl w:ilvl="2" w:tplc="4009001B" w:tentative="1">
+      <w:start w:val="1"/>
+      <w:numFmt w:val="lowerRoman"/>
+      <w:lvlText w:val="%3."/>
+      <w:lvlJc w:val="right"/>
+      <w:pPr>
+        <w:ind w:left="2520" w:hanging="180"/>
+      </w:pPr>
+    </w:lvl>
+    <w:lvl w:ilvl="3" w:tplc="4009000F" w:tentative="1">
+      <w:start w:val="1"/>
+      <w:numFmt w:val="decimal"/>
+      <w:lvlText w:val="%4."/>
+      <w:lvlJc w:val="left"/>
+      <w:pPr>
+        <w:ind w:left="3240" w:hanging="360"/>
+      </w:pPr>
+    </w:lvl>
+    <w:lvl w:ilvl="4" w:tplc="40090019" w:tentative="1">
+      <w:start w:val="1"/>
+      <w:numFmt w:val="lowerLetter"/>
+      <w:lvlText w:val="%5."/>
+      <w:lvlJc w:val="left"/>
+      <w:pPr>
+        <w:ind w:left="3960" w:hanging="360"/>
+      </w:pPr>
+    </w:lvl>
+    <w:lvl w:ilvl="5" w:tplc="4009001B" w:tentative="1">
+      <w:start w:val="1"/>
+      <w:numFmt w:val="lowerRoman"/>
+      <w:lvlText w:val="%6."/>
+      <w:lvlJc w:val="right"/>
+      <w:pPr>
+        <w:ind w:left="4680" w:hanging="180"/>
+      </w:pPr>
+    </w:lvl>
+    <w:lvl w:ilvl="6" w:tplc="4009000F" w:tentative="1">
+      <w:start w:val="1"/>
+      <w:numFmt w:val="decimal"/>
+      <w:lvlText w:val="%7."/>
+      <w:lvlJc w:val="left"/>
+      <w:pPr>
+        <w:ind w:left="5400" w:hanging="360"/>
+      </w:pPr>
+    </w:lvl>
+    <w:lvl w:ilvl="7" w:tplc="40090019" w:tentative="1">
+      <w:start w:val="1"/>
+      <w:numFmt w:val="lowerLetter"/>
+      <w:lvlText w:val="%8."/>
+      <w:lvlJc w:val="left"/>
+      <w:pPr>
+        <w:ind w:left="6120" w:hanging="360"/>
+      </w:pPr>
+    </w:lvl>
+    <w:lvl w:ilvl="8" w:tplc="4009001B" w:tentative="1">
+      <w:start w:val="1"/>
+      <w:numFmt w:val="lowerRoman"/>
+      <w:lvlText w:val="%9."/>
+      <w:lvlJc w:val="right"/>
+      <w:pPr>
+        <w:ind w:left="6840" w:hanging="180"/>
+      </w:pPr>
+    </w:lvl>
+  </w:abstractNum>
+  <w:abstractNum w:abstractNumId="20" w15:restartNumberingAfterBreak="0">
     <w:nsid w:val="4C0D43C3"/>
     <w:multiLevelType w:val="multilevel"/>
     <w:tmpl w:val="C194D866"/>
@@ -10300,7 +12958,7 @@
       </w:pPr>
     </w:lvl>
   </w:abstractNum>
-  <w:abstractNum w:abstractNumId="15" w15:restartNumberingAfterBreak="0">
+  <w:abstractNum w:abstractNumId="21" w15:restartNumberingAfterBreak="0">
     <w:nsid w:val="4DAD2BB7"/>
     <w:multiLevelType w:val="hybridMultilevel"/>
     <w:tmpl w:val="16169982"/>
@@ -10386,7 +13044,7 @@
       </w:pPr>
     </w:lvl>
   </w:abstractNum>
-  <w:abstractNum w:abstractNumId="16" w15:restartNumberingAfterBreak="0">
+  <w:abstractNum w:abstractNumId="22" w15:restartNumberingAfterBreak="0">
     <w:nsid w:val="4FE54EE8"/>
     <w:multiLevelType w:val="multilevel"/>
     <w:tmpl w:val="9F307DE2"/>
@@ -10472,7 +13130,7 @@
       </w:pPr>
     </w:lvl>
   </w:abstractNum>
-  <w:abstractNum w:abstractNumId="17" w15:restartNumberingAfterBreak="0">
+  <w:abstractNum w:abstractNumId="23" w15:restartNumberingAfterBreak="0">
     <w:nsid w:val="50964967"/>
     <w:multiLevelType w:val="hybridMultilevel"/>
     <w:tmpl w:val="DDEE89CC"/>
@@ -10561,7 +13219,7 @@
       </w:pPr>
     </w:lvl>
   </w:abstractNum>
-  <w:abstractNum w:abstractNumId="18" w15:restartNumberingAfterBreak="0">
+  <w:abstractNum w:abstractNumId="24" w15:restartNumberingAfterBreak="0">
     <w:nsid w:val="546329B7"/>
     <w:multiLevelType w:val="hybridMultilevel"/>
     <w:tmpl w:val="2A2A074E"/>
@@ -10651,7 +13309,93 @@
       </w:pPr>
     </w:lvl>
   </w:abstractNum>
-  <w:abstractNum w:abstractNumId="19" w15:restartNumberingAfterBreak="0">
+  <w:abstractNum w:abstractNumId="25" w15:restartNumberingAfterBreak="0">
+    <w:nsid w:val="57AE7F3C"/>
+    <w:multiLevelType w:val="hybridMultilevel"/>
+    <w:tmpl w:val="85D6EA06"/>
+    <w:lvl w:ilvl="0" w:tplc="FFFFFFFF">
+      <w:start w:val="1"/>
+      <w:numFmt w:val="decimal"/>
+      <w:lvlText w:val="%1."/>
+      <w:lvlJc w:val="left"/>
+      <w:pPr>
+        <w:ind w:left="720" w:hanging="360"/>
+      </w:pPr>
+    </w:lvl>
+    <w:lvl w:ilvl="1" w:tplc="FFFFFFFF" w:tentative="1">
+      <w:start w:val="1"/>
+      <w:numFmt w:val="lowerLetter"/>
+      <w:lvlText w:val="%2."/>
+      <w:lvlJc w:val="left"/>
+      <w:pPr>
+        <w:ind w:left="1440" w:hanging="360"/>
+      </w:pPr>
+    </w:lvl>
+    <w:lvl w:ilvl="2" w:tplc="FFFFFFFF" w:tentative="1">
+      <w:start w:val="1"/>
+      <w:numFmt w:val="lowerRoman"/>
+      <w:lvlText w:val="%3."/>
+      <w:lvlJc w:val="right"/>
+      <w:pPr>
+        <w:ind w:left="2160" w:hanging="180"/>
+      </w:pPr>
+    </w:lvl>
+    <w:lvl w:ilvl="3" w:tplc="FFFFFFFF" w:tentative="1">
+      <w:start w:val="1"/>
+      <w:numFmt w:val="decimal"/>
+      <w:lvlText w:val="%4."/>
+      <w:lvlJc w:val="left"/>
+      <w:pPr>
+        <w:ind w:left="2880" w:hanging="360"/>
+      </w:pPr>
+    </w:lvl>
+    <w:lvl w:ilvl="4" w:tplc="FFFFFFFF" w:tentative="1">
+      <w:start w:val="1"/>
+      <w:numFmt w:val="lowerLetter"/>
+      <w:lvlText w:val="%5."/>
+      <w:lvlJc w:val="left"/>
+      <w:pPr>
+        <w:ind w:left="3600" w:hanging="360"/>
+      </w:pPr>
+    </w:lvl>
+    <w:lvl w:ilvl="5" w:tplc="FFFFFFFF" w:tentative="1">
+      <w:start w:val="1"/>
+      <w:numFmt w:val="lowerRoman"/>
+      <w:lvlText w:val="%6."/>
+      <w:lvlJc w:val="right"/>
+      <w:pPr>
+        <w:ind w:left="4320" w:hanging="180"/>
+      </w:pPr>
+    </w:lvl>
+    <w:lvl w:ilvl="6" w:tplc="FFFFFFFF" w:tentative="1">
+      <w:start w:val="1"/>
+      <w:numFmt w:val="decimal"/>
+      <w:lvlText w:val="%7."/>
+      <w:lvlJc w:val="left"/>
+      <w:pPr>
+        <w:ind w:left="5040" w:hanging="360"/>
+      </w:pPr>
+    </w:lvl>
+    <w:lvl w:ilvl="7" w:tplc="FFFFFFFF" w:tentative="1">
+      <w:start w:val="1"/>
+      <w:numFmt w:val="lowerLetter"/>
+      <w:lvlText w:val="%8."/>
+      <w:lvlJc w:val="left"/>
+      <w:pPr>
+        <w:ind w:left="5760" w:hanging="360"/>
+      </w:pPr>
+    </w:lvl>
+    <w:lvl w:ilvl="8" w:tplc="FFFFFFFF" w:tentative="1">
+      <w:start w:val="1"/>
+      <w:numFmt w:val="lowerRoman"/>
+      <w:lvlText w:val="%9."/>
+      <w:lvlJc w:val="right"/>
+      <w:pPr>
+        <w:ind w:left="6480" w:hanging="180"/>
+      </w:pPr>
+    </w:lvl>
+  </w:abstractNum>
+  <w:abstractNum w:abstractNumId="26" w15:restartNumberingAfterBreak="0">
     <w:nsid w:val="581D2824"/>
     <w:multiLevelType w:val="hybridMultilevel"/>
     <w:tmpl w:val="41C0C86A"/>
@@ -10764,7 +13508,7 @@
       </w:rPr>
     </w:lvl>
   </w:abstractNum>
-  <w:abstractNum w:abstractNumId="20" w15:restartNumberingAfterBreak="0">
+  <w:abstractNum w:abstractNumId="27" w15:restartNumberingAfterBreak="0">
     <w:nsid w:val="58C84917"/>
     <w:multiLevelType w:val="hybridMultilevel"/>
     <w:tmpl w:val="567AFC1A"/>
@@ -10877,7 +13621,7 @@
       </w:rPr>
     </w:lvl>
   </w:abstractNum>
-  <w:abstractNum w:abstractNumId="21" w15:restartNumberingAfterBreak="0">
+  <w:abstractNum w:abstractNumId="28" w15:restartNumberingAfterBreak="0">
     <w:nsid w:val="5FE50CB1"/>
     <w:multiLevelType w:val="hybridMultilevel"/>
     <w:tmpl w:val="B6046F06"/>
@@ -10967,7 +13711,7 @@
       </w:pPr>
     </w:lvl>
   </w:abstractNum>
-  <w:abstractNum w:abstractNumId="22" w15:restartNumberingAfterBreak="0">
+  <w:abstractNum w:abstractNumId="29" w15:restartNumberingAfterBreak="0">
     <w:nsid w:val="62872F81"/>
     <w:multiLevelType w:val="hybridMultilevel"/>
     <w:tmpl w:val="09963F74"/>
@@ -11057,7 +13801,120 @@
       </w:pPr>
     </w:lvl>
   </w:abstractNum>
-  <w:abstractNum w:abstractNumId="23" w15:restartNumberingAfterBreak="0">
+  <w:abstractNum w:abstractNumId="30" w15:restartNumberingAfterBreak="0">
+    <w:nsid w:val="638B2640"/>
+    <w:multiLevelType w:val="hybridMultilevel"/>
+    <w:tmpl w:val="1788144A"/>
+    <w:lvl w:ilvl="0" w:tplc="40090003">
+      <w:start w:val="1"/>
+      <w:numFmt w:val="bullet"/>
+      <w:lvlText w:val="o"/>
+      <w:lvlJc w:val="left"/>
+      <w:pPr>
+        <w:ind w:left="1530" w:hanging="360"/>
+      </w:pPr>
+      <w:rPr>
+        <w:rFonts w:ascii="Courier New" w:hAnsi="Courier New" w:cs="Courier New" w:hint="default"/>
+      </w:rPr>
+    </w:lvl>
+    <w:lvl w:ilvl="1" w:tplc="40090003" w:tentative="1">
+      <w:start w:val="1"/>
+      <w:numFmt w:val="bullet"/>
+      <w:lvlText w:val="o"/>
+      <w:lvlJc w:val="left"/>
+      <w:pPr>
+        <w:ind w:left="2250" w:hanging="360"/>
+      </w:pPr>
+      <w:rPr>
+        <w:rFonts w:ascii="Courier New" w:hAnsi="Courier New" w:cs="Courier New" w:hint="default"/>
+      </w:rPr>
+    </w:lvl>
+    <w:lvl w:ilvl="2" w:tplc="40090005" w:tentative="1">
+      <w:start w:val="1"/>
+      <w:numFmt w:val="bullet"/>
+      <w:lvlText w:val=""/>
+      <w:lvlJc w:val="left"/>
+      <w:pPr>
+        <w:ind w:left="2970" w:hanging="360"/>
+      </w:pPr>
+      <w:rPr>
+        <w:rFonts w:ascii="Wingdings" w:hAnsi="Wingdings" w:hint="default"/>
+      </w:rPr>
+    </w:lvl>
+    <w:lvl w:ilvl="3" w:tplc="40090001" w:tentative="1">
+      <w:start w:val="1"/>
+      <w:numFmt w:val="bullet"/>
+      <w:lvlText w:val=""/>
+      <w:lvlJc w:val="left"/>
+      <w:pPr>
+        <w:ind w:left="3690" w:hanging="360"/>
+      </w:pPr>
+      <w:rPr>
+        <w:rFonts w:ascii="Symbol" w:hAnsi="Symbol" w:hint="default"/>
+      </w:rPr>
+    </w:lvl>
+    <w:lvl w:ilvl="4" w:tplc="40090003" w:tentative="1">
+      <w:start w:val="1"/>
+      <w:numFmt w:val="bullet"/>
+      <w:lvlText w:val="o"/>
+      <w:lvlJc w:val="left"/>
+      <w:pPr>
+        <w:ind w:left="4410" w:hanging="360"/>
+      </w:pPr>
+      <w:rPr>
+        <w:rFonts w:ascii="Courier New" w:hAnsi="Courier New" w:cs="Courier New" w:hint="default"/>
+      </w:rPr>
+    </w:lvl>
+    <w:lvl w:ilvl="5" w:tplc="40090005" w:tentative="1">
+      <w:start w:val="1"/>
+      <w:numFmt w:val="bullet"/>
+      <w:lvlText w:val=""/>
+      <w:lvlJc w:val="left"/>
+      <w:pPr>
+        <w:ind w:left="5130" w:hanging="360"/>
+      </w:pPr>
+      <w:rPr>
+        <w:rFonts w:ascii="Wingdings" w:hAnsi="Wingdings" w:hint="default"/>
+      </w:rPr>
+    </w:lvl>
+    <w:lvl w:ilvl="6" w:tplc="40090001" w:tentative="1">
+      <w:start w:val="1"/>
+      <w:numFmt w:val="bullet"/>
+      <w:lvlText w:val=""/>
+      <w:lvlJc w:val="left"/>
+      <w:pPr>
+        <w:ind w:left="5850" w:hanging="360"/>
+      </w:pPr>
+      <w:rPr>
+        <w:rFonts w:ascii="Symbol" w:hAnsi="Symbol" w:hint="default"/>
+      </w:rPr>
+    </w:lvl>
+    <w:lvl w:ilvl="7" w:tplc="40090003" w:tentative="1">
+      <w:start w:val="1"/>
+      <w:numFmt w:val="bullet"/>
+      <w:lvlText w:val="o"/>
+      <w:lvlJc w:val="left"/>
+      <w:pPr>
+        <w:ind w:left="6570" w:hanging="360"/>
+      </w:pPr>
+      <w:rPr>
+        <w:rFonts w:ascii="Courier New" w:hAnsi="Courier New" w:cs="Courier New" w:hint="default"/>
+      </w:rPr>
+    </w:lvl>
+    <w:lvl w:ilvl="8" w:tplc="40090005" w:tentative="1">
+      <w:start w:val="1"/>
+      <w:numFmt w:val="bullet"/>
+      <w:lvlText w:val=""/>
+      <w:lvlJc w:val="left"/>
+      <w:pPr>
+        <w:ind w:left="7290" w:hanging="360"/>
+      </w:pPr>
+      <w:rPr>
+        <w:rFonts w:ascii="Wingdings" w:hAnsi="Wingdings" w:hint="default"/>
+      </w:rPr>
+    </w:lvl>
+  </w:abstractNum>
+  <w:abstractNum w:abstractNumId="31" w15:restartNumberingAfterBreak="0">
     <w:nsid w:val="6E6E33C4"/>
     <w:multiLevelType w:val="hybridMultilevel"/>
     <w:tmpl w:val="243EBC70"/>
@@ -11149,7 +14006,7 @@
       </w:pPr>
     </w:lvl>
   </w:abstractNum>
-  <w:abstractNum w:abstractNumId="24" w15:restartNumberingAfterBreak="0">
+  <w:abstractNum w:abstractNumId="32" w15:restartNumberingAfterBreak="0">
     <w:nsid w:val="7397314D"/>
     <w:multiLevelType w:val="hybridMultilevel"/>
     <w:tmpl w:val="1AE4F7FA"/>
@@ -11262,7 +14119,7 @@
       </w:rPr>
     </w:lvl>
   </w:abstractNum>
-  <w:abstractNum w:abstractNumId="25" w15:restartNumberingAfterBreak="0">
+  <w:abstractNum w:abstractNumId="33" w15:restartNumberingAfterBreak="0">
     <w:nsid w:val="7AB015C5"/>
     <w:multiLevelType w:val="hybridMultilevel"/>
     <w:tmpl w:val="AC70AFD6"/>
@@ -11375,7 +14232,7 @@
       </w:rPr>
     </w:lvl>
   </w:abstractNum>
-  <w:abstractNum w:abstractNumId="26" w15:restartNumberingAfterBreak="0">
+  <w:abstractNum w:abstractNumId="34" w15:restartNumberingAfterBreak="0">
     <w:nsid w:val="7E583D86"/>
     <w:multiLevelType w:val="hybridMultilevel"/>
     <w:tmpl w:val="EF12223A"/>
@@ -11489,85 +14346,109 @@
     </w:lvl>
   </w:abstractNum>
   <w:num w:numId="1" w16cid:durableId="2116702776">
+    <w:abstractNumId w:val="2"/>
+  </w:num>
+  <w:num w:numId="2" w16cid:durableId="74521518">
+    <w:abstractNumId w:val="20"/>
+  </w:num>
+  <w:num w:numId="3" w16cid:durableId="696739033">
+    <w:abstractNumId w:val="22"/>
+  </w:num>
+  <w:num w:numId="4" w16cid:durableId="396051932">
+    <w:abstractNumId w:val="7"/>
+  </w:num>
+  <w:num w:numId="5" w16cid:durableId="1546867271">
+    <w:abstractNumId w:val="4"/>
+  </w:num>
+  <w:num w:numId="6" w16cid:durableId="792485075">
+    <w:abstractNumId w:val="29"/>
+  </w:num>
+  <w:num w:numId="7" w16cid:durableId="1622876310">
+    <w:abstractNumId w:val="27"/>
+  </w:num>
+  <w:num w:numId="8" w16cid:durableId="818570542">
+    <w:abstractNumId w:val="24"/>
+  </w:num>
+  <w:num w:numId="9" w16cid:durableId="344674794">
+    <w:abstractNumId w:val="9"/>
+  </w:num>
+  <w:num w:numId="10" w16cid:durableId="1358579457">
+    <w:abstractNumId w:val="5"/>
+  </w:num>
+  <w:num w:numId="11" w16cid:durableId="1725984708">
+    <w:abstractNumId w:val="33"/>
+  </w:num>
+  <w:num w:numId="12" w16cid:durableId="1092355393">
+    <w:abstractNumId w:val="12"/>
+  </w:num>
+  <w:num w:numId="13" w16cid:durableId="1932377">
+    <w:abstractNumId w:val="11"/>
+  </w:num>
+  <w:num w:numId="14" w16cid:durableId="97332818">
+    <w:abstractNumId w:val="18"/>
+  </w:num>
+  <w:num w:numId="15" w16cid:durableId="1516533306">
+    <w:abstractNumId w:val="26"/>
+  </w:num>
+  <w:num w:numId="16" w16cid:durableId="556473261">
+    <w:abstractNumId w:val="32"/>
+  </w:num>
+  <w:num w:numId="17" w16cid:durableId="1587348393">
+    <w:abstractNumId w:val="10"/>
+  </w:num>
+  <w:num w:numId="18" w16cid:durableId="1506288457">
+    <w:abstractNumId w:val="28"/>
+  </w:num>
+  <w:num w:numId="19" w16cid:durableId="14118627">
+    <w:abstractNumId w:val="15"/>
+  </w:num>
+  <w:num w:numId="20" w16cid:durableId="1165513481">
+    <w:abstractNumId w:val="21"/>
+  </w:num>
+  <w:num w:numId="21" w16cid:durableId="1250654850">
+    <w:abstractNumId w:val="23"/>
+  </w:num>
+  <w:num w:numId="22" w16cid:durableId="1027947538">
+    <w:abstractNumId w:val="13"/>
+  </w:num>
+  <w:num w:numId="23" w16cid:durableId="1743604658">
+    <w:abstractNumId w:val="17"/>
+  </w:num>
+  <w:num w:numId="24" w16cid:durableId="726994963">
+    <w:abstractNumId w:val="14"/>
+  </w:num>
+  <w:num w:numId="25" w16cid:durableId="281495918">
+    <w:abstractNumId w:val="31"/>
+  </w:num>
+  <w:num w:numId="26" w16cid:durableId="1153372607">
+    <w:abstractNumId w:val="3"/>
+  </w:num>
+  <w:num w:numId="27" w16cid:durableId="717049480">
+    <w:abstractNumId w:val="34"/>
+  </w:num>
+  <w:num w:numId="28" w16cid:durableId="2092391205">
+    <w:abstractNumId w:val="25"/>
+  </w:num>
+  <w:num w:numId="29" w16cid:durableId="1161388792">
+    <w:abstractNumId w:val="1"/>
+  </w:num>
+  <w:num w:numId="30" w16cid:durableId="1943951094">
+    <w:abstractNumId w:val="30"/>
+  </w:num>
+  <w:num w:numId="31" w16cid:durableId="309359737">
+    <w:abstractNumId w:val="6"/>
+  </w:num>
+  <w:num w:numId="32" w16cid:durableId="1624576415">
+    <w:abstractNumId w:val="16"/>
+  </w:num>
+  <w:num w:numId="33" w16cid:durableId="1056202691">
     <w:abstractNumId w:val="0"/>
   </w:num>
-  <w:num w:numId="2" w16cid:durableId="74521518">
-    <w:abstractNumId w:val="14"/>
-  </w:num>
-  <w:num w:numId="3" w16cid:durableId="696739033">
-    <w:abstractNumId w:val="16"/>
-  </w:num>
-  <w:num w:numId="4" w16cid:durableId="396051932">
-    <w:abstractNumId w:val="4"/>
-  </w:num>
-  <w:num w:numId="5" w16cid:durableId="1546867271">
-    <w:abstractNumId w:val="2"/>
-  </w:num>
-  <w:num w:numId="6" w16cid:durableId="792485075">
-    <w:abstractNumId w:val="22"/>
-  </w:num>
-  <w:num w:numId="7" w16cid:durableId="1622876310">
-    <w:abstractNumId w:val="20"/>
-  </w:num>
-  <w:num w:numId="8" w16cid:durableId="818570542">
-    <w:abstractNumId w:val="18"/>
-  </w:num>
-  <w:num w:numId="9" w16cid:durableId="344674794">
-    <w:abstractNumId w:val="5"/>
-  </w:num>
-  <w:num w:numId="10" w16cid:durableId="1358579457">
-    <w:abstractNumId w:val="3"/>
-  </w:num>
-  <w:num w:numId="11" w16cid:durableId="1725984708">
-    <w:abstractNumId w:val="25"/>
-  </w:num>
-  <w:num w:numId="12" w16cid:durableId="1092355393">
-    <w:abstractNumId w:val="8"/>
-  </w:num>
-  <w:num w:numId="13" w16cid:durableId="1932377">
-    <w:abstractNumId w:val="7"/>
-  </w:num>
-  <w:num w:numId="14" w16cid:durableId="97332818">
-    <w:abstractNumId w:val="13"/>
-  </w:num>
-  <w:num w:numId="15" w16cid:durableId="1516533306">
+  <w:num w:numId="34" w16cid:durableId="1712729846">
     <w:abstractNumId w:val="19"/>
   </w:num>
-  <w:num w:numId="16" w16cid:durableId="556473261">
-    <w:abstractNumId w:val="24"/>
-  </w:num>
-  <w:num w:numId="17" w16cid:durableId="1587348393">
-    <w:abstractNumId w:val="6"/>
-  </w:num>
-  <w:num w:numId="18" w16cid:durableId="1506288457">
-    <w:abstractNumId w:val="21"/>
-  </w:num>
-  <w:num w:numId="19" w16cid:durableId="14118627">
-    <w:abstractNumId w:val="11"/>
-  </w:num>
-  <w:num w:numId="20" w16cid:durableId="1165513481">
-    <w:abstractNumId w:val="15"/>
-  </w:num>
-  <w:num w:numId="21" w16cid:durableId="1250654850">
-    <w:abstractNumId w:val="17"/>
-  </w:num>
-  <w:num w:numId="22" w16cid:durableId="1027947538">
-    <w:abstractNumId w:val="9"/>
-  </w:num>
-  <w:num w:numId="23" w16cid:durableId="1743604658">
-    <w:abstractNumId w:val="12"/>
-  </w:num>
-  <w:num w:numId="24" w16cid:durableId="726994963">
-    <w:abstractNumId w:val="10"/>
-  </w:num>
-  <w:num w:numId="25" w16cid:durableId="281495918">
-    <w:abstractNumId w:val="23"/>
-  </w:num>
-  <w:num w:numId="26" w16cid:durableId="1153372607">
-    <w:abstractNumId w:val="1"/>
-  </w:num>
-  <w:num w:numId="27" w16cid:durableId="717049480">
-    <w:abstractNumId w:val="26"/>
+  <w:num w:numId="35" w16cid:durableId="209221811">
+    <w:abstractNumId w:val="8"/>
   </w:num>
 </w:numbering>
 </file>

</xml_diff>